<commit_message>
Refond la chaîne de production du PDF et met à jour registre et déclaration
PDF de contrôle : images rendues, sommaire (niveaux 1-2) et table des
matières détaillée (tous niveaux) générés avec pagination réelle, page de
titre isolée et sans folio, texte alternatif retiré du rendu visible.
DOCX : sauts de page sur chaque division, page de titre centrée, champs
Sommaire et Table des matières. Registre v1.7 et déclaration finale v1.2
consignent l'audit de soutenabilité et ses 70 constats appliqués.

Co-Authored-By: Claude Fable 5 <noreply@anthropic.com>
Claude-Session: https://claude.ai/code/session_019cQWueQyn1tismMV8DQS9i
</commit_message>
<xml_diff>
--- a/revision-memoire/manuscrit/Memoire_GEMBA_EL-HASSOUNY_corrige_v1.docx
+++ b/revision-memoire/manuscrit/Memoire_GEMBA_EL-HASSOUNY_corrige_v1.docx
@@ -5,6 +5,7 @@
     <w:p>
       <w:pPr>
         <w:pStyle w:val="Title"/>
+        <w:jc w:val="center"/>
       </w:pPr>
       <w:r>
         <w:t xml:space="preserve">Les</w:t>
@@ -187,6 +188,7 @@
     <w:p>
       <w:pPr>
         <w:pStyle w:val="Author"/>
+        <w:jc w:val="center"/>
       </w:pPr>
       <w:r>
         <w:t xml:space="preserve">Mohamed</w:t>
@@ -254,6 +256,7 @@
     <w:p>
       <w:pPr>
         <w:pStyle w:val="ImageCaption"/>
+        <w:jc w:val="center"/>
       </w:pPr>
       <w:r>
         <w:t xml:space="preserve">Logotype de TBS Education</w:t>
@@ -262,6 +265,7 @@
     <w:p>
       <w:pPr>
         <w:pStyle w:val="BodyText"/>
+        <w:jc w:val="center"/>
       </w:pPr>
       <w:r>
         <w:rPr>
@@ -274,6 +278,7 @@
     <w:p>
       <w:pPr>
         <w:pStyle w:val="BodyText"/>
+        <w:jc w:val="center"/>
       </w:pPr>
       <w:r>
         <w:t xml:space="preserve">Mémoire présenté en vue de l'obtention du Global Executive MBA en Management Stratégique</w:t>
@@ -282,6 +287,7 @@
     <w:p>
       <w:pPr>
         <w:pStyle w:val="BodyText"/>
+        <w:jc w:val="center"/>
       </w:pPr>
       <w:r>
         <w:t xml:space="preserve">Programme Global Executive MBA (GEMBA), Promotion P23</w:t>
@@ -290,6 +296,7 @@
     <w:p>
       <w:pPr>
         <w:pStyle w:val="BodyText"/>
+        <w:jc w:val="center"/>
       </w:pPr>
       <w:r>
         <w:t xml:space="preserve">Présenté par :</w:t>
@@ -308,6 +315,7 @@
     <w:p>
       <w:pPr>
         <w:pStyle w:val="BodyText"/>
+        <w:jc w:val="center"/>
       </w:pPr>
       <w:r>
         <w:t xml:space="preserve">Sous la direction de :</w:t>
@@ -326,6 +334,7 @@
     <w:p>
       <w:pPr>
         <w:pStyle w:val="BodyText"/>
+        <w:jc w:val="center"/>
       </w:pPr>
       <w:r>
         <w:t xml:space="preserve">TBS Education Casablanca</w:t>
@@ -334,6 +343,7 @@
     <w:p>
       <w:pPr>
         <w:pStyle w:val="BodyText"/>
+        <w:jc w:val="center"/>
       </w:pPr>
       <w:r>
         <w:t xml:space="preserve">Année universitaire 2024-2026</w:t>
@@ -343,6 +353,7 @@
     <w:p>
       <w:pPr>
         <w:pStyle w:val="Heading1"/>
+        <w:pageBreakBefore/>
       </w:pPr>
       <w:r>
         <w:rPr>
@@ -389,6 +400,7 @@
     <w:p>
       <w:pPr>
         <w:pStyle w:val="Heading1"/>
+        <w:pageBreakBefore/>
       </w:pPr>
       <w:r>
         <w:rPr>
@@ -429,7 +441,7 @@
         <w:t xml:space="preserve">Maroc Digital 2030</w:t>
       </w:r>
       <w:r>
-        <w:t xml:space="preserve">). Sept propositions de recherche (P1 à P7) en découlent. La démarche adopte une posture post-positiviste et une logique qualitative déductive : douze à vingt entretiens semi-directifs sont prévus auprès de professionnels RH d'organisations diversifiées par la taille, le secteur et la maturité digitale, puis analysés par analyse thématique combinant codage déductif, codes émergents et double codage partiel. Le présent document couvre la phase théorique et méthodologique de la recherche ; la phase empirique, à venir, confrontera les propositions au discours des répondants. La contribution attendue est double : un enrichissement contextualisé des modèles d'acceptation appliqués à l'IA et des repères d'action pour les directions RH, les dirigeants, les éditeurs de solutions et les acteurs publics marocains.</w:t>
+        <w:t xml:space="preserve">). Sept propositions de recherche (P1 à P7) en découlent. La démarche adopte une posture post-positiviste et une logique qualitative déductive : douze à vingt entretiens semi-directifs sont prévus auprès de professionnels RH d'organisations diversifiées selon cinq axes (taille, secteur d'activité, genre, ancienneté dans la fonction et statut managérial), puis analysés par analyse thématique combinant codage déductif, codes émergents et double codage partiel. Le présent document couvre la phase théorique et méthodologique de la recherche ; la phase empirique, à venir, confrontera les propositions au discours des répondants. La contribution attendue est double : un enrichissement contextualisé des modèles d'acceptation appliqués à l'IA et des repères d'action pour les directions RH, les dirigeants, les éditeurs de solutions et les acteurs publics marocains.</w:t>
       </w:r>
     </w:p>
     <w:p>
@@ -445,6 +457,7 @@
     <w:p>
       <w:pPr>
         <w:pStyle w:val="Heading1"/>
+        <w:pageBreakBefore/>
       </w:pPr>
       <w:r>
         <w:rPr>
@@ -475,7 +488,7 @@
         <w:t xml:space="preserve"> </w:t>
       </w:r>
       <w:r>
-        <w:t xml:space="preserve">strategy). Seven research propositions (P1 to P7) derive from this framework. The study adopts a post-positivist stance and a deductive qualitative logic: twelve to twenty semi-structured interviews are planned with HR professionals from organisations diversified by size, sector and digital maturity, then analysed through thematic analysis combining deductive coding, emergent codes and partial double coding. This document covers the theoretical and methodological phase of the research; the forthcoming empirical phase will confront the propositions with respondents' accounts. The expected contribution is twofold: a contextualised enrichment of technology acceptance models applied to AI, and actionable guidance for HR departments, executives, solution vendors and Moroccan public actors.</w:t>
+        <w:t xml:space="preserve">strategy). Seven research propositions (P1 to P7) derive from this framework. The study adopts a post-positivist stance and a deductive qualitative logic: twelve to twenty semi-structured interviews are planned with HR professionals diversified along five axes (organisation size, sector, gender, tenure in the HR function and managerial status), then analysed through thematic analysis combining deductive coding, emergent codes and partial double coding. This document covers the theoretical and methodological phase of the research; the forthcoming empirical phase will confront the propositions with respondents' accounts. The expected contribution is twofold: a contextualised enrichment of technology acceptance models applied to AI, and actionable guidance for HR departments, executives, solution vendors and Moroccan public actors.</w:t>
       </w:r>
     </w:p>
     <w:p>
@@ -491,6 +504,7 @@
     <w:p>
       <w:pPr>
         <w:pStyle w:val="Heading1"/>
+        <w:pageBreakBefore/>
       </w:pPr>
       <w:r>
         <w:rPr>
@@ -687,19 +701,19 @@
               <w:jc w:val="left"/>
             </w:pPr>
             <w:r>
-              <w:t xml:space="preserve">DRH</w:t>
-            </w:r>
-          </w:p>
-        </w:tc>
-        <w:tc>
-          <w:tcPr/>
-          <w:p>
-            <w:pPr>
-              <w:pStyle w:val="Compact"/>
-              <w:jc w:val="left"/>
-            </w:pPr>
-            <w:r>
-              <w:t xml:space="preserve">Directeur ou Direction des Ressources Humaines</w:t>
+              <w:t xml:space="preserve">CONF</w:t>
+            </w:r>
+          </w:p>
+        </w:tc>
+        <w:tc>
+          <w:tcPr/>
+          <w:p>
+            <w:pPr>
+              <w:pStyle w:val="Compact"/>
+              <w:jc w:val="left"/>
+            </w:pPr>
+            <w:r>
+              <w:t xml:space="preserve">Confiance envers les outils d'IA (variable du modèle conceptuel)</w:t>
             </w:r>
           </w:p>
         </w:tc>
@@ -716,6 +730,64 @@
               <w:jc w:val="left"/>
             </w:pPr>
             <w:r>
+              <w:t xml:space="preserve">CONF-DATA</w:t>
+            </w:r>
+          </w:p>
+        </w:tc>
+        <w:tc>
+          <w:tcPr/>
+          <w:p>
+            <w:pPr>
+              <w:pStyle w:val="Compact"/>
+              <w:jc w:val="left"/>
+            </w:pPr>
+            <w:r>
+              <w:t xml:space="preserve">Préoccupations relatives à la confidentialité des données RH (variable du modèle conceptuel)</w:t>
+            </w:r>
+          </w:p>
+        </w:tc>
+      </w:tr>
+      <w:tr>
+        <w:trPr>
+          <w:cantSplit/>
+        </w:trPr>
+        <w:tc>
+          <w:tcPr/>
+          <w:p>
+            <w:pPr>
+              <w:pStyle w:val="Compact"/>
+              <w:jc w:val="left"/>
+            </w:pPr>
+            <w:r>
+              <w:t xml:space="preserve">DRH</w:t>
+            </w:r>
+          </w:p>
+        </w:tc>
+        <w:tc>
+          <w:tcPr/>
+          <w:p>
+            <w:pPr>
+              <w:pStyle w:val="Compact"/>
+              <w:jc w:val="left"/>
+            </w:pPr>
+            <w:r>
+              <w:t xml:space="preserve">Directeur ou Direction des Ressources Humaines</w:t>
+            </w:r>
+          </w:p>
+        </w:tc>
+      </w:tr>
+      <w:tr>
+        <w:trPr>
+          <w:cantSplit/>
+        </w:trPr>
+        <w:tc>
+          <w:tcPr/>
+          <w:p>
+            <w:pPr>
+              <w:pStyle w:val="Compact"/>
+              <w:jc w:val="left"/>
+            </w:pPr>
+            <w:r>
               <w:t xml:space="preserve">e-HRM</w:t>
             </w:r>
           </w:p>
@@ -813,19 +885,19 @@
               <w:jc w:val="left"/>
             </w:pPr>
             <w:r>
-              <w:t xml:space="preserve">IA</w:t>
-            </w:r>
-          </w:p>
-        </w:tc>
-        <w:tc>
-          <w:tcPr/>
-          <w:p>
-            <w:pPr>
-              <w:pStyle w:val="Compact"/>
-              <w:jc w:val="left"/>
-            </w:pPr>
-            <w:r>
-              <w:t xml:space="preserve">Intelligence Artificielle</w:t>
+              <w:t xml:space="preserve">GEMBA</w:t>
+            </w:r>
+          </w:p>
+        </w:tc>
+        <w:tc>
+          <w:tcPr/>
+          <w:p>
+            <w:pPr>
+              <w:pStyle w:val="Compact"/>
+              <w:jc w:val="left"/>
+            </w:pPr>
+            <w:r>
+              <w:t xml:space="preserve">Global Executive MBA</w:t>
             </w:r>
           </w:p>
         </w:tc>
@@ -842,19 +914,19 @@
               <w:jc w:val="left"/>
             </w:pPr>
             <w:r>
-              <w:t xml:space="preserve">Familles de codes analytiques</w:t>
-            </w:r>
-          </w:p>
-        </w:tc>
-        <w:tc>
-          <w:tcPr/>
-          <w:p>
-            <w:pPr>
-              <w:pStyle w:val="Compact"/>
-              <w:jc w:val="left"/>
-            </w:pPr>
-            <w:r>
-              <w:t xml:space="preserve">UP (utilité perçue) ; VAH (valeur ajoutée humaine) ; FU (facilité d’usage perçue) ; AE (auto-efficacité numérique) ; AX (anxiété de prise en main) ; IS (influence sociale) ; MNG (légitimation managériale) ; CF (conditions facilitantes) ; RES (anxiété générale et résistances) ; RMP (crainte du remplacement) ; CT (confiance et transparence) ; RIS (risques éthiques) ; CFD (confidentialité des données) ; CTX (facteurs contextuels marocains) ; HIE (hiérarchisation réflexive) ; EM (codes émergents) : définitions au Tableau 10 et en Annexe E</w:t>
+              <w:t xml:space="preserve">GRH</w:t>
+            </w:r>
+          </w:p>
+        </w:tc>
+        <w:tc>
+          <w:tcPr/>
+          <w:p>
+            <w:pPr>
+              <w:pStyle w:val="Compact"/>
+              <w:jc w:val="left"/>
+            </w:pPr>
+            <w:r>
+              <w:t xml:space="preserve">Gestion des Ressources Humaines</w:t>
             </w:r>
           </w:p>
         </w:tc>
@@ -871,6 +943,35 @@
               <w:jc w:val="left"/>
             </w:pPr>
             <w:r>
+              <w:t xml:space="preserve">IA</w:t>
+            </w:r>
+          </w:p>
+        </w:tc>
+        <w:tc>
+          <w:tcPr/>
+          <w:p>
+            <w:pPr>
+              <w:pStyle w:val="Compact"/>
+              <w:jc w:val="left"/>
+            </w:pPr>
+            <w:r>
+              <w:t xml:space="preserve">Intelligence Artificielle</w:t>
+            </w:r>
+          </w:p>
+        </w:tc>
+      </w:tr>
+      <w:tr>
+        <w:trPr>
+          <w:cantSplit/>
+        </w:trPr>
+        <w:tc>
+          <w:tcPr/>
+          <w:p>
+            <w:pPr>
+              <w:pStyle w:val="Compact"/>
+              <w:jc w:val="left"/>
+            </w:pPr>
+            <w:r>
               <w:t xml:space="preserve">LLM</w:t>
             </w:r>
           </w:p>
@@ -910,29 +1011,19 @@
               <w:jc w:val="left"/>
             </w:pPr>
             <w:r>
-              <w:t xml:space="preserve">ML</w:t>
-            </w:r>
-          </w:p>
-        </w:tc>
-        <w:tc>
-          <w:tcPr/>
-          <w:p>
-            <w:pPr>
-              <w:pStyle w:val="Compact"/>
-              <w:jc w:val="left"/>
-            </w:pPr>
-            <w:r>
-              <w:rPr>
-                <w:iCs/>
-                <w:i/>
-              </w:rPr>
-              <w:t xml:space="preserve">Machine Learning</w:t>
-            </w:r>
-            <w:r>
-              <w:t xml:space="preserve"> </w:t>
-            </w:r>
-            <w:r>
-              <w:t xml:space="preserve">(apprentissage automatique)</w:t>
+              <w:t xml:space="preserve">OS1-OS5</w:t>
+            </w:r>
+          </w:p>
+        </w:tc>
+        <w:tc>
+          <w:tcPr/>
+          <w:p>
+            <w:pPr>
+              <w:pStyle w:val="Compact"/>
+              <w:jc w:val="left"/>
+            </w:pPr>
+            <w:r>
+              <w:t xml:space="preserve">Objectifs spécifiques de recherche 1 à 5</w:t>
             </w:r>
           </w:p>
         </w:tc>
@@ -978,19 +1069,19 @@
               <w:jc w:val="left"/>
             </w:pPr>
             <w:r>
-              <w:t xml:space="preserve">PME</w:t>
-            </w:r>
-          </w:p>
-        </w:tc>
-        <w:tc>
-          <w:tcPr/>
-          <w:p>
-            <w:pPr>
-              <w:pStyle w:val="Compact"/>
-              <w:jc w:val="left"/>
-            </w:pPr>
-            <w:r>
-              <w:t xml:space="preserve">Petite et Moyenne Entreprise</w:t>
+              <w:t xml:space="preserve">PE</w:t>
+            </w:r>
+          </w:p>
+        </w:tc>
+        <w:tc>
+          <w:tcPr/>
+          <w:p>
+            <w:pPr>
+              <w:pStyle w:val="Compact"/>
+              <w:jc w:val="left"/>
+            </w:pPr>
+            <w:r>
+              <w:t xml:space="preserve">Petite Entreprise</w:t>
             </w:r>
           </w:p>
         </w:tc>
@@ -1007,19 +1098,19 @@
               <w:jc w:val="left"/>
             </w:pPr>
             <w:r>
-              <w:t xml:space="preserve">RGPD</w:t>
-            </w:r>
-          </w:p>
-        </w:tc>
-        <w:tc>
-          <w:tcPr/>
-          <w:p>
-            <w:pPr>
-              <w:pStyle w:val="Compact"/>
-              <w:jc w:val="left"/>
-            </w:pPr>
-            <w:r>
-              <w:t xml:space="preserve">Règlement Général sur la Protection des Données (Union européenne)</w:t>
+              <w:t xml:space="preserve">PME</w:t>
+            </w:r>
+          </w:p>
+        </w:tc>
+        <w:tc>
+          <w:tcPr/>
+          <w:p>
+            <w:pPr>
+              <w:pStyle w:val="Compact"/>
+              <w:jc w:val="left"/>
+            </w:pPr>
+            <w:r>
+              <w:t xml:space="preserve">Petite et Moyenne Entreprise</w:t>
             </w:r>
           </w:p>
         </w:tc>
@@ -1036,19 +1127,19 @@
               <w:jc w:val="left"/>
             </w:pPr>
             <w:r>
-              <w:t xml:space="preserve">RH</w:t>
-            </w:r>
-          </w:p>
-        </w:tc>
-        <w:tc>
-          <w:tcPr/>
-          <w:p>
-            <w:pPr>
-              <w:pStyle w:val="Compact"/>
-              <w:jc w:val="left"/>
-            </w:pPr>
-            <w:r>
-              <w:t xml:space="preserve">Ressources Humaines</w:t>
+              <w:t xml:space="preserve">RGPD</w:t>
+            </w:r>
+          </w:p>
+        </w:tc>
+        <w:tc>
+          <w:tcPr/>
+          <w:p>
+            <w:pPr>
+              <w:pStyle w:val="Compact"/>
+              <w:jc w:val="left"/>
+            </w:pPr>
+            <w:r>
+              <w:t xml:space="preserve">Règlement Général sur la Protection des Données (Union européenne)</w:t>
             </w:r>
           </w:p>
         </w:tc>
@@ -1065,19 +1156,19 @@
               <w:jc w:val="left"/>
             </w:pPr>
             <w:r>
-              <w:t xml:space="preserve">RRH</w:t>
-            </w:r>
-          </w:p>
-        </w:tc>
-        <w:tc>
-          <w:tcPr/>
-          <w:p>
-            <w:pPr>
-              <w:pStyle w:val="Compact"/>
-              <w:jc w:val="left"/>
-            </w:pPr>
-            <w:r>
-              <w:t xml:space="preserve">Responsable des Ressources Humaines</w:t>
+              <w:t xml:space="preserve">RH</w:t>
+            </w:r>
+          </w:p>
+        </w:tc>
+        <w:tc>
+          <w:tcPr/>
+          <w:p>
+            <w:pPr>
+              <w:pStyle w:val="Compact"/>
+              <w:jc w:val="left"/>
+            </w:pPr>
+            <w:r>
+              <w:t xml:space="preserve">Ressources Humaines</w:t>
             </w:r>
           </w:p>
         </w:tc>
@@ -1094,19 +1185,19 @@
               <w:jc w:val="left"/>
             </w:pPr>
             <w:r>
-              <w:t xml:space="preserve">SIRH</w:t>
-            </w:r>
-          </w:p>
-        </w:tc>
-        <w:tc>
-          <w:tcPr/>
-          <w:p>
-            <w:pPr>
-              <w:pStyle w:val="Compact"/>
-              <w:jc w:val="left"/>
-            </w:pPr>
-            <w:r>
-              <w:t xml:space="preserve">Système d'Information de gestion des Ressources Humaines</w:t>
+              <w:t xml:space="preserve">RISK-ETH</w:t>
+            </w:r>
+          </w:p>
+        </w:tc>
+        <w:tc>
+          <w:tcPr/>
+          <w:p>
+            <w:pPr>
+              <w:pStyle w:val="Compact"/>
+              <w:jc w:val="left"/>
+            </w:pPr>
+            <w:r>
+              <w:t xml:space="preserve">Perception des risques éthiques et de l'équité des décisions algorithmiques (variable du modèle conceptuel)</w:t>
             </w:r>
           </w:p>
         </w:tc>
@@ -1123,19 +1214,19 @@
               <w:jc w:val="left"/>
             </w:pPr>
             <w:r>
-              <w:t xml:space="preserve">SQ</w:t>
-            </w:r>
-          </w:p>
-        </w:tc>
-        <w:tc>
-          <w:tcPr/>
-          <w:p>
-            <w:pPr>
-              <w:pStyle w:val="Compact"/>
-              <w:jc w:val="left"/>
-            </w:pPr>
-            <w:r>
-              <w:t xml:space="preserve">Sous-Question de recherche (SQ1 à SQ7)</w:t>
+              <w:t xml:space="preserve">RRH</w:t>
+            </w:r>
+          </w:p>
+        </w:tc>
+        <w:tc>
+          <w:tcPr/>
+          <w:p>
+            <w:pPr>
+              <w:pStyle w:val="Compact"/>
+              <w:jc w:val="left"/>
+            </w:pPr>
+            <w:r>
+              <w:t xml:space="preserve">Responsable des Ressources Humaines</w:t>
             </w:r>
           </w:p>
         </w:tc>
@@ -1152,6 +1243,64 @@
               <w:jc w:val="left"/>
             </w:pPr>
             <w:r>
+              <w:t xml:space="preserve">SIRH</w:t>
+            </w:r>
+          </w:p>
+        </w:tc>
+        <w:tc>
+          <w:tcPr/>
+          <w:p>
+            <w:pPr>
+              <w:pStyle w:val="Compact"/>
+              <w:jc w:val="left"/>
+            </w:pPr>
+            <w:r>
+              <w:t xml:space="preserve">Système d'Information de gestion des Ressources Humaines</w:t>
+            </w:r>
+          </w:p>
+        </w:tc>
+      </w:tr>
+      <w:tr>
+        <w:trPr>
+          <w:cantSplit/>
+        </w:trPr>
+        <w:tc>
+          <w:tcPr/>
+          <w:p>
+            <w:pPr>
+              <w:pStyle w:val="Compact"/>
+              <w:jc w:val="left"/>
+            </w:pPr>
+            <w:r>
+              <w:t xml:space="preserve">SQ</w:t>
+            </w:r>
+          </w:p>
+        </w:tc>
+        <w:tc>
+          <w:tcPr/>
+          <w:p>
+            <w:pPr>
+              <w:pStyle w:val="Compact"/>
+              <w:jc w:val="left"/>
+            </w:pPr>
+            <w:r>
+              <w:t xml:space="preserve">Sous-Question de recherche (SQ1 à SQ7)</w:t>
+            </w:r>
+          </w:p>
+        </w:tc>
+      </w:tr>
+      <w:tr>
+        <w:trPr>
+          <w:cantSplit/>
+        </w:trPr>
+        <w:tc>
+          <w:tcPr/>
+          <w:p>
+            <w:pPr>
+              <w:pStyle w:val="Compact"/>
+              <w:jc w:val="left"/>
+            </w:pPr>
+            <w:r>
               <w:t xml:space="preserve">TAM</w:t>
             </w:r>
           </w:p>
@@ -1191,19 +1340,35 @@
               <w:jc w:val="left"/>
             </w:pPr>
             <w:r>
-              <w:t xml:space="preserve">TPE</w:t>
-            </w:r>
-          </w:p>
-        </w:tc>
-        <w:tc>
-          <w:tcPr/>
-          <w:p>
-            <w:pPr>
-              <w:pStyle w:val="Compact"/>
-              <w:jc w:val="left"/>
-            </w:pPr>
-            <w:r>
-              <w:t xml:space="preserve">Très Petite Entreprise</w:t>
+              <w:t xml:space="preserve">T-O-E</w:t>
+            </w:r>
+          </w:p>
+        </w:tc>
+        <w:tc>
+          <w:tcPr/>
+          <w:p>
+            <w:pPr>
+              <w:pStyle w:val="Compact"/>
+              <w:jc w:val="left"/>
+            </w:pPr>
+            <w:r>
+              <w:t xml:space="preserve">Cadre</w:t>
+            </w:r>
+            <w:r>
+              <w:t xml:space="preserve"> </w:t>
+            </w:r>
+            <w:r>
+              <w:rPr>
+                <w:iCs/>
+                <w:i/>
+              </w:rPr>
+              <w:t xml:space="preserve">Technology-Organization-Environment</w:t>
+            </w:r>
+            <w:r>
+              <w:t xml:space="preserve"> </w:t>
+            </w:r>
+            <w:r>
+              <w:t xml:space="preserve">(technologie, organisation, environnement)</w:t>
             </w:r>
           </w:p>
         </w:tc>
@@ -1220,6 +1385,142 @@
               <w:jc w:val="left"/>
             </w:pPr>
             <w:r>
+              <w:t xml:space="preserve">TPB</w:t>
+            </w:r>
+          </w:p>
+        </w:tc>
+        <w:tc>
+          <w:tcPr/>
+          <w:p>
+            <w:pPr>
+              <w:pStyle w:val="Compact"/>
+              <w:jc w:val="left"/>
+            </w:pPr>
+            <w:r>
+              <w:rPr>
+                <w:iCs/>
+                <w:i/>
+              </w:rPr>
+              <w:t xml:space="preserve">Theory of Planned Behavior</w:t>
+            </w:r>
+            <w:r>
+              <w:t xml:space="preserve"> </w:t>
+            </w:r>
+            <w:r>
+              <w:t xml:space="preserve">(théorie du comportement planifié)</w:t>
+            </w:r>
+          </w:p>
+        </w:tc>
+      </w:tr>
+      <w:tr>
+        <w:trPr>
+          <w:cantSplit/>
+        </w:trPr>
+        <w:tc>
+          <w:tcPr/>
+          <w:p>
+            <w:pPr>
+              <w:pStyle w:val="Compact"/>
+              <w:jc w:val="left"/>
+            </w:pPr>
+            <w:r>
+              <w:t xml:space="preserve">TPE</w:t>
+            </w:r>
+          </w:p>
+        </w:tc>
+        <w:tc>
+          <w:tcPr/>
+          <w:p>
+            <w:pPr>
+              <w:pStyle w:val="Compact"/>
+              <w:jc w:val="left"/>
+            </w:pPr>
+            <w:r>
+              <w:t xml:space="preserve">Très Petite Entreprise</w:t>
+            </w:r>
+          </w:p>
+        </w:tc>
+      </w:tr>
+      <w:tr>
+        <w:trPr>
+          <w:cantSplit/>
+        </w:trPr>
+        <w:tc>
+          <w:tcPr/>
+          <w:p>
+            <w:pPr>
+              <w:pStyle w:val="Compact"/>
+              <w:jc w:val="left"/>
+            </w:pPr>
+            <w:r>
+              <w:t xml:space="preserve">TRA</w:t>
+            </w:r>
+          </w:p>
+        </w:tc>
+        <w:tc>
+          <w:tcPr/>
+          <w:p>
+            <w:pPr>
+              <w:pStyle w:val="Compact"/>
+              <w:jc w:val="left"/>
+            </w:pPr>
+            <w:r>
+              <w:rPr>
+                <w:iCs/>
+                <w:i/>
+              </w:rPr>
+              <w:t xml:space="preserve">Theory of Reasoned Action</w:t>
+            </w:r>
+            <w:r>
+              <w:t xml:space="preserve"> </w:t>
+            </w:r>
+            <w:r>
+              <w:t xml:space="preserve">(théorie de l'action raisonnée)</w:t>
+            </w:r>
+          </w:p>
+        </w:tc>
+      </w:tr>
+      <w:tr>
+        <w:trPr>
+          <w:cantSplit/>
+        </w:trPr>
+        <w:tc>
+          <w:tcPr/>
+          <w:p>
+            <w:pPr>
+              <w:pStyle w:val="Compact"/>
+              <w:jc w:val="left"/>
+            </w:pPr>
+            <w:r>
+              <w:t xml:space="preserve">TRANSP</w:t>
+            </w:r>
+          </w:p>
+        </w:tc>
+        <w:tc>
+          <w:tcPr/>
+          <w:p>
+            <w:pPr>
+              <w:pStyle w:val="Compact"/>
+              <w:jc w:val="left"/>
+            </w:pPr>
+            <w:r>
+              <w:t xml:space="preserve">Transparence et explicabilité perçues (variable du modèle conceptuel)</w:t>
+            </w:r>
+          </w:p>
+        </w:tc>
+      </w:tr>
+      <w:tr>
+        <w:trPr>
+          <w:cantSplit/>
+        </w:trPr>
+        <w:tc>
+          <w:tcPr/>
+          <w:p>
+            <w:pPr>
+              <w:pStyle w:val="Compact"/>
+              <w:jc w:val="left"/>
+            </w:pPr>
+            <w:r>
               <w:t xml:space="preserve">UTAUT</w:t>
             </w:r>
           </w:p>
@@ -1248,11 +1549,20 @@
         </w:tc>
       </w:tr>
     </w:tbl>
+    <w:p>
+      <w:pPr>
+        <w:pStyle w:val="BodyText"/>
+      </w:pPr>
+      <w:r>
+        <w:t xml:space="preserve">Les sigles des familles de codes analytiques et descriptifs (UP, VAH, FU, AE, AX, IS, MNG, CF, RES, RMP, CT, RIS, CFD, CTX, HIE, EM, PRO, REP, USG, PRO-FUT) sont définis au Tableau 10 et, avec leurs sous-codes, en Annexe E.</w:t>
+      </w:r>
+    </w:p>
     <w:bookmarkEnd w:id="26"/>
     <w:bookmarkStart w:id="27" w:name="sommaire"/>
     <w:p>
       <w:pPr>
         <w:pStyle w:val="Heading1"/>
+        <w:pageBreakBefore/>
       </w:pPr>
       <w:r>
         <w:rPr>
@@ -1273,7 +1583,7 @@
         <w:fldChar w:fldCharType="separate"/>
       </w:r>
       <w:r>
-        <w:t>Table générée sous Word : clic droit puis « Mettre à jour les champs » (ou F9).</w:t>
+        <w:t>Table générée sous Word : clic droit puis « Mettre à jour les champs » (ou Ctrl+A puis F9).</w:t>
       </w:r>
       <w:r>
         <w:fldChar w:fldCharType="end"/>
@@ -1296,6 +1606,7 @@
     <w:p>
       <w:pPr>
         <w:pStyle w:val="Heading1"/>
+        <w:pageBreakBefore/>
       </w:pPr>
       <w:r>
         <w:rPr>
@@ -1323,7 +1634,7 @@
         <w:pStyle w:val="FirstParagraph"/>
       </w:pPr>
       <w:r>
-        <w:t xml:space="preserve">L'intelligence artificielle a quitté les laboratoires pour s'installer dans le quotidien des organisations. Depuis la diffusion massive des systèmes d'IA générative à la fin de l'année 2022, la question posée aux directions n'est plus de savoir si ces technologies seront utilisées, mais comment les collaborateurs se les approprient, avec quelles attentes et quelles réticences (Berente et al., 2021 ; Dwivedi et al., 2021). La fonction ressources humaines illustre ce basculement avec une acuité particulière. Devenue un acteur stratégique de la performance des organisations (Stone et al., 2015), accompagnée pendant deux décennies par les SIRH puis par l'e-HRM avec des résultats contrastés (Strohmeier, 2007 ; Bondarouk &amp; Ruël, 2009 ; Bondarouk et al., 2017), elle voit l'IA franchir aujourd'hui un seuil supplémentaire. Tri automatisé des candidatures, agents conversationnels de recrutement,</w:t>
+        <w:t xml:space="preserve">L'intelligence artificielle a quitté les laboratoires pour s'installer dans le quotidien des organisations. Depuis la diffusion massive des systèmes d'IA générative à la fin de l'année 2022, la question posée aux directions n'est plus de savoir si ces technologies seront utilisées, mais comment les collaborateurs se les approprient, avec quelles attentes et quelles réticences (Berente et al., 2021 ; Dwivedi et al., 2021). La fonction ressources humaines illustre ce basculement avec une acuité particulière. Devenue un acteur stratégique de la performance des organisations (Stone et al., 2015), accompagnée pendant deux décennies par les SIRH puis par l'e-HRM avec des résultats contrastés (Bondarouk &amp; Ruël, 2009 ; Bondarouk et al., 2017 ; Strohmeier, 2007), elle voit l'IA franchir aujourd'hui un seuil supplémentaire. Tri automatisé des candidatures, agents conversationnels de recrutement,</w:t>
       </w:r>
       <w:r>
         <w:t xml:space="preserve"> </w:t>
@@ -1339,7 +1650,7 @@
         <w:t xml:space="preserve"> </w:t>
       </w:r>
       <w:r>
-        <w:t xml:space="preserve">prédictifs, parcours de formation adaptatifs, IA générative mobilisée pour rédiger une fiche de poste : ces outils ne se limitent plus à accélérer des tâches existantes, ils touchent au cœur du jugement professionnel (Tambe et al., 2019 ; Vrontis et al., 2022 ; Budhwar et al., 2022), le recrutement concentrant les usages les plus visibles (Black &amp; van Esch, 2020 ; Suen et al., 2019).</w:t>
+        <w:t xml:space="preserve">prédictifs, parcours de formation adaptatifs, IA générative mobilisée pour rédiger une fiche de poste : ces outils ne se limitent plus à accélérer des tâches existantes, ils touchent au cœur du jugement professionnel (Budhwar et al., 2022 ; Tambe et al., 2019 ; Vrontis et al., 2022), le recrutement concentrant les usages les plus visibles (Black &amp; van Esch, 2020 ; Suen et al., 2019).</w:t>
       </w:r>
     </w:p>
     <w:p>
@@ -1368,7 +1679,10 @@
         <w:t xml:space="preserve">Maroc Digital 2030</w:t>
       </w:r>
       <w:r>
-        <w:t xml:space="preserve">, lancée officiellement en septembre 2024, articule la digitalisation des services publics et le développement de l'économie numérique, avec parmi ses catalyseurs transversaux la formation aux talents digitaux et l'intégration de l'intelligence artificielle. Le socle juridique de la protection des données repose sur la loi 09-08, promulguée par le Dahir n° 1-09-15 du 18 février 2009 et dont l'application est contrôlée par la CNDP ; aucun texte marocain ne régit à ce jour spécifiquement l'IA. Les professionnels RH évoluent donc entre une incitation nationale forte à digitaliser et un encadrement de l'IA encore en construction, situation qui rend leurs arbitrages individuels d'autant plus décisifs.</w:t>
+        <w:t xml:space="preserve"> </w:t>
+      </w:r>
+      <w:r>
+        <w:t xml:space="preserve">(Ministère délégué chargé de la Transition Numérique et de la Réforme de l'Administration, 2024), lancée officiellement en septembre 2024, articule la digitalisation des services publics et le développement de l'économie numérique, avec parmi ses catalyseurs transversaux la formation aux talents digitaux et l'intégration de l'intelligence artificielle. Le socle juridique de la protection des données repose sur la loi 09-08, promulguée par le Dahir n° 1-09-15 du 18 février 2009 et dont l'application est contrôlée par la CNDP ; aucun texte marocain ne régit à ce jour spécifiquement l'IA. Les professionnels RH évoluent donc entre une incitation nationale forte à digitaliser et un encadrement de l'IA encore en construction, situation qui rend leurs arbitrages individuels d'autant plus décisifs.</w:t>
       </w:r>
     </w:p>
     <w:p>
@@ -1408,7 +1722,7 @@
         <w:pStyle w:val="FirstParagraph"/>
       </w:pPr>
       <w:r>
-        <w:t xml:space="preserve">L'intérêt scientifique du sujet tient à la rencontre entre une littérature abondante et un objet qui lui échappe encore partiellement. Les modèles d'acceptation des technologies forment un corpus éprouvé, du TAM fondateur (Davis, 1989) à l'UTAUT (Venkatesh et al., 2003) et à leurs extensions successives (Venkatesh &amp; Davis, 2000 ; Venkatesh &amp; Bala, 2008 ; Venkatesh et al., 2012). Leur application à l'IA dans la fonction RH laisse pourtant trois angles morts, qui délimitent la contribution visée. Une lacune sectorielle, d'abord : les professionnels RH, pourtant à la fois prescripteurs et utilisateurs des outils, restent peu étudiés comme adoptants à part entière (Tambe et al., 2019 ; Budhwar et al., 2022). Une lacune contextuelle, ensuite : la production empirique se concentre en Amérique du Nord, en Europe et en Asie (Pillai &amp; Sivathanu, 2020), le continent africain, et le Maroc en particulier, y occupant une place marginale. Une lacune méthodologique, enfin : les recensions soulignent la domination des devis quantitatifs par questionnaire (Williams et al., 2015), alors que la compréhension fine des représentations, des craintes et des arbitrages appelle des approches qualitatives, encore rares sur cet objet.</w:t>
+        <w:t xml:space="preserve">L'intérêt scientifique du sujet tient à la rencontre entre une littérature abondante et un objet qui lui échappe encore partiellement. Les modèles d'acceptation des technologies forment un corpus éprouvé, du TAM fondateur (Davis, 1989) à l'UTAUT (Venkatesh et al., 2003) et à leurs extensions successives (Venkatesh &amp; Davis, 2000 ; Venkatesh &amp; Bala, 2008 ; Venkatesh et al., 2012). Leur application à l'IA dans la fonction RH laisse pourtant trois angles morts, qui délimitent la contribution visée. Une lacune sectorielle, d'abord : les professionnels RH, pourtant à la fois prescripteurs et utilisateurs des outils, restent peu étudiés comme adoptants à part entière (Budhwar et al., 2022 ; Tambe et al., 2019). Une lacune contextuelle, ensuite : la production empirique se concentre en Amérique du Nord, en Europe et en Asie (Pillai &amp; Sivathanu, 2020), le continent africain, et le Maroc en particulier, y occupant une place marginale. Une lacune méthodologique, enfin : les recensions soulignent la domination des devis quantitatifs par questionnaire (Williams et al., 2015), alors que la compréhension fine des représentations, des craintes et des arbitrages appelle des approches qualitatives, encore rares sur cet objet.</w:t>
       </w:r>
     </w:p>
     <w:p>
@@ -1429,7 +1743,7 @@
         <w:t xml:space="preserve">Maroc Digital 2030</w:t>
       </w:r>
       <w:r>
-        <w:t xml:space="preserve">, ont besoin de connaissances situées pour calibrer la formation et l'accompagnement des entreprises. S'y ajoute un intérêt proprement contextuel : les connaissances sur les pratiques RH de la région Souss-Massa restent fragmentaires et, sur l'usage de l'IA, à peu près inexistantes ; produire un matériau empirique de première main possède une valeur documentaire propre, en réponse aux appels internationaux à diversifier les contextes d'étude de l'IA en RH (Budhwar et al., 2022).</w:t>
+        <w:t xml:space="preserve">, ont besoin de connaissances situées pour calibrer la formation et l'accompagnement des entreprises. S'y ajoute un intérêt proprement contextuel : les connaissances sur les pratiques RH de la région Souss-Massa restent fragmentaires et, sur l'usage de l'IA, à peu près inexistantes dans les bases consultées (Annexe F) ; produire un matériau empirique de première main possède une valeur documentaire propre, en réponse aux appels internationaux à diversifier les contextes d'étude de l'IA en RH (Budhwar et al., 2022).</w:t>
       </w:r>
     </w:p>
     <w:p>
@@ -1515,7 +1829,7 @@
         <w:t xml:space="preserve"> </w:t>
       </w:r>
       <w:r>
-        <w:t xml:space="preserve">Facilité d'usage perçue : quelle place les professionnels lui accordent-ils dans l'intégration des outils d'IA à leurs pratiques RH quotidiennes ?</w:t>
+        <w:t xml:space="preserve">Facilité d'usage perçue : quelle place les professionnels accordent-ils à la facilité d'usage perçue dans l'intégration des outils d'IA à leurs pratiques RH quotidiennes ?</w:t>
       </w:r>
     </w:p>
     <w:p>
@@ -1605,7 +1919,7 @@
         <w:t xml:space="preserve"> </w:t>
       </w:r>
       <w:r>
-        <w:t xml:space="preserve">Facteurs contextuels et organisationnels marocains : comment la culture organisationnelle, la maturité digitale des entreprises et le cadre légal de la loi 09-08 enrichissent-ils et nuancent-ils le pouvoir explicatif des modèles classiques ?</w:t>
+        <w:t xml:space="preserve">Facteurs contextuels et organisationnels marocains : comment la culture organisationnelle, la maturité digitale des entreprises, la taille de l'organisation et le cadre légal de la loi 09-08 enrichissent-ils et nuancent-ils le pouvoir explicatif des modèles classiques ?</w:t>
       </w:r>
     </w:p>
     <w:p>
@@ -1885,15 +2199,28 @@
         <w:pStyle w:val="FirstParagraph"/>
       </w:pPr>
       <w:r>
-        <w:t xml:space="preserve">La recherche adopte une posture post-positiviste : une réalité des mécanismes d'adoption existe indépendamment du chercheur, mais elle n'est accessible que de manière imparfaite, à travers des perceptions situées et un dispositif faillible (Popper, 1959 ; Guba &amp; Lincoln, 1994). Cette position autorise une démarche déductive : partir d'un cadre théorique établi, en dériver des propositions falsifiables par le discours, puis les confronter à un matériau empirique qui conserve le pouvoir de les contredire. Le choix du qualitatif découle de la nature de la question posée. Comprendre pourquoi un professionnel RH accorde ou refuse sa confiance à un algorithme, comment il vit la perspective d'être partiellement remplacé, ce que la loi 09-08 évoque concrètement dans sa pratique : ces objets se prêtent mal aux échelles fermées d'un questionnaire.</w:t>
-      </w:r>
-    </w:p>
-    <w:p>
-      <w:pPr>
-        <w:pStyle w:val="BodyText"/>
-      </w:pPr>
-      <w:r>
-        <w:t xml:space="preserve">Le dispositif prévoit douze à vingt entretiens semi-directifs auprès de professionnels RH de la région Souss-Massa (DRH, responsables RH, chargés de recrutement et de formation), sélectionnés par échantillonnage raisonné selon une matrice de diversification croisant taille d'organisation, secteur d'activité et degré d'exposition à l'IA, la taille finale de l'échantillon étant arbitrée par la saturation thématique (Guest et al., 2006 ; Saunders et al., 2018). Le guide d'entretien est construit thème par thème à partir des propositions P1 à P7, ce qui garantit la traçabilité entre cadre théorique, questions posées et grille d'analyse ; ses questions sont délibérément orientées vers le récit d'expérience vécue plutôt que vers l'opinion générale. Les entretiens seront conduits en français, avec des reformulations possibles en darija, et les dilemmes de traduction seront traités avec les précautions recommandées par la littérature (Temple &amp; Young, 2004). Les données seront analysées par analyse thématique (Bardin, 2013 ; Braun &amp; Clarke, 2006 ; Miles et al., 2014), avec une grille de codage déductive ouverte aux codes émergents et un double codage partiel, complétées par une triangulation avec des sources documentaires (offres d'emploi, communication institutionnelle, textes officiels). La qualité de l'ensemble sera appréciée à l'aune des critères de crédibilité, de transférabilité, de fiabilité et de confirmabilité (Lincoln &amp; Guba, 1985) ; le dispositif éthique (consentement éclairé, pseudonymisation, conservation sécurisée), aligné sur la loi 09-08, s'inspire à titre complémentaire des exigences du RGPD. La Partie II justifie chacun de ces choix et en expose les limites anticipées.</w:t>
+        <w:t xml:space="preserve">La recherche adopte une posture post-positiviste : une réalité des mécanismes d'adoption existe indépendamment du chercheur, mais elle n'est accessible que de manière imparfaite, à travers des perceptions situées et un dispositif faillible (Guba &amp; Lincoln, 1994 ; Popper, 1959). Cette position autorise une démarche déductive : partir d'un cadre théorique établi, en dériver des propositions falsifiables par le discours, puis les confronter à un matériau empirique qui conserve le pouvoir de les contredire. Le choix du qualitatif découle de la nature de la question posée. Comprendre pourquoi un professionnel RH accorde ou refuse sa confiance à un algorithme, comment il vit la perspective d'être partiellement remplacé, ce que la loi 09-08 évoque concrètement dans sa pratique : ces objets se prêtent mal aux échelles fermées d'un questionnaire.</w:t>
+      </w:r>
+    </w:p>
+    <w:p>
+      <w:pPr>
+        <w:pStyle w:val="BodyText"/>
+      </w:pPr>
+      <w:r>
+        <w:t xml:space="preserve">Le dispositif prévoit douze à vingt entretiens semi-directifs auprès de professionnels RH de la région Souss-Massa (DRH, responsables RH, chargés de recrutement et de formation), sélectionnés par échantillonnage raisonné selon une matrice de diversification à cinq axes (taille d'organisation, secteur d'activité, genre, ancienneté dans la fonction RH et statut managérial), l'exposition récente à un outil d'IA constituant un critère d'inclusion, la taille finale de l'échantillon étant arbitrée par la saturation thématique (Guest et al., 2006 ; Saunders et al., 2018). Le guide d'entretien est construit thème par thème à partir des propositions P1 à P7, ce qui garantit la traçabilité entre cadre théorique, questions posées et grille d'analyse ; ses questions sont délibérément orientées vers le récit d'expérience vécue plutôt que vers l'opinion générale. Les entretiens seront conduits en français, avec des reformulations possibles en</w:t>
+      </w:r>
+      <w:r>
+        <w:t xml:space="preserve"> </w:t>
+      </w:r>
+      <w:r>
+        <w:rPr>
+          <w:iCs/>
+          <w:i/>
+        </w:rPr>
+        <w:t xml:space="preserve">darija</w:t>
+      </w:r>
+      <w:r>
+        <w:t xml:space="preserve">, et les dilemmes de traduction seront traités avec les précautions recommandées par la littérature (Temple &amp; Young, 2004). Les données seront analysées par analyse thématique (Bardin, 2013 ; Braun &amp; Clarke, 2006 ; Miles et al., 2014), avec une grille de codage déductive ouverte aux codes émergents et un double codage partiel, complétées par une triangulation avec les documents organisationnels partagés par les répondants (politiques RH, chartes d'usage de l'IA, plans de formation). La qualité de l'ensemble sera appréciée à l'aune des critères de crédibilité, de transférabilité, de fiabilité et de confirmabilité (Lincoln &amp; Guba, 1985) ; le dispositif éthique (consentement éclairé, pseudonymisation, conservation sécurisée), aligné sur la loi 09-08, s'inspire à titre complémentaire des exigences du RGPD. La Partie II justifie chacun de ces choix et en expose les limites anticipées.</w:t>
       </w:r>
     </w:p>
     <w:bookmarkEnd w:id="31"/>
@@ -1953,6 +2280,7 @@
     <w:p>
       <w:pPr>
         <w:pStyle w:val="Heading1"/>
+        <w:pageBreakBefore/>
       </w:pPr>
       <w:r>
         <w:rPr>
@@ -2110,7 +2438,7 @@
         <w:t xml:space="preserve">Maroc Digital 2030</w:t>
       </w:r>
       <w:r>
-        <w:t xml:space="preserve">) décrivent le contexte d'exercice des professionnels sans fonder aucune proposition ; les cas d'entreprise documentés par la presse économique (Amazon, HireVue, Workday) illustrent des controverses publiques, leur portée probatoire est faible et l'argument sur le caractère structurel des biais algorithmiques est porté par la revue systématique de Köchling et Wehner (2020). Le chapitre 1 circonscrit l'objet d'étude, des définitions de l'IA à la revue empirique incluant les contextes africain, arabe et marocain ; le chapitre 2 retrace la généalogie critique du Technology Acceptance Model (Davis, 1989) et de ses extensions (TAM 2, TAM 3, UTAUT, UTAUT 2), discute ses limites à l'aune de cadres concurrents, puis construit le modèle conceptuel intégrateur articulé aux sept propositions (P1 à P7), P6 et P7 se situant à l'intersection des modèles classiques d'acceptation, des travaux récents sur les spécificités de l'IA en RH (Tambe et al., 2019 ; Budhwar et al., 2022 ; Charlwood &amp; Guenole, 2022) et des recherches sur l'adoption des technologies dans les contextes émergents (Dwivedi et al., 2019).</w:t>
+        <w:t xml:space="preserve">) décrivent le contexte d'exercice des professionnels sans fonder aucune proposition ; les cas d'entreprise documentés par la presse économique (Amazon, HireVue, Workday) illustrent des controverses publiques, leur portée probatoire est faible et l'argument sur le caractère structurel des biais algorithmiques est porté par la revue systématique de Köchling et Wehner (2020). Le chapitre 1 circonscrit l'objet d'étude, des définitions de l'IA à la revue empirique incluant les contextes africain, arabe et marocain ; le chapitre 2 retrace la généalogie critique du Technology Acceptance Model (Davis, 1989) et de ses extensions (TAM 2, TAM 3, UTAUT, UTAUT 2), discute ses limites à l'aune de cadres concurrents, puis construit le modèle conceptuel intégrateur articulé aux sept propositions (P1 à P7), P6 et P7 se situant à l'intersection des modèles classiques d'acceptation, des travaux récents sur les spécificités de l'IA en RH (Budhwar et al., 2022 ; Charlwood &amp; Guenole, 2022 ; Tambe et al., 2019) et des recherches sur l'adoption des technologies dans les contextes émergents (Dwivedi et al., 2019).</w:t>
       </w:r>
     </w:p>
     <w:bookmarkStart w:id="58" w:name="Xa82dce9560ed5c14ed0d0374dd115a61b056405"/>
@@ -2160,7 +2488,17 @@
         <w:pStyle w:val="FirstParagraph"/>
       </w:pPr>
       <w:r>
-        <w:t xml:space="preserve">Définir l'IA ne relève pas ici d'un préalable d'érudition : le périmètre retenu commande ce que la recherche pourra observer et ce que le modèle conceptuel devra expliquer. Or la littérature ne converge pas vers une définition unique. Les travaux d'ingénierie et de systèmes d'information entrent par les techniques et leurs performances (Janiesch et al., 2021) ; les travaux de management des SI par les propriétés de l'artefact, Berente et al. (2021) caractérisant la gestion de l'IA par trois facettes en tension, l'autonomie croissante des systèmes, leur capacité d'apprentissage et leur inscrutabilité ; les travaux de gestion des ressources humaines, enfin, par les usages et leurs effets sur le travail et les personnes (Tambe et al., 2019 ; Meijerink et al., 2021). Selon l'entrée retenue, l'opacité algorithmique apparaît soit comme une limitation technique appelée à se résorber, soit comme une propriété stable de l'expérience d'usage. Ce mémoire retient la seconde lecture, et la section en expose les raisons.</w:t>
+        <w:t xml:space="preserve">Définir l'IA ne relève pas ici d'un préalable d'érudition : le périmètre retenu commande ce que la recherche pourra observer et ce que le modèle conceptuel devra expliquer. Or la littérature ne converge pas vers une définition unique. Les travaux d'ingénierie et de systèmes d'information entrent par les techniques et leurs performances (Janiesch et al., 2021) ; les travaux de management des SI par les propriétés de l'artefact, Berente et al. (2021) caractérisant la gestion de l'IA par trois facettes en tension, l'autonomie croissante des systèmes, leur capacité d'apprentissage et leur « inscrutabilité » (</w:t>
+      </w:r>
+      <w:r>
+        <w:rPr>
+          <w:iCs/>
+          <w:i/>
+        </w:rPr>
+        <w:t xml:space="preserve">inscrutability</w:t>
+      </w:r>
+      <w:r>
+        <w:t xml:space="preserve">) ; les travaux de gestion des ressources humaines, enfin, par les usages et leurs effets sur le travail et les personnes (Meijerink et al., 2021 ; Tambe et al., 2019). Selon l'entrée retenue, l'opacité algorithmique apparaît soit comme une limitation technique appelée à se résorber, soit comme une propriété stable de l'expérience d'usage. Ce mémoire retient la seconde lecture, et la section en expose les raisons.</w:t>
       </w:r>
     </w:p>
     <w:bookmarkStart w:id="37" w:name="Xda69909120d5858bf0f8908bfe6419a222b983d"/>
@@ -2350,7 +2688,7 @@
         <w:t xml:space="preserve">deep learning</w:t>
       </w:r>
       <w:r>
-        <w:t xml:space="preserve">, modèles génératifs) aux implications variables selon les tâches. Deux enseignements en découlent : l'hétérogénéité de l'objet interdit de traiter l'adoption comme un phénomène homogène et impose de laisser le répondant qualifier lui-même les outils dont il parle ; l'opacité est une propriété durable de l'expérience d'usage, non un défaut passager (Janiesch et al., 2021 ; Berente et al., 2021), ce qui commande de la traiter comme une variable explicative. Ce second enseignement fonde la proposition P6.</w:t>
+        <w:t xml:space="preserve">, modèles génératifs) aux implications variables selon les tâches. Deux enseignements en découlent : l'hétérogénéité de l'objet interdit de traiter l'adoption comme un phénomène homogène et impose de laisser le répondant qualifier lui-même les outils dont il parle ; l'opacité est une propriété durable de l'expérience d'usage, non un défaut passager (Berente et al., 2021 ; Janiesch et al., 2021), ce qui commande de la traiter comme une variable explicative. Ce second enseignement fonde la proposition P6.</w:t>
       </w:r>
     </w:p>
     <w:bookmarkEnd w:id="39"/>
@@ -2408,7 +2746,7 @@
         <w:pStyle w:val="FirstParagraph"/>
       </w:pPr>
       <w:r>
-        <w:t xml:space="preserve">Parallèlement, les systèmes d'information de ressources humaines (SIRH) ont centralisé les données, automatisé les tâches transactionnelles et externalisé certaines fonctions, dynamique étudiée de longue date par la littérature e-HRM (Strohmeier, 2007 ; Bondarouk &amp; Ruël, 2009 ; Marler &amp; Fisher, 2013 ; Bondarouk et al., 2017). Le passage du SIRH à l'IA relève donc moins d'une rupture absolue que d'un continuum : là où les SIRH ont rendu les données disponibles, l'IA leur confère un pouvoir prédictif et prescriptif, les organisations au socle SIRH mature paraissant mieux préparées que les autres (Bondarouk et al., 2017). La notion de</w:t>
+        <w:t xml:space="preserve">Parallèlement, les systèmes d'information de ressources humaines (SIRH) ont centralisé les données, automatisé les tâches transactionnelles et externalisé certaines fonctions, dynamique étudiée de longue date par la littérature e-HRM (Bondarouk &amp; Ruël, 2009 ; Bondarouk et al., 2017 ; Marler &amp; Fisher, 2013 ; Strohmeier, 2007). Le passage du SIRH à l'IA relève donc moins d'une rupture absolue que d'un continuum : là où les SIRH ont rendu les données disponibles, l'IA leur confère un pouvoir prédictif et prescriptif, les organisations au socle SIRH mature paraissant mieux préparées que les autres (Bondarouk et al., 2017). La notion de</w:t>
       </w:r>
       <w:r>
         <w:t xml:space="preserve"> </w:t>
@@ -2424,7 +2762,7 @@
         <w:t xml:space="preserve"> </w:t>
       </w:r>
       <w:r>
-        <w:t xml:space="preserve">désigne une configuration où l'IA ne remplace pas le professionnel mais étend ses capacités d'analyse et de décision (Tambe et al., 2019 ; Budhwar et al., 2022) ; Tambe et al. (2019) identifient quatre défis propres à l'IA en RH, la complexité des phénomènes humains, la rareté des données, la sensibilité aux biais éthiques et juridiques et les réactions des salariés à une gestion algorithmique de leur trajectoire.</w:t>
+        <w:t xml:space="preserve">désigne une configuration où l'IA ne remplace pas le professionnel mais étend ses capacités d'analyse et de décision (Budhwar et al., 2022 ; Tambe et al., 2019) ; Tambe et al. (2019) identifient quatre défis propres à l'IA en RH, la complexité des phénomènes humains, la rareté des données, la sensibilité aux biais éthiques et juridiques et les réactions des salariés à une gestion algorithmique de leur trajectoire.</w:t>
       </w:r>
     </w:p>
     <w:p>
@@ -2494,7 +2832,7 @@
         <w:pStyle w:val="BodyText"/>
       </w:pPr>
       <w:r>
-        <w:t xml:space="preserve">Le recrutement constitue le domaine le plus avancé et le plus publié (Black &amp; van Esch, 2020 ; Suen et al., 2019 ; Pillai &amp; Sivathanu, 2020) :</w:t>
+        <w:t xml:space="preserve">Le recrutement constitue le domaine le plus avancé et le plus publié (Black &amp; van Esch, 2020 ; Pillai &amp; Sivathanu, 2020 ; Suen et al., 2019) :</w:t>
       </w:r>
       <w:r>
         <w:t xml:space="preserve"> </w:t>
@@ -2630,7 +2968,7 @@
         <w:pStyle w:val="BodyText"/>
       </w:pPr>
       <w:r>
-        <w:t xml:space="preserve">Un quatrième domaine, plus récent et plus contesté, est l'analyse de l'engagement et du climat social au moyen d'outils d'écoute collaborateur algorithmique, qui appliquent l'analyse de sentiment à des enquêtes ouvertes, des messages internes ou des réseaux sociaux d'entreprise. Ces solutions promettent une visibilité accrue sur le climat social mais soulèvent des questions éthiques marquées de surveillance et de confidentialité (Charlwood &amp; Guenole, 2022 ; Tursunbayeva et al., 2022). C'est le seul domaine où la controverse éthique précède la diffusion des usages : il offre de ce fait un révélateur privilégié des arbitrages normatifs que les professionnels RH opèrent en amont de toute considération d'efficacité.</w:t>
+        <w:t xml:space="preserve">Un quatrième domaine, plus récent et plus contesté, est l'analyse de l'engagement et du climat social au moyen d'outils d'écoute collaborateur algorithmique, qui appliquent l'analyse de sentiment à des enquêtes ouvertes, des messages internes ou des réseaux sociaux d'entreprise. Ces solutions promettent une visibilité accrue sur le climat social mais soulèvent de vives questions éthiques de surveillance et de confidentialité (Charlwood &amp; Guenole, 2022 ; Tursunbayeva et al., 2022). C'est le seul domaine où la controverse éthique précède la diffusion des usages : il offre de ce fait un révélateur privilégié des arbitrages normatifs que les professionnels RH opèrent en amont de toute considération d'efficacité.</w:t>
       </w:r>
     </w:p>
     <w:p>
@@ -2978,7 +3316,7 @@
         <w:pStyle w:val="FirstParagraph"/>
       </w:pPr>
       <w:r>
-        <w:t xml:space="preserve">Les implémentations les plus avancées, concentrées en Amérique du Nord, en Europe occidentale et en Asie de l'Est, combinent plusieurs outils intégrés à un écosystème SIRH cohérent et bénéficient d'un appui fort de la direction générale (Vrontis et al., 2022), selon des trajectoires que Stone et al. (2015) avaient anticipées et que l'accélération numérique post-pandémique a amplifiées (Dwivedi et al., 2020). Trois épisodes controversés jalonnent cette diffusion. Leur statut doit être posé d'emblée : documentés par la presse économique internationale, par des décisions d'entreprise rendues publiques et, pour l'un, par des procédures judiciaires en cours, ils ne constituent pas des données scientifiques et leur valeur probante est faible ; ils sont mobilisés parce qu'ils circulent largement et façonnent les représentations des praticiens. Amazon a abandonné en 2018 un algorithme expérimental de tri des candidatures qui pénalisait systématiquement les CV de candidates, biais hérité de données d'entraînement majoritairement masculines (Tambe et al., 2019 ; Charlwood &amp; Guenole, 2022). HireVue a retiré en 2021 la composante d'analyse faciale de sa solution d'entretien vidéo, mise en cause pour sa validité scientifique et ses risques de discrimination indirecte ; Suen et al. (2019) documentent par ailleurs la dégradation de l'expérience perçue lorsque l'entretien paraît déshumanisé, et Langer et Landers (2021) montrent que les effets s'étendent aux observateurs tiers, dont les jugements pèsent sur la légitimité des outils. Workday, enfin, fait l'objet d'actions en justice aux États-Unis (2023-2024) pour des effets discriminatoires allégués de ses algorithmes de présélection.</w:t>
+        <w:t xml:space="preserve">Les implémentations les plus avancées, concentrées en Amérique du Nord, en Europe occidentale et en Asie de l'Est, combinent plusieurs outils intégrés à un écosystème SIRH cohérent et bénéficient d'un appui fort de la direction générale (Vrontis et al., 2022), selon des trajectoires que Stone et al. (2015) avaient anticipées et que l'accélération numérique post-pandémique a amplifiées (Dwivedi et al., 2020). Trois épisodes controversés jalonnent cette diffusion. Leur statut doit être posé d'emblée : documentés par la presse économique internationale, par des décisions d'entreprise rendues publiques et, pour l'un, par des procédures judiciaires en cours, ils ne constituent pas des données scientifiques et leur valeur probante est faible ; ils sont mobilisés parce qu'ils circulent largement et façonnent les représentations des praticiens. Amazon a abandonné en 2018 un algorithme expérimental de tri des candidatures qui pénalisait systématiquement les CV de candidates, biais hérité de données d'entraînement majoritairement masculines (Charlwood &amp; Guenole, 2022 ; Tambe et al., 2019). HireVue a retiré en 2021 la composante d'analyse faciale de sa solution d'entretien vidéo, mise en cause pour sa validité scientifique et ses risques de discrimination indirecte ; Suen et al. (2019) documentent par ailleurs la dégradation de l'expérience perçue lorsque l'entretien paraît déshumanisé, et Langer et Landers (2021) montrent que les effets s'étendent aux observateurs tiers, dont les jugements pèsent sur la légitimité des outils. Workday, enfin, fait l'objet d'actions en justice aux États-Unis (2023-2024) pour des effets discriminatoires allégués de ses algorithmes de présélection.</w:t>
       </w:r>
     </w:p>
     <w:p>
@@ -3008,7 +3346,7 @@
         <w:pStyle w:val="FirstParagraph"/>
       </w:pPr>
       <w:r>
-        <w:t xml:space="preserve">La recension des bases internationales (Semantic Scholar, Scopus) et marocaines (IMIST, Toubkal), conduite selon la stratégie documentée en Annexe F, révèle une rareté manifeste des travaux empiriques indexés sur l'adoption de l'IA par les professionnels RH au Maroc. Trois facteurs l'expliquent vraisemblablement : la diffusion massive de l'IA en RH seulement depuis 2022, la sous-indexation des revues marocaines de gestion dans les bases anglo-saxonnes, la dispersion des travaux entre publications, thèses et littérature grise ; les travaux marocains accessibles portent sur la digitalisation des SIRH ou l'adoption des technologies en général, sans focalisation sur l'IA. Cette rareté fonde l'une des justifications scientifiques du mémoire.</w:t>
+        <w:t xml:space="preserve">La recension des bases internationales (Semantic Scholar, Scopus) et marocaines (IMIST, Toubkal), conduite selon la stratégie documentée en Annexe F, révèle une rareté manifeste des travaux empiriques indexés sur l'adoption de l'IA par les professionnels RH au Maroc. Elle s'explique vraisemblablement par la diffusion massive de l'IA en RH seulement depuis 2022, la sous-indexation des revues marocaines de gestion dans les bases anglo-saxonnes, la dispersion des travaux entre publications, thèses et littérature grise ; les travaux marocains accessibles portent sur la digitalisation des SIRH ou l'adoption des technologies en général, sans focalisation sur l'IA. Cette rareté fonde l'une des justifications scientifiques du mémoire.</w:t>
       </w:r>
     </w:p>
     <w:p>
@@ -3045,7 +3383,7 @@
         <w:t xml:space="preserve">Maroc Digital 2030</w:t>
       </w:r>
       <w:r>
-        <w:t xml:space="preserve">, lancée officiellement en septembre 2024, qui place la transformation numérique au cœur de l'agenda national ; la loi 09-08, promulguée par le dahir n° 1-09-15 du 18 février 2009 et placée sous le contrôle de la CNDP, qui encadre tout traitement algorithmique de données RH sensibles, aucune loi marocaine spécifique à l'IA n'ayant été adoptée à ce jour ; un tissu économique régional aux secteurs et aux tailles d'organisation très contrastés. Ces éléments ne démontrent rien par eux-mêmes : ils définissent les conditions concrètes de déploiement des mécanismes théoriques, et le guide d'entretien les mobilise comme relances plutôt que comme questions frontales. Le Tableau 2, qui récapitule les principaux travaux mobilisés dans cette revue en explicitant la nature et la portée de chacun, condition d'une évaluation lucide de leur degré de preuve, figure en Annexe G.</w:t>
+        <w:t xml:space="preserve">, lancée officiellement en septembre 2024, qui place la transformation numérique au cœur de l'agenda national ; la loi 09-08, placée sous le contrôle de la CNDP, qui encadre tout traitement algorithmique de données RH sensibles, aucune loi marocaine spécifique à l'IA n'ayant été adoptée à ce jour ; un tissu économique régional aux secteurs et aux tailles d'organisation très contrastés. Ces éléments ne démontrent rien par eux-mêmes : ils définissent les conditions concrètes de déploiement des mécanismes théoriques, et le guide d'entretien les mobilise comme relances plutôt que comme questions frontales. Le Tableau 2, qui récapitule les principaux travaux mobilisés dans cette revue en explicitant la nature et la portée de chacun, condition d'une évaluation lucide de leur degré de preuve, figure en Annexe G.</w:t>
       </w:r>
     </w:p>
     <w:p>
@@ -3107,7 +3445,7 @@
         <w:pStyle w:val="FirstParagraph"/>
       </w:pPr>
       <w:r>
-        <w:t xml:space="preserve">Quatre résultats peuvent être tenus pour établis, en ce qu'ils ont été obtenus par des équipes distinctes, sur des objets techniques différents et par des méthodes non convergentes : l'utilité perçue et la facilité d'usage perçue demeurent des déterminants centraux de l'adoption, y compris pour l'IA appliquée au recrutement (Davis, 1989 ; Venkatesh et al., 2003 ; Pillai &amp; Sivathanu, 2020), aucun travail recensé ne les infirmant ; l'écart entre l'intention déclarée et l'usage effectif est un phénomène robuste, observé pour l'e-HRM (Parry &amp; Tyson, 2011), pour le</w:t>
+        <w:t xml:space="preserve">Quatre résultats peuvent être tenus pour établis, en ce qu'ils ont été obtenus par des équipes distinctes, sur des objets techniques différents et par des méthodes non convergentes : l'utilité perçue et la facilité d'usage perçue demeurent des déterminants centraux de l'adoption, y compris pour l'IA appliquée au recrutement (Davis, 1989 ; Pillai &amp; Sivathanu, 2020 ; Venkatesh et al., 2003), aucun travail recensé ne les infirmant ; l'écart entre l'intention déclarée et l'usage effectif est un phénomène robuste, observé pour l'e-HRM (Parry &amp; Tyson, 2011), pour le</w:t>
       </w:r>
       <w:r>
         <w:t xml:space="preserve"> </w:t>
@@ -3123,7 +3461,7 @@
         <w:t xml:space="preserve"> </w:t>
       </w:r>
       <w:r>
-        <w:t xml:space="preserve">(Marler &amp; Boudreau, 2017) et anticipé pour l'IA (Tambe et al., 2019), sa reproduction sur trois vagues technologiques successives en faisant l'acquis le mieux étayé du champ ; les conditions organisationnelles, soutien de la direction, infrastructure ou formation, jouent un rôle modulateur déterminant (Venkatesh et al., 2003 ; Bondarouk et al., 2017 ; Pillai &amp; Sivathanu, 2020 ; Vrontis et al., 2022) ; les risques de biais et de discrimination algorithmiques constituent un phénomène structurel et non accidentel, établi par revue systématique et indépendamment des cas médiatisés (Köchling &amp; Wehner, 2020). Ces acquis délimitent ce qu'il serait vain de redémontrer et justifient de conserver le noyau du cadre TAM/UTAUT plutôt que de lui substituer un cadre alternatif, choix discuté et assumé en section 2.3.</w:t>
+        <w:t xml:space="preserve">(Marler &amp; Boudreau, 2017) et anticipé pour l'IA (Tambe et al., 2019), sa reproduction sur trois vagues technologiques successives en faisant l'acquis le mieux étayé du champ ; les conditions organisationnelles, soutien de la direction, infrastructure ou formation, jouent un rôle modulateur déterminant (Bondarouk et al., 2017 ; Pillai &amp; Sivathanu, 2020 ; Venkatesh et al., 2003 ; Vrontis et al., 2022) ; les risques de biais et de discrimination algorithmiques constituent un phénomène structurel et non accidentel, établi par revue systématique et indépendamment des cas médiatisés (Köchling &amp; Wehner, 2020). Ces acquis délimitent ce qu'il serait vain de redémontrer et justifient de conserver le noyau du cadre TAM/UTAUT plutôt que de lui substituer un cadre alternatif, choix discuté et assumé en section 2.3.</w:t>
       </w:r>
     </w:p>
     <w:bookmarkEnd w:id="54"/>
@@ -3195,7 +3533,7 @@
         <w:t xml:space="preserve"> </w:t>
       </w:r>
       <w:r>
-        <w:t xml:space="preserve">La sous-représentation de l'Afrique du Nord et du Maroc dans la production internationale, constatée par Bondarouk et al. (2017) pour l'ensemble du champ e-HRM, ne constituerait à elle seule qu'un argument de complétude documentaire. L'argument scientifique procède de la structure même des modèles mobilisés : plusieurs variables du cadre ont un contenu dont la littérature reconnaît qu'il varie selon les configurations institutionnelles et culturelles. L'influence sociale, définie par Venkatesh et al. (2003) comme la perception des attentes d'autrui, peut opérer comme une pression normative entre pairs dans un contexte, comme une prescription hiérarchique difficilement discutable dans un autre ; les conditions facilitantes recouvrent des réalités hétérogènes selon l'équipement des organisations ; le cadre légal, absent du modèle originel, structure ici directement le périmètre des usages licites. Dwivedi et al. (2019) montrent précisément que le modèle a été validé sur des populations et des environnements particuliers, et Budhwar et al. (2022) en tirent un appel à la contextualisation. On ignore donc si les mécanismes établis conservent le même contenu hors de leurs terrains d'origine, et le Maroc n'offre à ce jour aucun matériau permettant d'en juger.</w:t>
+        <w:t xml:space="preserve">La sous-représentation de l'Afrique du Nord et du Maroc dans la production internationale, constatée par Bondarouk et al. (2017) pour l'ensemble du champ e-HRM, ne constituerait à elle seule qu'un argument de complétude documentaire. L'argument scientifique procède de la structure même des modèles mobilisés : plusieurs variables du cadre ont un contenu dont la littérature reconnaît qu'il varie selon les configurations institutionnelles et culturelles. L'influence sociale, définie par Venkatesh et al. (2003) comme la perception des attentes d'autrui, peut opérer comme une pression normative entre pairs dans un contexte, comme une prescription hiérarchique difficilement discutable dans un autre ; les conditions facilitantes recouvrent des réalités hétérogènes selon l'équipement des organisations ; le cadre légal, absent du modèle originel, structure ici directement le périmètre des usages licites. Dwivedi et al. (2019) montrent précisément que le modèle a été validé sur des populations et des environnements particuliers, et Budhwar et al. (2022) en tirent un appel à la contextualisation. On ignore donc si les mécanismes établis conservent le même contenu hors de leurs terrains d'origine, et le Maroc n'offre à ce jour, dans les bases consultées (Annexe F), aucun matériau indexé permettant d'en juger.</w:t>
       </w:r>
     </w:p>
     <w:p>
@@ -3540,7 +3878,7 @@
         <w:pStyle w:val="FirstParagraph"/>
       </w:pPr>
       <w:r>
-        <w:t xml:space="preserve">L'articulation entre les deux croyances mérite examen. Davis (1989) postule qu'un outil aisé à prendre en main a plus de chances d'apporter une valeur effective, la facilité d'usage nourrissant l'utilité perçue : ce lien figure parmi les résultats les plus reproduits du champ. Les synthèses ultérieures en relativisent toutefois la constance : Lee et al. (2003), Williams et al. (2015) et Dwivedi et al. (2019) documentent une forte variabilité du poids relatif des deux croyances selon les contextes, le déterminant lié à l'effort perdant de son pouvoir explicatif à mesure que l'expérience s'accroît. Conséquence directe pour la présente recherche : le poids respectif de l'utilité et de la facilité ne se postule pas, il s'établit sur le terrain.</w:t>
+        <w:t xml:space="preserve">L'articulation entre les deux croyances mérite examen. Davis (1989) postule qu'un outil aisé à prendre en main a plus de chances d'apporter une valeur effective, la facilité d'usage nourrissant l'utilité perçue : ce lien figure parmi les résultats les plus reproduits du champ. Les synthèses ultérieures en relativisent toutefois la constance : Y. Lee et al. (2003), Williams et al. (2015) et Dwivedi et al. (2019) documentent une forte variabilité du poids relatif des deux croyances selon les contextes, le déterminant lié à l'effort perdant de son pouvoir explicatif à mesure que l'expérience s'accroît. Conséquence directe pour la présente recherche : le poids respectif de l'utilité et de la facilité ne se postule pas, il s'établit sur le terrain.</w:t>
       </w:r>
     </w:p>
     <w:p>
@@ -3860,7 +4198,7 @@
         <w:t xml:space="preserve"> </w:t>
       </w:r>
       <w:r>
-        <w:t xml:space="preserve">Adapté de « User acceptance of information technology : Toward a unified view », par V. Venkatesh, M. G. Morris, G. B. Davis et F. D. Davis, 2003,</w:t>
+        <w:t xml:space="preserve">Adapté de « User acceptance of information technology: Toward a unified view », par V. Venkatesh, M. G. Morris, G. B. Davis et F. D. Davis, 2003,</w:t>
       </w:r>
       <w:r>
         <w:t xml:space="preserve"> </w:t>
@@ -3911,15 +4249,7 @@
         <w:pStyle w:val="BodyText"/>
       </w:pPr>
       <w:r>
-        <w:t xml:space="preserve">Le tableau 4 synthétise la trajectoire d'enrichissement progressif de la famille TAM/UTAUT : variables centrales, apport spécifique et principale limite de chacun des cinq modèles fondateurs.</w:t>
-      </w:r>
-    </w:p>
-    <w:p>
-      <w:pPr>
-        <w:pStyle w:val="BodyText"/>
-      </w:pPr>
-      <w:r>
-        <w:t xml:space="preserve">Le Tableau 4, synthèse comparative des cinq modèles d'acceptation des technologies, figure en Annexe G.</w:t>
+        <w:t xml:space="preserve">Le Tableau 4, qui synthétise la trajectoire d'enrichissement progressif de la famille TAM/UTAUT (variables centrales, apport spécifique et principale limite de chacun des cinq modèles fondateurs), figure en Annexe G.</w:t>
       </w:r>
     </w:p>
     <w:p>
@@ -4018,7 +4348,7 @@
         <w:pStyle w:val="BodyText"/>
       </w:pPr>
       <w:r>
-        <w:t xml:space="preserve">Publiée dans le même numéro spécial, la critique de Benbasat et Barki (2007) prolonge ce diagnostic sur un point qui intéresse directement le présent mémoire : le succès du TAM a détourné la recherche en systèmes d'information de l'artefact technologique lui-même, la technologie devenant une variable externe indifférenciée dont les propriétés concrètes n'ont plus à être examinées. Le reproche pouvait paraître théorique tant que les technologies étudiées étaient des logiciels de bureautique comparables ; il devient décisif face à l'IA. Si les propriétés de l'artefact ne comptent pas, adopter un tableur et adopter un système de présélection algorithmique relèvent des mêmes mécanismes, ce qui contredit tout ce que le chapitre 1 a établi. Prendre au sérieux cette critique revient donc à réintroduire dans le modèle les propriétés spécifiques de l'artefact IA, précisément ce que la proposition P6 formalise : la critique la plus radicale du cadre fournit l'argument le plus solide en faveur de son enrichissement plutôt que de son abandon. Ces deux critiques imposent une question préalable, que peut apporter une étude supplémentaire à un cadre déjà si largement éprouvé ; la section 2.3.4 y répond.</w:t>
+        <w:t xml:space="preserve">Publiée dans le même numéro spécial, la critique de Benbasat et Barki (2007) prolonge ce diagnostic sur un point qui intéresse directement le présent mémoire : le succès du TAM a détourné la recherche en systèmes d'information de l'artefact technologique lui-même, la technologie devenant une variable externe indifférenciée dont les propriétés concrètes n'ont plus à être examinées. Le reproche pouvait paraître théorique tant que les technologies étudiées étaient des logiciels de bureautique comparables ; il devient décisif face à l'IA. Si les propriétés de l'artefact ne comptent pas, adopter un tableur et adopter un système de présélection algorithmique relèvent des mêmes mécanismes, ce qui contredit tout ce que le chapitre 1 a établi. Prendre au sérieux cette critique revient donc à réintroduire dans le modèle les propriétés spécifiques de l'artefact IA, précisément ce que la proposition P6 formalise : la critique la plus radicale du cadre fournit l'argument le plus solide en faveur de son enrichissement plutôt que de son abandon. Ces deux critiques imposent une question préalable : que peut apporter une étude supplémentaire à un cadre déjà si largement éprouvé ? La section 2.3.4 y répond.</w:t>
       </w:r>
     </w:p>
     <w:bookmarkEnd w:id="74"/>
@@ -4150,7 +4480,7 @@
         <w:t xml:space="preserve">conversationnelle</w:t>
       </w:r>
       <w:r>
-        <w:t xml:space="preserve">, l'usage relevant d'une co-construction itérative et non de l'exécution d'une commande. Ce constat rejoint la caractérisation de Berente et al. (2021) : autonomie croissante des systèmes, capacité d'apprentissage, inscrutabilité. Ces différences déplacent les conditions mêmes de formation des croyances fondatrices du modèle : l'utilité d'un grand modèle de langage ne se manifeste pas de manière stable d'un usage à l'autre, elle dépend de la qualité du</w:t>
+        <w:t xml:space="preserve">, l'usage relevant d'une co-construction itérative et non de l'exécution d'une commande. Ce constat rejoint la caractérisation de Berente et al. (2021) : autonomie croissante des systèmes, capacité d'apprentissage, caractère insondable. Ces différences déplacent les conditions mêmes de formation des croyances fondatrices du modèle : l'utilité d'un grand modèle de langage ne se manifeste pas de manière stable d'un usage à l'autre, elle dépend de la qualité du</w:t>
       </w:r>
       <w:r>
         <w:t xml:space="preserve"> </w:t>
@@ -4184,7 +4514,7 @@
         <w:pStyle w:val="BodyText"/>
       </w:pPr>
       <w:r>
-        <w:t xml:space="preserve">Quatre dimensions, jusque-là périphériques dans la famille TAM/UTAUT, accèdent ainsi au statut de variables centrales : la confiance envers les systèmes d'IA, un système opaque exigeant un acte de confiance non trivial dans la fiabilité de ses recommandations, particulièrement lorsqu'elles affectent des décisions RH à fort enjeu (Tambe et al., 2019 ; Budhwar et al., 2022) ; la transparence algorithmique, dont l'absence constitue pour les professionnels RH un frein structurel dès que les décisions doivent être justifiées auprès de candidats, de collaborateurs ou d'instances réglementaires (Tambe et al., 2019) ; les risques éthiques, biais, discrimination indirecte et perte d'humanité de la décision, que Charlwood et Guenole (2022) théorisent comme des paradoxes constitutifs susceptibles d'inverser le rapport entre coûts et bénéfices anticipé par l'utilisateur ; la confidentialité des données RH, d'autant plus sensible que les traitements portent sur des informations personnelles et que leur finalité peut dériver au fil des usages (Tursunbayeva et al., 2022). Trois conséquences en découlent pour la recherche : les variables explicatives classiques doivent être considérées comme partielles et non comme exhaustives ; les dimensions propres à l'IA gagnent à être explorées explicitement, exigence qui motive la proposition P6 ; une posture exclusivement déductive risquerait d'enfermer le matériau dans une grille trop étroite, d'où l'intérêt d'un dispositif qualitatif autorisant l'émergence.</w:t>
+        <w:t xml:space="preserve">Quatre dimensions, jusque-là périphériques dans la famille TAM/UTAUT, accèdent ainsi au statut de variables centrales : la confiance envers les systèmes d'IA, un système opaque exigeant un acte de confiance non trivial dans la fiabilité de ses recommandations, particulièrement lorsqu'elles affectent des décisions RH à fort enjeu (Budhwar et al., 2022 ; Tambe et al., 2019) ; la transparence algorithmique, dont l'absence constitue pour les professionnels RH un frein structurel dès que les décisions doivent être justifiées auprès de candidats, de collaborateurs ou d'instances réglementaires (Tambe et al., 2019) ; les risques éthiques, biais, discrimination indirecte et perte d'humanité de la décision, que Charlwood et Guenole (2022) théorisent comme des paradoxes constitutifs susceptibles d'inverser le rapport entre coûts et bénéfices anticipé par l'utilisateur ; la confidentialité des données RH, d'autant plus sensible que les traitements portent sur des informations personnelles et que leur finalité peut dériver au fil des usages (Tursunbayeva et al., 2022). Trois conséquences en découlent pour la recherche : les variables explicatives classiques doivent être considérées comme partielles et non comme exhaustives ; les dimensions propres à l'IA gagnent à être explorées explicitement, exigence qui motive la proposition P6 ; une posture exclusivement déductive risquerait d'enfermer le matériau dans une grille trop étroite, d'où l'intérêt d'un dispositif qualitatif autorisant l'émergence.</w:t>
       </w:r>
     </w:p>
     <w:bookmarkEnd w:id="75"/>
@@ -4206,7 +4536,7 @@
         <w:pStyle w:val="FirstParagraph"/>
       </w:pPr>
       <w:r>
-        <w:t xml:space="preserve">Plusieurs cadres alternatifs méritent d'être présentés, pour situer la décision de retenir TAM/UTAUT et identifier les dimensions que ces cadres saisiraient mieux. La théorie de la diffusion des innovations, dont Rogers (2003) offre la formulation la plus aboutie, analyse les caractéristiques perçues de l'innovation elle-même, cinq propriétés prédisant la vitesse de diffusion : avantage relatif, compatibilité avec les valeurs et les besoins existants, complexité, testabilité, observabilité. Appliquée à l'IA en RH, cette grille éclairerait la diffusion rapide du tri de CV et les résistances persistantes que suscite l'analyse de sentiment, en pointant la compatibilité avec les valeurs identitaires de la profession. La théorie de l'appropriation, formalisée par DeSanctis et Poole (1994) dans la lignée de la théorie de la structuration et prolongée par Orlikowski (1992), analyse les usages situés, les détournements par rapport aux usages prescrits et la co-construction progressive du sens d'une technologie : elle met en lumière ce que le TAM ne capture pas, un outil pouvant être formellement adopté tout en étant détourné de sa fonction, contourné par des pratiques parallèles ou intégré dans un</w:t>
+        <w:t xml:space="preserve">Plusieurs cadres alternatifs méritent d'être présentés, pour situer la décision de retenir TAM/UTAUT et identifier les dimensions que ces cadres saisiraient mieux. La théorie de la diffusion des innovations, dont Rogers (2003) offre la formulation la plus aboutie, analyse les caractéristiques perçues de l'innovation elle-même, cinq propriétés prédisant la vitesse de diffusion : avantage relatif, compatibilité avec les valeurs et les besoins existants, complexité, testabilité, observabilité. Appliquée à l'IA en RH, cette grille éclairerait la diffusion rapide du tri de CV et les résistances persistantes que suscite l'analyse de sentiment, en pointant la compatibilité avec les valeurs identitaires de la profession. La théorie de l'appropriation, initiée par Orlikowski (1992) dans la lignée de la théorie de la structuration et formalisée par DeSanctis et Poole (1994), analyse les usages situés, les détournements par rapport aux usages prescrits et la co-construction progressive du sens d'une technologie : elle met en lumière ce que le TAM ne capture pas, un outil pouvant être formellement adopté tout en étant détourné de sa fonction, contourné par des pratiques parallèles ou intégré dans un</w:t>
       </w:r>
       <w:r>
         <w:t xml:space="preserve"> </w:t>
@@ -4230,7 +4560,7 @@
         <w:pStyle w:val="BodyText"/>
       </w:pPr>
       <w:r>
-        <w:t xml:space="preserve">Ces trois cadres n'ont pas la même relation au TAM, et la distinction commande l'usage qui en est fait. La théorie décomposée en est une variante interne, substituable mais peu susceptible d'apporter des dimensions nouvelles. La diffusion des innovations est complémentaire : elle déplace le regard de l'utilisateur vers les propriétés perçues de l'innovation, rejoignant le reproche de Benbasat et Barki (2007), et fournit avec la compatibilité un instrument utile pour penser la friction entre l'IA et les valeurs de la profession RH. La théorie de l'appropriation est en revanche incommensurable : elle ne cherche pas à prédire une adoption mais à décrire une construction sociale de l'usage, et ne peut être combinée au TAM sans incohérence épistémologique. Deux emprunts ciblés sont donc opérés et assumés comme tels : de Rogers (2003), l'idée que la compatibilité avec les valeurs professionnelles constitue un frein possible, dimension que la proposition P5 intègre sous l'angle de l'identité menacée ; de la théorie de l'appropriation, aucun concept mais une vigilance méthodologique, rester attentif dans les entretiens aux écarts entre usage prescrit et usage réel. Lee et al. (2003), qui documentent la trajectoire bibliométrique du TAM, rappellent du reste que la force du modèle n'a jamais résidé dans son exhaustivité : le cadre est puissant mais incomplet, ce qui exige du chercheur qu'il explicite sa posture plutôt qu'il ne l'adopte tacitement.</w:t>
+        <w:t xml:space="preserve">Ces trois cadres n'ont pas la même relation au TAM, et la distinction commande l'usage qui en est fait. La théorie décomposée en est une variante interne, substituable mais peu susceptible d'apporter des dimensions nouvelles. La diffusion des innovations est complémentaire : elle déplace le regard de l'utilisateur vers les propriétés perçues de l'innovation, rejoignant le reproche de Benbasat et Barki (2007), et fournit avec la compatibilité un instrument utile pour penser la friction entre l'IA et les valeurs de la profession RH. La théorie de l'appropriation est en revanche incommensurable : elle ne cherche pas à prédire une adoption mais à décrire une construction sociale de l'usage, et ne peut être combinée au TAM sans incohérence épistémologique. Deux emprunts ciblés sont donc opérés et assumés comme tels : de Rogers (2003), l'idée que la compatibilité avec les valeurs professionnelles constitue un frein possible, dimension que la proposition P5 intègre sous l'angle de l'identité menacée ; de la théorie de l'appropriation, aucun concept mais une vigilance méthodologique, rester attentif dans les entretiens aux écarts entre usage prescrit et usage réel. Y. Lee et al. (2003), qui documentent la trajectoire bibliométrique du TAM, rappellent du reste que la force du modèle n'a jamais résidé dans son exhaustivité : le cadre est puissant mais incomplet, ce qui exige du chercheur qu'il explicite sa posture plutôt qu'il ne l'adopte tacitement.</w:t>
       </w:r>
     </w:p>
     <w:bookmarkEnd w:id="76"/>
@@ -4252,7 +4582,7 @@
         <w:pStyle w:val="FirstParagraph"/>
       </w:pPr>
       <w:r>
-        <w:t xml:space="preserve">Pourquoi, au regard de ces critiques, retenir le TAM/UTAUT comme cadre principal ? Trois raisons justifient ce choix. La posture qualitative déductive exige d'abord un cadre structurant, suffisamment lisible pour orienter la collecte et le codage, suffisamment ouvert pour autoriser l'émergence : la parcimonie décriée par Bagozzi (2007) constitue ici un avantage opérationnel, permettant un guide d'entretien clair et une grille d'analyse traçable. La mobilisation du cadre garantit ensuite la comparabilité avec la littérature internationale dominante (Pillai &amp; Sivathanu, 2020 ; Williams et al., 2015 ; Dwivedi et al., 2019) : des résultats situés sur le terrain marocain n'ont de portée qu'à la condition d'être discutés à l'aune des cadres les plus partagés. Ses dimensions sont enfin opérationnellement testables en entretien, chacune se traduisant en questions ouvertes, en relances et en codes analytiques, ce qui n'est pas le cas des concepts plus diffus de la théorie de l'appropriation.</w:t>
+        <w:t xml:space="preserve">Pourquoi, au regard de ces critiques, retenir le TAM/UTAUT comme cadre principal ? Ce choix se justifie à un triple titre. La posture qualitative déductive exige d'abord un cadre structurant, suffisamment lisible pour orienter la collecte et le codage, suffisamment ouvert pour autoriser l'émergence : la parcimonie décriée par Bagozzi (2007) constitue ici un avantage opérationnel, permettant un guide d'entretien clair et une grille d'analyse traçable. La mobilisation du cadre garantit ensuite la comparabilité avec la littérature internationale dominante (Dwivedi et al., 2019 ; Pillai &amp; Sivathanu, 2020 ; Williams et al., 2015) : des résultats situés sur le terrain marocain n'ont de portée qu'à la condition d'être discutés à l'aune des cadres les plus partagés. Ses dimensions sont enfin opérationnellement testables en entretien, chacune se traduisant en questions ouvertes, en relances et en codes analytiques, ce qui n'est pas le cas des concepts plus diffus de la théorie de l'appropriation.</w:t>
       </w:r>
     </w:p>
     <w:p>
@@ -4322,7 +4652,7 @@
         <w:pStyle w:val="FirstParagraph"/>
       </w:pPr>
       <w:r>
-        <w:t xml:space="preserve">Aucun modèle pris isolément ne couvre l'ensemble des dimensions pertinentes : le TAM originel (Davis, 1989) est trop parcimonieux pour saisir les dimensions sociales et organisationnelles ; UTAUT (Venkatesh et al., 2003) intègre les conditions facilitantes mais ignore largement les dimensions cognitives et affectives ; TAM 3 (Venkatesh &amp; Bala, 2008) introduit l'anxiété et l'auto-efficacité mais reste centré sur la facilité d'usage ; UTAUT 2 (Venkatesh et al., 2012) ajoute des variables consuméristes dont seules certaines sont transposables au contexte organisationnel. Les relectures critiques du champ (Bagozzi, 2007 ; Dwivedi et al., 2019) invitent dès lors à mobiliser ces modèles comme des réservoirs conceptuels, au service de la problématique posée. Le cadre intégrateur combine ainsi cinq apports : les deux variables fondatrices du TAM, utilité perçue et facilité d'usage perçue (Davis, 1989) ; les dimensions sociales et organisationnelles d'UTAUT, influence sociale et conditions facilitantes (Venkatesh et al., 2003) ; les dimensions cognitives et affectives de TAM 3, auto-efficacité numérique et anxiété (Venkatesh &amp; Bala, 2008 ; Compeau &amp; Higgins, 1995), la seconde étant enrichie de la crainte du remplacement professionnel (Charlwood &amp; Guenole, 2022) ; un bloc de variables IA-spécifiques détaillé en 2.4.3 ; des variables modératrices contextuelles issues d'UTAUT 2 et de la littérature internationale de GRH (Venkatesh et al., 2012 ; Budhwar et al., 2022 ; Pillai &amp; Sivathanu, 2020). Dans la perspective post-positiviste justifiée au chapitre 3, ce cadre est mobilisé comme structure heuristique, sans prétendre épuiser la complexité du réel ni interdire l'émergence de variables non anticipées.</w:t>
+        <w:t xml:space="preserve">Aucun modèle pris isolément ne couvre l'ensemble des dimensions pertinentes : le TAM originel (Davis, 1989) est trop parcimonieux pour saisir les dimensions sociales et organisationnelles ; UTAUT (Venkatesh et al., 2003) intègre les conditions facilitantes mais ignore largement les dimensions cognitives et affectives ; TAM 3 (Venkatesh &amp; Bala, 2008) introduit l'anxiété et l'auto-efficacité mais reste centré sur la facilité d'usage ; UTAUT 2 (Venkatesh et al., 2012) ajoute des variables consuméristes dont seules certaines sont transposables au contexte organisationnel. Les relectures critiques du champ (Bagozzi, 2007 ; Dwivedi et al., 2019) invitent dès lors à mobiliser ces modèles comme des réservoirs conceptuels, au service de la problématique posée. Le cadre intégrateur combine ainsi cinq apports : les deux variables fondatrices du TAM, utilité perçue et facilité d'usage perçue (Davis, 1989) ; les dimensions sociales et organisationnelles d'UTAUT, influence sociale et conditions facilitantes (Venkatesh et al., 2003) ; les dimensions cognitives et affectives de TAM 3, auto-efficacité numérique et anxiété (Compeau &amp; Higgins, 1995 ; Venkatesh &amp; Bala, 2008), la seconde étant enrichie de la crainte du remplacement professionnel (Charlwood &amp; Guenole, 2022) ; un bloc de variables IA-spécifiques détaillé en 2.4.3 ; des variables modératrices contextuelles issues d'UTAUT 2 et de la littérature internationale de GRH (Budhwar et al., 2022 ; Pillai &amp; Sivathanu, 2020 ; Venkatesh et al., 2012). Dans la perspective post-positiviste justifiée au chapitre 3, ce cadre est mobilisé comme structure heuristique, sans prétendre épuiser la complexité du réel ni interdire l'émergence de variables non anticipées.</w:t>
       </w:r>
     </w:p>
     <w:bookmarkEnd w:id="79"/>
@@ -4362,7 +4692,7 @@
         <w:t xml:space="preserve"> </w:t>
       </w:r>
       <w:r>
-        <w:t xml:space="preserve">: degré auquel le professionnel RH estime que l'IA améliorerait sa performance (gain de temps, qualité décisionnelle, productivité) et lui apporterait une valeur ajoutée par rapport au travail humain. Variable centrale du TAM (Davis, 1989), confirmée par la littérature empirique (Pillai &amp; Sivathanu, 2020 ; Vrontis et al., 2022) et enrichie de la dimension comparative entre IA et humain (Charlwood &amp; Guenole, 2022 ; Budhwar et al., 2022).</w:t>
+        <w:t xml:space="preserve">: degré auquel le professionnel RH estime que l'IA améliorerait sa performance (gain de temps, qualité décisionnelle, productivité) et lui apporterait une valeur ajoutée par rapport au travail humain. Variable centrale du TAM (Davis, 1989), confirmée par la littérature empirique (Pillai &amp; Sivathanu, 2020 ; Vrontis et al., 2022) et enrichie de la dimension comparative entre IA et humain (Budhwar et al., 2022 ; Charlwood &amp; Guenole, 2022).</w:t>
       </w:r>
     </w:p>
     <w:p>
@@ -4424,7 +4754,7 @@
         <w:t xml:space="preserve"> </w:t>
       </w:r>
       <w:r>
-        <w:t xml:space="preserve">: ressources organisationnelles, techniques et humaines mobilisables pour soutenir l'usage (budgets, infrastructures, formation, accompagnement). Variable propre à UTAUT (Venkatesh et al., 2003), elle y est la seule à porter sur le comportement d'usage plutôt que sur l'intention. Cette position traduit un enseignement établi au chapitre 1, l'écart robuste entre intention déclarée et usage effectif (Parry &amp; Tyson, 2011 ; Marler &amp; Fisher, 2013) : un professionnel peut former une intention favorable sans jamais la convertir en pratique, faute de moyens. La proposition P4 porte précisément sur cette conversion.</w:t>
+        <w:t xml:space="preserve">: ressources organisationnelles, techniques et humaines mobilisables pour soutenir l'usage (budgets, infrastructures, formation, accompagnement). Variable propre à UTAUT (Venkatesh et al., 2003), elle y est la seule à porter sur le comportement d'usage plutôt que sur l'intention. Cette position traduit un enseignement établi au chapitre 1, l'écart robuste entre intention déclarée et usage effectif (Marler &amp; Fisher, 2013 ; Parry &amp; Tyson, 2011) : un professionnel peut former une intention favorable sans jamais la convertir en pratique, faute de moyens. La proposition P4 porte précisément sur cette conversion.</w:t>
       </w:r>
     </w:p>
     <w:p>
@@ -4468,7 +4798,7 @@
         <w:t xml:space="preserve"> </w:t>
       </w:r>
       <w:r>
-        <w:t xml:space="preserve">: sentiments d'inconfort, de peur ou d'opposition associés à l'IA, enrichis de deux dimensions identitaires propres à l'IA en RH, la crainte du remplacement professionnel et la peur de la perte de valeur ajoutée humaine (Venkatesh &amp; Bala, 2008 ; Tambe et al., 2019 ; Charlwood &amp; Guenole, 2022). Comme l'auto-efficacité, l'anxiété est modélisée en antécédent : elle est associée négativement à la facilité d'usage perçue.</w:t>
+        <w:t xml:space="preserve">: anxiété éprouvée lors de la prise en main des outils d'IA ; comme l'auto-efficacité, elle est modélisée en antécédent, associée négativement à la facilité d'usage perçue (Venkatesh &amp; Bala, 2008). Les registres voisins que sont l'anxiété générale et les résistances suscitées par l'IA (famille RES), la crainte du remplacement professionnel (RMP) et la peur de la perte de valeur ajoutée humaine (VAH) constituent des freins directs distincts, rattachés à la proposition P5 (Charlwood &amp; Guenole, 2022 ; Tambe et al., 2019) : la littérature invite à ne pas les confondre avec l'anxiété de prise en main.</w:t>
       </w:r>
     </w:p>
     <w:bookmarkEnd w:id="80"/>
@@ -4586,7 +4916,7 @@
         <w:t xml:space="preserve"> </w:t>
       </w:r>
       <w:r>
-        <w:t xml:space="preserve">Cette variable recouvre la sensibilité aux risques de biais, de discrimination indirecte et de déshumanisation des décisions. Lee (2018) montre que, pour des tâches perçues comme « humaines » telles que recruter ou évaluer, une décision algorithmique est jugée moins équitable et suscite des émotions plus négatives qu'une décision identique rendue par un humain : la résistance engage des jugements normatifs sur ce qu'une machine est légitime à décider, non un simple déficit d'information. La revue systématique de Köchling et Wehner (2020) établit par ailleurs que les systèmes peuvent reproduire, voire amplifier, les biais de leurs données d'apprentissage, dont les cas emblématiques du chapitre 1 fournissent l'illustration ; Charlwood et Guenole (2022) théorisent ces tensions comme des paradoxes constitutifs que les professionnels doivent arbitrer en situation.</w:t>
+        <w:t xml:space="preserve">Cette variable recouvre la sensibilité aux risques de biais, de discrimination indirecte et de déshumanisation des décisions. M. K. Lee (2018) montre que, pour des tâches perçues comme « humaines » telles que recruter ou évaluer, une décision algorithmique est jugée moins équitable et suscite des émotions plus négatives qu'une décision identique rendue par un humain : la résistance engage des jugements normatifs sur ce qu'une machine est légitime à décider, non un simple déficit d'information. La revue systématique de Köchling et Wehner (2020) établit par ailleurs que les systèmes peuvent reproduire, voire amplifier, les biais de leurs données d'apprentissage, dont les cas emblématiques du chapitre 1 fournissent l'illustration ; Charlwood et Guenole (2022) théorisent ces tensions comme des paradoxes constitutifs que les professionnels doivent arbitrer en situation.</w:t>
       </w:r>
     </w:p>
     <w:p>
@@ -4604,7 +4934,10 @@
         <w:t xml:space="preserve"> </w:t>
       </w:r>
       <w:r>
-        <w:t xml:space="preserve">Tursunbayeva et al. (2022) montrent que ces préoccupations débordent la seule conformité juridique, risques d'atteinte à la vie privée, opacité des finalités, dérive des usages (</w:t>
+        <w:t xml:space="preserve">Tursunbayeva et al. (2022) montrent que ces préoccupations débordent la seule conformité juridique (risques d'atteinte à la vie privée, opacité des finalités, dérive des usages,</w:t>
+      </w:r>
+      <w:r>
+        <w:t xml:space="preserve"> </w:t>
       </w:r>
       <w:r>
         <w:rPr>
@@ -4614,7 +4947,7 @@
         <w:t xml:space="preserve">function creep</w:t>
       </w:r>
       <w:r>
-        <w:t xml:space="preserve">), la légitimité des dispositifs reposant sur le consentement éclairé des salariés et la gouvernance des données autant que sur la loi : la confidentialité est donc traitée comme un jugement de légitimité formé par le professionnel, non comme une contrainte externe. Le cadre marocain spécifie, à titre descriptif, les conditions concrètes de ce jugement : la loi 09-08, promulguée par le dahir n° 1-09-15 du 18 février 2009 et placée sous le contrôle de la CNDP, encadre les traitements de données personnelles, aucun texte spécifique à l'IA n'ayant été adopté à ce jour. Une question empirique en résulte, qui sera posée au terrain : la loi 09-08 est-elle, pour les professionnels de la région, une référence effectivement mobilisée dans leurs arbitrages, ou une norme connue de loin dont l'application concrète reste indéterminée ?</w:t>
+        <w:t xml:space="preserve">), la légitimité des dispositifs reposant sur le consentement éclairé des salariés et la gouvernance des données autant que sur la loi : la confidentialité est donc traitée comme un jugement de légitimité formé par le professionnel, non comme une contrainte externe. Le cadre marocain spécifie, à titre descriptif, les conditions concrètes de ce jugement : la loi 09-08, placée sous le contrôle de la CNDP, encadre les traitements de données personnelles, aucun texte spécifique à l'IA n'ayant été adopté à ce jour. Une question empirique en résulte, qui sera posée au terrain : la loi 09-08 est-elle, pour les professionnels de la région, une référence effectivement mobilisée dans leurs arbitrages, ou une norme connue de loin dont l'application concrète reste indéterminée ?</w:t>
       </w:r>
     </w:p>
     <w:p>
@@ -4758,7 +5091,7 @@
         <w:t xml:space="preserve"> </w:t>
       </w:r>
       <w:r>
-        <w:t xml:space="preserve">Le cadre intégrateur ne procède pas d'une addition de variables mais d'une réponse argumentée aux controverses laissées ouvertes par les deux chapitres. Aux quatre déterminants classiques, conservés parce que les acquis établis en section 1.5 leur donnent raison, s'ajoutent deux antécédents psychologiques hérités de TAM 3 et quatre variables propres à l'IA. Ces dernières répondent point par point à la controverse sur les réactions au jugement algorithmique, en traitant la confiance comme une variable conditionnelle plutôt que comme une disposition stable (Dietvorst et al., 2015 ; Logg et al., 2019 ; Glikson &amp; Woolley, 2020), et à la critique de la mise à l'écart de l'artefact, en réintroduisant l'opacité et ses effets sous les espèces de la transparence perçue (Shin, 2021), de l'équité perçue (Lee, 2018 ; Köchling &amp; Wehner, 2020) et de la légitimité du traitement des données (Tursunbayeva et al., 2022) : elles constituent le contenu de la proposition P6, apport conceptuel principal du mémoire. Les variables modératrices contextuelles tirent les conséquences de la lacune contextuelle établie au chapitre 1 : parce que le contenu même de l'influence sociale, des conditions facilitantes et du cadre légal varie selon les configurations institutionnelles (Budhwar et al., 2022 ; Dwivedi et al., 2019), elles fondent la proposition P7. Reste à assembler ces variables en une architecture de lecture explicite, objet de la section suivante.</w:t>
+        <w:t xml:space="preserve">Le cadre intégrateur ne procède pas d'une addition de variables mais d'une réponse argumentée aux controverses laissées ouvertes par les deux chapitres. Aux quatre déterminants classiques, conservés parce que les acquis établis en section 1.5 leur donnent raison, s'ajoutent deux antécédents psychologiques hérités de TAM 3 et quatre variables propres à l'IA. Ces dernières répondent point par point à la controverse sur les réactions au jugement algorithmique, en traitant la confiance comme une variable conditionnelle plutôt que comme une disposition stable (Dietvorst et al., 2015 ; Glikson &amp; Woolley, 2020 ; Logg et al., 2019), et à la critique de la mise à l'écart de l'artefact, en réintroduisant l'opacité et ses effets sous les espèces de la transparence perçue (Shin, 2021), de l'équité perçue (Köchling &amp; Wehner, 2020 ; M. K. Lee, 2018) et de la légitimité du traitement des données (Tursunbayeva et al., 2022) : elles constituent le contenu de la proposition P6, apport conceptuel principal du mémoire. Les variables modératrices contextuelles tirent les conséquences de la lacune contextuelle établie au chapitre 1 : parce que le contenu même de l'influence sociale, des conditions facilitantes et du cadre légal varie selon les configurations institutionnelles (Budhwar et al., 2022 ; Dwivedi et al., 2019), elles fondent la proposition P7. Reste à assembler ces variables en une architecture de lecture explicite, objet de la section suivante.</w:t>
       </w:r>
     </w:p>
     <w:bookmarkEnd w:id="82"/>
@@ -4861,7 +5194,7 @@
         <w:t xml:space="preserve"> </w:t>
       </w:r>
       <w:r>
-        <w:t xml:space="preserve">Quatre variables propres à l'IA sont directement associées à l'intention : la confiance envers les outils, la transparence et l'explicabilité perçues, la perception des risques éthiques et de l'équité des décisions, les préoccupations de confidentialité des données RH. Elles traduisent les spécificités de l'objet (opacité, dimension probabiliste, sensibilité éthique) et s'enracinent dans la littérature présentée en 2.4.3 (Mayer et al., 1995 ; Glikson &amp; Woolley, 2020 ; Dietvorst et al., 2015 ; Logg et al., 2019 ; Shin, 2021 ; Lee, 2018 ; Köchling &amp; Wehner, 2020 ; Tursunbayeva et al., 2022), relayée par les travaux consacrés à l'IA en RH (Tambe et al., 2019 ; Charlwood &amp; Guenole, 2022 ; Budhwar et al., 2022). Ce bloc constitue l'apport conceptuel principal du modèle.</w:t>
+        <w:t xml:space="preserve">Quatre variables propres à l'IA sont directement associées à l'intention : la confiance envers les outils, la transparence et l'explicabilité perçues, la perception des risques éthiques et de l'équité des décisions, les préoccupations de confidentialité des données RH. Elles traduisent les spécificités de l'objet (opacité, dimension probabiliste, sensibilité éthique) et s'enracinent dans la littérature présentée en 2.4.3 (Dietvorst et al., 2015 ; Glikson &amp; Woolley, 2020 ; Köchling &amp; Wehner, 2020 ; M. K. Lee, 2018 ; Logg et al., 2019 ; Mayer et al., 1995 ; Shin, 2021 ; Tursunbayeva et al., 2022), relayée par les travaux consacrés à l'IA en RH (Budhwar et al., 2022 ; Charlwood &amp; Guenole, 2022 ; Tambe et al., 2019). Ce bloc constitue l'apport conceptuel principal du modèle.</w:t>
       </w:r>
     </w:p>
     <w:p>
@@ -4993,7 +5326,17 @@
         <w:pStyle w:val="BodyText"/>
       </w:pPr>
       <w:r>
-        <w:t xml:space="preserve">La figure procède d'une élaboration de l'auteur à partir de Davis (1989), Venkatesh et al. (2003), Venkatesh et Bala (2008), Tambe et al. (2019), Charlwood et Guenole (2022) et Budhwar et al. (2022), enrichie des travaux mobilisés en section 2.4.3 pour les variables spécifiques à l'IA.</w:t>
+        <w:rPr>
+          <w:iCs/>
+          <w:i/>
+        </w:rPr>
+        <w:t xml:space="preserve">Note.</w:t>
+      </w:r>
+      <w:r>
+        <w:t xml:space="preserve"> </w:t>
+      </w:r>
+      <w:r>
+        <w:t xml:space="preserve">Élaboration de l'auteur à partir de Davis (1989), Venkatesh et al. (2003), Venkatesh et Bala (2008), Tambe et al. (2019), Charlwood et Guenole (2022) et Budhwar et al. (2022), enrichie des travaux mobilisés en section 2.4.3 pour les variables spécifiques à l'IA.</w:t>
       </w:r>
     </w:p>
     <w:bookmarkEnd w:id="87"/>
@@ -5178,7 +5521,7 @@
               <w:jc w:val="left"/>
             </w:pPr>
             <w:r>
-              <w:t xml:space="preserve">L'utilité perçue est le déterminant le plus constant de l'adoption, y compris pour l'IA en recrutement (Davis, 1989 ; Venkatesh et al., 2003 ; Pillai &amp; Sivathanu, 2020)</w:t>
+              <w:t xml:space="preserve">L'utilité perçue est le déterminant le plus constant de l'adoption, y compris pour l'IA en recrutement (Davis, 1989 ; Pillai &amp; Sivathanu, 2020 ; Venkatesh et al., 2003)</w:t>
             </w:r>
           </w:p>
         </w:tc>
@@ -5373,7 +5716,7 @@
               <w:jc w:val="left"/>
             </w:pPr>
             <w:r>
-              <w:t xml:space="preserve">L'écart entre intention et usage est robuste sur trois vagues technologiques et dépend des conditions organisationnelles (Parry &amp; Tyson, 2011 ; Marler &amp; Fisher, 2013 ; Bondarouk et al., 2017)</w:t>
+              <w:t xml:space="preserve">L'écart entre intention et usage est robuste sur trois vagues technologiques et dépend des conditions organisationnelles (Bondarouk et al., 2017 ; Marler &amp; Fisher, 2013 ; Parry &amp; Tyson, 2011)</w:t>
             </w:r>
           </w:p>
         </w:tc>
@@ -5414,19 +5757,19 @@
               <w:jc w:val="left"/>
             </w:pPr>
             <w:r>
-              <w:t xml:space="preserve">L'anxiété liée à l'usage, d'une part, la crainte du remplacement professionnel et la peur de la perte de valeur ajoutée humaine, d'autre part, sont perçues comme des freins majeurs, la première étant associée négativement à la facilité d'usage perçue</w:t>
-            </w:r>
-          </w:p>
-        </w:tc>
-        <w:tc>
-          <w:tcPr/>
-          <w:p>
-            <w:pPr>
-              <w:pStyle w:val="Compact"/>
-              <w:jc w:val="left"/>
-            </w:pPr>
-            <w:r>
-              <w:t xml:space="preserve">AX vers FU</w:t>
+              <w:t xml:space="preserve">L'anxiété liée à l'usage, d'une part, la crainte du remplacement professionnel et la peur de la perte de valeur ajoutée humaine, d'autre part, sont perçues comme des freins majeurs, en particulier chez les professionnels expérimentés</w:t>
+            </w:r>
+          </w:p>
+        </w:tc>
+        <w:tc>
+          <w:tcPr/>
+          <w:p>
+            <w:pPr>
+              <w:pStyle w:val="Compact"/>
+              <w:jc w:val="left"/>
+            </w:pPr>
+            <w:r>
+              <w:t xml:space="preserve">RES ; RMP ; VAH (l'anxiété de prise en main, AX-1, demeure rattachée à P2)</w:t>
             </w:r>
           </w:p>
         </w:tc>
@@ -5503,7 +5846,7 @@
               <w:jc w:val="left"/>
             </w:pPr>
             <w:r>
-              <w:t xml:space="preserve">La confiance, l'explicabilité, l'équité perçue et l'éthique des données sont documentées comme déterminantes hors du champ RH (Mayer et al., 1995 ; Glikson &amp; Woolley, 2020 ; Shin, 2021 ; Lee, 2018 ; Tursunbayeva et al., 2022)</w:t>
+              <w:t xml:space="preserve">La confiance, l'explicabilité, l'équité perçue et l'éthique des données sont documentées comme déterminantes hors du champ RH (Glikson &amp; Woolley, 2020 ; M. K. Lee, 2018 ; Mayer et al., 1995 ; Shin, 2021 ; Tursunbayeva et al., 2022)</w:t>
             </w:r>
           </w:p>
         </w:tc>
@@ -5544,7 +5887,7 @@
               <w:jc w:val="left"/>
             </w:pPr>
             <w:r>
-              <w:t xml:space="preserve">Les facteurs contextuels et organisationnels marocains (culture organisationnelle, maturité digitale, taille, cadre légal 09-08) enrichissent et nuancent le pouvoir explicatif des modèles classiques et peuvent faire émerger des déterminants absents de ces modèles</w:t>
+              <w:t xml:space="preserve">Les facteurs contextuels et organisationnels marocains (culture organisationnelle, maturité digitale, taille, cadre légal 09-08) enrichissent et nuancent le pouvoir explicatif des modèles classiques</w:t>
             </w:r>
           </w:p>
         </w:tc>
@@ -5568,19 +5911,19 @@
               <w:jc w:val="left"/>
             </w:pPr>
             <w:r>
-              <w:t xml:space="preserve">Les modèles ont été validés sur des environnements particuliers et leur transférabilité n'est pas acquise (Dwivedi et al., 2019 ; Budhwar et al., 2022 ; Bondarouk et al., 2017)</w:t>
-            </w:r>
-          </w:p>
-        </w:tc>
-        <w:tc>
-          <w:tcPr/>
-          <w:p>
-            <w:pPr>
-              <w:pStyle w:val="Compact"/>
-              <w:jc w:val="left"/>
-            </w:pPr>
-            <w:r>
-              <w:t xml:space="preserve">L'existence même de déterminants propres au terrain marocain, qu'aucune étude empirique locale ne permet aujourd'hui d'anticiper</w:t>
+              <w:t xml:space="preserve">Les modèles ont été validés sur des environnements particuliers et leur transférabilité n'est pas acquise (Bondarouk et al., 2017 ; Budhwar et al., 2022 ; Dwivedi et al., 2019)</w:t>
+            </w:r>
+          </w:p>
+        </w:tc>
+        <w:tc>
+          <w:tcPr/>
+          <w:p>
+            <w:pPr>
+              <w:pStyle w:val="Compact"/>
+              <w:jc w:val="left"/>
+            </w:pPr>
+            <w:r>
+              <w:t xml:space="preserve">L'existence même de déterminants propres au terrain marocain, qu'aucune étude empirique locale indexée dans les bases consultées (Annexe F) ne permet aujourd'hui d'anticiper</w:t>
             </w:r>
           </w:p>
         </w:tc>
@@ -5613,7 +5956,7 @@
         <w:pStyle w:val="FirstParagraph"/>
       </w:pPr>
       <w:r>
-        <w:t xml:space="preserve">Le statut de la proposition P7 mérite d'être souligné : les facteurs contextuels marocains n'y sont pas traités comme de simples variables de contrôle destinées à neutraliser des effets parasites, ils constituent un axe central de contribution potentielle de la recherche. Les modèles de la famille TAM/UTAUT ont été élaborés et validés, pour l'essentiel, dans des contextes occidentaux ; leur transférabilité à un terrain comme la région Souss-Massa ne va pas de soi (Dwivedi et al., 2019 ; Budhwar et al., 2022). Le terrain marocain peut faire émerger des facteurs absents des modèles : rapport spécifique à la légitimation managériale et à l'autorité hiérarchique, cultures d'entreprises familiales ou de filiales internationales, maturité digitale hétérogène, effets du cadre institutionnel (loi 09-08,</w:t>
+        <w:t xml:space="preserve">Le statut de la proposition P7 mérite d'être souligné : les facteurs contextuels marocains n'y sont pas traités comme de simples variables de contrôle destinées à neutraliser des effets parasites, ils constituent un axe central de contribution potentielle de la recherche. Les modèles de la famille TAM/UTAUT ont été élaborés et validés, pour l'essentiel, dans des contextes occidentaux ; leur transférabilité à un terrain comme la région Souss-Massa ne va pas de soi (Budhwar et al., 2022 ; Dwivedi et al., 2019). Le terrain marocain peut faire émerger des facteurs absents des modèles : rapport spécifique à la légitimation managériale et à l'autorité hiérarchique, cultures d'entreprises familiales ou de filiales internationales, maturité digitale hétérogène, effets du cadre institutionnel (loi 09-08,</w:t>
       </w:r>
       <w:r>
         <w:t xml:space="preserve"> </w:t>
@@ -5705,10 +6048,11 @@
     </w:p>
     <w:bookmarkEnd w:id="92"/>
     <w:bookmarkEnd w:id="93"/>
-    <w:bookmarkStart w:id="145" w:name="partie-ii.-méthodologie-de-la-recherche"/>
+    <w:bookmarkStart w:id="140" w:name="partie-ii.-méthodologie-de-la-recherche"/>
     <w:p>
       <w:pPr>
         <w:pStyle w:val="Heading1"/>
+        <w:pageBreakBefore/>
       </w:pPr>
       <w:r>
         <w:rPr>
@@ -5747,15 +6091,15 @@
         <w:pStyle w:val="BodyText"/>
       </w:pPr>
       <w:r>
-        <w:t xml:space="preserve">Celle-ci détaille le dispositif méthodologique retenu et s'organise en deux chapitres complémentaires. Le Chapitre 3 explicite le positionnement épistémologique post-positiviste de la recherche, en justifie la pertinence au regard de la problématique, présente le design global (une approche qualitative à logique déductive, déployée selon une stratégie d'étude qualitative à visée explicative) et caractérise le terrain de la région Souss-Massa. Le Chapitre 4 décrit pour sa part le dispositif opératoire : construction de l'échantillon raisonné, élaboration et test du guide d'entretien semi-directif, stratégie linguistique multilingue, conduite pratique des entretiens et considérations éthiques (loi marocaine 09-08, CNDP, RGPD). Il expose également la stratégie de triangulation des sources documentaires, la méthode d'analyse thématique de contenu structurée par une grille de codage déductive issue du cadre TAM/UTAUT, les outils logiciels mobilisés, la procédure de double codage assortie du calcul du coefficient kappa de Cohen, les critères de scientificité (Lincoln &amp; Guba, 1985) et la réflexivité du chercheur.</w:t>
-      </w:r>
-    </w:p>
-    <w:p>
-      <w:pPr>
-        <w:pStyle w:val="BodyText"/>
-      </w:pPr>
-      <w:r>
-        <w:t xml:space="preserve">L'ambition transversale de la partie est de garantir la cohérence interne entre épistémologie, design, terrain et analyse. Cette cohérence constitue une condition nécessaire de la validité scientifique d'une recherche qualitative (Paillé &amp; Mucchielli, 2016 ; Miles et al., 2014).</w:t>
+        <w:t xml:space="preserve">Celle-ci détaille le dispositif méthodologique retenu et s'organise en deux chapitres complémentaires. Le chapitre 3 explicite le positionnement épistémologique post-positiviste de la recherche, en justifie la pertinence au regard de la problématique, présente le design global (une approche qualitative à logique déductive, déployée selon une stratégie d'étude qualitative à visée explicative) et caractérise le terrain de la région Souss-Massa. Le chapitre 4 décrit pour sa part le dispositif opératoire : construction de l'échantillon raisonné, élaboration et test du guide d'entretien semi-directif, stratégie linguistique multilingue, conduite pratique des entretiens et considérations éthiques (loi marocaine 09-08, CNDP, RGPD). Il expose également la stratégie de triangulation des sources documentaires, la méthode d'analyse thématique de contenu structurée par une grille de codage déductive issue du cadre TAM/UTAUT, les outils logiciels mobilisés, la procédure de double codage assortie du calcul du coefficient kappa de Cohen, les critères de scientificité (Lincoln &amp; Guba, 1985) et la réflexivité du chercheur.</w:t>
+      </w:r>
+    </w:p>
+    <w:p>
+      <w:pPr>
+        <w:pStyle w:val="BodyText"/>
+      </w:pPr>
+      <w:r>
+        <w:t xml:space="preserve">L'ambition transversale de la partie est de garantir la cohérence interne entre épistémologie, design, terrain et analyse. Cette cohérence constitue une condition nécessaire de la validité scientifique d'une recherche qualitative (Miles et al., 2014 ; Paillé &amp; Mucchielli, 2016).</w:t>
       </w:r>
     </w:p>
     <w:bookmarkStart w:id="110" w:name="Xdbec6f382d40569fa3e169e16e6a40aea45a660"/>
@@ -5776,7 +6120,7 @@
         <w:pStyle w:val="FirstParagraph"/>
       </w:pPr>
       <w:r>
-        <w:t xml:space="preserve">Toute recherche repose sur des présupposés épistémologiques qui orientent la définition de l'objet, le choix des méthodes et l'interprétation des résultats (Thiétart, 2014 ; Paillé &amp; Mucchielli, 2016). Le présent chapitre explicite la posture adoptée, le post-positivisme au sens de Guba et Lincoln (1994), et en démontre la cohérence avec une démarche qualitative déductive structurée par le cadre TAM/UTAUT. Cinq sections déroulent les choix qui en découlent : les grands paradigmes en sciences de gestion (3.1), la justification du post-positivisme (3.2), le choix d'une approche qualitative (3.3), la stratégie d'étude à visée explicative (3.4) et le terrain de la région Souss-Massa (3.5). Conformément aux recommandations de Miles et al. (2014), ces décisions sont pensées comme un ensemble intégré, non comme une suite de choix indépendants.</w:t>
+        <w:t xml:space="preserve">Toute recherche repose sur des présupposés épistémologiques qui orientent la définition de l'objet, le choix des méthodes et l'interprétation des résultats (Paillé &amp; Mucchielli, 2016 ; Thiétart, 2014). Le présent chapitre explicite la posture adoptée, le post-positivisme au sens de Guba et Lincoln (1994), et en démontre la cohérence avec une démarche qualitative déductive structurée par le cadre TAM/UTAUT. Cinq sections déroulent les choix qui en découlent : les grands paradigmes en sciences de gestion (3.1), la justification du post-positivisme (3.2), le choix d'une approche qualitative (3.3), la stratégie d'étude à visée explicative (3.4) et le terrain de la région Souss-Massa (3.5). Conformément aux recommandations de Miles et al. (2014), ces décisions sont pensées comme un ensemble intégré, non comme une suite de choix indépendants.</w:t>
       </w:r>
     </w:p>
     <w:bookmarkStart w:id="96" w:name="Xba23fd5329e6f09212bca58821f6f55eae5a57c"/>
@@ -5920,7 +6264,7 @@
         <w:pStyle w:val="FirstParagraph"/>
       </w:pPr>
       <w:r>
-        <w:t xml:space="preserve">La recherche s'inscrit dans une démarche résolument déductive, structurée par le TAM (Davis, 1989), le TAM 3 (Venkatesh &amp; Bala, 2008) et l'UTAUT (Venkatesh et al., 2003), enrichis des travaux récents sur l'IA en RH (Tambe et al., 2019 ; Charlwood &amp; Guenole, 2022 ; Budhwar et al., 2022) : les sept propositions formulées en Partie I constituent autant d'énoncés falsifiables à confronter au terrain, la connaissance préexistante servant de grille structurante pour observer et interpréter le réel. La cohérence entre posture et démarche s'observe à trois niveaux. Au plan</w:t>
+        <w:t xml:space="preserve">La recherche s'inscrit dans une démarche résolument déductive, structurée par le TAM (Davis, 1989), le TAM 3 (Venkatesh &amp; Bala, 2008) et l'UTAUT (Venkatesh et al., 2003), enrichis des travaux récents sur l'IA en RH (Budhwar et al., 2022 ; Charlwood &amp; Guenole, 2022 ; Tambe et al., 2019) : les sept propositions formulées en Partie I constituent autant d'énoncés falsifiables à confronter au terrain, la connaissance préexistante servant de grille structurante pour observer et interpréter le réel. La cohérence entre posture et démarche s'observe à trois niveaux. Au plan</w:t>
       </w:r>
       <w:r>
         <w:t xml:space="preserve"> </w:t>
@@ -5959,7 +6303,7 @@
         <w:t xml:space="preserve">méthodologique</w:t>
       </w:r>
       <w:r>
-        <w:t xml:space="preserve">, le codage des entretiens est principalement déductif tout en autorisant l'émergence de codes complémentaires, démarche que Miles et al. (2014) qualifient d'hybride. Le post-positivisme tolère et valorise explicitement les approches qualitatives à logique déductive (Guba &amp; Lincoln, 1994 ; Creswell &amp; Poth, 2018) : le dispositif se distingue ainsi du positivisme strict, qui exigerait une démarche quantitative, comme du constructivisme, qui prohiberait toute pré-structuration théorique.</w:t>
+        <w:t xml:space="preserve">, le codage des entretiens est principalement déductif tout en autorisant l'émergence de codes complémentaires, démarche que Miles et al. (2014) qualifient d'hybride. Le post-positivisme tolère et valorise explicitement les approches qualitatives à logique déductive (Creswell &amp; Poth, 2018 ; Guba &amp; Lincoln, 1994) : le dispositif se distingue ainsi du positivisme strict, qui exigerait une démarche quantitative, comme du constructivisme, qui prohiberait toute pré-structuration théorique.</w:t>
       </w:r>
     </w:p>
     <w:bookmarkEnd w:id="97"/>
@@ -6033,7 +6377,7 @@
         <w:pStyle w:val="FirstParagraph"/>
       </w:pPr>
       <w:r>
-        <w:t xml:space="preserve">La problématique, qui interroge les facteurs associés, dans le discours des professionnels RH de la région Souss-Massa, à l'adoption ou à la non-adoption de l'IA au regard des dimensions classiques de l'acceptation et des spécificités propres à l'IA, appelle quatre arbitrages qu'une approche qualitative est seule à pouvoir mener de front. Il s'agit d'abord de saisir des représentations et des perceptions (utilité perçue, facilité d'usage, anxiété), par nature subjectives et difficilement réductibles à des échelles standardisées dans un contexte sous-investigué : les entretiens semi-directifs donnent un accès direct au discours des acteurs et à leur cadre interprétatif (Bardin, 2013 ; Paillé &amp; Mucchielli, 2016). Le phénomène étudié est ensuite émergent dans le contexte marocain : les usages y sont récents, hétérogènes, parfois incomplètement formalisés, et un questionnaire standardisé risquerait de présupposer des catégories d'usage qui n'existent pas encore localement. L'exploration des facteurs spécifiques à l'IA (P6) et des facteurs contextuels marocains (P7) exige en outre une investigation discursive approfondie : Tambe et al. (2019) soulignent la difficulté de capturer par questionnaire fermé les enjeux éthiques et de transparence des décisions algorithmiques, Charlwood et Guenole (2022) mettent en évidence des paradoxes (efficacité contre équité, augmentation contre remplacement) qui appellent le qualitatif, et Budhwar et al. (2022) plaident pour des recherches contextualisées sur la confiance et la confidentialité dans les économies émergentes. La sous-représentation des études qualitatives dans la littérature UTAUT (Williams et al., 2015) constitue enfin une lacune méthodologique que ce mémoire entend contribuer à combler.</w:t>
+        <w:t xml:space="preserve">La problématique, qui interroge les facteurs associés, dans le discours des professionnels RH de la région Souss-Massa, à l'adoption ou à la non-adoption de l'IA au regard des dimensions classiques de l'acceptation et des spécificités propres à l'IA, appelle quatre exigences qu'une approche qualitative est seule à pouvoir satisfaire de front. Il s'agit d'abord de saisir des représentations et des perceptions (utilité perçue, facilité d'usage, anxiété), par nature subjectives et difficilement réductibles à des échelles standardisées dans un contexte sous-investigué : les entretiens semi-directifs donnent un accès direct au discours des acteurs et à leur cadre interprétatif (Bardin, 2013 ; Paillé &amp; Mucchielli, 2016). Le phénomène étudié est ensuite émergent dans le contexte marocain : les usages y sont récents, hétérogènes, parfois incomplètement formalisés, et un questionnaire standardisé risquerait de présupposer des catégories d'usage qui n'existent pas encore localement. L'exploration des facteurs spécifiques à l'IA (P6) et des facteurs contextuels marocains (P7) exige en outre une investigation discursive approfondie : Tambe et al. (2019) soulignent la difficulté de capturer par questionnaire fermé les enjeux éthiques et de transparence des décisions algorithmiques, Charlwood et Guenole (2022) mettent en évidence des paradoxes (efficacité contre équité, augmentation contre remplacement) qui appellent le qualitatif, et Budhwar et al. (2022) plaident pour des recherches contextualisées sur la confiance et la confidentialité dans les économies émergentes. La sous-représentation des études qualitatives dans la littérature UTAUT (Williams et al., 2015) constitue enfin une lacune méthodologique que ce mémoire entend contribuer à combler.</w:t>
       </w:r>
     </w:p>
     <w:bookmarkEnd w:id="100"/>
@@ -6055,7 +6399,7 @@
         <w:pStyle w:val="FirstParagraph"/>
       </w:pPr>
       <w:r>
-        <w:t xml:space="preserve">L'approche qualitative permet de contextualiser les facteurs d'adoption, un même répondant pouvant nuancer fortement son rapport à l'utilité perçue selon le type d'outil considéré ; d'identifier des dimensions émergentes absentes du cadre initial, intégrables comme codes complémentaires, tel le poids symbolique du « tampon papier » dans certaines administrations ou la souveraineté des données ; d'interpréter enfin les silences, les hésitations et les contradictions du discours, données précieuses pour repérer les freins implicites, Pillai et Sivathanu (2020) observant ainsi, en contexte indien, des écarts entre discours managérial favorable et pratiques effectives. Une approche quantitative aurait permis de tester statistiquement la validité du modèle, mais sans cette finesse interprétative : le choix qualitatif est cohérent avec la problématique, le contexte et l'état de l'art méthodologique sur UTAUT.</w:t>
+        <w:t xml:space="preserve">L'approche qualitative permet de contextualiser les facteurs d'adoption, un même répondant pouvant nuancer fortement son rapport à l'utilité perçue selon le type d'outil considéré ; d'identifier des dimensions émergentes absentes du cadre initial, intégrables comme codes complémentaires, tels le poids symbolique du « tampon papier » dans certaines administrations ou la souveraineté des données ; d'interpréter enfin les silences, les hésitations et les contradictions du discours, données précieuses pour repérer les freins implicites, Pillai et Sivathanu (2020) observant ainsi, en contexte indien, des écarts entre discours managérial favorable et pratiques effectives. Une approche quantitative aurait permis de tester statistiquement la validité du modèle, mais sans cette finesse interprétative : le choix qualitatif est cohérent avec la problématique, le contexte et l'état de l'art méthodologique sur UTAUT.</w:t>
       </w:r>
     </w:p>
     <w:bookmarkEnd w:id="101"/>
@@ -7060,7 +7404,20 @@
         <w:t xml:space="preserve">HR business partner</w:t>
       </w:r>
       <w:r>
-        <w:t xml:space="preserve">, de chargé de recrutement et de chargé de formation. Ce scénario reflète le poids du secteur agricole et agro-industriel dans l'emploi régional ; il demeure prévisionnel, subordonné aux critères du Tableau 7, à l'accès réel au terrain et à la logique de saturation exposée plus bas, et l'échantillon effectivement réalisé sera décrit puis confronté à ce scénario dans la Partie III. Le statut de l'organisation (privée, semi-publique ou publique) est par ailleurs relevé pour chaque répondant, en complément du secteur d'activité.</w:t>
+        <w:t xml:space="preserve">, de chargé de recrutement et de chargé de formation. Ce scénario reflète le poids du secteur agricole et agro-industriel dans l'emploi régional ; il demeure prévisionnel, subordonné aux critères du Tableau 7, à l'accès réel au terrain et à la logique de saturation exposée plus bas, et l'échantillon effectivement réalisé sera décrit puis confronté à ce scénario dans la Partie III. Ce scénario n'atteint pas, en l'état, la cible souhaitable du Tableau 8 relative à la représentation de l'</w:t>
+      </w:r>
+      <w:r>
+        <w:rPr>
+          <w:iCs/>
+          <w:i/>
+        </w:rPr>
+        <w:t xml:space="preserve">offshoring</w:t>
+      </w:r>
+      <w:r>
+        <w:t xml:space="preserve"> </w:t>
+      </w:r>
+      <w:r>
+        <w:t xml:space="preserve">: cet écart serait corrigé si l'accès au terrain le permet et, à défaut, consigné au journal de bord puis discuté au titre des limites. Le statut de l'organisation (privée, semi-publique ou publique) est par ailleurs relevé pour chaque répondant, en complément du secteur d'activité.</w:t>
       </w:r>
     </w:p>
     <w:p>
@@ -7163,10 +7520,10 @@
           <w:bCs/>
           <w:b/>
         </w:rPr>
-        <w:t xml:space="preserve">12 à 20 répondants</w:t>
-      </w:r>
-      <w:r>
-        <w:t xml:space="preserve">, fourchette appuyée sur des repères empiriques convergents : Guest et al. (2006) montrent qu'environ douze entretiens suffisent à atteindre la saturation thématique dans un échantillon relativement homogène interrogé avec une grille structurée ; Miles et al. (2014) situent au-delà de vingt le seuil où le rendement marginal de chaque entretien supplémentaire devient négligeable. Le critère d'arrêt s'apprécie selon trois indicateurs : absence de nouveaux sous-thèmes lors des deux ou trois derniers entretiens, confirmation des catégories déjà identifiées par les nouveaux verbatims, couverture suffisante de la matrice de diversification. Si, à vingt entretiens, la saturation n'était pas atteinte sur une dimension donnée, un recrutement complémentaire ciblé serait engagé. La saturation ne se décrète pas : elle se documente, entretien après entretien, dans le journal de bord.</w:t>
+        <w:t xml:space="preserve">douze à vingt répondants</w:t>
+      </w:r>
+      <w:r>
+        <w:t xml:space="preserve">, fourchette appuyée sur des repères empiriques convergents : Guest et al. (2006) montrent qu'environ douze entretiens suffisent à atteindre la saturation thématique dans un échantillon relativement homogène interrogé avec une grille structurée ; Miles et al. (2014) situent au-delà de vingt le seuil où le rendement marginal de chaque entretien supplémentaire devient négligeable. L'échantillon visé étant délibérément hétérogène sur cinq axes, la borne basse de douze demeure indicative : l'arrêt reste conditionné à la saturation documentée dimension par dimension. Le critère d'arrêt s'apprécie selon trois indicateurs : absence de nouveaux sous-thèmes lors des deux ou trois derniers entretiens, confirmation des catégories déjà identifiées par les nouveaux verbatims, couverture suffisante de la matrice de diversification. Si, à vingt entretiens, la saturation n'était pas atteinte sur une dimension donnée, un recrutement complémentaire ciblé serait engagé. La saturation ne se décrète pas : elle se documente, entretien après entretien, dans le journal de bord.</w:t>
       </w:r>
     </w:p>
     <w:bookmarkEnd w:id="113"/>
@@ -7279,7 +7636,7 @@
         <w:t xml:space="preserve"> </w:t>
       </w:r>
       <w:r>
-        <w:t xml:space="preserve">(Paillé &amp; Mucchielli, 2016 ; Bardin, 2013) : seize</w:t>
+        <w:t xml:space="preserve">(Bardin, 2013 ; Paillé &amp; Mucchielli, 2016) : seize</w:t>
       </w:r>
       <w:r>
         <w:t xml:space="preserve"> </w:t>
@@ -7380,7 +7737,7 @@
         <w:t xml:space="preserve"> </w:t>
       </w:r>
       <w:r>
-        <w:t xml:space="preserve">: lorsque le répondant ne dispose que d'une heure, priorité aux thèmes 3 et 5, qui portent P1, P2, P5 et P6, thème 6 réduit aux relances de Q13, question réflexive maintenue en toute hypothèse. Le test pilote calibrera cet arbitrage.</w:t>
+        <w:t xml:space="preserve">: lorsque le répondant ne dispose que d'une heure, la priorité est donnée aux thèmes 3 et 5, qui portent P1, P2, P5 et P6 ; le thème 6 est réduit aux relances de Q13 et la question réflexive est maintenue en toute hypothèse. Le test pilote calibrera cet arbitrage.</w:t>
       </w:r>
     </w:p>
     <w:p>
@@ -7420,7 +7777,7 @@
         <w:pStyle w:val="FirstParagraph"/>
       </w:pPr>
       <w:r>
-        <w:t xml:space="preserve">Le Thème 5 concentre cinq des seize questions racines et près du tiers de la durée de l'entretien, déséquilibre délibéré que justifient deux arguments. Le premier est théorique : la proposition P6 recouvre quatre variables distinctes, construites séparément en section 2.4.3, la confiance envers les outils, la transparence et l'explicabilité perçues, la perception des risques éthiques et de l'équité, les préoccupations de confidentialité des données RH ; les traiter par une question unique reviendrait à présumer leur articulation, que la recherche entend précisément établir. Le second est méthodologique : sur la confiance, les biais ou l'éthique, les réponses de principe sont socialement attendues, nul professionnel ne déclarant se désintéresser des biais algorithmiques ; interroger frontalement ces dimensions produirait un discours normatif, homogène et peu informatif. Le guide les aborde donc par des situations vécues. La confiance est instruite par le récit de ce que le répondant a effectivement fait d'une recommandation algorithmique, avec relances sur l'observation éventuelle d'une erreur et sur l'évolution ultérieure de l'usage, ce qui éprouve la tension entre aversion et appréciation algorithmiques documentée au chapitre 2 (Dietvorst et al., 2015 ; Logg et al., 2019). La transparence est saisie par une situation de justification auprès d'un tiers et par ce que le répondant n'a pas su expliquer, opérationnalisation directe du mécanisme mis en évidence par Shin (2021). Les biais sont abordés par l'observation ou la crainte d'un résultat inéquitable, puis par les frontières normatives de la décision algorithmique, dans la ligne de Lee (2018) et de Köchling et Wehner (2020). La confidentialité est instruite par le récit d'une hésitation concrète avant de transmettre une donnée à un outil, qui donne accès à la portée réelle de la loi 09-08 dans les pratiques plutôt qu'à sa connaissance déclarative. La crainte du remplacement, enfin, est approchée par la part du travail jugée automatisable et par le récit d'une situation où ce sentiment a été éprouvé.</w:t>
+        <w:t xml:space="preserve">Le Thème 5 concentre cinq des seize questions racines et près du tiers de la durée de l'entretien, déséquilibre délibéré que justifient deux arguments. Le premier est théorique : la proposition P6 recouvre quatre variables distinctes, construites séparément en section 2.4.3, la confiance envers les outils, la transparence et l'explicabilité perçues, la perception des risques éthiques et de l'équité, les préoccupations de confidentialité des données RH ; les traiter par une question unique reviendrait à présumer leur articulation, que la recherche entend précisément établir. Le second est méthodologique : sur la confiance, les biais ou l'éthique, les réponses de principe sont socialement attendues, nul professionnel ne déclarant se désintéresser des biais algorithmiques ; interroger frontalement ces dimensions produirait un discours normatif, homogène et peu informatif. Le guide les aborde donc par des situations vécues. La confiance est instruite par le récit de ce que le répondant a effectivement fait d'une recommandation algorithmique, avec relances sur l'observation éventuelle d'une erreur et sur l'évolution ultérieure de l'usage, ce qui éprouve la tension entre aversion et appréciation algorithmiques documentée au chapitre 2 (Dietvorst et al., 2015 ; Logg et al., 2019). La transparence est saisie par une situation de justification auprès d'un tiers et par ce que le répondant n'a pas su expliquer, opérationnalisation directe du mécanisme mis en évidence par Shin (2021). Les biais sont abordés par l'observation ou la crainte d'un résultat inéquitable, puis par les frontières normatives de la décision algorithmique, dans la ligne de M. K. Lee (2018) et de Köchling et Wehner (2020). La confidentialité est instruite par le récit d'une hésitation concrète avant de transmettre une donnée à un outil, qui donne accès à la portée réelle de la loi 09-08 dans les pratiques plutôt qu'à sa connaissance déclarative. La crainte du remplacement, enfin, est approchée par la part du travail jugée automatisable et par le récit d'une situation où ce sentiment a été éprouvé.</w:t>
       </w:r>
     </w:p>
     <w:bookmarkEnd w:id="116"/>
@@ -8053,7 +8410,7 @@
         <w:pStyle w:val="BodyText"/>
       </w:pPr>
       <w:r>
-        <w:t xml:space="preserve">La lecture du tableau appelle quatre commentaires. P1 et P2 mobilisent le noyau du TAM (Davis, 1989), enrichi pour P2 de l'auto-efficacité au sens de Compeau et Higgins (1995) et de l'anxiété d'usage intégrée par le TAM 3 (Venkatesh &amp; Bala, 2008) ; P3 et P4 renvoient aux dimensions sociales et organisationnelles de l'UTAUT (Venkatesh et al., 2003), la légitimation managériale prolongeant l'influence sociale. La famille VAH apparaît deux fois : la valeur ajoutée humaine est interrogée positivement en Q4, à travers les situations de non-recours délibéré, et négativement en Q12, comme valeur menacée, ce qui permettra de confronter les deux versants d'un même construit. Le poids du Thème 5 traduit la centralité des facteurs IA-spécifiques dans la contribution attendue du mémoire. P7, enfin, opérationnalise les facteurs contextuels marocains dans la filiation des extensions contextuelles du cadre (Venkatesh et al., 2012 ; Dwivedi et al., 2019). Les questions hors tableau remplissent des fonctions complémentaires : Q1 (codes PRO), Q2 et Q3 (REP, USG) assurent l'échauffement et le cadrage empirique ; Q14 (PRO-FUT) nourrit la mise en perspective managériale ; Q15 (HIE) produit le matériau du § 4.2.3 ; Q16 (EM) constitue l'espace dédié à l'émergence. La matrice détaillée question par question figure en Annexe D, le rappel synthétique en section 2.5 ; les trois présentations sont strictement cohérentes entre elles.</w:t>
+        <w:t xml:space="preserve">La lecture du tableau appelle quatre commentaires. P1 et P2 mobilisent le noyau du TAM (Davis, 1989), enrichi pour P2 de l'auto-efficacité au sens de Compeau et Higgins (1995) et de l'anxiété d'usage intégrée par le TAM 3 (Venkatesh &amp; Bala, 2008) ; P3 et P4 renvoient aux dimensions sociales et organisationnelles de l'UTAUT (Venkatesh et al., 2003), la légitimation managériale prolongeant l'influence sociale. La famille VAH apparaît deux fois : la valeur ajoutée humaine est interrogée positivement en Q4, à travers les situations de non-recours délibéré, et négativement en Q12, comme valeur menacée, ce qui permettra de confronter les deux versants d'un même construit. Le poids du Thème 5 traduit la centralité des facteurs IA-spécifiques dans la contribution attendue du mémoire. P7, enfin, opérationnalise les facteurs contextuels marocains dans la filiation des extensions contextuelles du cadre (Dwivedi et al., 2019 ; Venkatesh et al., 2012). Les questions hors tableau remplissent des fonctions complémentaires : Q1 (codes PRO), Q2 et Q3 (REP, USG) assurent l'échauffement et le cadrage empirique ; Q14 (PRO-FUT) nourrit la mise en perspective managériale ; Q15 (HIE) produit le matériau du § 4.2.3 ; Q16 (EM) constitue l'espace dédié à l'émergence. La matrice détaillée question par question figure en Annexe D, le rappel synthétique en section 2.5 ; les trois présentations sont strictement cohérentes entre elles.</w:t>
       </w:r>
     </w:p>
     <w:bookmarkEnd w:id="118"/>
@@ -8153,7 +8510,7 @@
         <w:pStyle w:val="FirstParagraph"/>
       </w:pPr>
       <w:r>
-        <w:t xml:space="preserve">La prise de contact s'opère par message écrit accompagné de la lettre de présentation de la recherche (Annexe B), qui précise l'identité du chercheur et son institution de rattachement, l'objet et le cadre académique de la recherche, les critères de participation, la durée et les modalités de l'entretien, les garanties éthiques et les coordonnées permettant un échange préalable ; un rendez-vous est ensuite fixé selon la disponibilité du répondant, avec un rappel 48 heures avant l'échéance. La collecte est planifiée sur trois à quatre mois, entre l'été et l'automne 2026 : cet étalement permet l'analyse itérative en parallèle de la collecte (cf. § 4.4.2) et absorbe la saisonnalité du terrain, la période estivale mobilisant fortement les fonctions RH du tourisme et de l'hôtellerie régionale. Les entretiens sont conduits, au choix du répondant, en présentiel, privilégié parce qu'il facilite l'observation des dimensions non verbales qui constituent des données qualitatives à part entière, ou par visioconférence sécurisée lorsque l'éloignement, l'agenda ou les préférences du répondant l'exigent. Dans les deux cas, la durée cible est de 75 minutes, dans une fourchette de 70 à 90 minutes ; l'entretien débute par le préambule oral décrit plus haut, suivi du recueil du consentement écrit, l'enregistrement ne démarrant qu'après ce recueil.</w:t>
+        <w:t xml:space="preserve">La prise de contact s'opère par message écrit accompagné de la lettre de présentation de la recherche (Annexe B), qui précise l'identité du chercheur et son institution de rattachement, l'objet et le cadre académique de la recherche, les critères de participation, la durée et les modalités de l'entretien, les garanties éthiques et les coordonnées permettant un échange préalable ; un rendez-vous est ensuite fixé selon la disponibilité du répondant, avec un rappel 48 heures avant l'échéance. La collecte est planifiée sur trois à quatre mois, entre l'été et l'automne 2026 : cet étalement permet l'analyse itérative en parallèle de la collecte (cf. § 4.4.2) et absorbe la saisonnalité du terrain, la période estivale mobilisant fortement les fonctions RH du tourisme et de l'hôtellerie régionale. Les entretiens sont conduits, au choix du répondant, en présentiel, privilégié parce qu'il facilite l'observation des dimensions non verbales qui constituent des données qualitatives à part entière, ou par visioconférence sécurisée lorsque l'éloignement, l'agenda ou les préférences du répondant l'exigent. Dans les deux cas, la durée cible est de 75 minutes, dans une fourchette de 70 à 90 minutes ; l'entretien débute par le préambule oral décrit plus haut, suivi du recueil du consentement écrit, l'enregistrement ne démarrant qu'après ce recueil ou, dans le cas d'exception prévu au § 4.3.3, qu'après le recueil oral du consentement clause par clause.</w:t>
       </w:r>
     </w:p>
     <w:bookmarkEnd w:id="121"/>
@@ -8233,7 +8590,7 @@
         <w:pStyle w:val="BodyText"/>
       </w:pPr>
       <w:r>
-        <w:t xml:space="preserve">La retranscription est intégrale et pseudonymisée. Les noms de personnes, d'entreprises et d'outils susceptibles d'identifier le répondant sont remplacés par des codes (R1 à Rn pour les répondants, E1 et suivants pour les entreprises) ; la table de correspondance est conservée à part, chiffrée, accessible au seul chercheur, et détruite au plus tard un mois après la soutenance, moment au-delà duquel le retrait individuel des données ne peut techniquement plus être exécuté, ce dont les répondants sont informés. Le terme de pseudonymisation est retenu à dessein : tant que cette table existe, le rapprochement avec l'identité du répondant demeure possible pour le seul chercheur, ce qui ne constitue pas une anonymisation irréversible. La retranscription est effectuée manuellement ou à l'aide d'un outil de transcription automatique exécuté localement (par exemple Whisper), de manière à ce qu'aucun enregistrement ne transite par un service tiers, puis systématiquement relue ; les combinaisons rares de caractéristiques susceptibles de permettre une réidentification indirecte sont masquées ou agrégées dans le mémoire. Les destinataires des données se limitent au chercheur, à l'encadrante du mémoire pour la supervision, au second codeur pour le sous-corpus pseudonymisé du double codage, sous engagement écrit de confidentialité, et au jury pour les extraits cités dans le volume. Les fichiers audio, stockés sur un support chiffré, sont détruits au plus tard trois mois après la soutenance ; les retranscriptions pseudonymisées et les exports d'analyse sont conservés cinq ans à des fins de vérification académique, sauf exigence contraire de l'établissement, puis supprimés ; les formulaires de consentement sont archivés séparément pendant la durée de preuve requise. Ces durées, définies par catégorie de données, sont rappelées dans la lettre de présentation et le formulaire de consentement.</w:t>
+        <w:t xml:space="preserve">La retranscription est intégrale et pseudonymisée. Les noms de personnes, d'entreprises et d'outils susceptibles d'identifier le répondant sont remplacés par des codes (R1 à Rn pour les répondants, E1 et suivants pour les entreprises) ; la table de correspondance est conservée à part, chiffrée, accessible au seul chercheur, et détruite au plus tard un mois après la soutenance, moment au-delà duquel le retrait individuel des données ne peut techniquement plus être exécuté, ce dont les répondants sont informés. Le terme de pseudonymisation est retenu à dessein : tant que cette table existe, le rapprochement avec l'identité du répondant demeure possible pour le seul chercheur, ce qui ne constitue pas une anonymisation irréversible. La retranscription est effectuée manuellement ou à l'aide d'un outil de transcription automatique exécuté localement (par exemple Whisper), de manière à ce qu'aucun enregistrement ne transite par un service tiers, puis systématiquement relue ; les combinaisons rares de caractéristiques susceptibles de permettre une réidentification indirecte sont masquées ou agrégées dans le mémoire. Les destinataires des données se limitent au chercheur, à l'encadrante du mémoire pour la supervision, au second codeur pour le sous-corpus pseudonymisé du double codage, sous engagement écrit de confidentialité, et au jury pour les extraits cités dans le volume. Les fichiers audio, stockés sur un support chiffré, sont détruits au plus tard trois mois après la soutenance ; les retranscriptions pseudonymisées et les exports d'analyse sont conservés cinq ans à des fins de vérification académique, sauf exigence contraire de l'établissement, puis supprimés ; les formulaires de consentement sont archivés séparément pendant cinq ans, durée de preuve retenue par défaut et ajustable selon les exigences de l'établissement. Ces durées, définies par catégorie de données, sont rappelées dans la lettre de présentation et le formulaire de consentement.</w:t>
       </w:r>
     </w:p>
     <w:bookmarkEnd w:id="122"/>
@@ -8255,7 +8612,7 @@
         <w:pStyle w:val="FirstParagraph"/>
       </w:pPr>
       <w:r>
-        <w:t xml:space="preserve">Chaque répondant signe un formulaire de consentement éclairé (Annexe C), établi en deux exemplaires. À titre d'exception, lorsque la signature est matériellement impossible, le consentement est recueilli oralement en début d'enregistrement, clause par clause, l'exception étant consignée au journal de bord et le formulaire signé régularisé dès que possible. Le formulaire précise l'objet académique et non commercial de la recherche, les modalités de l'entretien, le droit de retrait à tout moment et sans justification, avec destruction des données déjà collectées, la pseudonymisation systématique dans le mémoire final, la confidentialité de l'enregistrement, les destinataires possibles des résultats et les coordonnées du chercheur.</w:t>
+        <w:t xml:space="preserve">Chaque répondant signe un formulaire de consentement éclairé (Annexe C), établi en deux exemplaires. À titre d'exception, lorsque la signature est matériellement impossible, le consentement est recueilli oralement en début d'enregistrement, clause par clause, l'exception étant consignée au journal de bord et le formulaire signé régularisé dès que possible. Le formulaire précise l'objet académique et non commercial de la recherche, les modalités de l'entretien, le droit de retrait à tout moment et sans justification, dans la limite temporelle liée à la destruction de la table de correspondance (cf. § 4.3.2), avec destruction des données déjà collectées, la pseudonymisation systématique dans le mémoire final, la confidentialité de l'enregistrement, les destinataires possibles des résultats et les coordonnées du chercheur.</w:t>
       </w:r>
     </w:p>
     <w:p>
@@ -8279,7 +8636,7 @@
         <w:t xml:space="preserve"> </w:t>
       </w:r>
       <w:r>
-        <w:t xml:space="preserve">relative à la protection des personnes physiques à l'égard du traitement des données à caractère personnel, promulguée par le Dahir n° 1-09-15 du 18 février 2009, ainsi qu'à son décret d'application et aux délibérations de la CNDP. Six principes structurent cette conformité : la finalité explicite ; la minimisation, seuls les verbatims pseudonymisés et des métadonnées de profil agrégées étant conservés ; la loyauté et la transparence ; le consentement libre, spécifique et éclairé ; la sécurité et la confidentialité, par stockage chiffré, accès restreint et destruction programmée par catégorie de données ; les droits d'accès, de rectification et d'opposition, chaque répondant pouvant à tout moment consulter sa retranscription, la faire modifier ou la retirer du corpus. Pour les répondants ressortissants de l'Union européenne ou exerçant dans une filiale de groupe européen, la conformité au RGPD (Règlement (UE) 2016/679) est également assurée, les principes des deux régimes convergeant largement. Le traitement projeté fait l'objet, avant toute collecte, de la formalité préalable requise auprès de la CNDP, déclaration ou autorisation selon le régime applicable, déposée par le responsable du traitement identifié dans le dossier ; aucun entretien n'est conduit avant l'obtention du récépissé ou de l'autorisation, dont les références sont reportées dans la lettre de présentation et le formulaire de consentement, le protocole de recherche, la note d'information et le formulaire faisant partie des pièces du dossier. Ce cadre n'est pas qu'une contrainte externe : la sensibilité des données RH et la conformité à la loi 09-08 figurent parmi les objets mêmes de l'enquête (P6 et P7), et le sérieux du dispositif éthique participe de la crédibilité du chercheur auprès de répondants professionnellement avertis de ces questions.</w:t>
+        <w:t xml:space="preserve">relative à la protection des personnes physiques à l'égard du traitement des données à caractère personnel, promulguée par le Dahir n° 1-09-15 du 18 février 2009, ainsi qu'à son décret d'application et aux délibérations de la CNDP. Six principes structurent cette conformité : la finalité explicite ; la minimisation, seuls les verbatims pseudonymisés et des métadonnées de profil agrégées étant conservés ; la loyauté et la transparence ; le consentement libre, spécifique et éclairé ; la sécurité et la confidentialité, par stockage chiffré, accès restreint et destruction programmée par catégorie de données ; les droits d'accès, de rectification et d'opposition, chaque répondant pouvant, dans la même limite temporelle, consulter sa retranscription, la faire modifier ou la retirer du corpus. Pour les répondants ressortissants de l'Union européenne ou exerçant dans une filiale de groupe européen, la conformité au RGPD (Règlement (UE) 2016/679) est également assurée, les principes des deux régimes convergeant largement. Le traitement projeté fait l'objet, avant toute collecte, de la formalité préalable requise auprès de la CNDP, déclaration ou autorisation selon le régime applicable, déposée par le responsable du traitement identifié dans le dossier ; aucun entretien n'est conduit avant l'obtention du récépissé ou de l'autorisation, dont les références sont reportées dans la lettre de présentation et le formulaire de consentement, le protocole de recherche, la note d'information et le formulaire faisant partie des pièces du dossier. Ce cadre n'est pas qu'une contrainte externe : la sensibilité des données RH et la conformité à la loi 09-08 figurent parmi les objets mêmes de l'enquête (P6 et P7), et le sérieux du dispositif éthique participe de la crédibilité du chercheur auprès de répondants professionnellement avertis de ces questions.</w:t>
       </w:r>
     </w:p>
     <w:bookmarkEnd w:id="123"/>
@@ -8605,7 +8962,7 @@
         <w:t xml:space="preserve"> </w:t>
       </w:r>
       <w:r>
-        <w:t xml:space="preserve">à partir des dimensions du cadre TAM/UTAUT enrichi et des sept propositions. Elle se décline en treize familles de codes analytiques subdivisées en sous-codes opérationnels, complétées par les codes descriptifs de contexte (PRO, REP, USG, PRO-FUT), la famille réflexive HIE issue de la question de clôture et les codes émergents EM. Aux familles issues du noyau TAM/UTAUT (UP, FU, AE, AX, IS, CF) s'ajoutent celles qui opérationnalisent les enrichissements du modèle conceptuel : VAH (valeur ajoutée humaine) pour P1, MNG (légitimation managériale) pour P3, RMP (remplacement) pour P5, CT (confiance et transparence), RIS (risques éthiques) et CFD (confidentialité des données) pour les facteurs IA-spécifiques de P6, et CTX pour les facteurs contextuels marocains de P7. Le Tableau 10 en présente un extrait centré sur ces familles distinctives ; la grille complète, avec les définitions opérationnelles de chaque sous-code et leurs ancrages théoriques, figure en Annexe E.</w:t>
+        <w:t xml:space="preserve">à partir des dimensions du cadre TAM/UTAUT enrichi et des sept propositions. Elle se décline en treize familles de codes analytiques subdivisées en sous-codes opérationnels, complétées par les codes descriptifs de contexte (PRO, REP, USG, PRO-FUT), la famille réflexive HIE issue de la question de clôture et les codes émergents EM. Aux familles issues du noyau TAM/UTAUT (UP, FU, AE, AX, IS, CF) s'ajoutent celles qui opérationnalisent les enrichissements du modèle conceptuel : VAH (valeur ajoutée humaine) pour P1, MNG (légitimation managériale) pour P3, RMP (remplacement) pour P5, CT (confiance et transparence), RIS (risques éthiques) et CFD (confidentialité des données) pour les facteurs IA-spécifiques de P6, et CTX pour les facteurs contextuels marocains de P7. Le Tableau 10 en présente un extrait centré sur ces familles distinctives ; la grille complète, avec les définitions opérationnelles de chaque sous-code et leurs ancrages théoriques, figure en Annexe E, où la famille USG est en outre déclinée en six sous-codes (USG-1 à USG-6) reprenant l'échelle d'états d'usage définie par l'objectif OS1, du non-usage sans intention à l'abandon.</w:t>
       </w:r>
     </w:p>
     <w:p>
@@ -9036,7 +9393,20 @@
         <w:t xml:space="preserve"> </w:t>
       </w:r>
       <w:r>
-        <w:t xml:space="preserve">mobilisée au chapitre 2. Les familles CT, RIS et CFD isolent ce qui relève spécifiquement de l'IA : elles permettront de mesurer, en discussion, la contribution distinctive des facteurs IA-spécifiques au pouvoir explicatif du modèle, conformément aux recommandations de Tambe et al. (2019) et de Charlwood et Guenole (2022). La grille est affinée à l'issue des trois premiers entretiens codés puis stabilisée, la version stabilisée étant celle de l'Annexe E. La démarche, principalement déductive, reste ouverte aux</w:t>
+        <w:t xml:space="preserve">mobilisée au chapitre 2. Les familles CT, RIS et CFD isolent ce qui relève spécifiquement de l'IA : elles permettront de mesurer, en discussion, la contribution distinctive des facteurs IA-spécifiques au pouvoir explicatif du modèle, conformément aux recommandations de Tambe et al. (2019) et de Charlwood et Guenole (2022). La grille sera affinée à l'issue des trois premiers entretiens codés, puis stabilisée : la version reproduite en Annexe E est la grille</w:t>
+      </w:r>
+      <w:r>
+        <w:t xml:space="preserve"> </w:t>
+      </w:r>
+      <w:r>
+        <w:rPr>
+          <w:iCs/>
+          <w:i/>
+        </w:rPr>
+        <w:t xml:space="preserve">a priori</w:t>
+      </w:r>
+      <w:r>
+        <w:t xml:space="preserve">, la version stabilisée étant destinée à la version finale du mémoire. La démarche, principalement déductive, reste ouverte aux</w:t>
       </w:r>
       <w:r>
         <w:t xml:space="preserve"> </w:t>
@@ -9111,7 +9481,7 @@
         <w:t xml:space="preserve">double codage indépendant</w:t>
       </w:r>
       <w:r>
-        <w:t xml:space="preserve">, appliqué à 25 % du corpus, soit trois à cinq entretiens selon la taille finale de l'échantillon. Le sous-corpus est stratifié de manière à couvrir les langues d'entretien, les grands secteurs et les types de profils, un tirage aléatoire étant opéré à l'intérieur de ces strates. L'unité de codage est le segment de sens, portion de verbatim porteuse d'une idée identifiable ; un même segment peut recevoir plusieurs codes, et les segments qui ne relèvent d'aucun code reçoivent la mention explicite « hors grille », qui entre dans le calcul de l'accord. Le second codeur est un pair chercheur extérieur à l'encadrement du mémoire, désigné avant le début de la collecte ; il signe un engagement écrit de confidentialité, figure à ce titre parmi les destinataires des données pseudonymisées (cf. § 4.3.2), et sa formation préalable à la grille fait l'objet d'une séance dédiée.</w:t>
+        <w:t xml:space="preserve">, appliqué à 25 % du corpus, soit trois à cinq entretiens selon la taille finale de l'échantillon. Le sous-corpus est stratifié de manière à couvrir les langues d'entretien, les grands secteurs et les types de profils, un tirage aléatoire étant opéré à l'intérieur de ces strates. L'unité de codage est le segment de sens, portion de verbatim porteuse d'une idée identifiable ; la segmentation du sous-corpus est arrêtée en amont et imposée aux deux codeurs, seul l'étiquetage étant indépendant ; un même segment peut recevoir plusieurs codes, et les segments qui ne relèvent d'aucun code reçoivent la mention explicite « hors grille », qui entre dans le calcul de l'accord. Le second codeur est un pair chercheur extérieur à l'encadrement du mémoire, désigné avant le début de la collecte ; il signe un engagement écrit de confidentialité, figure à ce titre parmi les destinataires des données pseudonymisées (cf. § 4.3.2), et sa formation préalable à la grille fait l'objet d'une séance dédiée.</w:t>
       </w:r>
     </w:p>
     <w:p>
@@ -9135,7 +9505,7 @@
         <w:t xml:space="preserve"> </w:t>
       </w:r>
       <w:r>
-        <w:t xml:space="preserve">(Cohen, 1960) est calculé sur ce sous-corpus, avec un seuil d'acceptabilité fixé à κ ≥ 0,70, appuyé sur l'échelle de Landis et Koch (1977), qui qualifient de « substantiel » un accord compris entre 0,61 et 0,80. Le calcul est conduit dimension par dimension (P1 à P7, familles CT, RES, RIS, CFD, MNG et RMP incluses), afin de localiser les éventuelles fragilités du codage plutôt que de les diluer dans un score global. En cas de kappa inférieur au seuil sur une dimension, une procédure de résolution est engagée : discussion entre les codeurs sur les sources de divergence, reformulation des définitions opérationnelles concernées, re-codage du sous-corpus avec la grille révisée, recalcul du kappa. Le kappa initial et le kappa obtenu après révision sont l'un et l'autre rapportés dans la Partie III, avec les divergences persistantes et les éventuels effets de prévalence : l'itération ne vise pas à franchir mécaniquement le seuil, mais à stabiliser des définitions dont l'instabilité éventuelle constitue en elle-même un enseignement. Chaque cycle est tracé dans le journal de bord ; si le seuil demeurait hors d'atteinte sur une dimension après deux itérations, la discussion des résultats le signalerait explicitement et entourerait l'interprétation de cette dimension des précautions requises. Ce dispositif complète les deux triangulations du § 4.4.1 : ensemble, ils soutiennent la crédibilité, la fiabilité et la confirmabilité de l'analyse.</w:t>
+        <w:t xml:space="preserve">(Cohen, 1960) est calculé sur ce sous-corpus, avec un seuil d'acceptabilité fixé à κ ≥ 0,70, appuyé sur l'échelle de Landis et Koch (1977), où un accord compris entre 0,61 et 0,80 est qualifié de « substantiel ». Le calcul est conduit dimension par dimension (P1 à P7, familles CT, RES, RIS, CFD, MNG et RMP incluses), afin de localiser les éventuelles fragilités du codage plutôt que de les diluer dans un score global. En cas de kappa inférieur au seuil sur une dimension, une procédure de résolution est engagée : discussion entre les codeurs sur les sources de divergence, reformulation des définitions opérationnelles concernées, re-codage du sous-corpus avec la grille révisée, recalcul du kappa. Le kappa initial et le kappa obtenu après révision sont l'un et l'autre rapportés dans la Partie III, avec les divergences persistantes et les éventuels effets de prévalence : l'itération ne vise pas à franchir mécaniquement le seuil, mais à stabiliser des définitions dont l'instabilité éventuelle constitue en elle-même un enseignement. Chaque cycle est tracé dans le journal de bord ; si le seuil demeurait hors d'atteinte sur une dimension après deux itérations, la discussion des résultats le signalerait explicitement et entourerait l'interprétation de cette dimension des précautions requises. Ce dispositif complète les deux triangulations du § 4.4.1 : ensemble, ils soutiennent la crédibilité, la fiabilité et la confirmabilité de l'analyse.</w:t>
       </w:r>
     </w:p>
     <w:bookmarkEnd w:id="132"/>
@@ -9271,7 +9641,7 @@
         <w:pStyle w:val="FirstParagraph"/>
       </w:pPr>
       <w:r>
-        <w:t xml:space="preserve">La rigueur d'une recherche qualitative passe par l'explicitation de la position du chercheur vis-à-vis de son objet et de son terrain (Paillé &amp; Mucchielli, 2016 ; Miles et al., 2014). Le positionnement est ici partiellement</w:t>
+        <w:t xml:space="preserve">La rigueur d'une recherche qualitative passe par l'explicitation de la position du chercheur vis-à-vis de son objet et de son terrain (Miles et al., 2014 ; Paillé &amp; Mucchielli, 2016). Le positionnement est ici partiellement</w:t>
       </w:r>
       <w:r>
         <w:t xml:space="preserve"> </w:t>
@@ -9357,7 +9727,7 @@
         <w:pStyle w:val="FirstParagraph"/>
       </w:pPr>
       <w:r>
-        <w:t xml:space="preserve">Six limites principales sont anticipées, chacune assortie de ses atténuations : la limite d'échantillon, 12 à 20 répondants ne constituant pas un échantillon statistiquement représentatif des professionnels RH du Souss-Massa, la transférabilité restant à éprouver par des recherches complémentaires ; le biais de désirabilité sociale, les répondants pouvant valoriser leur usage de l'IA ou au contraire le minimiser, atténué par la garantie de pseudonymisation, la formulation ouverte des questions et l'attention aux contradictions discursives ; le biais d'auto-déclaration, le discours sur les usages ne se confondant pas avec les usages effectifs, atténué par la demande systématique d'illustrations concrètes et le croisement avec les documents organisationnels (cf. § 4.4.1) ; le biais de l'enquêteur, atténué par la réflexivité documentée, le guide structuré, le double codage et la supervision de l'encadrante ; le biais de sélection par boule de neige, atténué par le panachage des cinq canaux d'accès et le suivi actif de la matrice de diversification ; les limites du cadre TAM/UTAUT enrichi, la grille déductive pouvant sous-estimer des dimensions hors cadre telles que les dynamiques identitaires profondes, les processus organisationnels longitudinaux ou les effets de génération, atténuées par l'ouverture aux codes émergents (cf. § 4.4.3) et la confrontation aux apports récents de la littérature (Tambe et al., 2019 ; Charlwood &amp; Guenole, 2022 ; Budhwar et al., 2022). Ces limites ne disqualifient pas la recherche : elles en délimitent la portée, et elles sont reprises dans la conclusion générale du mémoire.</w:t>
+        <w:t xml:space="preserve">Six limites principales sont anticipées, chacune assortie de ses atténuations : la limite d'échantillon, douze à vingt répondants ne constituant pas un échantillon statistiquement représentatif des professionnels RH du Souss-Massa, la transférabilité restant à éprouver par des recherches complémentaires ; le biais de désirabilité sociale, les répondants pouvant valoriser leur usage de l'IA ou au contraire le minimiser, atténué par la garantie de pseudonymisation, la formulation ouverte des questions et l'attention aux contradictions discursives ; le biais d'auto-déclaration, le discours sur les usages ne se confondant pas avec les usages effectifs, atténué par la demande systématique d'illustrations concrètes et le croisement avec les documents organisationnels (cf. § 4.4.1) ; le biais de l'enquêteur, atténué par la réflexivité documentée, le guide structuré, le double codage et la supervision de l'encadrante ; le biais de sélection par boule de neige, atténué par le panachage des cinq canaux d'accès et le suivi actif de la matrice de diversification ; les limites du cadre TAM/UTAUT enrichi, la grille déductive pouvant sous-estimer des dimensions hors cadre telles que les dynamiques identitaires profondes, les processus organisationnels longitudinaux ou les effets de génération, atténuées par l'ouverture aux codes émergents (cf. § 4.4.3) et la confrontation aux apports récents de la littérature (Budhwar et al., 2022 ; Charlwood &amp; Guenole, 2022 ; Tambe et al., 2019). Ces limites ne disqualifient pas la recherche : elles en délimitent la portée, et elles sont reprises dans la conclusion générale du mémoire.</w:t>
       </w:r>
     </w:p>
     <w:p>
@@ -9375,7 +9745,7 @@
         <w:t xml:space="preserve"> </w:t>
       </w:r>
       <w:r>
-        <w:t xml:space="preserve">Le dispositif opératoire repose sur un échantillonnage raisonné de 12 à 20 professionnels RH de la région Souss-Massa, sélectionnés selon les critères d'inclusion et d'exclusion du Tableau 7, diversifiés selon la matrice à cinq axes du Tableau 8 et recrutés par le panachage de cinq canaux d'accès, jusqu'à saturation thématique documentée. La collecte s'appuie sur un guide d'entretien semi-directif de six thèmes et seize questions racines ouvertes, orientées vers le récit d'expérience et assorties de relances d'illustration, de récit et de ressenti ; sa traçabilité vis-à-vis des sept propositions est établie par le Tableau 9 et sera éprouvée par un test pilote auprès de deux répondants. La procédure intègre une stratégie linguistique adaptée au terrain (français,</w:t>
+        <w:t xml:space="preserve">Le dispositif opératoire repose sur un échantillonnage raisonné de douze à vingt professionnels RH de la région Souss-Massa, sélectionnés selon les critères d'inclusion et d'exclusion du Tableau 7, diversifiés selon la matrice à cinq axes du Tableau 8 et recrutés par le panachage de cinq canaux d'accès, jusqu'à saturation thématique documentée. La collecte s'appuie sur un guide d'entretien semi-directif de six thèmes et seize questions racines ouvertes, orientées vers le récit d'expérience et assorties de relances d'illustration, de récit et de ressenti ; sa traçabilité vis-à-vis des sept propositions est établie par le Tableau 9 et sera éprouvée par un test pilote auprès de deux répondants. La procédure intègre une stratégie linguistique adaptée au terrain (français,</w:t>
       </w:r>
       <w:r>
         <w:t xml:space="preserve"> </w:t>
@@ -9432,10 +9802,12 @@
       </w:r>
     </w:p>
     <w:bookmarkEnd w:id="139"/>
-    <w:bookmarkStart w:id="144" w:name="X9a4030f62b98460d335ea65567ebc3ac7cf9da8"/>
-    <w:p>
-      <w:pPr>
-        <w:pStyle w:val="Heading2"/>
+    <w:bookmarkEnd w:id="140"/>
+    <w:bookmarkStart w:id="145" w:name="X9a4030f62b98460d335ea65567ebc3ac7cf9da8"/>
+    <w:p>
+      <w:pPr>
+        <w:pStyle w:val="Heading1"/>
+        <w:pageBreakBefore/>
       </w:pPr>
       <w:r>
         <w:rPr>
@@ -9445,7 +9817,7 @@
         <w:t xml:space="preserve">Conclusion de la phase théorique et méthodologique</w:t>
       </w:r>
     </w:p>
-    <w:bookmarkStart w:id="140" w:name="le-chemin-parcouru"/>
+    <w:bookmarkStart w:id="141" w:name="le-chemin-parcouru"/>
     <w:p>
       <w:pPr>
         <w:pStyle w:val="Heading3"/>
@@ -9463,7 +9835,7 @@
         <w:pStyle w:val="FirstParagraph"/>
       </w:pPr>
       <w:r>
-        <w:t xml:space="preserve">Ce volume s'était fixé un objectif borné : construire, avant tout contact avec le terrain, un appareil théorique et méthodologique capable de soutenir une étude qualitative déductive de l'adoption de l'IA par les professionnels RH de la région Souss-Massa. Trois acquis peuvent être revendiqués à ce stade, avec la prudence qui s'impose puisque rien n'a encore été confronté aux données. Le premier est un cadre intégrateur argumenté. La revue a établi le double constat qui fonde la problématique, une fonction RH entrée dans une phase d'outillage algorithmique sans précédent (Tambe et al., 2019 ; Budhwar et al., 2022) et trois lacunes béantes, sectorielle, contextuelle et méthodologique ; le chapitre 2 a retracé la généalogie des modèles d'acceptation, du TAM (Davis, 1989) à l'UTAUT 2 (Venkatesh et al., 2012), pris au sérieux leurs critiques, puis construit un cadre qui conserve l'ossature classique en l'enrichissant de deux registres : les facteurs spécifiques à l'IA, confiance (Mayer et al., 1995 ; Glikson &amp; Woolley, 2020), explicabilité (Shin, 2021), aversion et appréciation algorithmiques (Dietvorst et al., 2015 ; Logg et al., 2019), équité perçue et risques de discrimination (Lee, 2018 ; Köchling &amp; Wehner, 2020), et les facteurs contextuels marocains, de la culture organisationnelle au cadre de la loi 09-08 et à la dynamique ouverte par</w:t>
+        <w:t xml:space="preserve">Ce volume s'était fixé un objectif borné : construire, avant tout contact avec le terrain, un appareil théorique et méthodologique capable de soutenir une étude qualitative déductive de l'adoption de l'IA par les professionnels RH de la région Souss-Massa. Trois acquis peuvent être revendiqués à ce stade, avec la prudence qui s'impose puisque rien n'a encore été confronté aux données. Le premier est un cadre intégrateur argumenté. La revue a établi le double constat qui fonde la problématique, une fonction RH entrée dans une phase d'outillage algorithmique sans précédent (Budhwar et al., 2022 ; Tambe et al., 2019) et trois lacunes béantes, sectorielle, contextuelle et méthodologique ; le chapitre 2 a retracé la généalogie des modèles d'acceptation, du TAM (Davis, 1989) à l'UTAUT 2 (Venkatesh et al., 2012), pris au sérieux leurs critiques, puis construit un cadre qui conserve l'ossature classique en l'enrichissant de deux registres : les facteurs spécifiques à l'IA, confiance (Glikson &amp; Woolley, 2020 ; Mayer et al., 1995), explicabilité (Shin, 2021), aversion et appréciation algorithmiques (Dietvorst et al., 2015 ; Logg et al., 2019), équité perçue et risques de discrimination (Köchling &amp; Wehner, 2020 ; M. K. Lee, 2018), et les facteurs contextuels marocains, de la culture organisationnelle au cadre de la loi 09-08 et à la dynamique ouverte par</w:t>
       </w:r>
       <w:r>
         <w:t xml:space="preserve"> </w:t>
@@ -9479,8 +9851,8 @@
         <w:t xml:space="preserve">. Le deuxième acquis est un jeu de sept propositions articulées à ce cadre : P1 à P5 opérationnalisent les dimensions classiques de l'acceptation, P6 isole ce qui relève en propre de l'IA, P7 érige le contexte marocain en facteur explicatif de plein droit ; chaque proposition est reliée à une sous-question, à un thème du guide et à une famille de codes, la chaîne de traçabilité courant de la théorie à la future grille d'analyse ; cette architecture constitue un pari raisonné, que le terrain viendra éprouver. Le troisième acquis est un dispositif méthodologique complet et auditable : posture post-positiviste assumée, échantillonnage raisonné avec matrice de diversification, cible de douze à vingt entretiens arbitrée par la saturation thématique (Guest et al., 2006 ; Saunders et al., 2018), guide semi-directif soumis à un pré-test avant la collecte principale, dispositif éthique aligné sur la loi 09-08 (consentement éclairé, pseudonymisation, conservation sécurisée), analyse thématique à codage mixte (Bardin, 2013 ; Braun &amp; Clarke, 2006), double codage partiel avec seuil d'accord explicite (Cohen, 1960 ; Landis &amp; Koch, 1977) et critères de scientificité de Lincoln et Guba (1985), complétés par un exercice de réflexivité sur la position du chercheur.</w:t>
       </w:r>
     </w:p>
-    <w:bookmarkEnd w:id="140"/>
-    <w:bookmarkStart w:id="141" w:name="ce-que-la-phase-empirique-devra-trancher"/>
+    <w:bookmarkEnd w:id="141"/>
+    <w:bookmarkStart w:id="142" w:name="ce-que-la-phase-empirique-devra-trancher"/>
     <w:p>
       <w:pPr>
         <w:pStyle w:val="Heading3"/>
@@ -9517,8 +9889,8 @@
         <w:t xml:space="preserve">était trop étroit. Une attention particulière sera portée aux professionnels expérimentés, chez qui P5 anticipe les résistances les plus vives. Chaque proposition pourra être soutenue, nuancée ou contredite par le matériau ; aucun de ces verdicts ne constituerait un échec, une proposition contredite sur la base de données solides étant un résultat de recherche à part entière. Les limites anticipées (taille de l'échantillon, matériau déclaratif, ancrage régional) sont assumées et documentées au chapitre 4 : elles bornent la portée des conclusions à venir sans les invalider.</w:t>
       </w:r>
     </w:p>
-    <w:bookmarkEnd w:id="141"/>
-    <w:bookmarkStart w:id="142" w:name="les-contributions-attendues"/>
+    <w:bookmarkEnd w:id="142"/>
+    <w:bookmarkStart w:id="143" w:name="les-contributions-attendues"/>
     <w:p>
       <w:pPr>
         <w:pStyle w:val="Heading3"/>
@@ -9552,8 +9924,8 @@
         <w:t xml:space="preserve">, des connaissances situées utiles au calibrage de la formation et du futur encadrement de l'IA. Ces retombées demeurent conditionnelles : elles n'auront de valeur que si la phase empirique les fonde.</w:t>
       </w:r>
     </w:p>
-    <w:bookmarkEnd w:id="142"/>
-    <w:bookmarkStart w:id="143" w:name="X7ec70d21c5f04ff37f574b24c4de73b5d1c67d7"/>
+    <w:bookmarkEnd w:id="143"/>
+    <w:bookmarkStart w:id="144" w:name="X7ec70d21c5f04ff37f574b24c4de73b5d1c67d7"/>
     <w:p>
       <w:pPr>
         <w:pStyle w:val="Heading3"/>
@@ -9574,13 +9946,13 @@
         <w:t xml:space="preserve">La phase terrain s'organisera en quatre temps, pour une durée cumulée estimée à un semestre : finalisation de l'accès au terrain et pré-test du guide auprès de deux répondants, suivis des ajustements éventuels (trois à quatre semaines) ; vague principale d'entretiens conduite jusqu'à saturation dans la fourchette de douze à vingt, la retranscription étant menée au fil de l'eau (huit à dix semaines) ; analyse thématique complète, incluant le double codage partiel et la stabilisation de la grille (six à huit semaines, en chevauchement partiel avec la fin de la collecte) ; rédaction de la Partie III, restitution aux répondants volontaires et mise au point de la conclusion générale (quatre à six semaines). Ce séquencement demeure indicatif : il dépendra des disponibilités des répondants et sera ajusté en accord avec l'encadrante. Au terme de cette première étape, l'essentiel est en place pour aborder le terrain : une question précise, un cadre discutable au sens fort du terme, des instruments prêts et des critères explicites pour juger la qualité de ce qui sera produit. La suite appartient aux données.</w:t>
       </w:r>
     </w:p>
-    <w:bookmarkEnd w:id="143"/>
     <w:bookmarkEnd w:id="144"/>
     <w:bookmarkEnd w:id="145"/>
     <w:bookmarkStart w:id="147" w:name="bibliographie"/>
     <w:p>
       <w:pPr>
         <w:pStyle w:val="Heading1"/>
+        <w:pageBreakBefore/>
       </w:pPr>
       <w:r>
         <w:rPr>
@@ -9661,7 +10033,7 @@
         <w:pStyle w:val="BodyText"/>
       </w:pPr>
       <w:r>
-        <w:t xml:space="preserve">Benbasat, I., &amp; Barki, H. (2007). Quo vadis, TAM ?</w:t>
+        <w:t xml:space="preserve">Benbasat, I., &amp; Barki, H. (2007). Quo vadis, TAM?</w:t>
       </w:r>
       <w:r>
         <w:t xml:space="preserve"> </w:t>
@@ -10013,7 +10385,7 @@
         <w:t xml:space="preserve">International Journal of Information Management, 55</w:t>
       </w:r>
       <w:r>
-        <w:t xml:space="preserve">, 102211. https://doi.org/10.1016/j.ijinfomgt.2020.102211</w:t>
+        <w:t xml:space="preserve">, article 102211. https://doi.org/10.1016/j.ijinfomgt.2020.102211</w:t>
       </w:r>
     </w:p>
     <w:p>
@@ -10034,7 +10406,7 @@
         <w:t xml:space="preserve">International Journal of Information Management, 57</w:t>
       </w:r>
       <w:r>
-        <w:t xml:space="preserve">, 101994. https://doi.org/10.1016/j.ijinfomgt.2019.08.002</w:t>
+        <w:t xml:space="preserve">, article 101994. https://doi.org/10.1016/j.ijinfomgt.2019.08.002</w:t>
       </w:r>
     </w:p>
     <w:p>
@@ -10268,7 +10640,7 @@
         <w:t xml:space="preserve">Computers in Human Behavior, 123</w:t>
       </w:r>
       <w:r>
-        <w:t xml:space="preserve">, 106878. https://doi.org/10.1016/j.chb.2021.106878</w:t>
+        <w:t xml:space="preserve">, article 106878. https://doi.org/10.1016/j.chb.2021.106878</w:t>
       </w:r>
     </w:p>
     <w:p>
@@ -10679,7 +11051,7 @@
         <w:t xml:space="preserve">International Journal of Human-Computer Studies, 146</w:t>
       </w:r>
       <w:r>
-        <w:t xml:space="preserve">, 102551. https://doi.org/10.1016/j.ijhcs.2020.102551</w:t>
+        <w:t xml:space="preserve">, article 102551. https://doi.org/10.1016/j.ijhcs.2020.102551</w:t>
       </w:r>
     </w:p>
     <w:p>
@@ -11040,6 +11412,7 @@
     <w:p>
       <w:pPr>
         <w:pStyle w:val="Heading1"/>
+        <w:pageBreakBefore/>
       </w:pPr>
       <w:r>
         <w:rPr>
@@ -11166,7 +11539,7 @@
         <w:t xml:space="preserve"> </w:t>
       </w:r>
       <w:r>
-        <w:t xml:space="preserve">Conformément aux recommandations de l'entretien de recherche (Paillé &amp; Mucchielli, 2016 ; Bardin, 2013), le guide mobilise un nombre restreint de</w:t>
+        <w:t xml:space="preserve">Conformément aux recommandations de l'entretien de recherche (Bardin, 2013 ; Paillé &amp; Mucchielli, 2016), le guide mobilise un nombre restreint de</w:t>
       </w:r>
       <w:r>
         <w:t xml:space="preserve"> </w:t>
@@ -11424,7 +11797,7 @@
           <w:iCs/>
           <w:i/>
         </w:rPr>
-        <w:t xml:space="preserve">« Bonjour, je vous remercie d'avoir accepté cet entretien. Je conduis cette recherche dans le cadre d'un mémoire de Global Executive MBA, préparé à TBS Education Casablanca, portant sur l'adoption de l'intelligence artificielle par les professionnels RH au Maroc. L'entretien dure environ une heure et quart ; il sera enregistré pour permettre la retranscription, puis l'enregistrement sera détruit à l'issue de la soutenance. Vos propos seront pseudonymisés (un identifiant R1, R2, R3... sera utilisé) et traités conformément à la loi 09-08 sur la protection des données personnelles. Il n'y a ni bonne ni mauvaise réponse : ce qui m'intéresse, c'est votre expérience concrète, y compris lorsqu'elle est faite d'hésitations ou de tentatives qui n'ont pas abouti. Vous pouvez interrompre l'entretien ou refuser de répondre à une question à tout moment. Avez-vous des questions avant de commencer ? »</w:t>
+        <w:t xml:space="preserve">« Bonjour, je vous remercie d'avoir accepté cet entretien. Je conduis cette recherche dans le cadre d'un mémoire de Global Executive MBA, préparé à TBS Education Casablanca, portant sur l'adoption de l'intelligence artificielle par les professionnels RH au Maroc. L'entretien dure environ une heure et quart ; il sera enregistré par captation locale sur mon équipement pour permettre la retranscription, puis l'enregistrement sera détruit au plus tard trois mois après la soutenance. Vos propos seront pseudonymisés (un identifiant R1, R2, R3... sera utilisé) et traités conformément à la loi 09-08 sur la protection des données personnelles. Il n'y a ni bonne ni mauvaise réponse : ce qui m'intéresse, c'est votre expérience concrète, y compris lorsqu'elle est faite d'hésitations ou de tentatives qui n'ont pas abouti. Vous pouvez interrompre l'entretien ou refuser de répondre à une question à tout moment. Avez-vous des questions avant de commencer ? »</w:t>
       </w:r>
     </w:p>
     <w:p>
@@ -11432,7 +11805,7 @@
         <w:pStyle w:val="FirstParagraph"/>
       </w:pPr>
       <w:r>
-        <w:t xml:space="preserve">Recueil du consentement éclairé écrit avant toute captation (cf. Annexe C). Démarrage de l'enregistrement audio.</w:t>
+        <w:t xml:space="preserve">Recueil du consentement éclairé écrit avant toute captation (cf. Annexe C) ; en cas d'impossibilité matérielle de signature, recueil oral clause par clause en début d'enregistrement, régularisé par écrit dès que possible (cf. § 4.3.3). Démarrage de l'enregistrement audio.</w:t>
       </w:r>
     </w:p>
     <w:bookmarkEnd w:id="150"/>
@@ -12228,7 +12601,7 @@
               <w:jc w:val="left"/>
             </w:pPr>
             <w:r>
-              <w:t xml:space="preserve">audio, avec consentement écrit préalable</w:t>
+              <w:t xml:space="preserve">audio, par captation locale exclusive, avec consentement préalable (écrit ou, par exception, oral clause par clause)</w:t>
             </w:r>
           </w:p>
         </w:tc>
@@ -12315,7 +12688,7 @@
               <w:jc w:val="left"/>
             </w:pPr>
             <w:r>
-              <w:t xml:space="preserve">support chiffré, accès limité au chercheur et, pour supervision, à l'encadrante du mémoire</w:t>
+              <w:t xml:space="preserve">support chiffré ; accès du chercheur, de l'encadrante (supervision) et, pour une partie des retranscriptions pseudonymisées, du second codeur sous engagement écrit de confidentialité ; extraits cités accessibles au jury</w:t>
             </w:r>
           </w:p>
         </w:tc>
@@ -12344,7 +12717,7 @@
               <w:jc w:val="left"/>
             </w:pPr>
             <w:r>
-              <w:t xml:space="preserve">enregistrement détruit au plus tard trois mois après la soutenance</w:t>
+              <w:t xml:space="preserve">audio détruit au plus tard trois mois après la soutenance ; table de correspondance détruite au plus tard un mois après la soutenance ; retranscriptions pseudonymisées conservées cinq ans</w:t>
             </w:r>
           </w:p>
         </w:tc>
@@ -12691,7 +13064,7 @@
               <w:jc w:val="left"/>
             </w:pPr>
             <w:r>
-              <w:t xml:space="preserve">P3. L'influence sociale (direction générale, pairs, normes professionnelles) et la légitimation managériale des outils d'IA agissent comme un levier déterminant de l'adoption</w:t>
+              <w:t xml:space="preserve">P3. L'influence sociale (direction générale, pairs, normes professionnelles) ainsi que la légitimation managériale des outils d'IA, est associée à l'adoption dans le contexte organisationnel marocain</w:t>
             </w:r>
           </w:p>
         </w:tc>
@@ -12768,7 +13141,7 @@
               <w:jc w:val="left"/>
             </w:pPr>
             <w:r>
-              <w:t xml:space="preserve">Conditions facilitantes (Venkatesh et al., 2003 ; Bondarouk et al., 2017)</w:t>
+              <w:t xml:space="preserve">Conditions facilitantes (Bondarouk et al., 2017 ; Venkatesh et al., 2003)</w:t>
             </w:r>
           </w:p>
         </w:tc>
@@ -12821,19 +13194,19 @@
               <w:jc w:val="left"/>
             </w:pPr>
             <w:r>
-              <w:t xml:space="preserve">P5. L'anxiété liée à l'usage, d'une part, la crainte du remplacement professionnel et la peur de la perte de valeur ajoutée humaine, d'autre part, sont perçues comme des freins majeurs à l'adoption</w:t>
-            </w:r>
-          </w:p>
-        </w:tc>
-        <w:tc>
-          <w:tcPr/>
-          <w:p>
-            <w:pPr>
-              <w:pStyle w:val="Compact"/>
-              <w:jc w:val="left"/>
-            </w:pPr>
-            <w:r>
-              <w:t xml:space="preserve">Anxiété, résistance et transformation du métier (Venkatesh &amp; Bala, 2008 ; Charlwood &amp; Guenole, 2022 ; Meijerink et al., 2021)</w:t>
+              <w:t xml:space="preserve">P5. L'anxiété liée à l'usage, d'une part, la crainte du remplacement professionnel et la peur de la perte de valeur ajoutée humaine, d'autre part, sont perçues comme des freins majeurs à l'adoption, en particulier chez les professionnels expérimentés</w:t>
+            </w:r>
+          </w:p>
+        </w:tc>
+        <w:tc>
+          <w:tcPr/>
+          <w:p>
+            <w:pPr>
+              <w:pStyle w:val="Compact"/>
+              <w:jc w:val="left"/>
+            </w:pPr>
+            <w:r>
+              <w:t xml:space="preserve">Anxiété, résistance et transformation du métier (Charlwood &amp; Guenole, 2022 ; Meijerink et al., 2021 ; Venkatesh &amp; Bala, 2008)</w:t>
             </w:r>
           </w:p>
         </w:tc>
@@ -12898,7 +13271,7 @@
               <w:jc w:val="left"/>
             </w:pPr>
             <w:r>
-              <w:t xml:space="preserve">Confiance et jugement algorithmique (Mayer et al., 1995 ; Glikson &amp; Woolley, 2020 ; Dietvorst et al., 2015 ; Logg et al., 2019) ; explicabilité (Shin, 2021) ; équité perçue (Lee, 2018 ; Köchling &amp; Wehner, 2020) ; éthique des données (Tursunbayeva et al., 2022)</w:t>
+              <w:t xml:space="preserve">Confiance et jugement algorithmique (Dietvorst et al., 2015 ; Glikson &amp; Woolley, 2020 ; Logg et al., 2019 ; Mayer et al., 1995) ; explicabilité (Shin, 2021) ; équité perçue (Köchling &amp; Wehner, 2020 ; M. K. Lee, 2018) ; éthique des données (Tursunbayeva et al., 2022)</w:t>
             </w:r>
           </w:p>
         </w:tc>
@@ -12963,7 +13336,7 @@
               <w:jc w:val="left"/>
             </w:pPr>
             <w:r>
-              <w:t xml:space="preserve">Variables modératrices contextuelles (Venkatesh et al., 2012 ; Dwivedi et al., 2019 ; Budhwar et al., 2022)</w:t>
+              <w:t xml:space="preserve">Variables modératrices contextuelles (Budhwar et al., 2022 ; Dwivedi et al., 2019 ; Venkatesh et al., 2012)</w:t>
             </w:r>
           </w:p>
         </w:tc>
@@ -13018,7 +13391,7 @@
         <w:pStyle w:val="BodyText"/>
       </w:pPr>
       <w:r>
-        <w:t xml:space="preserve">Le poids du Thème 5, seul à couvrir deux propositions et cinq questions racines, traduit la centralité des facteurs spécifiques à l'IA dans la contribution attendue du mémoire. Il répond également à une exigence méthodologique : la confiance, la transparence, les biais, la confidentialité et la crainte du remplacement sont des dimensions sur lesquelles les réponses de principe sont particulièrement probables, et seules des relances orientées vers des situations vécues permettent d'atteindre les mécanismes sous-jacents.</w:t>
+        <w:t xml:space="preserve">Le poids du Thème 5, seul à mobiliser cinq questions racines, traduit la centralité des facteurs spécifiques à l'IA dans la contribution attendue du mémoire. Il répond également à une exigence méthodologique : la confiance, la transparence, les biais, la confidentialité et la crainte du remplacement sont des dimensions sur lesquelles les réponses de principe sont particulièrement probables, et seules des relances orientées vers des situations vécues permettent d'atteindre les mécanismes sous-jacents.</w:t>
       </w:r>
     </w:p>
     <w:bookmarkEnd w:id="159"/>
@@ -13125,7 +13498,7 @@
         <w:pStyle w:val="BodyText"/>
       </w:pPr>
       <w:r>
-        <w:t xml:space="preserve">Cette recherche s'inscrit dans un dispositif éthique strict. La participation est volontaire et peut être interrompue à tout moment, sans justification. Les propos recueillis sont pseudonymisés : un identifiant neutre (R1 à Rn) remplace toute mention nominative, aucun nom d'entreprise n'apparaît dans le mémoire et la table de correspondance, conservée à part et chiffrée, est détruite au plus tard un mois après la soutenance, ce qui marque la limite au-delà de laquelle un retrait individuel des données n'est techniquement plus possible. L'entretien fait l'objet, avec votre accord, d'un enregistrement audio réalisé par captation locale et destiné à la seule retranscription ; conservé sur un support chiffré, il est accessible au chercheur et, pour la supervision académique, à l'encadrante du mémoire, un second codeur tenu par un engagement écrit de confidentialité pouvant en outre accéder à une partie des retranscriptions pseudonymisées ; cet enregistrement est détruit au plus tard trois mois après la soutenance. L'ensemble du traitement est conforme à la loi 09-08 relative à la protection des personnes physiques à l'égard du traitement des données à caractère personnel, et les données ne servent qu'à des fins strictement académiques.</w:t>
+        <w:t xml:space="preserve">Cette recherche s'inscrit dans un dispositif éthique strict. La participation est volontaire et peut être interrompue à tout moment, sans justification. Les propos recueillis sont pseudonymisés : un identifiant neutre (R1 à Rn) remplace toute mention nominative, aucun nom d'entreprise n'apparaît dans le mémoire et la table de correspondance, conservée à part et chiffrée, est détruite au plus tard un mois après la soutenance, ce qui marque la limite au-delà de laquelle un retrait individuel des données n'est techniquement plus possible. L'entretien fait l'objet, avec votre accord, d'un enregistrement audio réalisé par captation locale et destiné à la seule retranscription ; conservé sur un support chiffré, il est accessible au chercheur et, pour la supervision académique, à l'encadrante du mémoire, un second codeur tenu par un engagement écrit de confidentialité pouvant en outre accéder à une partie des retranscriptions pseudonymisées ; cet enregistrement est détruit au plus tard trois mois après la soutenance, les retranscriptions pseudonymisées et les exports d'analyse étant pour leur part conservés cinq ans à des fins de vérification académique, puis supprimés ; les extraits cités dans le mémoire soutenu, accessibles au jury, demeurent pseudonymisés. Ce traitement fait l'objet de la formalité préalable requise auprès de la CNDP, accomplie avant toute collecte (récépissé ou autorisation n° ……………..). L'ensemble du traitement est conforme à la loi 09-08 relative à la protection des personnes physiques à l'égard du traitement des données à caractère personnel, et les données ne servent qu'à des fins strictement académiques.</w:t>
       </w:r>
     </w:p>
     <w:p>
@@ -13223,7 +13596,7 @@
         <w:pStyle w:val="BodyText"/>
       </w:pPr>
       <w:r>
-        <w:t xml:space="preserve">Le présent formulaire complète la lettre de présentation de la recherche (Annexe B) et le préambule oral de l'entretien. Il matérialise le consentement libre et éclairé du répondant, recueilli avant tout enregistrement. En cochant les clauses ci-dessous et en signant ce document, je reconnais avoir pris connaissance des conditions de la recherche et y consentir en toute connaissance de cause :</w:t>
+        <w:t xml:space="preserve">Le présent formulaire complète la lettre de présentation de la recherche (Annexe B) et le préambule oral de l'entretien. Il matérialise le consentement libre et éclairé du répondant, recueilli avant tout enregistrement ou, en cas d'impossibilité matérielle de signature, recueilli oralement clause par clause en début d'enregistrement puis régularisé par écrit. En cochant les clauses ci-dessous et en signant ce document, je reconnais avoir pris connaissance des conditions de la recherche et y consentir en toute connaissance de cause :</w:t>
       </w:r>
     </w:p>
     <w:p>
@@ -13279,7 +13652,7 @@
         <w:pStyle w:val="BlockText"/>
       </w:pPr>
       <w:r>
-        <w:t xml:space="preserve">☐ Je suis informé(e) que l'enregistrement sera conservé sur un support chiffré, accessible au chercheur et, pour la supervision académique, à l'encadrante du mémoire, un second codeur tenu à la confidentialité pouvant accéder à une partie des retranscriptions pseudonymisées, puis détruit au plus tard trois mois après la soutenance.</w:t>
+        <w:t xml:space="preserve">☐ Je suis informé(e) que l'enregistrement sera conservé sur un support chiffré, accessible au chercheur et, pour la supervision académique, à l'encadrante du mémoire, un second codeur tenu à la confidentialité pouvant accéder à une partie des retranscriptions pseudonymisées et le jury aux seuls extraits pseudonymisés cités dans le mémoire ; l'enregistrement est détruit au plus tard trois mois après la soutenance et les retranscriptions pseudonymisées sont conservées cinq ans à des fins de vérification académique, puis supprimées.</w:t>
       </w:r>
     </w:p>
     <w:p>
@@ -13287,7 +13660,7 @@
         <w:pStyle w:val="BlockText"/>
       </w:pPr>
       <w:r>
-        <w:t xml:space="preserve">☐ Je suis informé(e) que le traitement des données est conforme à la loi 09-08 relative à la protection des personnes physiques à l'égard du traitement des données à caractère personnel, promulguée par le Dahir n° 1-09-15 du 18 février 2009, et que la formalité préalable requise auprès de la CNDP (Commission Nationale de contrôle de la protection des Données à caractère Personnel) est accomplie avant toute collecte.</w:t>
+        <w:t xml:space="preserve">☐ Je suis informé(e) que le traitement des données est conforme à la loi 09-08 relative à la protection des personnes physiques à l'égard du traitement des données à caractère personnel, promulguée par le Dahir n° 1-09-15 du 18 février 2009, et que la formalité préalable requise auprès de la CNDP (Commission Nationale de contrôle de la protection des Données à caractère Personnel) est accomplie avant toute collecte (récépissé ou autorisation n° ……………..).</w:t>
       </w:r>
     </w:p>
     <w:p>
@@ -13295,6 +13668,14 @@
         <w:pStyle w:val="BlockText"/>
       </w:pPr>
       <w:r>
+        <w:t xml:space="preserve">☐ Je suis informé(e) de mes droits d'accès, de rectification et d'opposition, que je peux exercer auprès du chercheur, dans la limite temporelle liée à la destruction de la table de correspondance.</w:t>
+      </w:r>
+    </w:p>
+    <w:p>
+      <w:pPr>
+        <w:pStyle w:val="BlockText"/>
+      </w:pPr>
+      <w:r>
         <w:t xml:space="preserve">☐ Facultatif : j'accepte d'être recontacté(e) pour valider la synthèse intermédiaire de l'analyse (</w:t>
       </w:r>
       <w:r>
@@ -13362,6 +13743,14 @@
       </w:pPr>
       <w:r>
         <w:t xml:space="preserve">Nom et prénom : Mohamed EL HASSOUNY</w:t>
+      </w:r>
+    </w:p>
+    <w:p>
+      <w:pPr>
+        <w:pStyle w:val="BodyText"/>
+      </w:pPr>
+      <w:r>
+        <w:t xml:space="preserve">Téléphone : …………………………… ; adresse électronique : ……………………………</w:t>
       </w:r>
     </w:p>
     <w:p>
@@ -14375,7 +14764,7 @@
         <w:pStyle w:val="BodyText"/>
       </w:pPr>
       <w:r>
-        <w:t xml:space="preserve">Les codes PRO, REP, USG et PRO-FUT sont des codes descriptifs de contexte, hors grille analytique ; ils documentent le profil du répondant, ses représentations, ses usages et ses projections. La famille HIE recueille la hiérarchisation opérée par le répondant en clôture d'entretien ; elle ne teste aucune proposition mais alimentera la discussion des implications managériales, en confrontant l'ordre de priorité énoncé par les praticiens à celui que suggère l'analyse thématique. Le préfixe EM désigne enfin les codes émergents créés en cours d'analyse (cf. Annexe E).</w:t>
+        <w:t xml:space="preserve">Les codes PRO, REP, USG et PRO-FUT sont des codes descriptifs de contexte, hors grille analytique ; ils documentent le profil du répondant, ses représentations, ses usages et ses projections, la famille USG étant déclinée en six sous-codes calqués sur l'échelle d'états d'usage de l'objectif OS1 (Annexe E). La famille HIE recueille la hiérarchisation opérée par le répondant en clôture d'entretien ; elle ne teste aucune proposition mais alimentera la discussion des implications managériales, en confrontant l'ordre de priorité énoncé par les praticiens à celui que suggère l'analyse thématique. Le préfixe EM désigne enfin les codes émergents créés en cours d'analyse (cf. Annexe E).</w:t>
       </w:r>
     </w:p>
     <w:p>
@@ -14421,7 +14810,7 @@
         <w:t xml:space="preserve"> </w:t>
       </w:r>
       <w:r>
-        <w:t xml:space="preserve">à partir des dimensions du cadre TAM/UTAUT enrichi et des sept propositions de recherche (P1 à P7). Elle se décline en treize familles de codes analytiques, chacune subdivisée en sous-codes opérationnels, auxquelles s'ajoutent les codes descriptifs de contexte (PRO, REP, USG, PRO-FUT), la famille réflexive HIE et les codes émergents EM. La structure intègre les apports de la révision du modèle conceptuel : sous-famille VAH (valeur ajoutée humaine) pour la P1 enrichie, famille MNG (légitimation managériale) pour la P3 enrichie, famille RMP (remplacement) pour la P5 enrichie, et trois familles dédiées aux facteurs IA-spécifiques de la P6, à savoir CT (confiance et transparence), RIS (risques) et CFD (confidentialité).</w:t>
+        <w:t xml:space="preserve">à partir des dimensions du cadre TAM/UTAUT enrichi et des sept propositions de recherche (P1 à P7). Elle se décline en treize familles de codes analytiques, chacune subdivisée en sous-codes opérationnels, auxquelles s'ajoutent les codes descriptifs de contexte (PRO, REP, USG, PRO-FUT), la famille réflexive HIE et les codes émergents EM ; l'ensemble, familles analytiques comme codes descriptifs, est détaillé au Tableau E1. La structure intègre les apports de la révision du modèle conceptuel : sous-famille VAH (valeur ajoutée humaine) pour la P1 enrichie, famille MNG (légitimation managériale) pour la P3 enrichie, famille RMP (remplacement) pour la P5 enrichie, et trois familles dédiées aux facteurs IA-spécifiques de la P6, à savoir CT (confiance et transparence), RIS (risques) et CFD (confidentialité).</w:t>
       </w:r>
     </w:p>
     <w:p>
@@ -14661,7 +15050,7 @@
               <w:jc w:val="left"/>
             </w:pPr>
             <w:r>
-              <w:t xml:space="preserve">Tambe et al. (2019) ; Charlwood &amp; Guenole (2022)</w:t>
+              <w:t xml:space="preserve">Tambe et al. (2019) ; Charlwood et Guenole (2022)</w:t>
             </w:r>
           </w:p>
         </w:tc>
@@ -14726,7 +15115,7 @@
               <w:jc w:val="left"/>
             </w:pPr>
             <w:r>
-              <w:t xml:space="preserve">Davis (1989) ; Venkatesh &amp; Davis (2000) ; Venkatesh &amp; Bala (2008)</w:t>
+              <w:t xml:space="preserve">Davis (1989) ; Venkatesh et Davis (2000) ; Venkatesh et Bala (2008)</w:t>
             </w:r>
           </w:p>
         </w:tc>
@@ -14791,7 +15180,7 @@
               <w:jc w:val="left"/>
             </w:pPr>
             <w:r>
-              <w:t xml:space="preserve">Compeau &amp; Higgins (1995) ; Venkatesh &amp; Bala (2008)</w:t>
+              <w:t xml:space="preserve">Compeau et Higgins (1995) ; Venkatesh et Bala (2008)</w:t>
             </w:r>
           </w:p>
         </w:tc>
@@ -14921,7 +15310,7 @@
               <w:jc w:val="left"/>
             </w:pPr>
             <w:r>
-              <w:t xml:space="preserve">Venkatesh et al. (2003) ; Venkatesh &amp; Bala (2008)</w:t>
+              <w:t xml:space="preserve">Venkatesh et al. (2003) ; Venkatesh et Bala (2008)</w:t>
             </w:r>
           </w:p>
         </w:tc>
@@ -15051,7 +15440,7 @@
               <w:jc w:val="left"/>
             </w:pPr>
             <w:r>
-              <w:t xml:space="preserve">Venkatesh &amp; Bala (2008) ; Charlwood &amp; Guenole (2022)</w:t>
+              <w:t xml:space="preserve">Venkatesh et Bala (2008) ; Charlwood et Guenole (2022)</w:t>
             </w:r>
           </w:p>
         </w:tc>
@@ -15116,7 +15505,7 @@
               <w:jc w:val="left"/>
             </w:pPr>
             <w:r>
-              <w:t xml:space="preserve">Charlwood &amp; Guenole (2022) ; Langer &amp; Landers (2021)</w:t>
+              <w:t xml:space="preserve">Charlwood et Guenole (2022) ; Langer et Landers (2021)</w:t>
             </w:r>
           </w:p>
         </w:tc>
@@ -15181,7 +15570,7 @@
               <w:jc w:val="left"/>
             </w:pPr>
             <w:r>
-              <w:t xml:space="preserve">Mayer et al. (1995) ; Glikson &amp; Woolley (2020) ; Shin (2021)</w:t>
+              <w:t xml:space="preserve">Mayer et al. (1995) ; Glikson et Woolley (2020) ; Shin (2021)</w:t>
             </w:r>
           </w:p>
         </w:tc>
@@ -15246,7 +15635,7 @@
               <w:jc w:val="left"/>
             </w:pPr>
             <w:r>
-              <w:t xml:space="preserve">Tambe et al. (2019) ; Köchling &amp; Wehner (2020)</w:t>
+              <w:t xml:space="preserve">Tambe et al. (2019) ; Köchling et Wehner (2020)</w:t>
             </w:r>
           </w:p>
         </w:tc>
@@ -15377,6 +15766,331 @@
             </w:pPr>
             <w:r>
               <w:t xml:space="preserve">Venkatesh et al. (2012) ; Dwivedi et al. (2019) ; Budhwar et al. (2022)</w:t>
+            </w:r>
+          </w:p>
+        </w:tc>
+      </w:tr>
+      <w:tr>
+        <w:trPr>
+          <w:cantSplit/>
+        </w:trPr>
+        <w:tc>
+          <w:tcPr/>
+          <w:p>
+            <w:pPr>
+              <w:pStyle w:val="Compact"/>
+              <w:jc w:val="left"/>
+            </w:pPr>
+            <w:r>
+              <w:t xml:space="preserve">Profil (descriptif, hors grille analytique)</w:t>
+            </w:r>
+          </w:p>
+        </w:tc>
+        <w:tc>
+          <w:tcPr/>
+          <w:p>
+            <w:pPr>
+              <w:pStyle w:val="Compact"/>
+              <w:jc w:val="left"/>
+            </w:pPr>
+            <w:r>
+              <w:t xml:space="preserve">PRO</w:t>
+            </w:r>
+          </w:p>
+        </w:tc>
+        <w:tc>
+          <w:tcPr/>
+          <w:p>
+            <w:pPr>
+              <w:pStyle w:val="Compact"/>
+              <w:jc w:val="left"/>
+            </w:pPr>
+            <w:r>
+              <w:t xml:space="preserve">PRO-1 fonction ; PRO-2 parcours ; PRO-3 contexte-organisationnel</w:t>
+            </w:r>
+          </w:p>
+        </w:tc>
+        <w:tc>
+          <w:tcPr/>
+          <w:p>
+            <w:pPr>
+              <w:pStyle w:val="Compact"/>
+              <w:jc w:val="left"/>
+            </w:pPr>
+            <w:r>
+              <w:t xml:space="preserve">Éléments de profil et de contexte servant de repères d'interprétation</w:t>
+            </w:r>
+          </w:p>
+        </w:tc>
+        <w:tc>
+          <w:tcPr/>
+          <w:p>
+            <w:pPr>
+              <w:pStyle w:val="Compact"/>
+              <w:jc w:val="left"/>
+            </w:pPr>
+            <w:r>
+              <w:t xml:space="preserve">Cadrage empirique (Q1)</w:t>
+            </w:r>
+          </w:p>
+        </w:tc>
+      </w:tr>
+      <w:tr>
+        <w:trPr>
+          <w:cantSplit/>
+        </w:trPr>
+        <w:tc>
+          <w:tcPr/>
+          <w:p>
+            <w:pPr>
+              <w:pStyle w:val="Compact"/>
+              <w:jc w:val="left"/>
+            </w:pPr>
+            <w:r>
+              <w:t xml:space="preserve">Représentations (descriptif)</w:t>
+            </w:r>
+          </w:p>
+        </w:tc>
+        <w:tc>
+          <w:tcPr/>
+          <w:p>
+            <w:pPr>
+              <w:pStyle w:val="Compact"/>
+              <w:jc w:val="left"/>
+            </w:pPr>
+            <w:r>
+              <w:t xml:space="preserve">REP</w:t>
+            </w:r>
+          </w:p>
+        </w:tc>
+        <w:tc>
+          <w:tcPr/>
+          <w:p>
+            <w:pPr>
+              <w:pStyle w:val="Compact"/>
+              <w:jc w:val="left"/>
+            </w:pPr>
+            <w:r>
+              <w:t xml:space="preserve">REP-1 définition-spontanée ; REP-2 origine-représentations</w:t>
+            </w:r>
+          </w:p>
+        </w:tc>
+        <w:tc>
+          <w:tcPr/>
+          <w:p>
+            <w:pPr>
+              <w:pStyle w:val="Compact"/>
+              <w:jc w:val="left"/>
+            </w:pPr>
+            <w:r>
+              <w:t xml:space="preserve">Représentations de l'IA formulées par le répondant</w:t>
+            </w:r>
+          </w:p>
+        </w:tc>
+        <w:tc>
+          <w:tcPr/>
+          <w:p>
+            <w:pPr>
+              <w:pStyle w:val="Compact"/>
+              <w:jc w:val="left"/>
+            </w:pPr>
+            <w:r>
+              <w:t xml:space="preserve">Cadrage empirique (Q2)</w:t>
+            </w:r>
+          </w:p>
+        </w:tc>
+      </w:tr>
+      <w:tr>
+        <w:trPr>
+          <w:cantSplit/>
+        </w:trPr>
+        <w:tc>
+          <w:tcPr/>
+          <w:p>
+            <w:pPr>
+              <w:pStyle w:val="Compact"/>
+              <w:jc w:val="left"/>
+            </w:pPr>
+            <w:r>
+              <w:t xml:space="preserve">Usages et états d'usage (descriptif, échelle de l'objectif OS1)</w:t>
+            </w:r>
+          </w:p>
+        </w:tc>
+        <w:tc>
+          <w:tcPr/>
+          <w:p>
+            <w:pPr>
+              <w:pStyle w:val="Compact"/>
+              <w:jc w:val="left"/>
+            </w:pPr>
+            <w:r>
+              <w:t xml:space="preserve">USG</w:t>
+            </w:r>
+          </w:p>
+        </w:tc>
+        <w:tc>
+          <w:tcPr/>
+          <w:p>
+            <w:pPr>
+              <w:pStyle w:val="Compact"/>
+              <w:jc w:val="left"/>
+            </w:pPr>
+            <w:r>
+              <w:t xml:space="preserve">USG-1 non-usage-sans-intention ; USG-2 intention-d'adoption ; USG-3 expérimentation ; USG-4 usage-ponctuel ; USG-5 usage-routinier ; USG-6 abandon</w:t>
+            </w:r>
+          </w:p>
+        </w:tc>
+        <w:tc>
+          <w:tcPr/>
+          <w:p>
+            <w:pPr>
+              <w:pStyle w:val="Compact"/>
+              <w:jc w:val="left"/>
+            </w:pPr>
+            <w:r>
+              <w:t xml:space="preserve">Position de chaque répondant sur l'échelle d'états d'usage définie en OS1</w:t>
+            </w:r>
+          </w:p>
+        </w:tc>
+        <w:tc>
+          <w:tcPr/>
+          <w:p>
+            <w:pPr>
+              <w:pStyle w:val="Compact"/>
+              <w:jc w:val="left"/>
+            </w:pPr>
+            <w:r>
+              <w:t xml:space="preserve">Cadrage empirique (Q3)</w:t>
+            </w:r>
+          </w:p>
+        </w:tc>
+      </w:tr>
+      <w:tr>
+        <w:trPr>
+          <w:cantSplit/>
+        </w:trPr>
+        <w:tc>
+          <w:tcPr/>
+          <w:p>
+            <w:pPr>
+              <w:pStyle w:val="Compact"/>
+              <w:jc w:val="left"/>
+            </w:pPr>
+            <w:r>
+              <w:t xml:space="preserve">Projection (descriptif)</w:t>
+            </w:r>
+          </w:p>
+        </w:tc>
+        <w:tc>
+          <w:tcPr/>
+          <w:p>
+            <w:pPr>
+              <w:pStyle w:val="Compact"/>
+              <w:jc w:val="left"/>
+            </w:pPr>
+            <w:r>
+              <w:t xml:space="preserve">PRO-FUT</w:t>
+            </w:r>
+          </w:p>
+        </w:tc>
+        <w:tc>
+          <w:tcPr/>
+          <w:p>
+            <w:pPr>
+              <w:pStyle w:val="Compact"/>
+              <w:jc w:val="left"/>
+            </w:pPr>
+            <w:r>
+              <w:t xml:space="preserve">PRO-FUT-1 conditions-de-réussite ; PRO-FUT-2 écueils-anticipés</w:t>
+            </w:r>
+          </w:p>
+        </w:tc>
+        <w:tc>
+          <w:tcPr/>
+          <w:p>
+            <w:pPr>
+              <w:pStyle w:val="Compact"/>
+              <w:jc w:val="left"/>
+            </w:pPr>
+            <w:r>
+              <w:t xml:space="preserve">Projection du répondant à trois ou cinq ans</w:t>
+            </w:r>
+          </w:p>
+        </w:tc>
+        <w:tc>
+          <w:tcPr/>
+          <w:p>
+            <w:pPr>
+              <w:pStyle w:val="Compact"/>
+              <w:jc w:val="left"/>
+            </w:pPr>
+            <w:r>
+              <w:t xml:space="preserve">Mise en perspective (Q14)</w:t>
+            </w:r>
+          </w:p>
+        </w:tc>
+      </w:tr>
+      <w:tr>
+        <w:trPr>
+          <w:cantSplit/>
+        </w:trPr>
+        <w:tc>
+          <w:tcPr/>
+          <w:p>
+            <w:pPr>
+              <w:pStyle w:val="Compact"/>
+              <w:jc w:val="left"/>
+            </w:pPr>
+            <w:r>
+              <w:t xml:space="preserve">Émergence (ouverture de la grille)</w:t>
+            </w:r>
+          </w:p>
+        </w:tc>
+        <w:tc>
+          <w:tcPr/>
+          <w:p>
+            <w:pPr>
+              <w:pStyle w:val="Compact"/>
+              <w:jc w:val="left"/>
+            </w:pPr>
+            <w:r>
+              <w:t xml:space="preserve">EM</w:t>
+            </w:r>
+          </w:p>
+        </w:tc>
+        <w:tc>
+          <w:tcPr/>
+          <w:p>
+            <w:pPr>
+              <w:pStyle w:val="Compact"/>
+              <w:jc w:val="left"/>
+            </w:pPr>
+            <w:r>
+              <w:t xml:space="preserve">EM- suivi d'un libellé libre (codes contextuels, affectifs, processuels)</w:t>
+            </w:r>
+          </w:p>
+        </w:tc>
+        <w:tc>
+          <w:tcPr/>
+          <w:p>
+            <w:pPr>
+              <w:pStyle w:val="Compact"/>
+              <w:jc w:val="left"/>
+            </w:pPr>
+            <w:r>
+              <w:t xml:space="preserve">Segment irréductible à un code a priori</w:t>
+            </w:r>
+          </w:p>
+        </w:tc>
+        <w:tc>
+          <w:tcPr/>
+          <w:p>
+            <w:pPr>
+              <w:pStyle w:val="Compact"/>
+              <w:jc w:val="left"/>
+            </w:pPr>
+            <w:r>
+              <w:t xml:space="preserve">Ouverture (Q16 et transversal)</w:t>
             </w:r>
           </w:p>
         </w:tc>
@@ -15879,7 +16593,7 @@
               <w:jc w:val="left"/>
             </w:pPr>
             <w:r>
-              <w:t xml:space="preserve">Black &amp; van Esch (2020) ; Suen et al. (2019) ; Pillai &amp; Sivathanu (2020)</w:t>
+              <w:t xml:space="preserve">Black et van Esch (2020) ; Suen et al. (2019) ; Pillai et Sivathanu (2020)</w:t>
             </w:r>
           </w:p>
         </w:tc>
@@ -15967,7 +16681,7 @@
               <w:jc w:val="left"/>
             </w:pPr>
             <w:r>
-              <w:t xml:space="preserve">Marler &amp; Boudreau (2017) ; Chen et al. (2012)</w:t>
+              <w:t xml:space="preserve">Marler et Boudreau (2017) ; Chen et al. (2012)</w:t>
             </w:r>
           </w:p>
         </w:tc>
@@ -16058,7 +16772,7 @@
               <w:jc w:val="left"/>
             </w:pPr>
             <w:r>
-              <w:t xml:space="preserve">Marler &amp; Boudreau (2017) ; Tambe et al. (2019)</w:t>
+              <w:t xml:space="preserve">Marler et Boudreau (2017) ; Tambe et al. (2019)</w:t>
             </w:r>
           </w:p>
         </w:tc>
@@ -16123,7 +16837,7 @@
               <w:jc w:val="left"/>
             </w:pPr>
             <w:r>
-              <w:t xml:space="preserve">Charlwood &amp; Guenole (2022) ; Tursunbayeva et al. (2022)</w:t>
+              <w:t xml:space="preserve">Charlwood et Guenole (2022) ; Tursunbayeva et al. (2022)</w:t>
             </w:r>
           </w:p>
         </w:tc>
@@ -16236,7 +16950,7 @@
               <w:jc w:val="left"/>
             </w:pPr>
             <w:r>
-              <w:t xml:space="preserve">Black &amp; van Esch (2020)</w:t>
+              <w:t xml:space="preserve">Black et van Esch (2020)</w:t>
             </w:r>
           </w:p>
         </w:tc>
@@ -16355,7 +17069,7 @@
               <w:jc w:val="left"/>
             </w:pPr>
             <w:r>
-              <w:t xml:space="preserve">Pillai &amp; Sivathanu (2020)</w:t>
+              <w:t xml:space="preserve">Pillai et Sivathanu (2020)</w:t>
             </w:r>
           </w:p>
         </w:tc>
@@ -16408,7 +17122,7 @@
               <w:jc w:val="left"/>
             </w:pPr>
             <w:r>
-              <w:t xml:space="preserve">Marler &amp; Boudreau (2017)</w:t>
+              <w:t xml:space="preserve">Marler et Boudreau (2017)</w:t>
             </w:r>
           </w:p>
         </w:tc>
@@ -16646,7 +17360,7 @@
               <w:jc w:val="left"/>
             </w:pPr>
             <w:r>
-              <w:t xml:space="preserve">Charlwood &amp; Guenole (2022)</w:t>
+              <w:t xml:space="preserve">Charlwood et Guenole (2022)</w:t>
             </w:r>
           </w:p>
         </w:tc>
@@ -16699,7 +17413,7 @@
               <w:jc w:val="left"/>
             </w:pPr>
             <w:r>
-              <w:t xml:space="preserve">Köchling &amp; Wehner (2020)</w:t>
+              <w:t xml:space="preserve">Köchling et Wehner (2020)</w:t>
             </w:r>
           </w:p>
         </w:tc>
@@ -16752,7 +17466,7 @@
               <w:jc w:val="left"/>
             </w:pPr>
             <w:r>
-              <w:t xml:space="preserve">Langer &amp; Landers (2021)</w:t>
+              <w:t xml:space="preserve">Langer et Landers (2021)</w:t>
             </w:r>
           </w:p>
         </w:tc>
@@ -17046,19 +17760,19 @@
               <w:jc w:val="left"/>
             </w:pPr>
             <w:r>
-              <w:t xml:space="preserve">Continuité d'un continuum de digitalisation (Stone et al., 2015 ; Bondarouk et al., 2017)</w:t>
-            </w:r>
-          </w:p>
-        </w:tc>
-        <w:tc>
-          <w:tcPr/>
-          <w:p>
-            <w:pPr>
-              <w:pStyle w:val="Compact"/>
-              <w:jc w:val="left"/>
-            </w:pPr>
-            <w:r>
-              <w:t xml:space="preserve">Rupture qualitative appelant un champ de recherche propre (Tambe et al., 2019 ; Meijerink et al., 2021 ; Charlwood &amp; Guenole, 2022)</w:t>
+              <w:t xml:space="preserve">Continuité d'un continuum de digitalisation (Bondarouk et al., 2017 ; Stone et al., 2015)</w:t>
+            </w:r>
+          </w:p>
+        </w:tc>
+        <w:tc>
+          <w:tcPr/>
+          <w:p>
+            <w:pPr>
+              <w:pStyle w:val="Compact"/>
+              <w:jc w:val="left"/>
+            </w:pPr>
+            <w:r>
+              <w:t xml:space="preserve">Rupture qualitative appelant un champ de recherche propre (Charlwood &amp; Guenole, 2022 ; Meijerink et al., 2021 ; Tambe et al., 2019)</w:t>
             </w:r>
           </w:p>
         </w:tc>
@@ -17821,7 +18535,7 @@
               <w:jc w:val="left"/>
             </w:pPr>
             <w:r>
-              <w:t xml:space="preserve">Venkatesh et al.</w:t>
+              <w:t xml:space="preserve">Venkatesh, Thong et Xu</w:t>
             </w:r>
           </w:p>
         </w:tc>
@@ -18170,19 +18884,19 @@
               <w:jc w:val="left"/>
             </w:pPr>
             <w:r>
-              <w:t xml:space="preserve">Inconfort et craintes associés à l'IA, dont la crainte du remplacement et la peur de la perte de valeur ajoutée humaine ; antécédent négatif de FU</w:t>
-            </w:r>
-          </w:p>
-        </w:tc>
-        <w:tc>
-          <w:tcPr/>
-          <w:p>
-            <w:pPr>
-              <w:pStyle w:val="Compact"/>
-              <w:jc w:val="left"/>
-            </w:pPr>
-            <w:r>
-              <w:t xml:space="preserve">Venkatesh et Bala (2008) ; Tambe et al. (2019) ; Charlwood et Guenole (2022)</w:t>
+              <w:t xml:space="preserve">Anxiété éprouvée lors de la prise en main des outils d'IA ; antécédent négatif de FU, rattachée à P2</w:t>
+            </w:r>
+          </w:p>
+        </w:tc>
+        <w:tc>
+          <w:tcPr/>
+          <w:p>
+            <w:pPr>
+              <w:pStyle w:val="Compact"/>
+              <w:jc w:val="left"/>
+            </w:pPr>
+            <w:r>
+              <w:t xml:space="preserve">Venkatesh et Bala (2008) ; Compeau et Higgins (1995)</w:t>
             </w:r>
           </w:p>
         </w:tc>
@@ -18199,31 +18913,31 @@
               <w:jc w:val="left"/>
             </w:pPr>
             <w:r>
-              <w:t xml:space="preserve">Confiance envers les outils d'IA (CONF)</w:t>
-            </w:r>
-          </w:p>
-        </w:tc>
-        <w:tc>
-          <w:tcPr/>
-          <w:p>
-            <w:pPr>
-              <w:pStyle w:val="Compact"/>
-              <w:jc w:val="left"/>
-            </w:pPr>
-            <w:r>
-              <w:t xml:space="preserve">Volonté de s'en remettre aux recommandations algorithmiques en acceptant une part de vulnérabilité, sur la foi d'une attente de fiabilité</w:t>
-            </w:r>
-          </w:p>
-        </w:tc>
-        <w:tc>
-          <w:tcPr/>
-          <w:p>
-            <w:pPr>
-              <w:pStyle w:val="Compact"/>
-              <w:jc w:val="left"/>
-            </w:pPr>
-            <w:r>
-              <w:t xml:space="preserve">Mayer et al. (1995) ; Glikson et Woolley (2020) ; Dietvorst et al. (2015) ; Logg et al. (2019)</w:t>
+              <w:t xml:space="preserve">Anxiété générale et résistances (RES)</w:t>
+            </w:r>
+          </w:p>
+        </w:tc>
+        <w:tc>
+          <w:tcPr/>
+          <w:p>
+            <w:pPr>
+              <w:pStyle w:val="Compact"/>
+              <w:jc w:val="left"/>
+            </w:pPr>
+            <w:r>
+              <w:t xml:space="preserve">Anxiété générale et résistances identitaires ou éthiques suscitées par l'IA ; frein direct rattaché à P5</w:t>
+            </w:r>
+          </w:p>
+        </w:tc>
+        <w:tc>
+          <w:tcPr/>
+          <w:p>
+            <w:pPr>
+              <w:pStyle w:val="Compact"/>
+              <w:jc w:val="left"/>
+            </w:pPr>
+            <w:r>
+              <w:t xml:space="preserve">Charlwood et Guenole (2022) ; Meijerink et al. (2021)</w:t>
             </w:r>
           </w:p>
         </w:tc>
@@ -18240,31 +18954,31 @@
               <w:jc w:val="left"/>
             </w:pPr>
             <w:r>
-              <w:t xml:space="preserve">Transparence et explicabilité perçues (TRANSP)</w:t>
-            </w:r>
-          </w:p>
-        </w:tc>
-        <w:tc>
-          <w:tcPr/>
-          <w:p>
-            <w:pPr>
-              <w:pStyle w:val="Compact"/>
-              <w:jc w:val="left"/>
-            </w:pPr>
-            <w:r>
-              <w:t xml:space="preserve">Possibilité perçue de comprendre et de justifier les fondements d'une recommandation algorithmique</w:t>
-            </w:r>
-          </w:p>
-        </w:tc>
-        <w:tc>
-          <w:tcPr/>
-          <w:p>
-            <w:pPr>
-              <w:pStyle w:val="Compact"/>
-              <w:jc w:val="left"/>
-            </w:pPr>
-            <w:r>
-              <w:t xml:space="preserve">Shin (2021) ; Tambe et al. (2019)</w:t>
+              <w:t xml:space="preserve">Remplacement et valeur humaine menacée (RMP ; VAH)</w:t>
+            </w:r>
+          </w:p>
+        </w:tc>
+        <w:tc>
+          <w:tcPr/>
+          <w:p>
+            <w:pPr>
+              <w:pStyle w:val="Compact"/>
+              <w:jc w:val="left"/>
+            </w:pPr>
+            <w:r>
+              <w:t xml:space="preserve">Crainte du remplacement professionnel et peur de la perte de valeur ajoutée humaine ; freins directs rattachés à P5</w:t>
+            </w:r>
+          </w:p>
+        </w:tc>
+        <w:tc>
+          <w:tcPr/>
+          <w:p>
+            <w:pPr>
+              <w:pStyle w:val="Compact"/>
+              <w:jc w:val="left"/>
+            </w:pPr>
+            <w:r>
+              <w:t xml:space="preserve">Tambe et al. (2019) ; Charlwood et Guenole (2022)</w:t>
             </w:r>
           </w:p>
         </w:tc>
@@ -18281,31 +18995,31 @@
               <w:jc w:val="left"/>
             </w:pPr>
             <w:r>
-              <w:t xml:space="preserve">Perception des risques éthiques (RISK-ETH)</w:t>
-            </w:r>
-          </w:p>
-        </w:tc>
-        <w:tc>
-          <w:tcPr/>
-          <w:p>
-            <w:pPr>
-              <w:pStyle w:val="Compact"/>
-              <w:jc w:val="left"/>
-            </w:pPr>
-            <w:r>
-              <w:t xml:space="preserve">Sensibilité aux biais, à la discrimination et à l'équité perçue des décisions algorithmiques en RH</w:t>
-            </w:r>
-          </w:p>
-        </w:tc>
-        <w:tc>
-          <w:tcPr/>
-          <w:p>
-            <w:pPr>
-              <w:pStyle w:val="Compact"/>
-              <w:jc w:val="left"/>
-            </w:pPr>
-            <w:r>
-              <w:t xml:space="preserve">Lee (2018) ; Köchling et Wehner (2020) ; Charlwood et Guenole (2022)</w:t>
+              <w:t xml:space="preserve">Confiance envers les outils d'IA (CONF)</w:t>
+            </w:r>
+          </w:p>
+        </w:tc>
+        <w:tc>
+          <w:tcPr/>
+          <w:p>
+            <w:pPr>
+              <w:pStyle w:val="Compact"/>
+              <w:jc w:val="left"/>
+            </w:pPr>
+            <w:r>
+              <w:t xml:space="preserve">Volonté de s'en remettre aux recommandations algorithmiques en acceptant une part de vulnérabilité, sur la foi d'une attente de fiabilité</w:t>
+            </w:r>
+          </w:p>
+        </w:tc>
+        <w:tc>
+          <w:tcPr/>
+          <w:p>
+            <w:pPr>
+              <w:pStyle w:val="Compact"/>
+              <w:jc w:val="left"/>
+            </w:pPr>
+            <w:r>
+              <w:t xml:space="preserve">Mayer et al. (1995) ; Glikson et Woolley (2020) ; Dietvorst et al. (2015) ; Logg et al. (2019)</w:t>
             </w:r>
           </w:p>
         </w:tc>
@@ -18322,31 +19036,31 @@
               <w:jc w:val="left"/>
             </w:pPr>
             <w:r>
-              <w:t xml:space="preserve">Confidentialité des données RH (CONF-DATA)</w:t>
-            </w:r>
-          </w:p>
-        </w:tc>
-        <w:tc>
-          <w:tcPr/>
-          <w:p>
-            <w:pPr>
-              <w:pStyle w:val="Compact"/>
-              <w:jc w:val="left"/>
-            </w:pPr>
-            <w:r>
-              <w:t xml:space="preserve">Préoccupations relatives à la protection des données personnelles traitées par les outils d'IA, dans le contexte de la loi 09-08</w:t>
-            </w:r>
-          </w:p>
-        </w:tc>
-        <w:tc>
-          <w:tcPr/>
-          <w:p>
-            <w:pPr>
-              <w:pStyle w:val="Compact"/>
-              <w:jc w:val="left"/>
-            </w:pPr>
-            <w:r>
-              <w:t xml:space="preserve">Tursunbayeva et al. (2022) ; Budhwar et al. (2022)</w:t>
+              <w:t xml:space="preserve">Transparence et explicabilité perçues (TRANSP)</w:t>
+            </w:r>
+          </w:p>
+        </w:tc>
+        <w:tc>
+          <w:tcPr/>
+          <w:p>
+            <w:pPr>
+              <w:pStyle w:val="Compact"/>
+              <w:jc w:val="left"/>
+            </w:pPr>
+            <w:r>
+              <w:t xml:space="preserve">Possibilité perçue de comprendre et de justifier les fondements d'une recommandation algorithmique</w:t>
+            </w:r>
+          </w:p>
+        </w:tc>
+        <w:tc>
+          <w:tcPr/>
+          <w:p>
+            <w:pPr>
+              <w:pStyle w:val="Compact"/>
+              <w:jc w:val="left"/>
+            </w:pPr>
+            <w:r>
+              <w:t xml:space="preserve">Shin (2021) ; Tambe et al. (2019)</w:t>
             </w:r>
           </w:p>
         </w:tc>
@@ -18363,31 +19077,31 @@
               <w:jc w:val="left"/>
             </w:pPr>
             <w:r>
-              <w:t xml:space="preserve">Modérateurs contextuels</w:t>
-            </w:r>
-          </w:p>
-        </w:tc>
-        <w:tc>
-          <w:tcPr/>
-          <w:p>
-            <w:pPr>
-              <w:pStyle w:val="Compact"/>
-              <w:jc w:val="left"/>
-            </w:pPr>
-            <w:r>
-              <w:t xml:space="preserve">Culture organisationnelle, maturité digitale, taille, secteur, ancienneté du professionnel, cadre légal et institutionnel marocain ; le rôle légitimant du management est traité dans IS et non ici</w:t>
-            </w:r>
-          </w:p>
-        </w:tc>
-        <w:tc>
-          <w:tcPr/>
-          <w:p>
-            <w:pPr>
-              <w:pStyle w:val="Compact"/>
-              <w:jc w:val="left"/>
-            </w:pPr>
-            <w:r>
-              <w:t xml:space="preserve">Venkatesh et al. (2012) ; Budhwar et al. (2022) ; Pillai et Sivathanu (2020)</w:t>
+              <w:t xml:space="preserve">Perception des risques éthiques (RISK-ETH)</w:t>
+            </w:r>
+          </w:p>
+        </w:tc>
+        <w:tc>
+          <w:tcPr/>
+          <w:p>
+            <w:pPr>
+              <w:pStyle w:val="Compact"/>
+              <w:jc w:val="left"/>
+            </w:pPr>
+            <w:r>
+              <w:t xml:space="preserve">Sensibilité aux biais, à la discrimination et à l'équité perçue des décisions algorithmiques en RH</w:t>
+            </w:r>
+          </w:p>
+        </w:tc>
+        <w:tc>
+          <w:tcPr/>
+          <w:p>
+            <w:pPr>
+              <w:pStyle w:val="Compact"/>
+              <w:jc w:val="left"/>
+            </w:pPr>
+            <w:r>
+              <w:t xml:space="preserve">M. K. Lee (2018) ; Köchling et Wehner (2020) ; Charlwood et Guenole (2022)</w:t>
             </w:r>
           </w:p>
         </w:tc>
@@ -18404,6 +19118,88 @@
               <w:jc w:val="left"/>
             </w:pPr>
             <w:r>
+              <w:t xml:space="preserve">Confidentialité des données RH (CONF-DATA)</w:t>
+            </w:r>
+          </w:p>
+        </w:tc>
+        <w:tc>
+          <w:tcPr/>
+          <w:p>
+            <w:pPr>
+              <w:pStyle w:val="Compact"/>
+              <w:jc w:val="left"/>
+            </w:pPr>
+            <w:r>
+              <w:t xml:space="preserve">Préoccupations relatives à la protection des données personnelles traitées par les outils d'IA, dans le contexte de la loi 09-08</w:t>
+            </w:r>
+          </w:p>
+        </w:tc>
+        <w:tc>
+          <w:tcPr/>
+          <w:p>
+            <w:pPr>
+              <w:pStyle w:val="Compact"/>
+              <w:jc w:val="left"/>
+            </w:pPr>
+            <w:r>
+              <w:t xml:space="preserve">Tursunbayeva et al. (2022) ; Budhwar et al. (2022)</w:t>
+            </w:r>
+          </w:p>
+        </w:tc>
+      </w:tr>
+      <w:tr>
+        <w:trPr>
+          <w:cantSplit/>
+        </w:trPr>
+        <w:tc>
+          <w:tcPr/>
+          <w:p>
+            <w:pPr>
+              <w:pStyle w:val="Compact"/>
+              <w:jc w:val="left"/>
+            </w:pPr>
+            <w:r>
+              <w:t xml:space="preserve">Modérateurs contextuels</w:t>
+            </w:r>
+          </w:p>
+        </w:tc>
+        <w:tc>
+          <w:tcPr/>
+          <w:p>
+            <w:pPr>
+              <w:pStyle w:val="Compact"/>
+              <w:jc w:val="left"/>
+            </w:pPr>
+            <w:r>
+              <w:t xml:space="preserve">Culture organisationnelle, maturité digitale, taille, secteur, ancienneté du professionnel, cadre légal et institutionnel marocain ; le rôle légitimant du management est traité dans IS et non ici</w:t>
+            </w:r>
+          </w:p>
+        </w:tc>
+        <w:tc>
+          <w:tcPr/>
+          <w:p>
+            <w:pPr>
+              <w:pStyle w:val="Compact"/>
+              <w:jc w:val="left"/>
+            </w:pPr>
+            <w:r>
+              <w:t xml:space="preserve">Venkatesh et al. (2012) ; Budhwar et al. (2022) ; Pillai et Sivathanu (2020)</w:t>
+            </w:r>
+          </w:p>
+        </w:tc>
+      </w:tr>
+      <w:tr>
+        <w:trPr>
+          <w:cantSplit/>
+        </w:trPr>
+        <w:tc>
+          <w:tcPr/>
+          <w:p>
+            <w:pPr>
+              <w:pStyle w:val="Compact"/>
+              <w:jc w:val="left"/>
+            </w:pPr>
+            <w:r>
               <w:t xml:space="preserve">Intention d'adoption et usage effectif</w:t>
             </w:r>
           </w:p>
@@ -18440,6 +19236,7 @@
     <w:p>
       <w:pPr>
         <w:pStyle w:val="Heading1"/>
+        <w:pageBreakBefore/>
       </w:pPr>
       <w:r>
         <w:rPr>
@@ -18460,7 +19257,7 @@
         <w:fldChar w:fldCharType="separate"/>
       </w:r>
       <w:r>
-        <w:t>Table générée sous Word : clic droit puis « Mettre à jour les champs » (ou F9).</w:t>
+        <w:t>Table générée sous Word : clic droit puis « Mettre à jour les champs » (ou Ctrl+A puis F9).</w:t>
       </w:r>
       <w:r>
         <w:fldChar w:fldCharType="end"/>
@@ -18471,6 +19268,7 @@
     <w:p>
       <w:pPr>
         <w:pStyle w:val="Heading1"/>
+        <w:pageBreakBefore/>
       </w:pPr>
       <w:r>
         <w:rPr>
@@ -18485,7 +19283,7 @@
         <w:pStyle w:val="FirstParagraph"/>
       </w:pPr>
       <w:r>
-        <w:t xml:space="preserve">Tableau 1. Typologie des outils d'IA appliqués à la fonction RH et état de la preuve empirique (Annexe G) ; Tableau 2. Principaux travaux mobilisés sur l'adoption de l'IA en RH, nature et portée (Annexe G) ; Tableau 3. Controverses structurantes de la littérature et conséquences pour le modèle conceptuel (Annexe G) ; Tableau 4. Synthèse comparative des cinq modèles d'acceptation des technologies (Annexe G) ; Tableau 5. Variables du cadre intégrateur et ancrages théoriques (Annexe G) ; Tableau 6. Articulation des propositions de recherche ; Tableau 7. Critères d'inclusion et d'exclusion de l'échantillon ; Tableau 8. Matrice de diversification de l'échantillon ; Tableau 9. Correspondance entre propositions, thèmes, questions et familles de codes ; Tableau 10. Grille de codage a priori (extrait) ; Tableau E1. Grille de codage a priori complète (Annexe E).</w:t>
+        <w:t xml:space="preserve">Tableau 1. Typologie des outils d'IA appliqués à la fonction RH et état de la preuve empirique (Annexe G) ; Tableau 2. Principaux travaux mobilisés sur l'adoption de l'IA en RH, nature et portée (Annexe G) ; Tableau 3. Controverses structurantes de la littérature et conséquences pour le modèle conceptuel (Annexe G) ; Tableau 4. Synthèse comparative des cinq modèles d'acceptation des technologies (Annexe G) ; Tableau 5. Variables du cadre intégrateur et ancrages théoriques (Annexe G) ; Tableau 6. Articulation des propositions de recherche : acquis de la littérature et zones d'ombre mises à l'épreuve ; Tableau 7. Critères d'inclusion et d'exclusion de l'échantillon ; Tableau 8. Matrice de diversification de l'échantillon ; Tableau 9. Correspondance entre propositions de recherche, thèmes du guide, questions et familles de codes ; Tableau 10. Grille de codage a priori (extrait) ; Tableau A1. Fiche logistique de l'entretien (Annexe A) ; Tableau A2. Correspondance entre propositions de recherche, thèmes, questions et familles de codes (Annexe A) ; Tableau D1. Matrice de traçabilité entre questions du guide, propositions de recherche et familles de codes (Annexe D) ; Tableau E1. Grille de codage a priori : familles, codes, sous-codes, définitions et ancrages théoriques (Annexe E).</w:t>
       </w:r>
     </w:p>
     <w:p>
@@ -18505,6 +19303,7 @@
     <w:p>
       <w:pPr>
         <w:pStyle w:val="Heading1"/>
+        <w:pageBreakBefore/>
       </w:pPr>
       <w:r>
         <w:rPr>

</xml_diff>

<commit_message>
Condense le corps à 79 pages hors annexes après les corrections d'audit
Condensation zonale en treize zones, chaque sortie validée avant intégration
(bornes de longueur, lignes de tableaux, images et légendes identiques au
caractère près, aucune citation APA perdue, chaînes juridiques et durées de
conservation intactes, aucun tiret proscrit). Dernière zone traitée par
remplacements ciblés. Séparations de titres rétablies aux jointures de zones :
les 127 titres du volume sont de nouveau reconnus, sommaire et table des
matières complets. Corps : 79 pages hors annexes (131 au total).

Co-Authored-By: Claude Fable 5 <noreply@anthropic.com>
Claude-Session: https://claude.ai/code/session_019cQWueQyn1tismMV8DQS9i
</commit_message>
<xml_diff>
--- a/revision-memoire/manuscrit/Memoire_GEMBA_EL-HASSOUNY_corrige_v1.docx
+++ b/revision-memoire/manuscrit/Memoire_GEMBA_EL-HASSOUNY_corrige_v1.docx
@@ -1634,7 +1634,7 @@
         <w:pStyle w:val="FirstParagraph"/>
       </w:pPr>
       <w:r>
-        <w:t xml:space="preserve">L'intelligence artificielle a quitté les laboratoires pour s'installer dans le quotidien des organisations. Depuis la diffusion massive des systèmes d'IA générative à la fin de l'année 2022, la question posée aux directions n'est plus de savoir si ces technologies seront utilisées, mais comment les collaborateurs se les approprient, avec quelles attentes et quelles réticences (Berente et al., 2021 ; Dwivedi et al., 2021). La fonction ressources humaines illustre ce basculement avec une acuité particulière. Devenue un acteur stratégique de la performance des organisations (Stone et al., 2015), accompagnée pendant deux décennies par les SIRH puis par l'e-HRM avec des résultats contrastés (Bondarouk &amp; Ruël, 2009 ; Bondarouk et al., 2017 ; Strohmeier, 2007), elle voit l'IA franchir aujourd'hui un seuil supplémentaire. Tri automatisé des candidatures, agents conversationnels de recrutement,</w:t>
+        <w:t xml:space="preserve">L'intelligence artificielle a quitté les laboratoires pour le quotidien des organisations. Depuis la diffusion massive de l'IA générative fin 2022, la question posée aux directions n'est plus de savoir si ces technologies seront utilisées, mais comment les collaborateurs se les approprient, avec quelles attentes et réticences (Berente et al., 2021 ; Dwivedi et al., 2021). La fonction ressources humaines illustre ce basculement avec acuité. Devenue acteur stratégique de la performance (Stone et al., 2015), accompagnée deux décennies durant par les SIRH puis l'e-HRM, aux résultats contrastés (Bondarouk &amp; Ruël, 2009 ; Bondarouk et al., 2017 ; Strohmeier, 2007), elle voit l'IA franchir un seuil supplémentaire. Tri automatisé des candidatures, agents conversationnels de recrutement,</w:t>
       </w:r>
       <w:r>
         <w:t xml:space="preserve"> </w:t>
@@ -1650,15 +1650,15 @@
         <w:t xml:space="preserve"> </w:t>
       </w:r>
       <w:r>
-        <w:t xml:space="preserve">prédictifs, parcours de formation adaptatifs, IA générative mobilisée pour rédiger une fiche de poste : ces outils ne se limitent plus à accélérer des tâches existantes, ils touchent au cœur du jugement professionnel (Budhwar et al., 2022 ; Tambe et al., 2019 ; Vrontis et al., 2022), le recrutement concentrant les usages les plus visibles (Black &amp; van Esch, 2020 ; Suen et al., 2019).</w:t>
-      </w:r>
-    </w:p>
-    <w:p>
-      <w:pPr>
-        <w:pStyle w:val="BodyText"/>
-      </w:pPr>
-      <w:r>
-        <w:t xml:space="preserve">Un constat structure l'ensemble du mémoire : l'IA ne peut pas être étudiée comme un simple module supplémentaire du SIRH. Elle s'en distingue par au moins cinq traits : l'opacité des mécanismes qui produisent une recommandation, qui déplace la question de l'acceptation vers celle de l'explicabilité ; la confiance, devenue condition centrale de la relation entre le professionnel et l'outil (Glikson &amp; Woolley, 2020) ; des risques éthiques avérés de biais et de discrimination algorithmique, particulièrement sensibles en recrutement (Köchling &amp; Wehner, 2020) ; la confidentialité de données RH qui touchent directement à la vie des personnes (Tursunbayeva et al., 2022) ; enfin la crainte du remplacement du professionnel par la machine qu'il est précisément invité à adopter (Charlwood &amp; Guenole, 2022 ; Meijerink et al., 2021). Une telle technologie appelle un cadre d'analyse enrichi, non une application mécanique de modèles conçus dans les années 1990 pour la bureautique.</w:t>
+        <w:t xml:space="preserve">prédictifs, parcours de formation adaptatifs, IA générative rédigeant des fiches de poste : ces outils n'accélèrent plus seulement des tâches existantes, ils touchent au cœur du jugement professionnel (Budhwar et al., 2022 ; Tambe et al., 2019 ; Vrontis et al., 2022), le recrutement concentrant les usages les plus visibles (Black &amp; van Esch, 2020 ; Suen et al., 2019).</w:t>
+      </w:r>
+    </w:p>
+    <w:p>
+      <w:pPr>
+        <w:pStyle w:val="BodyText"/>
+      </w:pPr>
+      <w:r>
+        <w:t xml:space="preserve">Un constat structure tout le mémoire : l'IA ne peut être étudiée comme un simple module du SIRH. Elle s'en distingue par au moins cinq traits : l'opacité des mécanismes de recommandation, qui déplace la question de l'acceptation vers l'explicabilité ; la confiance, devenue condition centrale de la relation du professionnel à l'outil (Glikson &amp; Woolley, 2020) ; des risques éthiques avérés de biais et de discrimination algorithmique, aigus en recrutement (Köchling &amp; Wehner, 2020) ; la confidentialité de données RH touchant directement à la vie des personnes (Tursunbayeva et al., 2022) ; enfin la crainte du remplacement du professionnel par la machine qu'il est précisément invité à adopter (Charlwood &amp; Guenole, 2022 ; Meijerink et al., 2021). Une telle technologie appelle un cadre d'analyse enrichi, non l'application mécanique de modèles conçus pour la bureautique des années 1990.</w:t>
       </w:r>
     </w:p>
     <w:p>
@@ -1682,15 +1682,15 @@
         <w:t xml:space="preserve"> </w:t>
       </w:r>
       <w:r>
-        <w:t xml:space="preserve">(Ministère délégué chargé de la Transition Numérique et de la Réforme de l'Administration, 2024), lancée officiellement en septembre 2024, articule la digitalisation des services publics et le développement de l'économie numérique, avec parmi ses catalyseurs transversaux la formation aux talents digitaux et l'intégration de l'intelligence artificielle. Le socle juridique de la protection des données repose sur la loi 09-08, promulguée par le Dahir n° 1-09-15 du 18 février 2009 et dont l'application est contrôlée par la CNDP ; aucun texte marocain ne régit à ce jour spécifiquement l'IA. Les professionnels RH évoluent donc entre une incitation nationale forte à digitaliser et un encadrement de l'IA encore en construction, situation qui rend leurs arbitrages individuels d'autant plus décisifs.</w:t>
-      </w:r>
-    </w:p>
-    <w:p>
-      <w:pPr>
-        <w:pStyle w:val="BodyText"/>
-      </w:pPr>
-      <w:r>
-        <w:t xml:space="preserve">C'est dans ce paysage que s'inscrit le terrain retenu : la région Souss-Massa, structurée autour du pôle économique d'Agadir. Son tissu productif combine des dominantes agro-alimentaire, touristique et halieutique avec un développement notable des services et de l'</w:t>
+        <w:t xml:space="preserve">(Ministère délégué chargé de la Transition Numérique et de la Réforme de l'Administration, 2024), lancée en septembre 2024, articule digitalisation des services publics et développement de l'économie numérique, avec parmi ses catalyseurs transversaux la formation aux talents digitaux et l'intégration de l'IA. Le socle juridique de la protection des données repose sur la loi 09-08, promulguée par le Dahir n° 1-09-15 du 18 février 2009 et dont l'application est contrôlée par la CNDP ; aucun texte marocain ne régit à ce jour spécifiquement l'IA. Les professionnels RH évoluent donc entre forte incitation nationale à digitaliser et encadrement de l'IA encore en construction, ce qui rend leurs arbitrages individuels d'autant plus décisifs.</w:t>
+      </w:r>
+    </w:p>
+    <w:p>
+      <w:pPr>
+        <w:pStyle w:val="BodyText"/>
+      </w:pPr>
+      <w:r>
+        <w:t xml:space="preserve">Dans ce paysage s'inscrit le terrain retenu : la région Souss-Massa, structurée autour du pôle économique d'Agadir. Son tissu productif mêle dominantes agro-alimentaire, touristique et halieutique, développement notable des services et de l'</w:t>
       </w:r>
       <w:r>
         <w:rPr>
@@ -1700,7 +1700,7 @@
         <w:t xml:space="preserve">offshoring</w:t>
       </w:r>
       <w:r>
-        <w:t xml:space="preserve">, et juxtapose TPE familiales, PME exportatrices et filiales de groupes internationaux. Cette diversité sectorielle et organisationnelle en fait un observatoire pertinent des écarts de maturité digitale. Or l'adoption effective de l'IA par les professionnels RH y demeure inégale et très peu documentée ; ce que l'on y observera ne vaudra pas pour l'ensemble du Maroc, mais fournira un point de comparaison utile pour d'autres régions au profil économique voisin. C'est précisément cette zone d'ombre que la présente recherche entend éclairer.</w:t>
+        <w:t xml:space="preserve">, et juxtapose TPE familiales, PME exportatrices et filiales de groupes internationaux. Cette double diversité en fait un observatoire pertinent des écarts de maturité digitale. Or l'adoption effective de l'IA par les professionnels RH y demeure inégale et très peu documentée ; ce que l'on y observera ne vaudra pas pour l'ensemble du Maroc, mais fournira un point de comparaison utile pour d'autres régions au profil économique voisin. C'est cette zone d'ombre que la présente recherche entend éclairer.</w:t>
       </w:r>
     </w:p>
     <w:bookmarkEnd w:id="28"/>
@@ -1722,15 +1722,15 @@
         <w:pStyle w:val="FirstParagraph"/>
       </w:pPr>
       <w:r>
-        <w:t xml:space="preserve">L'intérêt scientifique du sujet tient à la rencontre entre une littérature abondante et un objet qui lui échappe encore partiellement. Les modèles d'acceptation des technologies forment un corpus éprouvé, du TAM fondateur (Davis, 1989) à l'UTAUT (Venkatesh et al., 2003) et à leurs extensions successives (Venkatesh &amp; Davis, 2000 ; Venkatesh &amp; Bala, 2008 ; Venkatesh et al., 2012). Leur application à l'IA dans la fonction RH laisse pourtant trois angles morts, qui délimitent la contribution visée. Une lacune sectorielle, d'abord : les professionnels RH, pourtant à la fois prescripteurs et utilisateurs des outils, restent peu étudiés comme adoptants à part entière (Budhwar et al., 2022 ; Tambe et al., 2019). Une lacune contextuelle, ensuite : la production empirique se concentre en Amérique du Nord, en Europe et en Asie (Pillai &amp; Sivathanu, 2020), le continent africain, et le Maroc en particulier, y occupant une place marginale. Une lacune méthodologique, enfin : les recensions soulignent la domination des devis quantitatifs par questionnaire (Williams et al., 2015), alors que la compréhension fine des représentations, des craintes et des arbitrages appelle des approches qualitatives, encore rares sur cet objet.</w:t>
-      </w:r>
-    </w:p>
-    <w:p>
-      <w:pPr>
-        <w:pStyle w:val="BodyText"/>
-      </w:pPr>
-      <w:r>
-        <w:t xml:space="preserve">Le versant managérial est tout aussi direct : les DRH et les directions générales doivent décider d'investissements dont ils mesurent mal les conditions d'appropriation, les éditeurs de solutions cherchent à comprendre les attentes de marchés encore jeunes et les acteurs publics, engagés dans la mise en œuvre de</w:t>
+        <w:t xml:space="preserve">L'intérêt scientifique tient à la rencontre entre une littérature abondante et un objet qui lui échappe encore partiellement. Les modèles d'acceptation des technologies forment un corpus éprouvé, du TAM fondateur (Davis, 1989) à l'UTAUT (Venkatesh et al., 2003) et à leurs extensions successives (Venkatesh &amp; Davis, 2000 ; Venkatesh &amp; Bala, 2008 ; Venkatesh et al., 2012). Leur application à l'IA dans la fonction RH laisse pourtant trois angles morts, délimitant la contribution visée. Une lacune sectorielle, d'abord : les professionnels RH, à la fois prescripteurs et utilisateurs, restent peu étudiés comme adoptants à part entière (Budhwar et al., 2022 ; Tambe et al., 2019). Une lacune contextuelle, ensuite : la production empirique se concentre en Amérique du Nord, en Europe et en Asie (Pillai &amp; Sivathanu, 2020), l'Afrique, et le Maroc en particulier, y occupant une place marginale. Une lacune méthodologique, enfin : les recensions soulignent la domination des devis quantitatifs par questionnaire (Williams et al., 2015), alors que la compréhension fine des représentations, craintes et arbitrages appelle des approches qualitatives, encore rares sur cet objet.</w:t>
+      </w:r>
+    </w:p>
+    <w:p>
+      <w:pPr>
+        <w:pStyle w:val="BodyText"/>
+      </w:pPr>
+      <w:r>
+        <w:t xml:space="preserve">Le versant managérial est tout aussi direct : DRH et directions générales doivent décider d'investissements dont ils mesurent mal les conditions d'appropriation, les éditeurs de solutions sondent les attentes de marchés encore jeunes et les acteurs publics, engagés dans la mise en œuvre de</w:t>
       </w:r>
       <w:r>
         <w:t xml:space="preserve"> </w:t>
@@ -1743,15 +1743,15 @@
         <w:t xml:space="preserve">Maroc Digital 2030</w:t>
       </w:r>
       <w:r>
-        <w:t xml:space="preserve">, ont besoin de connaissances situées pour calibrer la formation et l'accompagnement des entreprises. S'y ajoute un intérêt proprement contextuel : les connaissances sur les pratiques RH de la région Souss-Massa restent fragmentaires et, sur l'usage de l'IA, à peu près inexistantes dans les bases consultées (Annexe F) ; produire un matériau empirique de première main possède une valeur documentaire propre, en réponse aux appels internationaux à diversifier les contextes d'étude de l'IA en RH (Budhwar et al., 2022).</w:t>
-      </w:r>
-    </w:p>
-    <w:p>
-      <w:pPr>
-        <w:pStyle w:val="BodyText"/>
-      </w:pPr>
-      <w:r>
-        <w:t xml:space="preserve">Un choix de positionnement doit être explicité d'emblée : le contexte marocain n'est pas traité ici comme une toile de fond. La culture organisationnelle, la maturité digitale des entreprises, la taille de l'organisation et le cadre de la loi 09-08 sont intégrés au modèle d'analyse comme des variables actives, susceptibles de déplacer les équilibres décrits par la littérature internationale ; cette ambition, cristallisée dans la proposition P7, constitue l'un des axes centraux de la contribution attendue. Le niveau d'analyse retenu est celui de l'individu : le professionnel RH, saisi dans son organisation, avec ses perceptions, ses intentions et ses pratiques déclarées. La démarche se veut ainsi complémentaire des travaux quantitatifs dominants, qu'elle peut nourrir en retour par des propositions affinées et contextualisées.</w:t>
+        <w:t xml:space="preserve">, ont besoin de connaissances situées pour calibrer formation et accompagnement des entreprises. S'y ajoute un intérêt contextuel : les connaissances sur les pratiques RH de la région Souss-Massa restent fragmentaires et, sur l'usage de l'IA, à peu près inexistantes dans les bases consultées (Annexe F) ; produire un matériau empirique de première main a une valeur documentaire propre, en réponse aux appels internationaux à diversifier les contextes d'étude de l'IA en RH (Budhwar et al., 2022).</w:t>
+      </w:r>
+    </w:p>
+    <w:p>
+      <w:pPr>
+        <w:pStyle w:val="BodyText"/>
+      </w:pPr>
+      <w:r>
+        <w:t xml:space="preserve">Un choix de positionnement doit être explicité d'emblée : le contexte marocain n'est pas ici une toile de fond. La culture organisationnelle, la maturité digitale, la taille de l'organisation et le cadre de la loi 09-08 sont intégrés au modèle d'analyse comme variables actives, susceptibles de déplacer les équilibres décrits par la littérature internationale ; cette ambition, cristallisée dans la proposition P7, constitue un axe central de la contribution attendue. Le niveau d'analyse est celui de l'individu : le professionnel RH, saisi dans son organisation, avec ses perceptions, intentions et pratiques déclarées. La démarche se veut ainsi complémentaire des travaux quantitatifs dominants, qu'elle peut nourrir en retour par des propositions affinées et contextualisées.</w:t>
       </w:r>
     </w:p>
     <w:bookmarkEnd w:id="29"/>
@@ -2199,15 +2199,15 @@
         <w:pStyle w:val="FirstParagraph"/>
       </w:pPr>
       <w:r>
-        <w:t xml:space="preserve">La recherche adopte une posture post-positiviste : une réalité des mécanismes d'adoption existe indépendamment du chercheur, mais elle n'est accessible que de manière imparfaite, à travers des perceptions situées et un dispositif faillible (Guba &amp; Lincoln, 1994 ; Popper, 1959). Cette position autorise une démarche déductive : partir d'un cadre théorique établi, en dériver des propositions falsifiables par le discours, puis les confronter à un matériau empirique qui conserve le pouvoir de les contredire. Le choix du qualitatif découle de la nature de la question posée. Comprendre pourquoi un professionnel RH accorde ou refuse sa confiance à un algorithme, comment il vit la perspective d'être partiellement remplacé, ce que la loi 09-08 évoque concrètement dans sa pratique : ces objets se prêtent mal aux échelles fermées d'un questionnaire.</w:t>
-      </w:r>
-    </w:p>
-    <w:p>
-      <w:pPr>
-        <w:pStyle w:val="BodyText"/>
-      </w:pPr>
-      <w:r>
-        <w:t xml:space="preserve">Le dispositif prévoit douze à vingt entretiens semi-directifs auprès de professionnels RH de la région Souss-Massa (DRH, responsables RH, chargés de recrutement et de formation), sélectionnés par échantillonnage raisonné selon une matrice de diversification à cinq axes (taille d'organisation, secteur d'activité, genre, ancienneté dans la fonction RH et statut managérial), l'exposition récente à un outil d'IA constituant un critère d'inclusion, la taille finale de l'échantillon étant arbitrée par la saturation thématique (Guest et al., 2006 ; Saunders et al., 2018). Le guide d'entretien est construit thème par thème à partir des propositions P1 à P7, ce qui garantit la traçabilité entre cadre théorique, questions posées et grille d'analyse ; ses questions sont délibérément orientées vers le récit d'expérience vécue plutôt que vers l'opinion générale. Les entretiens seront conduits en français, avec des reformulations possibles en</w:t>
+        <w:t xml:space="preserve">La recherche adopte une posture post-positiviste : une réalité des mécanismes d'adoption existe indépendamment du chercheur, mais n'est accessible qu'imparfaitement, à travers des perceptions situées et un dispositif faillible (Guba &amp; Lincoln, 1994 ; Popper, 1959). Cette posture autorise une démarche déductive : dériver d'un cadre théorique établi des propositions falsifiables par le discours, puis les confronter à un matériau empirique gardant le pouvoir de les contredire. Comprendre pourquoi un professionnel RH accorde ou refuse sa confiance à un algorithme, comment il vit la perspective d'être partiellement remplacé, ce que la loi 09-08 évoque concrètement dans sa pratique : ces objets se prêtent mal aux échelles fermées d'un questionnaire, d'où le choix du qualitatif.</w:t>
+      </w:r>
+    </w:p>
+    <w:p>
+      <w:pPr>
+        <w:pStyle w:val="BodyText"/>
+      </w:pPr>
+      <w:r>
+        <w:t xml:space="preserve">Le dispositif prévoit douze à vingt entretiens semi-directifs auprès de professionnels RH de la région Souss-Massa (DRH, responsables RH, chargés de recrutement et de formation), retenus par échantillonnage raisonné selon une matrice de diversification à cinq axes (taille d'organisation, secteur d'activité, genre, ancienneté dans la fonction RH et statut managérial) ; l'exposition récente à un outil d'IA sert de critère d'inclusion et la saturation thématique arbitre la taille finale de l'échantillon (Guest et al., 2006 ; Saunders et al., 2018). Construit thème par thème à partir des propositions P1 à P7, le guide d'entretien assure la traçabilité entre cadre théorique, questions posées et grille d'analyse ; ses questions visent délibérément le récit d'expérience vécue plutôt que l'opinion générale. Les entretiens seront conduits en français, avec reformulation possible en</w:t>
       </w:r>
       <w:r>
         <w:t xml:space="preserve"> </w:t>
@@ -2220,7 +2220,7 @@
         <w:t xml:space="preserve">darija</w:t>
       </w:r>
       <w:r>
-        <w:t xml:space="preserve">, et les dilemmes de traduction seront traités avec les précautions recommandées par la littérature (Temple &amp; Young, 2004). Les données seront analysées par analyse thématique (Bardin, 2013 ; Braun &amp; Clarke, 2006 ; Miles et al., 2014), avec une grille de codage déductive ouverte aux codes émergents et un double codage partiel, complétées par une triangulation avec les documents organisationnels partagés par les répondants (politiques RH, chartes d'usage de l'IA, plans de formation). La qualité de l'ensemble sera appréciée à l'aune des critères de crédibilité, de transférabilité, de fiabilité et de confirmabilité (Lincoln &amp; Guba, 1985) ; le dispositif éthique (consentement éclairé, pseudonymisation, conservation sécurisée), aligné sur la loi 09-08, s'inspire à titre complémentaire des exigences du RGPD. La Partie II justifie chacun de ces choix et en expose les limites anticipées.</w:t>
+        <w:t xml:space="preserve">, les dilemmes de traduction étant traités avec les précautions recommandées (Temple &amp; Young, 2004). L'analyse thématique des données (Bardin, 2013 ; Braun &amp; Clarke, 2006 ; Miles et al., 2014) mobilisera une grille de codage déductive ouverte aux codes émergents, un double codage partiel et une triangulation avec les documents organisationnels remis par les répondants (politiques RH, chartes d'usage de l'IA, plans de formation). La qualité sera appréciée selon les critères de crédibilité, transférabilité, fiabilité et confirmabilité (Lincoln &amp; Guba, 1985) ; le dispositif éthique (consentement éclairé, pseudonymisation, conservation sécurisée), aligné sur la loi 09-08, s'inspire à titre complémentaire des exigences du RGPD. La Partie II justifie ces choix et en expose les limites anticipées.</w:t>
       </w:r>
     </w:p>
     <w:bookmarkEnd w:id="31"/>
@@ -2242,7 +2242,7 @@
         <w:pStyle w:val="FirstParagraph"/>
       </w:pPr>
       <w:r>
-        <w:t xml:space="preserve">Le document est organisé en deux parties, correspondant à la phase théorique et méthodologique de la recherche. La Partie I construit le socle conceptuel : le chapitre 1 dresse l'état des lieux de l'IA dans la fonction RH (définitions et typologies, transformation de la fonction, panorama des outils, enseignements de deux décennies d'e-HRM, revue empirique incluant les contextes africain, arabe et marocain) ; le chapitre 2 retrace la généalogie des modèles d'acceptation du TAM à l'UTAUT 2, discute leurs critiques et les cadres concurrents (Rogers, 2003), puis construit le cadre intégrateur et le modèle conceptuel</w:t>
+        <w:t xml:space="preserve">Deux parties couvrent la phase théorique et méthodologique de la recherche. La Partie I construit le socle conceptuel : le chapitre 1 dresse l'état des lieux de l'IA dans la fonction RH (définitions et typologies, transformation de la fonction, panorama des outils, enseignements de deux décennies d'e-HRM, revue empirique incluant les contextes africain, arabe et marocain) ; le chapitre 2 retrace la généalogie des modèles d'acceptation du TAM à l'UTAUT 2, discute leurs critiques et les cadres concurrents (Rogers, 2003), puis construit le cadre intégrateur et le modèle conceptuel</w:t>
       </w:r>
       <w:r>
         <w:t xml:space="preserve"> </w:t>
@@ -2258,7 +2258,7 @@
         <w:t xml:space="preserve"> </w:t>
       </w:r>
       <w:r>
-        <w:t xml:space="preserve">articulé aux sept propositions. La Partie II expose la méthodologie : le chapitre 3 justifie la posture post-positiviste, le choix du qualitatif et la stratégie d'étude à visée explicative, puis présente le terrain de la région Souss-Massa ; le chapitre 4 détaille la construction de l'échantillon, le guide d'entretien et sa matrice de traçabilité, la procédure de collecte et le dispositif éthique, la stratégie d'analyse et les critères de scientificité. Une conclusion d'étape récapitule le chemin parcouru et fixe le calendrier indicatif du terrain ; la Partie III, consacrée aux résultats et à la discussion, sera rédigée à l'issue des entretiens. Les annexes rassemblent les instruments de la recherche (guide d'entretien complet, lettre de présentation, formulaire de consentement, grille de codage</w:t>
+        <w:t xml:space="preserve">articulé aux sept propositions. La Partie II expose la méthodologie : le chapitre 3 justifie la posture post-positiviste, le choix du qualitatif et la stratégie d'étude à visée explicative, puis présente le terrain de la région Souss-Massa ; le chapitre 4 détaille la construction de l'échantillon, le guide d'entretien et sa matrice de traçabilité, la procédure de collecte et le dispositif éthique, la stratégie d'analyse et les critères de scientificité. Une conclusion d'étape récapitule le parcours et fixe le calendrier indicatif du terrain ; la Partie III, consacrée aux résultats et à la discussion, sera rédigée à l'issue des entretiens. Les annexes rassemblent les instruments de la recherche (guide d'entretien complet, lettre de présentation, formulaire de consentement, grille de codage</w:t>
       </w:r>
       <w:r>
         <w:t xml:space="preserve"> </w:t>
@@ -2488,7 +2488,7 @@
         <w:pStyle w:val="FirstParagraph"/>
       </w:pPr>
       <w:r>
-        <w:t xml:space="preserve">Définir l'IA ne relève pas ici d'un préalable d'érudition : le périmètre retenu commande ce que la recherche pourra observer et ce que le modèle conceptuel devra expliquer. Or la littérature ne converge pas vers une définition unique. Les travaux d'ingénierie et de systèmes d'information entrent par les techniques et leurs performances (Janiesch et al., 2021) ; les travaux de management des SI par les propriétés de l'artefact, Berente et al. (2021) caractérisant la gestion de l'IA par trois facettes en tension, l'autonomie croissante des systèmes, leur capacité d'apprentissage et leur « inscrutabilité » (</w:t>
+        <w:t xml:space="preserve">Définir l'IA n'est pas un préalable d'érudition : le périmètre retenu commande ce que la recherche observera et ce que le modèle conceptuel devra expliquer. Or aucune définition unique ne fait consensus. L'ingénierie et les systèmes d'information entrent par les techniques et leurs performances (Janiesch et al., 2021) ; le management des SI par les propriétés de l'artefact, Berente et al. (2021) caractérisant la gestion de l'IA par trois facettes en tension, autonomie croissante des systèmes, capacité d'apprentissage et « inscrutabilité » (</w:t>
       </w:r>
       <w:r>
         <w:rPr>
@@ -2498,7 +2498,7 @@
         <w:t xml:space="preserve">inscrutability</w:t>
       </w:r>
       <w:r>
-        <w:t xml:space="preserve">) ; les travaux de gestion des ressources humaines, enfin, par les usages et leurs effets sur le travail et les personnes (Meijerink et al., 2021 ; Tambe et al., 2019). Selon l'entrée retenue, l'opacité algorithmique apparaît soit comme une limitation technique appelée à se résorber, soit comme une propriété stable de l'expérience d'usage. Ce mémoire retient la seconde lecture, et la section en expose les raisons.</w:t>
+        <w:t xml:space="preserve">) ; la gestion des ressources humaines, enfin, par les usages et leurs effets sur le travail et les personnes (Meijerink et al., 2021 ; Tambe et al., 2019). Selon l'entrée retenue, l'opacité algorithmique est une limitation technique appelée à se résorber ou une propriété stable de l'usage ; ce mémoire retient la seconde lecture et en expose les raisons.</w:t>
       </w:r>
     </w:p>
     <w:bookmarkStart w:id="37" w:name="Xda69909120d5858bf0f8908bfe6419a222b983d"/>
@@ -2519,7 +2519,7 @@
         <w:pStyle w:val="FirstParagraph"/>
       </w:pPr>
       <w:r>
-        <w:t xml:space="preserve">Née officiellement à la conférence de Dartmouth en 1956 dans une visée symbolique, fondée sur des règles logiques explicitement codées, l'IA connaît une première vague de systèmes experts avant l'« hiver » né de l'impossibilité de formaliser exhaustivement la connaissance humaine. L'inflexion contemporaine tient à un déplacement paradigmatique vers une IA fondée sur les données, rendu possible par la disponibilité massive de données numériques, l'accroissement de la puissance de calcul et le perfectionnement des algorithmes d'apprentissage statistique (Janiesch et al., 2021) ; il aboutit, à partir des années 2010, à l'essor du</w:t>
+        <w:t xml:space="preserve">Née à la conférence de Dartmouth en 1956 dans une visée symbolique fondée sur des règles logiques explicitement codées, l'IA connaît une première vague de systèmes experts avant l'« hiver » né de l'impossibilité de formaliser exhaustivement la connaissance humaine. L'inflexion contemporaine tient au déplacement vers une IA fondée sur les données, permis par l'abondance des données numériques, la puissance de calcul accrue et le perfectionnement des algorithmes d'apprentissage statistique (Janiesch et al., 2021), et aboutit dès les années 2010 à l'essor du</w:t>
       </w:r>
       <w:r>
         <w:t xml:space="preserve"> </w:t>
@@ -2535,7 +2535,7 @@
         <w:t xml:space="preserve"> </w:t>
       </w:r>
       <w:r>
-        <w:t xml:space="preserve">puis de l'IA générative (Dwivedi et al., 2021). Cette évolution rend accessibles aux non-spécialistes des fonctionnalités jusque-là réservées aux ingénieurs, facteur déterminant de la diffusion actuelle dans les fonctions support.</w:t>
+        <w:t xml:space="preserve">puis de l'IA générative (Dwivedi et al., 2021). Des fonctionnalités réservées aux ingénieurs deviennent accessibles aux non-spécialistes, facteur déterminant de la diffusion actuelle dans les fonctions support.</w:t>
       </w:r>
     </w:p>
     <w:bookmarkEnd w:id="37"/>
@@ -2557,7 +2557,7 @@
         <w:pStyle w:val="FirstParagraph"/>
       </w:pPr>
       <w:r>
-        <w:t xml:space="preserve">La distinction classique entre</w:t>
+        <w:t xml:space="preserve">La distinction entre</w:t>
       </w:r>
       <w:r>
         <w:t xml:space="preserve"> </w:t>
@@ -2583,7 +2583,7 @@
         <w:t xml:space="preserve">IA forte</w:t>
       </w:r>
       <w:r>
-        <w:t xml:space="preserve">, hypothétique intelligence générale, borne le périmètre de la recherche : les outils RH relèvent exclusivement de l'IA faible, performants sur des tâches circonscrites (trier des candidatures, prédire un risque de départ, recommander une formation) mais dépourvus d'autonomie cognitive. Au sein de l'IA faible, Janiesch et al. (2021) distinguent le</w:t>
+        <w:t xml:space="preserve">, hypothétique intelligence générale, borne le périmètre : les outils RH relèvent tous de l'IA faible, performants sur des tâches circonscrites (trier des candidatures, prédire un risque de départ, recommander une formation) mais dépourvus d'autonomie cognitive. Janiesch et al. (2021) y distinguent le</w:t>
       </w:r>
       <w:r>
         <w:t xml:space="preserve"> </w:t>
@@ -2596,7 +2596,7 @@
         <w:t xml:space="preserve">machine learning</w:t>
       </w:r>
       <w:r>
-        <w:t xml:space="preserve">, ensemble de techniques statistiques apprenant des régularités à partir de données, du</w:t>
+        <w:t xml:space="preserve">, techniques statistiques apprenant des régularités dans les données, du</w:t>
       </w:r>
       <w:r>
         <w:t xml:space="preserve"> </w:t>
@@ -2609,7 +2609,7 @@
         <w:t xml:space="preserve">deep learning</w:t>
       </w:r>
       <w:r>
-        <w:t xml:space="preserve">, sous-ensemble fondé sur des réseaux de neurones profonds. Cette distinction a une portée managériale directe : le</w:t>
+        <w:t xml:space="preserve">, sous-ensemble fondé sur des réseaux de neurones profonds. La portée managériale est directe : le</w:t>
       </w:r>
       <w:r>
         <w:t xml:space="preserve"> </w:t>
@@ -2625,7 +2625,7 @@
         <w:t xml:space="preserve"> </w:t>
       </w:r>
       <w:r>
-        <w:t xml:space="preserve">est réputé pour son opacité de « boîte noire », particulièrement problématique en RH, où les décisions affectent des trajectoires professionnelles (Charlwood &amp; Guenole, 2022 ; Tambe et al., 2019).</w:t>
+        <w:t xml:space="preserve">est réputé pour son opacité de « boîte noire », problématique en RH, où les décisions affectent des trajectoires professionnelles (Charlwood &amp; Guenole, 2022 ; Tambe et al., 2019).</w:t>
       </w:r>
     </w:p>
     <w:bookmarkEnd w:id="38"/>
@@ -2647,7 +2647,7 @@
         <w:pStyle w:val="FirstParagraph"/>
       </w:pPr>
       <w:r>
-        <w:t xml:space="preserve">L'émergence des grands modèles de langage (</w:t>
+        <w:t xml:space="preserve">Les grands modèles de langage (</w:t>
       </w:r>
       <w:r>
         <w:rPr>
@@ -2657,7 +2657,7 @@
         <w:t xml:space="preserve">Large Language Models</w:t>
       </w:r>
       <w:r>
-        <w:t xml:space="preserve">, LLM) et de l'IA générative constitue le tournant le plus visible des dernières années : ces systèmes ont massivement démocratisé l'usage de l'IA à partir de 2022-2023 et servent déjà, en RH, à rédiger des fiches de poste, répondre aux candidats, générer des supports de formation ou proposer des trames d'évaluation. L'état de la littérature appelle toutefois une mise en garde : les contributions les plus citées sont programmatiques, Dwivedi et al. (2021) dressant un agenda multidisciplinaire et Berente et al. (2021) un cadrage conceptuel, sans trancher empiriquement. Sur l'IA générative en RH, la littérature autorise donc des hypothèses de travail, non des résultats stabilisés : fiabilité, éthique et confidentialité y sont documentées comme préoccupations légitimes, sans que leur poids relatif dans les décisions d'adoption ait été mesuré, ce qui plaide pour un dispositif empirique ouvert à l'émergence.</w:t>
+        <w:t xml:space="preserve">, LLM) et l'IA générative constituent le tournant le plus visible des dernières années : ils ont démocratisé l'usage de l'IA à partir de 2022-2023 et servent déjà, en RH, à rédiger des fiches de poste, répondre aux candidats, générer des supports de formation ou proposer des trames d'évaluation. La littérature appelle toutefois une mise en garde : ses contributions les plus citées sont programmatiques, Dwivedi et al. (2021) dressant un agenda multidisciplinaire et Berente et al. (2021) un cadrage conceptuel, sans trancher empiriquement. Sur l'IA générative en RH, elle autorise donc des hypothèses de travail, non des résultats stabilisés : fiabilité, éthique et confidentialité y sont documentées comme préoccupations légitimes, sans mesure de leur poids relatif dans les décisions d'adoption, d'où le choix d'un dispositif empirique ouvert à l'émergence.</w:t>
       </w:r>
     </w:p>
     <w:p>
@@ -2675,7 +2675,7 @@
         <w:t xml:space="preserve"> </w:t>
       </w:r>
       <w:r>
-        <w:t xml:space="preserve">L'IA recouvre, pour les professionnels RH, un ensemble hétérogène de techniques (apprentissage statistique,</w:t>
+        <w:t xml:space="preserve">Pour les professionnels RH, l'IA recouvre des techniques hétérogènes (apprentissage statistique,</w:t>
       </w:r>
       <w:r>
         <w:t xml:space="preserve"> </w:t>
@@ -2688,7 +2688,7 @@
         <w:t xml:space="preserve">deep learning</w:t>
       </w:r>
       <w:r>
-        <w:t xml:space="preserve">, modèles génératifs) aux implications variables selon les tâches. Deux enseignements en découlent : l'hétérogénéité de l'objet interdit de traiter l'adoption comme un phénomène homogène et impose de laisser le répondant qualifier lui-même les outils dont il parle ; l'opacité est une propriété durable de l'expérience d'usage, non un défaut passager (Berente et al., 2021 ; Janiesch et al., 2021), ce qui commande de la traiter comme une variable explicative. Ce second enseignement fonde la proposition P6.</w:t>
+        <w:t xml:space="preserve">, modèles génératifs) aux implications variables selon les tâches. Deux enseignements en découlent : cette hétérogénéité interdit de traiter l'adoption comme un phénomène homogène et impose de laisser le répondant qualifier lui-même les outils dont il parle ; l'opacité est une propriété durable de l'usage, non un défaut passager (Berente et al., 2021 ; Janiesch et al., 2021), et doit donc être traitée comme variable explicative. Ce second enseignement fonde la proposition P6.</w:t>
       </w:r>
     </w:p>
     <w:bookmarkEnd w:id="39"/>
@@ -2724,7 +2724,7 @@
         <w:pStyle w:val="FirstParagraph"/>
       </w:pPr>
       <w:r>
-        <w:t xml:space="preserve">En quarante ans, la fonction RH est passée de l'administration du personnel (paie, contrats, dossiers) à une gestion élargie du recrutement, de la formation et de la mobilité, puis à un rôle de partenaire stratégique de la direction générale, porté par la reconnaissance du capital humain comme avantage concurrentiel (Stone et al., 2015). Cette montée en puissance s'accompagne d'une exigence de valeur démontrable qui crée un terrain favorable aux outils de mesure et d'optimisation : l'IA, technologie d'analyse et de prédiction, s'inscrit dans cette quête de légitimation par la donnée.</w:t>
+        <w:t xml:space="preserve">En quarante ans, la fonction RH est passée de l'administration du personnel (paie, contrats, dossiers) à une gestion élargie du recrutement, de la formation et de la mobilité, puis à un rôle de partenaire stratégique de la direction, porté par la reconnaissance du capital humain comme avantage concurrentiel (Stone et al., 2015). Elle s'accompagne d'une exigence de valeur démontrable, terrain favorable aux outils de mesure et d'optimisation : l'IA, technologie d'analyse et de prédiction, s'inscrit dans cette légitimation par la donnée.</w:t>
       </w:r>
     </w:p>
     <w:bookmarkEnd w:id="41"/>
@@ -2746,7 +2746,7 @@
         <w:pStyle w:val="FirstParagraph"/>
       </w:pPr>
       <w:r>
-        <w:t xml:space="preserve">Parallèlement, les systèmes d'information de ressources humaines (SIRH) ont centralisé les données, automatisé les tâches transactionnelles et externalisé certaines fonctions, dynamique étudiée de longue date par la littérature e-HRM (Bondarouk &amp; Ruël, 2009 ; Bondarouk et al., 2017 ; Marler &amp; Fisher, 2013 ; Strohmeier, 2007). Le passage du SIRH à l'IA relève donc moins d'une rupture absolue que d'un continuum : là où les SIRH ont rendu les données disponibles, l'IA leur confère un pouvoir prédictif et prescriptif, les organisations au socle SIRH mature paraissant mieux préparées que les autres (Bondarouk et al., 2017). La notion de</w:t>
+        <w:t xml:space="preserve">Parallèlement, les systèmes d'information de ressources humaines (SIRH) ont centralisé les données, automatisé les tâches transactionnelles et externalisé certaines fonctions, dynamique étudiée de longue date par la littérature e-HRM (Bondarouk &amp; Ruël, 2009 ; Bondarouk et al., 2017 ; Marler &amp; Fisher, 2013 ; Strohmeier, 2007). Le passage du SIRH à l'IA relève donc moins de la rupture que du continuum : là où les SIRH ont rendu les données disponibles, l'IA leur confère un pouvoir prédictif et prescriptif, les organisations au socle mature paraissant mieux préparées (Bondarouk et al., 2017). La</w:t>
       </w:r>
       <w:r>
         <w:t xml:space="preserve"> </w:t>
@@ -2762,15 +2762,15 @@
         <w:t xml:space="preserve"> </w:t>
       </w:r>
       <w:r>
-        <w:t xml:space="preserve">désigne une configuration où l'IA ne remplace pas le professionnel mais étend ses capacités d'analyse et de décision (Budhwar et al., 2022 ; Tambe et al., 2019) ; Tambe et al. (2019) identifient quatre défis propres à l'IA en RH, la complexité des phénomènes humains, la rareté des données, la sensibilité aux biais éthiques et juridiques et les réactions des salariés à une gestion algorithmique de leur trajectoire.</w:t>
-      </w:r>
-    </w:p>
-    <w:p>
-      <w:pPr>
-        <w:pStyle w:val="BodyText"/>
-      </w:pPr>
-      <w:r>
-        <w:t xml:space="preserve">Ces défis alimentent une controverse non tranchée qui traverse le chapitre : l'IA prolonge-t-elle la digitalisation de la fonction RH ou en marque-t-elle la rupture ? La thèse de la continuité fait de l'ouverture vers l'IA et le</w:t>
+        <w:t xml:space="preserve">désigne une configuration où l'IA ne remplace pas le professionnel mais étend ses capacités d'analyse et de décision (Budhwar et al., 2022 ; Tambe et al., 2019) ; Tambe et al. (2019) y identifient quatre défis, la complexité des phénomènes humains, la rareté des données, la sensibilité aux biais éthiques et juridiques et les réactions des salariés à une gestion algorithmique de leur trajectoire.</w:t>
+      </w:r>
+    </w:p>
+    <w:p>
+      <w:pPr>
+        <w:pStyle w:val="BodyText"/>
+      </w:pPr>
+      <w:r>
+        <w:t xml:space="preserve">Ces défis alimentent une controverse non tranchée : l'IA prolonge-t-elle la digitalisation RH ou en marque-t-elle la rupture ? La thèse de la continuité fait de l'IA et du</w:t>
       </w:r>
       <w:r>
         <w:t xml:space="preserve"> </w:t>
@@ -2786,23 +2786,23 @@
         <w:t xml:space="preserve"> </w:t>
       </w:r>
       <w:r>
-        <w:t xml:space="preserve">la quatrième phase d'un champ constitué depuis les années 1990 (Bondarouk et al., 2017), l'analyse prédictive figurant déjà parmi les leviers d'une transformation continue chez Stone et al. (2015) : les déterminants de l'adoption resteraient la maturité organisationnelle, la qualité du pilotage et le soutien de la direction. La thèse de la rupture s'appuie sur les propriétés de l'objet : Tambe et al. (2019) concluent que les recettes éprouvées de l'informatisation RH ne suffisent pas, Charlwood et Guenole (2022) parlent de paradoxes constitutifs et Meijerink et al. (2021) constituent la GRH algorithmique en champ de recherche distinct, la délégation partielle de décisions RH à des systèmes automatisés modifiant la nature même de la relation d'emploi.</w:t>
-      </w:r>
-    </w:p>
-    <w:p>
-      <w:pPr>
-        <w:pStyle w:val="BodyText"/>
-      </w:pPr>
-      <w:r>
-        <w:t xml:space="preserve">La position retenue dissocie deux plans, ce qui structure ensuite le modèle conceptuel. Sur les conditions organisationnelles, la continuité est la mieux étayée : rien n'indique qu'une organisation dépourvue de socle SIRH, de budget ou de compétences internes réussisse avec l'IA ce qu'elle a manqué avec l'e-HRM, constat qui justifie de conserver les conditions facilitantes issues d'UTAUT au cœur du modèle (proposition P4). Sur les ressorts subjectifs, l'argument de la rupture emporte la conviction : ni la confiance accordée à une recommandation opaque, ni la crainte d'être remplacé par l'outil que l'on est invité à déployer n'ont d'équivalent dans la littérature e-HRM, ce qui justifie les propositions P5 et P6. Cette dissociation constitue le premier apport analytique de la revue ; le terrain aura pour tâche de l'éprouver.</w:t>
-      </w:r>
-    </w:p>
-    <w:p>
-      <w:pPr>
-        <w:pStyle w:val="BodyText"/>
-      </w:pPr>
-      <w:r>
-        <w:t xml:space="preserve">Dans la région Souss-Massa, la trajectoire de la fonction RH paraît enfin plus compressée qu'en Europe occidentale ou en Amérique du Nord, certaines organisations ayant pu passer en moins d'une décennie d'une administration du personnel rudimentaire à une exposition aux outils d'IA. Cette hypothèse de « compression historique », non étayée par une littérature empirique systématique, constitue l'une des questions exploratoires que la recherche instruira en confrontant les trajectoires marocaines aux étapes décrites par la littérature internationale (Bondarouk et al., 2017 ; Stone et al., 2015) ; la rareté de la littérature marocaine sur l'adoption de l'IA en RH est d'ailleurs l'une des justifications scientifiques de la présente recherche.</w:t>
+        <w:t xml:space="preserve">la quatrième phase d'un champ constitué depuis les années 1990 (Bondarouk et al., 2017), l'analyse prédictive figurant déjà parmi les leviers de transformation chez Stone et al. (2015) : les déterminants de l'adoption resteraient la maturité organisationnelle, la qualité du pilotage et le soutien de la direction. La thèse de la rupture s'appuie sur les propriétés de l'objet : Tambe et al. (2019) concluent que les recettes de l'informatisation RH ne suffisent pas, Charlwood et Guenole (2022) parlent de paradoxes constitutifs et Meijerink et al. (2021) constituent la GRH algorithmique en champ distinct, la délégation partielle de décisions RH à des systèmes automatisés modifiant la nature de la relation d'emploi.</w:t>
+      </w:r>
+    </w:p>
+    <w:p>
+      <w:pPr>
+        <w:pStyle w:val="BodyText"/>
+      </w:pPr>
+      <w:r>
+        <w:t xml:space="preserve">La position retenue dissocie deux plans, ce qui structure le modèle conceptuel. Sur les conditions organisationnelles, la continuité est la mieux étayée : rien n'indique qu'une organisation dépourvue de socle SIRH, de budget ou de compétences internes réussisse avec l'IA ce qu'elle a manqué avec l'e-HRM, d'où le maintien des conditions facilitantes issues d'UTAUT au cœur du modèle (proposition P4). Sur les ressorts subjectifs, la rupture emporte la conviction : ni la confiance accordée à une recommandation opaque, ni la crainte d'être remplacé par l'outil que l'on est invité à déployer n'ont d'équivalent dans la littérature e-HRM, d'où les propositions P5 et P6. Cette dissociation est le premier apport analytique de la revue, que le terrain aura pour tâche d'éprouver.</w:t>
+      </w:r>
+    </w:p>
+    <w:p>
+      <w:pPr>
+        <w:pStyle w:val="BodyText"/>
+      </w:pPr>
+      <w:r>
+        <w:t xml:space="preserve">Dans le Souss-Massa, la trajectoire de la fonction RH paraît enfin plus compressée qu'en Europe occidentale ou en Amérique du Nord, certaines organisations ayant pu passer en moins d'une décennie d'une administration du personnel rudimentaire à l'exposition aux outils d'IA. Cette hypothèse de « compression historique », non étayée par une littérature empirique systématique, compte parmi les questions exploratoires que la recherche instruira en confrontant les trajectoires marocaines aux étapes décrites par la littérature internationale (Bondarouk et al., 2017 ; Stone et al., 2015) ; la rareté de la littérature marocaine sur l'adoption de l'IA en RH justifie d'ailleurs scientifiquement la recherche.</w:t>
       </w:r>
     </w:p>
     <w:bookmarkEnd w:id="42"/>
@@ -2824,15 +2824,15 @@
         <w:pStyle w:val="FirstParagraph"/>
       </w:pPr>
       <w:r>
-        <w:t xml:space="preserve">Quatre domaines d'application structurent aujourd'hui l'offre d'outils d'IA destinés aux ressources humaines : le recrutement, la gestion des talents, la formation et l'écoute des collaborateurs. Plutôt que d'en dresser le catalogue, la même question analytique est posée à chacun : que la littérature établit-elle réellement, sur quelle base probante, et que laisse-t-elle ouvert ? La réponse varie fortement d'un domaine à l'autre, et cette variation est elle-même un résultat de la revue.</w:t>
-      </w:r>
-    </w:p>
-    <w:p>
-      <w:pPr>
-        <w:pStyle w:val="BodyText"/>
-      </w:pPr>
-      <w:r>
-        <w:t xml:space="preserve">Le recrutement constitue le domaine le plus avancé et le plus publié (Black &amp; van Esch, 2020 ; Pillai &amp; Sivathanu, 2020 ; Suen et al., 2019) :</w:t>
+        <w:t xml:space="preserve">Quatre domaines structurent l'offre d'outils d'IA en ressources humaines : le recrutement, la gestion des talents, la formation et l'écoute des collaborateurs. Plutôt que d'en dresser le catalogue, la même question leur est posée : que la littérature établit-elle, sur quelle base probante, et que laisse-t-elle ouvert ? La réponse varie fortement d'un domaine à l'autre, variation qui est elle-même un résultat de la revue.</w:t>
+      </w:r>
+    </w:p>
+    <w:p>
+      <w:pPr>
+        <w:pStyle w:val="BodyText"/>
+      </w:pPr>
+      <w:r>
+        <w:t xml:space="preserve">Le recrutement est le domaine le plus avancé et le plus publié (Black &amp; van Esch, 2020 ; Pillai &amp; Sivathanu, 2020 ; Suen et al., 2019) :</w:t>
       </w:r>
       <w:r>
         <w:t xml:space="preserve"> </w:t>
@@ -2864,7 +2864,7 @@
         <w:t xml:space="preserve"> </w:t>
       </w:r>
       <w:r>
-        <w:t xml:space="preserve">candidat-poste, chatbots conversationnels gérant les premières étapes de la relation candidat, analyses vidéo automatisées d'entretiens. L'efficacité opérationnelle des étapes amont est établie ; ce qui divise tient au point de vue adopté. Black et van Esch (2020) raisonnent en managers et concluent que l'intérêt de ces outils réside dans la prise en charge de tâches répétitives à faible valeur ajoutée, sans établir les conditions dans lesquelles les recruteurs consentent effectivement à cette délégation ; Suen et al. (2019) montrent par voie expérimentale, côté candidat, que l'usage d'algorithmes n'altère pas les évaluations finales mais dégrade l'expérience perçue lorsqu'elle paraît déshumanisée ; Pillai et Sivathanu (2020) se placent au niveau de l'organisation. Ces travaux ne se contredisent pas : ils ne parlent pas du même sujet, et aucun ne prend pour objet le professionnel RH lui-même, premier indice de la lacune sectorielle discutée en section 1.5.</w:t>
+        <w:t xml:space="preserve">candidat-poste, chatbots pour les premières étapes de la relation candidat, analyses vidéo automatisées d'entretiens. L'efficacité opérationnelle des étapes amont est établie ; ce qui divise tient au point de vue adopté. Black et van Esch (2020) raisonnent en managers et situent l'intérêt de ces outils dans la prise en charge de tâches répétitives à faible valeur ajoutée, sans préciser à quelles conditions les recruteurs consentent à cette délégation ; Suen et al. (2019) montrent expérimentalement, côté candidat, que l'algorithme n'altère pas les évaluations finales mais dégrade l'expérience perçue lorsqu'elle paraît déshumanisée ; Pillai et Sivathanu (2020) se placent au niveau de l'organisation. Ces travaux ne se contredisent pas : ils ne traitent pas du même objet, et aucun ne porte sur le professionnel RH lui-même, premier indice de la lacune sectorielle discutée en section 1.5.</w:t>
       </w:r>
     </w:p>
     <w:p>
@@ -2888,7 +2888,7 @@
         <w:t xml:space="preserve"> </w:t>
       </w:r>
       <w:r>
-        <w:t xml:space="preserve">mobilise des techniques statistiques et algorithmiques pour analyser les données RH à des fins descriptives, prédictives ou prescriptives (Marler &amp; Boudreau, 2017) : prédiction des risques de départ, identification des hauts potentiels, analyse des écarts de rémunération, modélisation des parcours. La filiation avec la</w:t>
+        <w:t xml:space="preserve">applique aux données RH des techniques statistiques et algorithmiques à visée descriptive, prédictive ou prescriptive (Marler &amp; Boudreau, 2017) : prédiction des risques de départ, identification des hauts potentiels, analyse des écarts de rémunération, modélisation des parcours. La filiation avec la</w:t>
       </w:r>
       <w:r>
         <w:t xml:space="preserve"> </w:t>
@@ -2904,7 +2904,15 @@
         <w:t xml:space="preserve"> </w:t>
       </w:r>
       <w:r>
-        <w:t xml:space="preserve">fondée sur les données massives est explicite (Chen et al., 2012). Le verdict de la revue la plus systématique du domaine est sévère : la preuve d'un impact stratégique du</w:t>
+        <w:t xml:space="preserve">fondée sur les données massives est explicite (Chen et al., 2012). Le verdict de la revue la plus systématique est sévère : la preuve d'un impact stratégique reste largement à construire et la maturité analytique des fonctions RH demeure très inégale (Marler &amp; Boudreau, 2017). D'où une prudence méthodologique : l'utilité perçue déclarée ne saurait valoir utilité démontrée, et la proposition P1 sera instruite en interrogeant les bénéfices constatés autant qu'attendus.</w:t>
+      </w:r>
+    </w:p>
+    <w:p>
+      <w:pPr>
+        <w:pStyle w:val="BodyText"/>
+      </w:pPr>
+      <w:r>
+        <w:t xml:space="preserve">La formation et le développement des compétences sont transformés par les systèmes de recommandation, les parcours adaptatifs et la production de contenus pédagogiques par IA générative. Le contraste est frappant : aucune étude empirique de référence sur l'adoption de ces outils par les professionnels RH eux-mêmes n'a été identifiée dans les bases consultées, selon la stratégie de recherche décrite en Annexe F. Les arguments disponibles procèdent par extrapolation : Marler et Boudreau (2017) défendent une approche</w:t>
       </w:r>
       <w:r>
         <w:t xml:space="preserve"> </w:t>
@@ -2914,21 +2922,13 @@
           <w:iCs/>
           <w:i/>
         </w:rPr>
-        <w:t xml:space="preserve">people analytics</w:t>
-      </w:r>
-      <w:r>
-        <w:t xml:space="preserve"> </w:t>
-      </w:r>
-      <w:r>
-        <w:t xml:space="preserve">reste largement à construire et la maturité analytique des fonctions RH demeure très inégale (Marler &amp; Boudreau, 2017). Ce verdict invite à une prudence méthodologique : l'utilité perçue déclarée ne saurait être confondue avec une utilité démontrée, et la proposition P1 sera instruite en interrogeant les bénéfices constatés autant que les bénéfices attendus.</w:t>
-      </w:r>
-    </w:p>
-    <w:p>
-      <w:pPr>
-        <w:pStyle w:val="BodyText"/>
-      </w:pPr>
-      <w:r>
-        <w:t xml:space="preserve">La formation et le développement des compétences sont transformés par les systèmes de recommandation, les parcours d'apprentissage adaptatifs et la production de contenus pédagogiques par IA générative. Le contraste avec les domaines précédents est frappant : aucune étude empirique de référence sur l'adoption de ces outils par les professionnels RH eux-mêmes n'a été identifiée dans les bases consultées, selon la stratégie de recherche décrite en Annexe F. Les arguments disponibles procèdent par extrapolation : Marler et Boudreau (2017) défendent une approche</w:t>
+        <w:t xml:space="preserve">evidence-based</w:t>
+      </w:r>
+      <w:r>
+        <w:t xml:space="preserve"> </w:t>
+      </w:r>
+      <w:r>
+        <w:t xml:space="preserve">du développement des compétences sans traiter les dispositifs adaptatifs ; Tambe et al. (2019) rappellent que les jeux de données RH sont souvent trop restreints pour entraîner des modèles robustes. L'individualisation promise suppose une masse critique de traces d'apprentissage et une infrastructure de</w:t>
       </w:r>
       <w:r>
         <w:t xml:space="preserve"> </w:t>
@@ -2938,45 +2938,29 @@
           <w:iCs/>
           <w:i/>
         </w:rPr>
-        <w:t xml:space="preserve">evidence-based</w:t>
-      </w:r>
-      <w:r>
-        <w:t xml:space="preserve"> </w:t>
-      </w:r>
-      <w:r>
-        <w:t xml:space="preserve">du développement des compétences sans traiter spécifiquement les dispositifs adaptatifs ; Tambe et al. (2019) rappellent que les jeux de données RH sont souvent trop restreints pour entraîner des modèles robustes. L'individualisation promise suppose une masse critique de traces d'apprentissage et une infrastructure de</w:t>
-      </w:r>
-      <w:r>
-        <w:t xml:space="preserve"> </w:t>
-      </w:r>
-      <w:r>
-        <w:rPr>
-          <w:iCs/>
-          <w:i/>
-        </w:rPr>
         <w:t xml:space="preserve">learning analytics</w:t>
       </w:r>
       <w:r>
         <w:t xml:space="preserve"> </w:t>
       </w:r>
       <w:r>
-        <w:t xml:space="preserve">mature, conditions rarement réunies dans les organisations de taille intermédiaire. Ce vide documentaire justifie que le guide d'entretien n'impose pas au répondant une liste fermée d'usages attendus.</w:t>
-      </w:r>
-    </w:p>
-    <w:p>
-      <w:pPr>
-        <w:pStyle w:val="BodyText"/>
-      </w:pPr>
-      <w:r>
-        <w:t xml:space="preserve">Un quatrième domaine, plus récent et plus contesté, est l'analyse de l'engagement et du climat social au moyen d'outils d'écoute collaborateur algorithmique, qui appliquent l'analyse de sentiment à des enquêtes ouvertes, des messages internes ou des réseaux sociaux d'entreprise. Ces solutions promettent une visibilité accrue sur le climat social mais soulèvent de vives questions éthiques de surveillance et de confidentialité (Charlwood &amp; Guenole, 2022 ; Tursunbayeva et al., 2022). C'est le seul domaine où la controverse éthique précède la diffusion des usages : il offre de ce fait un révélateur privilégié des arbitrages normatifs que les professionnels RH opèrent en amont de toute considération d'efficacité.</w:t>
-      </w:r>
-    </w:p>
-    <w:p>
-      <w:pPr>
-        <w:pStyle w:val="BodyText"/>
-      </w:pPr>
-      <w:r>
-        <w:t xml:space="preserve">La Figure 2 situe ces quatre domaines le long du cycle de gestion des ressources humaines et les ordonne selon la maturité de leurs usages.</w:t>
+        <w:t xml:space="preserve">mature, rarement réunies dans les organisations de taille intermédiaire. Ce vide justifie que le guide d'entretien n'impose pas une liste fermée d'usages attendus.</w:t>
+      </w:r>
+    </w:p>
+    <w:p>
+      <w:pPr>
+        <w:pStyle w:val="BodyText"/>
+      </w:pPr>
+      <w:r>
+        <w:t xml:space="preserve">Un quatrième domaine, plus récent et plus contesté, analyse l'engagement et le climat social par des outils d'écoute collaborateur algorithmique, appliquant l'analyse de sentiment à des enquêtes ouvertes, des messages internes ou des réseaux sociaux d'entreprise. Ces solutions promettent une visibilité accrue mais soulèvent de vives questions éthiques de surveillance et de confidentialité (Charlwood &amp; Guenole, 2022 ; Tursunbayeva et al., 2022). C'est le seul domaine où la controverse éthique précède la diffusion des usages : il révèle les arbitrages normatifs que les professionnels RH opèrent en amont de toute considération d'efficacité.</w:t>
+      </w:r>
+    </w:p>
+    <w:p>
+      <w:pPr>
+        <w:pStyle w:val="BodyText"/>
+      </w:pPr>
+      <w:r>
+        <w:t xml:space="preserve">La Figure 2 situe ces quatre domaines le long du cycle de gestion des ressources humaines et les ordonne par maturité des usages.</w:t>
       </w:r>
     </w:p>
     <w:p>
@@ -3051,7 +3035,7 @@
         <w:pStyle w:val="BodyText"/>
       </w:pPr>
       <w:r>
-        <w:t xml:space="preserve">Le Tableau 1, qui récapitule cette lecture analytique en distinguant, pour chaque domaine, ce que la littérature établit de ce qu'elle laisse ouvert, figure en Annexe G.</w:t>
+        <w:t xml:space="preserve">Le Tableau 1, qui distingue pour chaque domaine ce que la littérature établit de ce qu'elle laisse ouvert, figure en Annexe G.</w:t>
       </w:r>
     </w:p>
     <w:p>
@@ -3069,7 +3053,7 @@
         <w:t xml:space="preserve"> </w:t>
       </w:r>
       <w:r>
-        <w:t xml:space="preserve">L'adoption de l'IA en RH s'inscrit dans une dynamique historique jalonnée par la stratégisation de la fonction et par la digitalisation des SIRH. La controverse entre continuité et rupture se résout par une dissociation : continuité des conditions organisationnelles, rupture des ressorts subjectifs. La cartographie des outils ajoute un second enseignement, moins attendu : l'état de la preuve empirique varie radicalement d'un domaine à l'autre, du recrutement abondamment documenté à la formation adaptative sur laquelle la littérature est presque muette, et là où la preuve existe, elle porte rarement sur le professionnel RH lui-même. Trois propositions en découlent. Le verdict réservé de Marler et Boudreau (2017) conduit à instruire la proposition P1 en distinguant l'utilité attendue de l'utilité constatée ; la continuité des conditions organisationnelles, établie par Bondarouk et al. (2017), fonde la proposition P4 ; l'hypothèse d'une trajectoire de digitalisation compressée dans le tissu marocain, formulée à titre exploratoire, appelle la proposition P7 et son examen sur le terrain.</w:t>
+        <w:t xml:space="preserve">L'adoption de l'IA en RH s'inscrit dans une dynamique jalonnée par la stratégisation de la fonction et la digitalisation des SIRH. La controverse entre continuité et rupture se résout par une dissociation : continuité des conditions organisationnelles, rupture des ressorts subjectifs. La cartographie ajoute un enseignement moins attendu : l'état de la preuve empirique varie radicalement d'un domaine à l'autre, du recrutement abondamment documenté à la formation adaptative, presque absente de la littérature ; là où la preuve existe, elle porte rarement sur le professionnel RH lui-même. Trois propositions en découlent. Le verdict réservé de Marler et Boudreau (2017) conduit à instruire la proposition P1 en distinguant utilité attendue et utilité constatée ; la continuité des conditions organisationnelles, établie par Bondarouk et al. (2017), fonde la proposition P4 ; l'hypothèse d'une trajectoire de digitalisation compressée dans le tissu marocain, formulée à titre exploratoire, appelle la proposition P7 et son examen sur le terrain.</w:t>
       </w:r>
     </w:p>
     <w:bookmarkEnd w:id="46"/>
@@ -3092,15 +3076,15 @@
         <w:pStyle w:val="FirstParagraph"/>
       </w:pPr>
       <w:r>
-        <w:t xml:space="preserve">Ce détour par l'e-HRM se justifie par un argument de méthode : si la thèse de la continuité a une part de vérité, la littérature e-HRM constitue le seul corpus cumulatif disponible pour anticiper ce qui, dans l'adoption de l'IA, relève de mécanismes déjà connus ; identifier ces mécanismes permet, par soustraction, de circonscrire ce qui appartient en propre à l'IA.</w:t>
-      </w:r>
-    </w:p>
-    <w:p>
-      <w:pPr>
-        <w:pStyle w:val="BodyText"/>
-      </w:pPr>
-      <w:r>
-        <w:t xml:space="preserve">Le champ s'est structuré dès les années 2000. Strohmeier (2007) distingue, dans une première revue systématique, des objectifs opérationnels, relationnels et transformationnels, typologie largement reprise ; Bondarouk et Ruël (2009) posent les défis structurels du champ, mesure des bénéfices, écart entre intentions et usage, tension entre standardisation et personnalisation ; Parry et Tyson (2011) démontrent empiriquement l'écart systématique entre objectifs déclarés et résultats observés, les organisations promettant des transformations stratégiques et constatant surtout des gains transactionnels, ce qui impose de distinguer l'intention d'adopter de l'intégration effective dans les pratiques ; Marler et Fisher (2013) concluent, en revue</w:t>
+        <w:t xml:space="preserve">Ce détour répond à un argument de méthode : si la thèse de la continuité a une part de vérité, la littérature e-HRM est le seul corpus cumulatif permettant d'anticiper ce qui, dans l'adoption de l'IA, relève de mécanismes déjà connus ; les identifier permet, par soustraction, de circonscrire ce qui appartient en propre à l'IA.</w:t>
+      </w:r>
+    </w:p>
+    <w:p>
+      <w:pPr>
+        <w:pStyle w:val="BodyText"/>
+      </w:pPr>
+      <w:r>
+        <w:t xml:space="preserve">Le champ s'est structuré dès les années 2000. Strohmeier (2007), dans une première revue systématique, distingue objectifs opérationnels, relationnels et transformationnels, typologie largement reprise ; Bondarouk et Ruël (2009) posent les défis structurels du champ, mesure des bénéfices, écart entre intentions et usage, tension entre standardisation et personnalisation ; Parry et Tyson (2011) démontrent empiriquement l'écart systématique entre objectifs déclarés et résultats observés, les organisations promettant des transformations stratégiques pour surtout constater des gains transactionnels, d'où la nécessité de distinguer l'intention d'adopter de l'intégration effective ; Marler et Fisher (2013) concluent, en revue</w:t>
       </w:r>
       <w:r>
         <w:t xml:space="preserve"> </w:t>
@@ -3113,7 +3097,7 @@
         <w:t xml:space="preserve">evidence-based</w:t>
       </w:r>
       <w:r>
-        <w:t xml:space="preserve">, que la contribution stratégique de l'e-HRM n'est jamais automatique, dépendant de la maturité organisationnelle, du pilotage et de l'engagement de la direction, conclusion d'une grande actualité pour l'IA (Tambe et al., 2019) ; Bondarouk et al. (2017), enfin, périodisent quatre décennies du champ et signalent la sous-représentation persistante des contextes non occidentaux.</w:t>
+        <w:t xml:space="preserve">, que la contribution stratégique de l'e-HRM n'est jamais automatique mais dépend de la maturité organisationnelle, du pilotage et de l'engagement de la direction, conclusion très actuelle pour l'IA (Tambe et al., 2019) ; Bondarouk et al. (2017) périodisent enfin quatre décennies du champ et signalent la sous-représentation persistante des contextes non occidentaux.</w:t>
       </w:r>
     </w:p>
     <w:p>
@@ -3137,7 +3121,7 @@
         <w:t xml:space="preserve"> </w:t>
       </w:r>
       <w:r>
-        <w:t xml:space="preserve">par Marler et Boudreau (2017) : la robustesse du constat, établi sur des objets techniques différents et à des périodes distinctes, en fait l'un des rares acquis solides du champ. Une question reste en suspens : cet écart traduit-il un déficit réel de mise en œuvre ou une asymétrie de mesure, les objectifs étant énoncés en termes stratégiques et les résultats constatés en termes transactionnels ? Aucun travail recensé ne tranche ; un dispositif qualitatif est bien placé pour éclairer cette alternative par le récit que les praticiens font de la distance entre l'attendu et l'obtenu. La transposition de cet héritage comporte cependant une limite : les systèmes étudiés par l'e-HRM sont transactionnels, ils exécutent et enregistrent ; l'IA introduit des systèmes qui recommandent, classent et prédisent, donc interviennent dans le jugement professionnel plutôt qu'en aval de celui-ci. Les enseignements e-HRM demeurent valides pour les conditions d'usage, mais muets sur la relation d'un professionnel à un outil qui empiète sur son expertise.</w:t>
+        <w:t xml:space="preserve">par Marler et Boudreau (2017) : établi sur des objets techniques différents et à des périodes distinctes, il est l'un des rares acquis solides du champ. Une question reste en suspens : cet écart traduit-il un déficit réel de mise en œuvre ou une asymétrie de mesure, objectifs énoncés en termes stratégiques et résultats en termes transactionnels ? Aucun travail recensé ne tranche ; un dispositif qualitatif peut éclairer l'alternative par le récit que les praticiens font de la distance entre l'attendu et l'obtenu. La transposition comporte cependant une limite : les systèmes e-HRM sont transactionnels, ils exécutent et enregistrent ; l'IA introduit des systèmes qui recommandent, classent et prédisent, intervenant dans le jugement professionnel plutôt qu'en aval. Les enseignements e-HRM restent valides pour les conditions d'usage, mais muets sur la relation d'un professionnel à un outil qui empiète sur son expertise.</w:t>
       </w:r>
     </w:p>
     <w:p>
@@ -3155,7 +3139,7 @@
         <w:t xml:space="preserve"> </w:t>
       </w:r>
       <w:r>
-        <w:t xml:space="preserve">Deux décennies de recherche e-HRM livrent trois enseignements transposables : distinguer l'intention déclarée de l'usage effectif (Parry &amp; Tyson, 2011) ; tenir la contribution stratégique pour conditionnelle, suspendue à la maturité organisationnelle et au pilotage (Marler &amp; Fisher, 2013) ; compter avec la sous-représentation persistante des contextes non occidentaux (Bondarouk et al., 2017). Le premier justifie de retenir deux variables dépendantes distinctes, l'intention d'adoption et l'usage effectif ; le deuxième fonde la proposition P4 ; le troisième nourrit la lacune contextuelle et la proposition P7. Ce que cet héritage ne permet pas d'anticiper, ce sont les effets propres d'un système qui intervient dans le jugement professionnel : c'est précisément l'objet de la section suivante.</w:t>
+        <w:t xml:space="preserve">Deux décennies de recherche e-HRM livrent trois enseignements transposables : distinguer l'intention déclarée de l'usage effectif (Parry &amp; Tyson, 2011) ; tenir la contribution stratégique pour conditionnelle, suspendue à la maturité organisationnelle et au pilotage (Marler &amp; Fisher, 2013) ; compter avec la sous-représentation persistante des contextes non occidentaux (Bondarouk et al., 2017). Le premier justifie deux variables dépendantes distinctes, l'intention d'adoption et l'usage effectif ; le deuxième fonde la proposition P4 ; le troisième nourrit la lacune contextuelle et la proposition P7. Cet héritage ne permet pas d'anticiper les effets propres d'un système qui intervient dans le jugement professionnel : c'est l'objet de la section suivante.</w:t>
       </w:r>
     </w:p>
     <w:bookmarkEnd w:id="48"/>
@@ -3177,7 +3161,7 @@
         <w:pStyle w:val="FirstParagraph"/>
       </w:pPr>
       <w:r>
-        <w:t xml:space="preserve">La revue qui suit examine la littérature empirique consacrée spécifiquement à l'IA, en quatre temps : le recrutement, domaine le plus documenté ; la gestion des talents et le</w:t>
+        <w:t xml:space="preserve">La revue qui suit examine en quatre temps la littérature empirique consacrée à l'IA : le recrutement, domaine le plus documenté ; la gestion des talents et le</w:t>
       </w:r>
       <w:r>
         <w:t xml:space="preserve"> </w:t>
@@ -3193,7 +3177,7 @@
         <w:t xml:space="preserve"> </w:t>
       </w:r>
       <w:r>
-        <w:t xml:space="preserve">; les cas emblématiques et les controverses ; les études menées en contextes africain, arabe et marocain. Elle poursuit un objectif de discussion et non de recensement : pour chaque ensemble de travaux, sur quoi les auteurs s'accordent-ils, sur quoi divergent-ils, et quelle question la controverse laisse-t-elle ouverte pour un professionnel RH marocain confronté aujourd'hui à ces outils ?</w:t>
+        <w:t xml:space="preserve">; les cas emblématiques et les controverses ; les contextes africain, arabe et marocain. Elle vise la discussion et non le recensement : pour chaque ensemble de travaux, sur quoi les auteurs s'accordent-ils, sur quoi divergent-ils, et quelle question la controverse laisse-t-elle ouverte pour un professionnel RH marocain confronté à ces outils ?</w:t>
       </w:r>
     </w:p>
     <w:bookmarkStart w:id="49" w:name="X348bd2bfcc1c6ead2ad0985063d06e84cb20355"/>
@@ -3214,7 +3198,7 @@
         <w:pStyle w:val="FirstParagraph"/>
       </w:pPr>
       <w:r>
-        <w:t xml:space="preserve">Black et van Esch (2020) proposent une analyse opérationnelle des outils d'IA appliqués au recrutement, identifient cinq étapes du processus susceptibles d'être augmentées et concluent de façon nuancée : l'IA améliore significativement l'efficacité aux étapes amont (tri,</w:t>
+        <w:t xml:space="preserve">Black et van Esch (2020) analysent les outils d'IA du recrutement, identifient cinq étapes susceptibles d'être augmentées et concluent de façon nuancée : l'IA améliore nettement l'efficacité aux étapes amont (tri,</w:t>
       </w:r>
       <w:r>
         <w:t xml:space="preserve"> </w:t>
@@ -3227,15 +3211,15 @@
         <w:t xml:space="preserve">matching</w:t>
       </w:r>
       <w:r>
-        <w:t xml:space="preserve">) mais montre ses limites aux étapes aval, plus relationnelles ; leur perspective demeure managériale et prescriptive. Suen et al. (2019), dans une étude expérimentale sur les entretiens vidéo automatisés, abordent l'angle complémentaire des réactions des candidats : l'usage d'algorithmes n'affecte pas significativement les évaluations finales mais influe négativement sur l'expérience candidat lorsqu'elle est perçue comme déshumanisée, ce qui rappelle que les bénéficiaires indirects de l'IA RH constituent eux aussi des parties prenantes dont les réactions affectent l'usage en retour. Pillai et Sivathanu (2020) livrent l'une des rares études empiriques mobilisant explicitement un cadre intégré, combinant UTAUT et modèle Technology-Organization-Environment (T-O-E), sur les organisations du secteur des technologies de l'information en Inde : leurs résultats confirment le rôle central de l'utilité perçue et de la facilité d'usage perçue, tout en révélant l'importance des facteurs organisationnels et environnementaux ; la similarité contextuelle en fait le point de comparaison empirique le plus pertinent pour le présent mémoire. Les enjeux éthiques forment le second pan critique de cette littérature : Charlwood et Guenole (2022) théorisent les paradoxes de la fonction RH face à l'IA, efficacité contre équité, objectivation contre reproduction des biais, augmentation contre remplacement, transparence contre opacité, dilemmes structurels qui pèsent sur les attitudes des professionnels et dans lesquels s'enracine en partie la proposition P5.</w:t>
-      </w:r>
-    </w:p>
-    <w:p>
-      <w:pPr>
-        <w:pStyle w:val="BodyText"/>
-      </w:pPr>
-      <w:r>
-        <w:t xml:space="preserve">Le bilan de ce premier ensemble peut être dressé : accord net sur les bénéfices opérationnels des étapes amont, corroboré par des méthodes différentes ; désaccord sur ce que ces bénéfices coûtent, et à qui, trois réponses coexistant sans se rencontrer, la dégradation de l'expérience candidat (Suen et al., 2019), des conditions organisationnelles et environnementales exigeantes (Pillai &amp; Sivathanu, 2020), des dilemmes normatifs pour la fonction elle-même (Charlwood &amp; Guenole, 2022). La question laissée ouverte est celle de l'arbitrage : comment un professionnel RH, en situation, tranche-t-il entre un gain d'efficacité tangible et un coût éthique diffus ? Aucun des travaux recensés ne l'observe directement, ce qui délimite l'apport visé par la présente recherche.</w:t>
+        <w:t xml:space="preserve">) mais montre ses limites aux étapes aval, plus relationnelles ; leur perspective reste managériale et prescriptive. Suen et al. (2019), par une étude expérimentale sur les entretiens vidéo automatisés, abordent, en complément, les réactions des candidats : l'algorithme n'affecte pas significativement les évaluations finales mais dégrade l'expérience candidat perçue comme déshumanisée, rappel que ces bénéficiaires indirects sont aussi des parties prenantes dont les réactions affectent l'usage en retour. Pillai et Sivathanu (2020) livrent l'une des rares études empiriques à cadre intégré, combinant UTAUT et modèle Technology-Organization-Environment (T-O-E), sur le secteur des technologies de l'information en Inde : ils confirment le rôle central de l'utilité et de la facilité d'usage perçues tout en révélant le poids des facteurs organisationnels et environnementaux ; la similarité contextuelle en fait le point de comparaison le plus pertinent pour ce mémoire. Les enjeux éthiques forment le second pan critique : Charlwood et Guenole (2022) théorisent les paradoxes de la fonction RH face à l'IA, efficacité contre équité, objectivation contre reproduction des biais, augmentation contre remplacement, transparence contre opacité, dilemmes structurels qui pèsent sur les attitudes des professionnels et où s'enracine en partie la proposition P5.</w:t>
+      </w:r>
+    </w:p>
+    <w:p>
+      <w:pPr>
+        <w:pStyle w:val="BodyText"/>
+      </w:pPr>
+      <w:r>
+        <w:t xml:space="preserve">Le bilan de ce premier ensemble se dresse ainsi : accord net sur les bénéfices opérationnels des étapes amont, corroboré par des méthodes différentes ; désaccord sur ce que ces bénéfices coûtent, et à qui, trois réponses coexistant sans se rencontrer, la dégradation de l'expérience candidat (Suen et al., 2019), des conditions organisationnelles et environnementales exigeantes (Pillai &amp; Sivathanu, 2020), des dilemmes normatifs pour la fonction (Charlwood &amp; Guenole, 2022). Reste ouverte la question de l'arbitrage : comment un professionnel RH, en situation, tranche-t-il entre un gain d'efficacité tangible et un coût éthique diffus ? Aucun travail recensé ne l'observe directement, ce qui délimite l'apport de la présente recherche.</w:t>
       </w:r>
     </w:p>
     <w:bookmarkEnd w:id="49"/>
@@ -3273,7 +3257,7 @@
         <w:t xml:space="preserve"> </w:t>
       </w:r>
       <w:r>
-        <w:t xml:space="preserve">constitue le deuxième grand champ d'investigation. Marler et Boudreau (2017) soulignent, en revue</w:t>
+        <w:t xml:space="preserve">forme le deuxième grand champ. Marler et Boudreau (2017) soulignent, en revue</w:t>
       </w:r>
       <w:r>
         <w:t xml:space="preserve"> </w:t>
@@ -3286,15 +3270,15 @@
         <w:t xml:space="preserve">evidence-based</w:t>
       </w:r>
       <w:r>
-        <w:t xml:space="preserve">, l'écart entre les discours promotionnels et la réalité des pratiques : les usages effectivement transformés restent rares et la preuve d'un impact organisationnel demeure souvent à construire, observation qui rejoint Parry et Tyson (2011) sur l'e-HRM et confirme un écart structurel entre attentes et résultats. Tambe et al. (2019), dans un article devenu une référence centrale, identifient quatre défis spécifiques à l'IA en RH : la complexité des phénomènes humains, difficiles à modéliser algorithmiquement ; la rareté relative des données RH par rapport à d'autres champs ; les biais éthiques et juridiques, majeurs dès lors que les décisions affectent des trajectoires individuelles ; la fragilité de la légitimité sociale d'une gestion algorithmique. Ces défis complètent la grille TAM/UTAUT classique et justifient une analyse qualitative attentive aux ressorts subjectifs des professionnels ; Vrontis et al. (2022), dans leur revue systématique, confirment ces tensions et pointent la grande hétérogénéité des situations selon les secteurs, les pays et les sous-domaines RH.</w:t>
-      </w:r>
-    </w:p>
-    <w:p>
-      <w:pPr>
-        <w:pStyle w:val="BodyText"/>
-      </w:pPr>
-      <w:r>
-        <w:t xml:space="preserve">Le statut épistémique de ces contributions conditionne l'usage qui peut en être fait. L'article de Tambe et al. (2019) est une analyse conceptuelle adossée à l'expérience du champ, non une étude empirique : ses quatre défis forment une grille de lecture féconde, mais leur poids respectif dans les décisions réelles d'adoption n'a pas été mesuré. Vrontis et al. (2022) et Budhwar et al. (2022) sont des revues systématiques, qui concluent l'une et l'autre à l'hétérogénéité des situations et appellent à des recherches contextualisées. La littérature sur l'IA en gestion des talents est ainsi riche en cadrages conceptuels et en revues, pauvre en études primaires portant sur les praticiens : ce déséquilibre est en lui-même un argument en faveur d'une contribution empirique de première main.</w:t>
+        <w:t xml:space="preserve">, l'écart entre discours promotionnels et réalité des pratiques : les usages réellement transformés restent rares et la preuve d'un impact organisationnel demeure à construire, ce que rejoint Parry et Tyson (2011) sur l'e-HRM, confirmant un écart structurel entre attentes et résultats. Tambe et al. (2019), dans un article de référence, identifient quatre défis propres à l'IA en RH : la complexité des phénomènes humains, difficiles à modéliser algorithmiquement ; la rareté relative des données RH ; les biais éthiques et juridiques, majeurs dès lors que les décisions affectent des trajectoires individuelles ; la fragilité de la légitimité sociale d'une gestion algorithmique. Ces défis complètent la grille TAM/UTAUT et justifient une analyse qualitative attentive aux ressorts subjectifs des professionnels ; Vrontis et al. (2022) confirment ces tensions en revue systématique et pointent l'hétérogénéité des situations selon les secteurs, les pays et les sous-domaines RH.</w:t>
+      </w:r>
+    </w:p>
+    <w:p>
+      <w:pPr>
+        <w:pStyle w:val="BodyText"/>
+      </w:pPr>
+      <w:r>
+        <w:t xml:space="preserve">Le statut épistémique de ces contributions conditionne leur usage. Tambe et al. (2019) proposent une analyse conceptuelle adossée à l'expérience du champ, non une étude empirique : leurs quatre défis forment une grille féconde, mais leur poids respectif dans les décisions d'adoption n'a pas été mesuré. Vrontis et al. (2022) et Budhwar et al. (2022) sont des revues systématiques concluant toutes deux à l'hétérogénéité des situations et appelant à des recherches contextualisées. La littérature sur l'IA en gestion des talents est ainsi riche en cadrages et en revues, pauvre en études primaires sur les praticiens : ce déséquilibre plaide pour une contribution empirique de première main.</w:t>
       </w:r>
     </w:p>
     <w:bookmarkEnd w:id="50"/>
@@ -3316,15 +3300,15 @@
         <w:pStyle w:val="FirstParagraph"/>
       </w:pPr>
       <w:r>
-        <w:t xml:space="preserve">Les implémentations les plus avancées, concentrées en Amérique du Nord, en Europe occidentale et en Asie de l'Est, combinent plusieurs outils intégrés à un écosystème SIRH cohérent et bénéficient d'un appui fort de la direction générale (Vrontis et al., 2022), selon des trajectoires que Stone et al. (2015) avaient anticipées et que l'accélération numérique post-pandémique a amplifiées (Dwivedi et al., 2020). Trois épisodes controversés jalonnent cette diffusion. Leur statut doit être posé d'emblée : documentés par la presse économique internationale, par des décisions d'entreprise rendues publiques et, pour l'un, par des procédures judiciaires en cours, ils ne constituent pas des données scientifiques et leur valeur probante est faible ; ils sont mobilisés parce qu'ils circulent largement et façonnent les représentations des praticiens. Amazon a abandonné en 2018 un algorithme expérimental de tri des candidatures qui pénalisait systématiquement les CV de candidates, biais hérité de données d'entraînement majoritairement masculines (Charlwood &amp; Guenole, 2022 ; Tambe et al., 2019). HireVue a retiré en 2021 la composante d'analyse faciale de sa solution d'entretien vidéo, mise en cause pour sa validité scientifique et ses risques de discrimination indirecte ; Suen et al. (2019) documentent par ailleurs la dégradation de l'expérience perçue lorsque l'entretien paraît déshumanisé, et Langer et Landers (2021) montrent que les effets s'étendent aux observateurs tiers, dont les jugements pèsent sur la légitimité des outils. Workday, enfin, fait l'objet d'actions en justice aux États-Unis (2023-2024) pour des effets discriminatoires allégués de ses algorithmes de présélection.</w:t>
-      </w:r>
-    </w:p>
-    <w:p>
-      <w:pPr>
-        <w:pStyle w:val="BodyText"/>
-      </w:pPr>
-      <w:r>
-        <w:t xml:space="preserve">De trois cas, on ne peut toutefois inférer une propriété générale : le risque de sélection des épisodes médiatisés interdit la généralisation. L'argument est porté par la revue systématique de Köchling et Wehner (2020), qui établit que la reproduction, voire l'amplification, des biais présents dans les données d'apprentissage constitue un risque transversal et structurel, indépendamment des cas médiatisés ; Charlwood et Guenole (2022) le formulent comme paradoxe, l'IA mobilisée pour objectiver les décisions pouvant amplifier les biais qu'elle prétendait neutraliser. Ces controverses pèsent durablement sur les perceptions des professionnels RH : elles alimentent la vigilance éthique dont rendra compte la proposition P6 et l'anxiété portée par la proposition P5, et soulèvent une question empirique que le guide d'entretien instruira avec précaution : ces cas sont-ils connus des professionnels de la région Souss-Massa, et si oui, avec quel effet sur leur rapport aux outils ?</w:t>
+        <w:t xml:space="preserve">Les implémentations les plus avancées, concentrées en Amérique du Nord, en Europe occidentale et en Asie de l'Est, combinent plusieurs outils intégrés à un écosystème SIRH cohérent et un appui fort de la direction générale (Vrontis et al., 2022), selon des trajectoires anticipées par Stone et al. (2015) et amplifiées par l'accélération numérique post-pandémique (Dwivedi et al., 2020). Trois épisodes controversés jalonnent cette diffusion, dont le statut doit être posé d'emblée : documentés par la presse économique internationale, par des décisions d'entreprise rendues publiques et, pour l'un, par des procédures judiciaires en cours, ils ne sont pas des données scientifiques et leur valeur probante est faible ; on les mobilise parce qu'ils circulent largement et façonnent les représentations des praticiens. Amazon a abandonné en 2018 un algorithme expérimental de tri qui pénalisait systématiquement les CV de candidates, biais hérité de données d'entraînement majoritairement masculines (Charlwood &amp; Guenole, 2022 ; Tambe et al., 2019). HireVue a retiré en 2021 la composante d'analyse faciale de sa solution d'entretien vidéo, mise en cause pour sa validité scientifique et ses risques de discrimination indirecte ; Suen et al. (2019) documentent la dégradation de l'expérience perçue quand l'entretien paraît déshumanisé, et Langer et Landers (2021) montrent que les effets atteignent les observateurs tiers, dont les jugements pèsent sur la légitimité des outils. Workday, enfin, fait l'objet d'actions en justice aux États-Unis (2023-2024) pour des effets discriminatoires allégués de ses algorithmes de présélection.</w:t>
+      </w:r>
+    </w:p>
+    <w:p>
+      <w:pPr>
+        <w:pStyle w:val="BodyText"/>
+      </w:pPr>
+      <w:r>
+        <w:t xml:space="preserve">De trois cas on ne peut inférer une propriété générale : le risque de sélection des épisodes médiatisés interdit la généralisation. La revue systématique de Köchling et Wehner (2020) porte l'argument : la reproduction, voire l'amplification, des biais des données d'apprentissage constitue un risque transversal et structurel, indépendamment des cas médiatisés ; Charlwood et Guenole (2022) le formulent comme paradoxe, l'IA mobilisée pour objectiver les décisions pouvant amplifier les biais qu'elle prétendait neutraliser. Ces controverses pèsent sur les perceptions des professionnels RH : elles alimentent la vigilance éthique dont rendra compte la proposition P6 et l'anxiété portée par la proposition P5, et soulèvent une question que le guide d'entretien instruira avec précaution : ces cas sont-ils connus des professionnels de la région Souss-Massa, et avec quel effet sur leur rapport aux outils ?</w:t>
       </w:r>
     </w:p>
     <w:bookmarkEnd w:id="51"/>
@@ -3346,23 +3330,23 @@
         <w:pStyle w:val="FirstParagraph"/>
       </w:pPr>
       <w:r>
-        <w:t xml:space="preserve">La recension des bases internationales (Semantic Scholar, Scopus) et marocaines (IMIST, Toubkal), conduite selon la stratégie documentée en Annexe F, révèle une rareté manifeste des travaux empiriques indexés sur l'adoption de l'IA par les professionnels RH au Maroc. Elle s'explique vraisemblablement par la diffusion massive de l'IA en RH seulement depuis 2022, la sous-indexation des revues marocaines de gestion dans les bases anglo-saxonnes, la dispersion des travaux entre publications, thèses et littérature grise ; les travaux marocains accessibles portent sur la digitalisation des SIRH ou l'adoption des technologies en général, sans focalisation sur l'IA. Cette rareté fonde l'une des justifications scientifiques du mémoire.</w:t>
-      </w:r>
-    </w:p>
-    <w:p>
-      <w:pPr>
-        <w:pStyle w:val="BodyText"/>
-      </w:pPr>
-      <w:r>
-        <w:t xml:space="preserve">La raison d'accorder au contexte un statut théorique, et non décoratif, est fournie par la littérature elle-même. Bondarouk et al. (2017) établissent que la production empirique e-HRM se concentre dans les contextes occidentaux, ce qui rend indéterminée la validité externe des mécanismes identifiés ; Budhwar et al. (2022) en tirent un appel explicite à des recherches contextualisées ; Dwivedi et al. (2019) montrent que l'UTAUT a été validé sur des populations et des environnements particuliers, ce qui interdit de tenir sa transférabilité pour acquise. Ces trois arguments, et eux seuls, fondent la proposition P7 : le contexte n'est pas une variable de contrôle destinée à neutraliser du bruit, il est un facteur explicatif dont la littérature reconnaît qu'elle l'a insuffisamment théorisé.</w:t>
-      </w:r>
-    </w:p>
-    <w:p>
-      <w:pPr>
-        <w:pStyle w:val="BodyText"/>
-      </w:pPr>
-      <w:r>
-        <w:t xml:space="preserve">À défaut de littérature marocaine abondante, les travaux sur d'autres économies émergentes éclairent la situation par analogie. Pillai et Sivathanu (2020) montrent, en Inde, que l'adoption de l'IA en recrutement est portée par les dimensions classiques du TAM/UTAUT, nuancées par des facteurs organisationnels et environnementaux saisis par le modèle T-O-E ; Dwivedi et al. (2020) soulignent que, dans les économies émergentes, l'accélération post-pandémique de la digitalisation a souvent dépassé les capacités d'accompagnement des organisations. L'analogie a toutefois ses limites : le terrain indien est celui d'un secteur technologique à forte intensité de compétences numériques, très éloigné du tissu agro-industriel et touristique de la région Souss-Massa ; ces travaux fournissent des hypothèses de travail, non des résultats transposables.</w:t>
+        <w:t xml:space="preserve">La recension des bases internationales (Semantic Scholar, Scopus) et marocaines (IMIST, Toubkal), conduite selon la stratégie documentée en Annexe F, révèle une rareté manifeste des travaux empiriques indexés sur l'adoption de l'IA par les professionnels RH au Maroc. Elle s'explique vraisemblablement par la diffusion massive de l'IA en RH depuis 2022 seulement, la sous-indexation des revues marocaines de gestion dans les bases anglo-saxonnes et la dispersion des travaux entre publications, thèses et littérature grise ; les travaux marocains accessibles portent sur la digitalisation des SIRH ou l'adoption des technologies en général, sans focalisation sur l'IA. Cette rareté fonde l'une des justifications scientifiques du mémoire.</w:t>
+      </w:r>
+    </w:p>
+    <w:p>
+      <w:pPr>
+        <w:pStyle w:val="BodyText"/>
+      </w:pPr>
+      <w:r>
+        <w:t xml:space="preserve">Accorder au contexte un statut théorique, et non décoratif, se justifie par la littérature elle-même. Bondarouk et al. (2017) établissent que la production empirique e-HRM se concentre dans les contextes occidentaux, laissant indéterminée la validité externe des mécanismes identifiés ; Budhwar et al. (2022) en tirent un appel explicite à des recherches contextualisées ; Dwivedi et al. (2019) montrent que l'UTAUT a été validé sur des populations et des environnements particuliers, interdisant de tenir sa transférabilité pour acquise. Ces trois arguments, et eux seuls, fondent la proposition P7 : le contexte n'est pas une variable de contrôle neutralisant du bruit, mais un facteur explicatif que la littérature reconnaît avoir insuffisamment théorisé.</w:t>
+      </w:r>
+    </w:p>
+    <w:p>
+      <w:pPr>
+        <w:pStyle w:val="BodyText"/>
+      </w:pPr>
+      <w:r>
+        <w:t xml:space="preserve">À défaut de littérature marocaine abondante, les travaux sur d'autres économies émergentes éclairent par analogie. Pillai et Sivathanu (2020) montrent, en Inde, que l'adoption de l'IA en recrutement est portée par les dimensions classiques du TAM/UTAUT, nuancées par les facteurs organisationnels et environnementaux du modèle T-O-E ; Dwivedi et al. (2020) soulignent que, dans ces économies, l'accélération post-pandémique de la digitalisation a souvent dépassé les capacités d'accompagnement des organisations. L'analogie a ses limites : le terrain indien relève d'un secteur technologique à forte intensité de compétences numériques, très éloigné du tissu agro-industriel et touristique de la région Souss-Massa ; ces travaux fournissent des hypothèses, non des résultats transposables.</w:t>
       </w:r>
     </w:p>
     <w:p>
@@ -3383,7 +3367,7 @@
         <w:t xml:space="preserve">Maroc Digital 2030</w:t>
       </w:r>
       <w:r>
-        <w:t xml:space="preserve">, lancée officiellement en septembre 2024, qui place la transformation numérique au cœur de l'agenda national ; la loi 09-08, placée sous le contrôle de la CNDP, qui encadre tout traitement algorithmique de données RH sensibles, aucune loi marocaine spécifique à l'IA n'ayant été adoptée à ce jour ; un tissu économique régional aux secteurs et aux tailles d'organisation très contrastés. Ces éléments ne démontrent rien par eux-mêmes : ils définissent les conditions concrètes de déploiement des mécanismes théoriques, et le guide d'entretien les mobilise comme relances plutôt que comme questions frontales. Le Tableau 2, qui récapitule les principaux travaux mobilisés dans cette revue en explicitant la nature et la portée de chacun, condition d'une évaluation lucide de leur degré de preuve, figure en Annexe G.</w:t>
+        <w:t xml:space="preserve">, lancée officiellement en septembre 2024, qui place la transformation numérique au cœur de l'agenda national ; la loi 09-08, placée sous le contrôle de la CNDP, qui encadre tout traitement algorithmique de données RH sensibles, aucune loi marocaine spécifique à l'IA n'ayant été adoptée à ce jour ; un tissu économique régional aux secteurs et aux tailles d'organisation très contrastés. Ces éléments ne démontrent rien par eux-mêmes : ils définissent les conditions concrètes de déploiement des mécanismes théoriques, et le guide d'entretien les mobilise en relances plutôt qu'en questions frontales. Le Tableau 2, qui récapitule les principaux travaux de cette revue en explicitant la nature et la portée de chacun, condition d'une évaluation lucide de leur degré de preuve, figure en Annexe G.</w:t>
       </w:r>
     </w:p>
     <w:p>
@@ -3401,7 +3385,7 @@
         <w:t xml:space="preserve"> </w:t>
       </w:r>
       <w:r>
-        <w:t xml:space="preserve">Les travaux convergent sur les bénéfices opérationnels de l'IA aux étapes amont des processus RH, résultat corroboré par des méthodes différentes. Ils divergent sur le prix de ces bénéfices, dégradation de l'expérience candidat, exigences organisationnelles ou dilemmes éthiques irréductibles, divergence qui tient moins à des résultats contradictoires qu'à un déplacement continuel de l'unité d'analyse, laissant le professionnel RH dans l'angle mort. Ils laissent enfin ouverte la question la plus directement pertinente pour cette recherche, celle de l'arbitrage en situation entre efficacité perçue et coût éthique perçu. Ces trois enseignements nourrissent le modèle : l'ambivalence documentée des bénéfices conduit à instruire P1 en distinguant l'attendu du constaté ; le caractère structurel du risque discriminatoire, établi par Köchling et Wehner (2020), fonde le volet éthique de P6 ; l'absence d'observation directe des arbitrages professionnels justifie le choix d'un dispositif qualitatif.</w:t>
+        <w:t xml:space="preserve">Les travaux convergent sur les bénéfices opérationnels de l'IA aux étapes amont des processus RH, résultat corroboré par des méthodes différentes. Ils divergent sur le prix de ces bénéfices, dégradation de l'expérience candidat, exigences organisationnelles ou dilemmes éthiques irréductibles, divergence qui tient moins à des résultats contradictoires qu'à un déplacement continuel de l'unité d'analyse, laissant le professionnel RH dans l'angle mort. Ils laissent enfin ouverte la question la plus pertinente pour cette recherche, celle de l'arbitrage en situation entre efficacité perçue et coût éthique perçu. Ces trois enseignements nourrissent le modèle : l'ambivalence des bénéfices conduit à instruire P1 en distinguant l'attendu du constaté ; le caractère structurel du risque discriminatoire, établi par Köchling et Wehner (2020), fonde le volet éthique de P6 ; l'absence d'observation directe des arbitrages professionnels justifie le choix d'un dispositif qualitatif.</w:t>
       </w:r>
     </w:p>
     <w:bookmarkEnd w:id="52"/>
@@ -3424,7 +3408,7 @@
         <w:pStyle w:val="FirstParagraph"/>
       </w:pPr>
       <w:r>
-        <w:t xml:space="preserve">Les sections précédentes ont examiné des ensembles de travaux séparément ; celle-ci les confronte. Elle établit ce sur quoi la littérature s'accorde, organise les désaccords en controverses identifiées, puis démontre que ces controverses laissent trois questions sans réponse possible en l'état des connaissances. Cette démonstration constitue la justification scientifique du mémoire : une lacune ne se constate pas, elle s'établit en montrant que les travaux les plus proches de la question posée demeurent structurellement incapables d'y répondre.</w:t>
+        <w:t xml:space="preserve">Les sections précédentes ont examiné séparément des ensembles de travaux ; celle-ci les confronte. Elle établit ce sur quoi la littérature s'accorde, organise les désaccords en controverses, puis montre qu'elles laissent trois questions sans réponse en l'état des connaissances. Elle fonde la justification scientifique du mémoire : une lacune ne se constate pas, elle s'établit en montrant que les travaux les plus proches de la question posée restent structurellement incapables d'y répondre.</w:t>
       </w:r>
     </w:p>
     <w:bookmarkStart w:id="54" w:name="quatre-acquis-solides"/>
@@ -3445,7 +3429,7 @@
         <w:pStyle w:val="FirstParagraph"/>
       </w:pPr>
       <w:r>
-        <w:t xml:space="preserve">Quatre résultats peuvent être tenus pour établis, en ce qu'ils ont été obtenus par des équipes distinctes, sur des objets techniques différents et par des méthodes non convergentes : l'utilité perçue et la facilité d'usage perçue demeurent des déterminants centraux de l'adoption, y compris pour l'IA appliquée au recrutement (Davis, 1989 ; Pillai &amp; Sivathanu, 2020 ; Venkatesh et al., 2003), aucun travail recensé ne les infirmant ; l'écart entre l'intention déclarée et l'usage effectif est un phénomène robuste, observé pour l'e-HRM (Parry &amp; Tyson, 2011), pour le</w:t>
+        <w:t xml:space="preserve">Quatre résultats peuvent être tenus pour établis, obtenus par des équipes distinctes, sur des objets différents et par des méthodes non convergentes : l'utilité perçue et la facilité d'usage perçue restent des déterminants centraux de l'adoption, y compris pour l'IA appliquée au recrutement (Davis, 1989 ; Pillai &amp; Sivathanu, 2020 ; Venkatesh et al., 2003), aucun travail recensé ne les infirmant ; l'écart entre intention déclarée et usage effectif est robuste, observé pour l'e-HRM (Parry &amp; Tyson, 2011), pour le</w:t>
       </w:r>
       <w:r>
         <w:t xml:space="preserve"> </w:t>
@@ -3461,7 +3445,7 @@
         <w:t xml:space="preserve"> </w:t>
       </w:r>
       <w:r>
-        <w:t xml:space="preserve">(Marler &amp; Boudreau, 2017) et anticipé pour l'IA (Tambe et al., 2019), sa reproduction sur trois vagues technologiques successives en faisant l'acquis le mieux étayé du champ ; les conditions organisationnelles, soutien de la direction, infrastructure ou formation, jouent un rôle modulateur déterminant (Bondarouk et al., 2017 ; Pillai &amp; Sivathanu, 2020 ; Venkatesh et al., 2003 ; Vrontis et al., 2022) ; les risques de biais et de discrimination algorithmiques constituent un phénomène structurel et non accidentel, établi par revue systématique et indépendamment des cas médiatisés (Köchling &amp; Wehner, 2020). Ces acquis délimitent ce qu'il serait vain de redémontrer et justifient de conserver le noyau du cadre TAM/UTAUT plutôt que de lui substituer un cadre alternatif, choix discuté et assumé en section 2.3.</w:t>
+        <w:t xml:space="preserve">(Marler &amp; Boudreau, 2017) et anticipé pour l'IA (Tambe et al., 2019), sa reproduction sur trois vagues technologiques en faisant l'acquis le mieux étayé du champ ; les conditions organisationnelles, soutien de la direction, infrastructure ou formation, jouent un rôle modulateur déterminant (Bondarouk et al., 2017 ; Pillai &amp; Sivathanu, 2020 ; Venkatesh et al., 2003 ; Vrontis et al., 2022) ; les risques de biais et de discrimination algorithmiques sont structurels et non accidentels, établis par revue systématique, indépendamment des cas médiatisés (Köchling &amp; Wehner, 2020). Ces acquis délimitent ce qu'il serait vain de redémontrer et justifient de conserver le noyau du cadre TAM/UTAUT plutôt qu'un cadre alternatif, choix assumé en section 2.3.</w:t>
       </w:r>
     </w:p>
     <w:bookmarkEnd w:id="54"/>
@@ -3483,7 +3467,7 @@
         <w:pStyle w:val="FirstParagraph"/>
       </w:pPr>
       <w:r>
-        <w:t xml:space="preserve">Les désaccords, en revanche, ne sont pas résiduels : ils portent sur des questions décisives pour la construction du modèle. Le Tableau 3, placé en Annexe G, les organise en cinq controverses, chacune formulée comme une opposition entre deux positions défendues dans la littérature, suivie de ce que le débat laisse ouvert et de la conséquence qui en est tirée pour le modèle conceptuel. Leur lecture transversale fait apparaître un point commun : aucune ne se résoudrait par une étude quantitative supplémentaire portant sur les mêmes variables ; ce qui manque n'est pas une mesure plus précise, mais l'accès aux raisonnements par lesquels les praticiens tranchent, en situation, ce que la littérature laisse indécidé.</w:t>
+        <w:t xml:space="preserve">Les désaccords, en revanche, ne sont pas résiduels : ils portent sur des questions décisives pour la construction du modèle. Le Tableau 3, en Annexe G, les organise en cinq controverses, chacune opposant deux positions de la littérature, suivie de ce que le débat laisse ouvert et de la conséquence tirée pour le modèle conceptuel. Leur lecture transversale révèle un point commun : aucune ne se résoudrait par une étude quantitative supplémentaire sur les mêmes variables ; ce qui manque n'est pas une mesure plus précise, mais l'accès aux raisonnements par lesquels les praticiens tranchent, en situation, ce que la littérature laisse indécidé.</w:t>
       </w:r>
     </w:p>
     <w:bookmarkEnd w:id="55"/>
@@ -3515,7 +3499,7 @@
         <w:t xml:space="preserve"> </w:t>
       </w:r>
       <w:r>
-        <w:t xml:space="preserve">Le professionnel RH occupe, face à l'IA, une position qu'aucune des recherches recensées ne prend pour objet, et c'est l'insuffisance conjointe des travaux les plus proches qui fait la lacune : Suen et al. (2019) étudient les réactions des candidats, personnes soumises à l'outil ; Marler et Boudreau (2017) raisonnent au niveau de l'organisation et de sa maturité analytique ; Pillai et Sivathanu (2020) saisissent l'adoption au niveau organisationnel dans un cadre quantitatif ; Langer et Landers (2021) élargissent l'analyse aux observateurs tiers, le professionnel RH y figurant comme spectateur d'une automatisation, non comme celui qui en décide ; Black et van Esch (2020) conseillent les managers sans documenter les conditions de leur adhésion. La position du professionnel RH est pourtant théoriquement singulière : il est simultanément prescripteur, utilisateur et cible potentielle, l'automatisation d'une partie de ses tâches étant explicitement annoncée par la littérature qu'il lit (Charlwood &amp; Guenole, 2022 ; Meijerink et al., 2021). Les modèles d'acceptation reposent sur une hypothèse implicite que cette configuration met en défaut, celle d'un utilisateur dont l'emploi n'est pas menacé par la technologie qu'on lui demande d'adopter : la lacune n'est pas seulement empirique, elle est théorique, et c'est ce qui fonde l'introduction explicite de la crainte du remplacement dans la proposition P5.</w:t>
+        <w:t xml:space="preserve">Le professionnel RH occupe, face à l'IA, une position qu'aucune recherche recensée ne prend pour objet, et l'insuffisance conjointe des travaux les plus proches fait la lacune : Suen et al. (2019) étudient les réactions des candidats, soumis à l'outil ; Marler et Boudreau (2017) raisonnent au niveau de l'organisation et de sa maturité analytique ; Pillai et Sivathanu (2020) saisissent l'adoption organisationnelle dans un cadre quantitatif ; Langer et Landers (2021) élargissent l'analyse aux observateurs tiers, où le professionnel RH figure en spectateur de l'automatisation et non en décideur ; Black et van Esch (2020) conseillent les managers sans documenter les conditions de leur adhésion. Sa position est pourtant théoriquement singulière : prescripteur, utilisateur et cible potentielle à la fois, l'automatisation d'une partie de ses tâches étant annoncée par la littérature qu'il lit (Charlwood &amp; Guenole, 2022 ; Meijerink et al., 2021). Les modèles d'acceptation reposent sur une hypothèse implicite que cette configuration met en défaut, celle d'un utilisateur dont l'emploi n'est pas menacé par la technologie qu'on lui demande d'adopter : la lacune n'est pas seulement empirique mais théorique, ce qui fonde l'introduction de la crainte du remplacement dans la proposition P5.</w:t>
       </w:r>
     </w:p>
     <w:p>
@@ -3533,7 +3517,7 @@
         <w:t xml:space="preserve"> </w:t>
       </w:r>
       <w:r>
-        <w:t xml:space="preserve">La sous-représentation de l'Afrique du Nord et du Maroc dans la production internationale, constatée par Bondarouk et al. (2017) pour l'ensemble du champ e-HRM, ne constituerait à elle seule qu'un argument de complétude documentaire. L'argument scientifique procède de la structure même des modèles mobilisés : plusieurs variables du cadre ont un contenu dont la littérature reconnaît qu'il varie selon les configurations institutionnelles et culturelles. L'influence sociale, définie par Venkatesh et al. (2003) comme la perception des attentes d'autrui, peut opérer comme une pression normative entre pairs dans un contexte, comme une prescription hiérarchique difficilement discutable dans un autre ; les conditions facilitantes recouvrent des réalités hétérogènes selon l'équipement des organisations ; le cadre légal, absent du modèle originel, structure ici directement le périmètre des usages licites. Dwivedi et al. (2019) montrent précisément que le modèle a été validé sur des populations et des environnements particuliers, et Budhwar et al. (2022) en tirent un appel à la contextualisation. On ignore donc si les mécanismes établis conservent le même contenu hors de leurs terrains d'origine, et le Maroc n'offre à ce jour, dans les bases consultées (Annexe F), aucun matériau indexé permettant d'en juger.</w:t>
+        <w:t xml:space="preserve">La sous-représentation de l'Afrique du Nord et du Maroc dans la production internationale, constatée par Bondarouk et al. (2017) pour tout le champ e-HRM, ne serait à elle seule qu'un argument de complétude documentaire. L'argument scientifique tient à la structure même des modèles mobilisés : plusieurs de leurs variables ont un contenu que la littérature reconnaît variable selon les configurations institutionnelles et culturelles. L'influence sociale, définie par Venkatesh et al. (2003) comme la perception des attentes d'autrui, opère ici comme pression normative entre pairs, là comme prescription hiérarchique difficilement discutable ; les conditions facilitantes recouvrent des réalités hétérogènes selon l'équipement des organisations ; le cadre légal, absent du modèle originel, structure ici le périmètre des usages licites. Dwivedi et al. (2019) montrent que le modèle a été validé sur des populations et environnements particuliers, et Budhwar et al. (2022) en tirent un appel à la contextualisation. On ignore donc si les mécanismes établis conservent le même contenu hors de leurs terrains d'origine, et le Maroc n'offre à ce jour, dans les bases consultées (Annexe F), aucun matériau indexé permettant d'en juger.</w:t>
       </w:r>
     </w:p>
     <w:p>
@@ -3551,7 +3535,7 @@
         <w:t xml:space="preserve"> </w:t>
       </w:r>
       <w:r>
-        <w:t xml:space="preserve">Williams et al. (2015) documentent la prédominance écrasante des devis quantitatifs par questionnaire et par équations structurelles dans la littérature UTAUT, orientation que confirme le réexamen de Dwivedi et al. (2019). Or un instrument standardisé mesure l'intensité de construits déjà identifiés ; il ne peut, par construction, révéler un construit qui n'aurait pas été anticipé. Les deux lacunes précédentes désignent exactement des zones où de tels construits sont probables, et les questions restées ouvertes au terme du Tableau 3 portent sur des arbitrages, raisonnements que seule la parole des acteurs rend accessibles. La lacune méthodologique n'est donc pas indépendante des deux autres : elle en est la conséquence, et elle explique pourquoi elles n'ont pas été comblées. Les trois lacunes se composent ainsi en un verrou unique, une population peu étudiée, dans un contexte peu documenté, avec des instruments incapables de faire émerger ce qui n'a pas été prévu : y répondre suppose de changer simultanément les trois termes, ce que le dispositif exposé en Partie II entreprend.</w:t>
+        <w:t xml:space="preserve">Williams et al. (2015) documentent la prédominance écrasante des devis quantitatifs par questionnaire et équations structurelles dans la littérature UTAUT, que confirme le réexamen de Dwivedi et al. (2019). Or un instrument standardisé mesure l'intensité de construits déjà identifiés ; il ne peut, par construction, révéler un construit non anticipé. Les deux lacunes précédentes désignent des zones où de tels construits sont probables, et les questions restées ouvertes au terme du Tableau 3 portent sur des arbitrages, raisonnements que seule la parole des acteurs rend accessibles. Cette lacune n'est donc pas indépendante des deux autres : elle en est la conséquence et explique qu'elles n'aient pas été comblées. Les trois composent ainsi un verrou unique, une population peu étudiée, dans un contexte peu documenté, avec des instruments incapables de faire émerger ce qui n'a pas été prévu : y répondre suppose de changer simultanément les trois termes, ce que le dispositif exposé en Partie II entreprend.</w:t>
       </w:r>
     </w:p>
     <w:p>
@@ -3569,7 +3553,7 @@
         <w:t xml:space="preserve"> </w:t>
       </w:r>
       <w:r>
-        <w:t xml:space="preserve">La confrontation des travaux fait apparaître quatre acquis solides, qui justifient de conserver le noyau du cadre TAM/UTAUT, et cinq controverses non tranchées, dont aucune ne se résoudrait par une mesure supplémentaire des mêmes variables. Ces controverses commandent trois choix de modélisation : distinguer bénéfices attendus et bénéfices constatés (P1), traiter la confiance comme une variable conditionnelle plutôt que comme une disposition stable (P6), conférer au contexte marocain un statut explicatif (P7). Les trois lacunes établies par confrontation, sectorielle, contextuelle et méthodologique, forment un verrou dont le mémoire tire sa justification scientifique, la position du professionnel RH, à la fois prescripteur, utilisateur et cible potentielle, fondant directement la proposition P5. Il reste à examiner les ressources théoriques disponibles pour analyser ces facteurs, des fondements du TAM à ses extensions unifiées : tel est l'objet du chapitre suivant.</w:t>
+        <w:t xml:space="preserve">La confrontation fait apparaître quatre acquis solides, qui justifient de conserver le noyau du cadre TAM/UTAUT, et cinq controverses non tranchées, qu'aucune mesure supplémentaire des mêmes variables ne résoudrait. Ces controverses commandent trois choix de modélisation : distinguer bénéfices attendus et constatés (P1), traiter la confiance comme une variable conditionnelle et non comme une disposition stable (P6), conférer au contexte marocain un statut explicatif (P7). Les trois lacunes, sectorielle, contextuelle et méthodologique, forment le verrou dont le mémoire tire sa justification scientifique, la position du professionnel RH, prescripteur, utilisateur et cible potentielle, fondant directement la proposition P5. Il reste à examiner les ressources théoriques mobilisables pour analyser ces facteurs, des fondements du TAM à ses extensions unifiées : tel est l'objet du chapitre suivant.</w:t>
       </w:r>
     </w:p>
     <w:bookmarkEnd w:id="56"/>
@@ -3669,7 +3653,7 @@
         <w:t xml:space="preserve">Theory of Reasoned Action</w:t>
       </w:r>
       <w:r>
-        <w:t xml:space="preserve">, TRA) formulée par Fishbein et Ajzen (1975). Cette théorie postule que le comportement individuel procède d'une intention comportementale, elle-même déterminée par deux antécédents : l'attitude envers le comportement et la norme subjective, c'est-à-dire la perception des attentes d'autrui. La théorie du comportement planifié (</w:t>
+        <w:t xml:space="preserve">, TRA) de Fishbein et Ajzen (1975), selon laquelle le comportement procède d'une intention comportementale, elle-même déterminée par deux antécédents, l'attitude envers le comportement et la norme subjective, soit la perception des attentes d'autrui. La théorie du comportement planifié (</w:t>
       </w:r>
       <w:r>
         <w:rPr>
@@ -3679,7 +3663,7 @@
         <w:t xml:space="preserve">Theory of Planned Behavior</w:t>
       </w:r>
       <w:r>
-        <w:t xml:space="preserve">, TPB) d'Ajzen (1991) enrichit ce socle d'un troisième antécédent, le contrôle comportemental perçu, afin de rendre compte des situations où l'individu ne dispose pas d'une autonomie complète d'action. Le TAM en hérite un principe fondateur : le comportement d'usage est médiatisé par des croyances et des perceptions, et non déterminé par les seules propriétés objectives de la technologie.</w:t>
+        <w:t xml:space="preserve">, TPB) d'Ajzen (1991) y ajoute un troisième antécédent, le contrôle comportemental perçu, pour les situations où l'autonomie d'action est incomplète. Le TAM en hérite un principe fondateur : l'usage est médiatisé par des croyances et des perceptions, non par les seules propriétés objectives de la technologie.</w:t>
       </w:r>
     </w:p>
     <w:bookmarkEnd w:id="59"/>
@@ -3701,7 +3685,7 @@
         <w:pStyle w:val="FirstParagraph"/>
       </w:pPr>
       <w:r>
-        <w:t xml:space="preserve">Le modèle proposé par Davis (1989) opère une simplification ciblée de la TRA pour expliquer l'acceptation des technologies de l'information en contexte organisationnel. Sa force tient à la parcimonie de son architecture. L'intention comportementale d'utiliser une technologie y est prédite par l'attitude, elle-même déterminée par deux croyances centrales, l'</w:t>
+        <w:t xml:space="preserve">Le modèle de Davis (1989) simplifie la TRA pour expliquer l'acceptation des technologies de l'information en contexte organisationnel, et sa force tient à sa parcimonie. L'intention comportementale d'utiliser une technologie y est prédite par l'attitude, déterminée par deux croyances centrales, l'</w:t>
       </w:r>
       <w:r>
         <w:rPr>
@@ -3758,7 +3742,7 @@
         <w:pStyle w:val="BodyText"/>
       </w:pPr>
       <w:r>
-        <w:t xml:space="preserve">Cette double définition demeure l'un des socles les plus mobilisés de la littérature des systèmes d'information et constitue le point d'ancrage des propositions P1 et P2 du présent mémoire.</w:t>
+        <w:t xml:space="preserve">Cette double définition, l'un des socles les plus mobilisés de la littérature des systèmes d'information, ancre les propositions P1 et P2 du présent mémoire.</w:t>
       </w:r>
     </w:p>
     <w:p>
@@ -3878,7 +3862,7 @@
         <w:pStyle w:val="FirstParagraph"/>
       </w:pPr>
       <w:r>
-        <w:t xml:space="preserve">L'articulation entre les deux croyances mérite examen. Davis (1989) postule qu'un outil aisé à prendre en main a plus de chances d'apporter une valeur effective, la facilité d'usage nourrissant l'utilité perçue : ce lien figure parmi les résultats les plus reproduits du champ. Les synthèses ultérieures en relativisent toutefois la constance : Y. Lee et al. (2003), Williams et al. (2015) et Dwivedi et al. (2019) documentent une forte variabilité du poids relatif des deux croyances selon les contextes, le déterminant lié à l'effort perdant de son pouvoir explicatif à mesure que l'expérience s'accroît. Conséquence directe pour la présente recherche : le poids respectif de l'utilité et de la facilité ne se postule pas, il s'établit sur le terrain.</w:t>
+        <w:t xml:space="preserve">L'articulation des deux croyances mérite examen. Davis (1989) postule qu'un outil aisé à prendre en main a plus de chances d'apporter une valeur effective, la facilité d'usage nourrissant l'utilité perçue : ce lien compte parmi les résultats les plus reproduits. Les synthèses ultérieures en relativisent la constance : Y. Lee et al. (2003), Williams et al. (2015) et Dwivedi et al. (2019) documentent une forte variabilité du poids relatif des deux croyances selon les contextes, le déterminant lié à l'effort perdant son pouvoir explicatif à mesure que l'expérience s'accroît. Le poids respectif de l'utilité et de la facilité ne se postule donc pas : il s'établit sur le terrain.</w:t>
       </w:r>
     </w:p>
     <w:p>
@@ -3896,7 +3880,7 @@
         <w:t xml:space="preserve"> </w:t>
       </w:r>
       <w:r>
-        <w:t xml:space="preserve">Le TAM opérationnalise une longue tradition psychosociale (TRA, TPB) au moyen d'une architecture parcimonieuse centrée sur deux croyances : cette parcimonie fait sa force et sa fragilité, et nourrira les extensions successives. Les définitions de Davis (1989) fondent les propositions P1 et P2 ; la variabilité contextuelle de leur poids impose de les traiter comme questions ouvertes, instruites par le récit d'usages concrets plutôt que par une échelle fermée.</w:t>
+        <w:t xml:space="preserve">Le TAM opérationnalise une tradition psychosociale (TRA, TPB) par une architecture parcimonieuse centrée sur deux croyances : cette parcimonie fait sa force et sa fragilité, et nourrira les extensions successives. Les définitions de Davis (1989) fondent les propositions P1 et P2 ; la variabilité contextuelle de leur poids impose de les traiter en questions ouvertes, instruites par le récit d'usages concrets plutôt que par une échelle fermée.</w:t>
       </w:r>
     </w:p>
     <w:bookmarkEnd w:id="64"/>
@@ -3919,7 +3903,7 @@
         <w:pStyle w:val="FirstParagraph"/>
       </w:pPr>
       <w:r>
-        <w:t xml:space="preserve">Deux mouvements structurent l'évolution du cadre après 1989. Le premier ouvre successivement les « boîtes noires » du modèle originel : TAM 2 explicite les antécédents de l'utilité perçue, TAM 3 ceux de la facilité d'usage perçue. Le second unifie le champ : UTAUT opère la synthèse de huit modèles concurrents, avant qu'UTAUT 2 n'étende le cadre au contexte de la consommation. La présente section retrace ces quatre étapes, puis en propose une lecture comparative.</w:t>
+        <w:t xml:space="preserve">Deux mouvements structurent l'évolution du cadre après 1989. Le premier ouvre les « boîtes noires » du modèle originel : TAM 2 explicite les antécédents de l'utilité perçue, TAM 3 ceux de la facilité d'usage perçue. Le second unifie le champ : UTAUT synthétise huit modèles concurrents, avant qu'UTAUT 2 n'étende le cadre à la consommation. La section retrace ces quatre étapes et en propose une lecture comparative.</w:t>
       </w:r>
     </w:p>
     <w:bookmarkStart w:id="66" w:name="X735088903033d18cb835bfb02900166ef1ba12d"/>
@@ -3940,7 +3924,7 @@
         <w:pStyle w:val="FirstParagraph"/>
       </w:pPr>
       <w:r>
-        <w:t xml:space="preserve">Proposé au terme de quatre études longitudinales en milieu organisationnel, le TAM 2 explicite les antécédents de l'utilité perçue, jusque-là dépourvue d'antécédents formels. Venkatesh et Davis (2000) distinguent des influences sociales (norme subjective, caractère volontaire de l'usage, image) et des facteurs cognitifs et instrumentaux (pertinence pour le travail, qualité de la production, démontrabilité des résultats). L'apport majeur tient à l'intégration explicite de l'environnement social : l'utilité s'apprécie en interaction avec les attentes du milieu professionnel, ce qui sous-tend directement la proposition P3.</w:t>
+        <w:t xml:space="preserve">Issu de quatre études longitudinales en milieu organisationnel, le TAM 2 dote l'utilité perçue des antécédents formels qui lui manquaient. Venkatesh et Davis (2000) distinguent des influences sociales (norme subjective, caractère volontaire de l'usage, image) et des facteurs cognitifs et instrumentaux (pertinence pour le travail, qualité de la production, démontrabilité des résultats). L'apport majeur est l'intégration explicite de l'environnement social : l'utilité s'apprécie au regard des attentes du milieu professionnel, ce qui sous-tend la proposition P3.</w:t>
       </w:r>
     </w:p>
     <w:bookmarkEnd w:id="66"/>
@@ -3962,7 +3946,7 @@
         <w:pStyle w:val="FirstParagraph"/>
       </w:pPr>
       <w:r>
-        <w:t xml:space="preserve">Le TAM 3 complète le tableau par les antécédents de la facilité d'usage perçue : auto-efficacité informatique, héritée de Compeau et Higgins (1995), anxiété informatique, caractère ludique perçu et perception de contrôle externe (Venkatesh &amp; Bala, 2008). Le positionnement de l'auto-efficacité et de l'anxiété en antécédents de la facilité d'usage, et non en déterminants directs de l'intention, sera repris</w:t>
+        <w:t xml:space="preserve">Le TAM 3 ajoute les antécédents de la facilité d'usage perçue : auto-efficacité informatique, héritée de Compeau et Higgins (1995), anxiété informatique, caractère ludique perçu et perception de contrôle externe (Venkatesh &amp; Bala, 2008). Ce positionnement de l'auto-efficacité et de l'anxiété en antécédents de la facilité d'usage, et non en déterminants directs de l'intention, sera repris</w:t>
       </w:r>
       <w:r>
         <w:t xml:space="preserve"> </w:t>
@@ -3978,7 +3962,7 @@
         <w:t xml:space="preserve"> </w:t>
       </w:r>
       <w:r>
-        <w:t xml:space="preserve">dans le modèle de la section 2.5. Ces apports ouvrent surtout un espace conceptuel pour les freins psychologiques que les modèles antérieurs ignoraient : la proposition P5 s'inscrit dans cette filiation, en interrogeant les craintes des professionnels RH face au remplacement, aux biais et aux transformations identitaires associées à l'IA.</w:t>
+        <w:t xml:space="preserve">dans le modèle de la section 2.5. Ces apports ouvrent surtout un espace conceptuel pour les freins psychologiques qu'ignoraient les modèles antérieurs : la proposition P5 s'y inscrit en interrogeant les craintes des professionnels RH face au remplacement, aux biais et aux transformations identitaires associées à l'IA.</w:t>
       </w:r>
     </w:p>
     <w:bookmarkEnd w:id="67"/>
@@ -4010,7 +3994,7 @@
         <w:t xml:space="preserve">Unified Theory of Acceptance and Use of Technology</w:t>
       </w:r>
       <w:r>
-        <w:t xml:space="preserve">) constitue une étape théorique majeure. Venkatesh et al. (2003) y opèrent la synthèse de huit modèles concurrents (TRA, TAM et TAM 2, théorie du comportement planifié, modèle motivationnel, modèle de l'utilisation des PC, théorie de la diffusion de l'innovation, théorie sociale cognitive) pour proposer un cadre intégré reposant sur quatre déterminants et quatre modérateurs.</w:t>
+        <w:t xml:space="preserve">) marque une étape théorique majeure : Venkatesh et al. (2003) y synthétisent huit modèles concurrents (TRA, TAM et TAM 2, théorie du comportement planifié, modèle motivationnel, modèle de l'utilisation des PC, théorie de la diffusion de l'innovation, théorie sociale cognitive) en un cadre intégré reposant sur quatre déterminants et quatre modérateurs.</w:t>
       </w:r>
     </w:p>
     <w:p>
@@ -4113,7 +4097,7 @@
         <w:t xml:space="preserve">facilitating conditions</w:t>
       </w:r>
       <w:r>
-        <w:t xml:space="preserve">), ressources organisationnelles, techniques et humaines nécessaires à l'usage effectif ; quatre modérateurs (genre, âge, expérience, caractère volontaire de l'usage) affinent la prédiction selon les profils d'utilisateurs.</w:t>
+        <w:t xml:space="preserve">), ressources organisationnelles, techniques et humaines nécessaires à l'usage effectif ; quatre modérateurs (genre, âge, expérience, caractère volontaire de l'usage) affinent la prédiction selon les profils.</w:t>
       </w:r>
     </w:p>
     <w:p>
@@ -4219,7 +4203,7 @@
         <w:pStyle w:val="BodyText"/>
       </w:pPr>
       <w:r>
-        <w:t xml:space="preserve">L'apport décisif d'UTAUT est l'introduction des conditions facilitantes, qui intègre la dimension organisationnelle de l'adoption : la proposition P4 interroge précisément la façon dont infrastructures, budgets, formation et accompagnement interviennent dans le passage de l'intention à l'usage effectif, articulation particulièrement adaptée à l'IA en RH.</w:t>
+        <w:t xml:space="preserve">L'apport décisif d'UTAUT, les conditions facilitantes, intègre la dimension organisationnelle de l'adoption : la proposition P4 interroge la façon dont infrastructures, budgets, formation et accompagnement pèsent dans le passage de l'intention à l'usage effectif, articulation particulièrement adaptée à l'IA en RH.</w:t>
       </w:r>
     </w:p>
     <w:bookmarkEnd w:id="71"/>
@@ -4241,31 +4225,31 @@
         <w:pStyle w:val="FirstParagraph"/>
       </w:pPr>
       <w:r>
-        <w:t xml:space="preserve">UTAUT 2 étend le cadre aux contextes de consommation en ajoutant la motivation hédonique, la valeur prix et l'habitude (Venkatesh et al., 2012). Cette extension garde une pertinence directe pour l'IA en RH au Maroc : la valeur prix pèse dans des organisations aux budgets contraints, l'habitude éclaire le passage de l'adoption initiale à l'usage routinier, et la proposition P7 prolonge cette logique d'élargissement vers les dimensions culturelles et institutionnelles du terrain.</w:t>
-      </w:r>
-    </w:p>
-    <w:p>
-      <w:pPr>
-        <w:pStyle w:val="BodyText"/>
-      </w:pPr>
-      <w:r>
-        <w:t xml:space="preserve">Le Tableau 4, qui synthétise la trajectoire d'enrichissement progressif de la famille TAM/UTAUT (variables centrales, apport spécifique et principale limite de chacun des cinq modèles fondateurs), figure en Annexe G.</w:t>
-      </w:r>
-    </w:p>
-    <w:p>
-      <w:pPr>
-        <w:pStyle w:val="BodyText"/>
-      </w:pPr>
-      <w:r>
-        <w:t xml:space="preserve">La lecture du tableau fait apparaître un mouvement d'ouverture des « boîtes noires » successives : celle de l'utilité perçue (TAM 2), puis celle de la facilité d'usage perçue (TAM 3), avant l'unification organisationnelle (UTAUT) et l'extension consumériste (UTAUT 2). Le gain de puissance prédictive, d'environ 40 % à environ 74 % de variance expliquée, s'est payé d'une complexification croissante.</w:t>
-      </w:r>
-    </w:p>
-    <w:p>
-      <w:pPr>
-        <w:pStyle w:val="BodyText"/>
-      </w:pPr>
-      <w:r>
-        <w:t xml:space="preserve">Ces pourcentages appellent une lecture prudente : obtenus sur les échantillons de validation des auteurs eux-mêmes, ils ne se reproduisent pas mécaniquement ailleurs. Williams et al. (2015) montrent que les études appliquant UTAUT en mobilisent rarement l'intégralité, souvent réduite à quelques déterminants et privée des modérateurs ; Dwivedi et al. (2019) proposent un modèle révisé qui réintroduit l'attitude et relativise le caractère systématiquement nécessaire des modérateurs ; une part de la puissance affichée tient donc moins à la justesse du modèle qu'à l'accumulation de variables, ce que Bagozzi (2007) formulera comme un problème de fond. Retenir de cette généalogie un cadre validé serait excessif ; y voir un répertoire de variables dont la pertinence s'apprécie cas par cas est plus fidèle à l'état des connaissances, et c'est la lecture adoptée ici.</w:t>
+        <w:t xml:space="preserve">UTAUT 2 étend le cadre à la consommation en ajoutant la motivation hédonique, la valeur prix et l'habitude (Venkatesh et al., 2012). L'extension reste pertinente pour l'IA en RH au Maroc : la valeur prix pèse dans des organisations aux budgets contraints, l'habitude éclaire le passage de l'adoption initiale à l'usage routinier, et la proposition P7 prolonge cet élargissement vers les dimensions culturelles et institutionnelles du terrain.</w:t>
+      </w:r>
+    </w:p>
+    <w:p>
+      <w:pPr>
+        <w:pStyle w:val="BodyText"/>
+      </w:pPr>
+      <w:r>
+        <w:t xml:space="preserve">Le Tableau 4, en Annexe G, synthétise cette trajectoire d'enrichissement de la famille TAM/UTAUT : variables centrales, apport spécifique et principale limite des cinq modèles fondateurs.</w:t>
+      </w:r>
+    </w:p>
+    <w:p>
+      <w:pPr>
+        <w:pStyle w:val="BodyText"/>
+      </w:pPr>
+      <w:r>
+        <w:t xml:space="preserve">Sa lecture fait apparaître l'ouverture successive des « boîtes noires » : l'utilité perçue (TAM 2), puis la facilité d'usage perçue (TAM 3), avant l'unification organisationnelle (UTAUT) et l'extension consumériste (UTAUT 2). Le gain de puissance prédictive, d'environ 40 % à environ 74 % de variance expliquée, s'est payé d'une complexification croissante.</w:t>
+      </w:r>
+    </w:p>
+    <w:p>
+      <w:pPr>
+        <w:pStyle w:val="BodyText"/>
+      </w:pPr>
+      <w:r>
+        <w:t xml:space="preserve">Ces pourcentages appellent la prudence : obtenus sur les échantillons de validation des auteurs, ils ne se reproduisent pas mécaniquement ailleurs. Williams et al. (2015) montrent que les études appliquant UTAUT en mobilisent rarement l'intégralité, souvent réduite à quelques déterminants et privée des modérateurs ; Dwivedi et al. (2019) proposent un modèle révisé qui réintroduit l'attitude et relativise la nécessité systématique des modérateurs. Une part de la puissance affichée tient donc moins à la justesse du modèle qu'à l'accumulation de variables, ce que Bagozzi (2007) formulera comme un problème de fond. Y voir un cadre validé serait excessif ; le lire comme un répertoire de variables dont la pertinence s'apprécie cas par cas est plus fidèle à l'état des connaissances : c'est la lecture adoptée ici.</w:t>
       </w:r>
     </w:p>
     <w:p>
@@ -4283,7 +4267,7 @@
         <w:t xml:space="preserve"> </w:t>
       </w:r>
       <w:r>
-        <w:t xml:space="preserve">Les extensions du TAM ont explicité les déterminants sociaux et cognitifs de l'utilité perçue (TAM 2) puis de la facilité d'usage perçue (TAM 3), avant l'unification opérée par UTAUT et son extension consumériste UTAUT 2. Deux apports de cette généalogie sont directement mobilisés par la suite : l'intégration explicite de l'environnement social, qui fonde la proposition P3, dont le terrain marocain devra éprouver le contenu réel, pression normative entre pairs ou prescription hiérarchique ; l'introduction des conditions facilitantes, seule variable du cadre à porter directement sur l'usage effectif, qui fonde la proposition P4 et rejoint l'enseignement e-HRM sur l'écart entre intention et usage. La lecture critique des taux de variance expliquée invite à mobiliser ce cadre comme un répertoire de variables à éprouver, non comme un modèle validé à répliquer.</w:t>
+        <w:t xml:space="preserve">Les extensions du TAM ont explicité les déterminants sociaux et cognitifs de l'utilité perçue (TAM 2) puis de la facilité d'usage perçue (TAM 3), avant l'unification par UTAUT et son extension consumériste UTAUT 2. Deux apports sont mobilisés par la suite : l'intégration explicite de l'environnement social, qui fonde la proposition P3, dont le terrain marocain devra éprouver le contenu réel, pression normative entre pairs ou prescription hiérarchique ; les conditions facilitantes, seule variable du cadre à porter directement sur l'usage effectif, qui fondent la proposition P4 et rejoignent l'enseignement e-HRM sur l'écart entre intention et usage. La lecture critique des taux de variance expliquée invite à mobiliser ce cadre comme un répertoire de variables à éprouver, non comme un modèle validé à répliquer.</w:t>
       </w:r>
     </w:p>
     <w:bookmarkEnd w:id="72"/>
@@ -4306,7 +4290,7 @@
         <w:pStyle w:val="FirstParagraph"/>
       </w:pPr>
       <w:r>
-        <w:t xml:space="preserve">Cette section examine successivement trois familles de critiques : les critiques internes au paradigme, formulées par ses propres protagonistes, qui dénoncent une stagnation et la mise à l'écart de l'artefact technologique ; la critique anti-déterministe née de la confrontation à l'IA générative ; l'existence de cadres théoriques concurrents. Elle explicite ensuite la position assumée par le mémoire. Cette clarification conditionne la rigueur de la phase empirique : mobiliser un cadre sans en discuter les limites exposerait l'analyse à une lecture acritique du matériau.</w:t>
+        <w:t xml:space="preserve">Cette section examine trois familles de critiques : les critiques internes, formulées par les protagonistes du paradigme, qui dénoncent une stagnation et la mise à l'écart de l'artefact technologique ; la critique anti-déterministe née de la confrontation à l'IA générative ; les cadres théoriques concurrents. Elle explicite ensuite la position du mémoire, clarification qui conditionne la rigueur de la phase empirique : mobiliser un cadre sans en discuter les limites exposerait l'analyse à une lecture acritique du matériau.</w:t>
       </w:r>
     </w:p>
     <w:bookmarkStart w:id="74" w:name="X72b9f98414d973e13334c5245e4d05de41af41c"/>
@@ -4327,7 +4311,7 @@
         <w:pStyle w:val="FirstParagraph"/>
       </w:pPr>
       <w:r>
-        <w:t xml:space="preserve">La critique la plus articulée du TAM est celle que Bagozzi (2007) formule sous le concept de</w:t>
+        <w:t xml:space="preserve">La critique la plus articulée du TAM est celle de Bagozzi (2007), formulée sous le concept de</w:t>
       </w:r>
       <w:r>
         <w:t xml:space="preserve"> </w:t>
@@ -4340,15 +4324,15 @@
         <w:t xml:space="preserve">stagnation paradigmatique</w:t>
       </w:r>
       <w:r>
-        <w:t xml:space="preserve">. Cette stagnation ne tient pas à une obsolescence empirique du modèle, qui continue de prédire correctement l'intention d'usage : elle procède d'un effet pervers de sa réussite académique. La parcimonie initiale du modèle en a fait un instrument de publication massivement reproductible, engendrant une production cumulative homogène mais théoriquement appauvrie, succession d'études confirmant les mêmes liens dans des contextes variés sans rénover la structure du modèle ni questionner ses fondements psychologiques. Le diagnostic se décline en quatre limites structurelles : la réduction de l'adoption à une intention rationnelle médiatisée par deux croyances, qui sous-théorise les émotions, l'affect et les états motivationnels complexes ; le traitement du passage de l'intention au comportement comme un simple lien, alors que cette transition mobilise des processus cognitifs distincts ; l'absorption des facteurs collectifs dans une « influence sociale » à la structure interne inexplorée ; le caractère foncièrement statique d'un modèle qui prédit l'adoption à un instant donné sans modéliser l'évolution des croyances dans le temps.</w:t>
-      </w:r>
-    </w:p>
-    <w:p>
-      <w:pPr>
-        <w:pStyle w:val="BodyText"/>
-      </w:pPr>
-      <w:r>
-        <w:t xml:space="preserve">Publiée dans le même numéro spécial, la critique de Benbasat et Barki (2007) prolonge ce diagnostic sur un point qui intéresse directement le présent mémoire : le succès du TAM a détourné la recherche en systèmes d'information de l'artefact technologique lui-même, la technologie devenant une variable externe indifférenciée dont les propriétés concrètes n'ont plus à être examinées. Le reproche pouvait paraître théorique tant que les technologies étudiées étaient des logiciels de bureautique comparables ; il devient décisif face à l'IA. Si les propriétés de l'artefact ne comptent pas, adopter un tableur et adopter un système de présélection algorithmique relèvent des mêmes mécanismes, ce qui contredit tout ce que le chapitre 1 a établi. Prendre au sérieux cette critique revient donc à réintroduire dans le modèle les propriétés spécifiques de l'artefact IA, précisément ce que la proposition P6 formalise : la critique la plus radicale du cadre fournit l'argument le plus solide en faveur de son enrichissement plutôt que de son abandon. Ces deux critiques imposent une question préalable : que peut apporter une étude supplémentaire à un cadre déjà si largement éprouvé ? La section 2.3.4 y répond.</w:t>
+        <w:t xml:space="preserve">. Elle ne tient pas à une obsolescence empirique du modèle, qui prédit toujours correctement l'intention d'usage, mais à un effet pervers de sa réussite académique : sa parcimonie initiale en a fait un instrument de publication massivement reproductible, d'où une production cumulative homogène mais théoriquement appauvrie, des études confirmant les mêmes liens dans des contextes variés sans rénover sa structure ni questionner ses fondements psychologiques. Le diagnostic recense quatre limites structurelles : la réduction de l'adoption à une intention rationnelle médiatisée par deux croyances, qui sous-théorise émotions, affect et états motivationnels complexes ; la réduction du passage de l'intention au comportement à un simple lien, alors qu'il mobilise des processus cognitifs distincts ; l'absorption des facteurs collectifs dans une « influence sociale » à la structure interne inexplorée ; le caractère statique d'un modèle qui prédit l'adoption à un instant donné sans modéliser l'évolution des croyances.</w:t>
+      </w:r>
+    </w:p>
+    <w:p>
+      <w:pPr>
+        <w:pStyle w:val="BodyText"/>
+      </w:pPr>
+      <w:r>
+        <w:t xml:space="preserve">Publiée dans le même numéro spécial, la critique de Benbasat et Barki (2007) prolonge ce diagnostic sur un point central pour le mémoire : le succès du TAM a détourné la recherche en systèmes d'information de l'artefact lui-même, la technologie devenant une variable externe indifférenciée dont les propriétés concrètes ne sont plus examinées. Le reproche restait théorique tant que les technologies étudiées étaient des logiciels de bureautique comparables ; il devient décisif face à l'IA, car si les propriétés de l'artefact ne comptent pas, adopter un tableur ou un système de présélection algorithmique relève des mêmes mécanismes, ce qui contredit les acquis du chapitre 1. Prendre au sérieux cette critique revient à réintroduire dans le modèle les propriétés spécifiques de l'artefact IA, ce que formalise la proposition P6 : la critique la plus radicale du cadre fournit le meilleur argument pour son enrichissement plutôt que pour son abandon. Ces deux critiques imposent une question préalable, celle de l'apport d'une étude supplémentaire à un cadre si largement éprouvé ; la section 2.3.4 y répond.</w:t>
       </w:r>
     </w:p>
     <w:bookmarkEnd w:id="74"/>
@@ -4370,7 +4354,7 @@
         <w:pStyle w:val="FirstParagraph"/>
       </w:pPr>
       <w:r>
-        <w:t xml:space="preserve">Une seconde famille de critiques, plus récente, interroge la transférabilité du cadre vers les technologies contemporaines. Le TAM a été conçu par Davis (1989) pour des logiciels de productivité partageant trois propriétés :</w:t>
+        <w:t xml:space="preserve">Une famille de critiques plus récente interroge la transférabilité du cadre aux technologies contemporaines. Davis (1989) a conçu le TAM pour des logiciels de productivité partageant trois propriétés :</w:t>
       </w:r>
       <w:r>
         <w:t xml:space="preserve"> </w:t>
@@ -4428,7 +4412,7 @@
         <w:t xml:space="preserve">transparents</w:t>
       </w:r>
       <w:r>
-        <w:t xml:space="preserve">, l'utilisateur comprenant au moins en principe ce que fait le logiciel ;</w:t>
+        <w:t xml:space="preserve">, l'utilisateur comprenant en principe ce que fait le logiciel ;</w:t>
       </w:r>
       <w:r>
         <w:t xml:space="preserve"> </w:t>
@@ -4441,7 +4425,7 @@
         <w:t xml:space="preserve">instrumentaux</w:t>
       </w:r>
       <w:r>
-        <w:t xml:space="preserve">, exécutant une tâche définie à l'avance. L'IA générative inverse chacune de ces propriétés : elle est</w:t>
+        <w:t xml:space="preserve">, exécutant une tâche définie à l'avance. L'IA générative inverse chacune d'elles : elle est</w:t>
       </w:r>
       <w:r>
         <w:t xml:space="preserve"> </w:t>
@@ -4467,7 +4451,7 @@
         <w:t xml:space="preserve">opaque</w:t>
       </w:r>
       <w:r>
-        <w:t xml:space="preserve">, les mécanismes internes des grands modèles de langage demeurant largement inintelligibles, y compris pour leurs concepteurs ;</w:t>
+        <w:t xml:space="preserve">, les mécanismes internes des grands modèles de langage demeurant inintelligibles, y compris pour leurs concepteurs ;</w:t>
       </w:r>
       <w:r>
         <w:t xml:space="preserve"> </w:t>
@@ -4480,7 +4464,7 @@
         <w:t xml:space="preserve">conversationnelle</w:t>
       </w:r>
       <w:r>
-        <w:t xml:space="preserve">, l'usage relevant d'une co-construction itérative et non de l'exécution d'une commande. Ce constat rejoint la caractérisation de Berente et al. (2021) : autonomie croissante des systèmes, capacité d'apprentissage, caractère insondable. Ces différences déplacent les conditions mêmes de formation des croyances fondatrices du modèle : l'utilité d'un grand modèle de langage ne se manifeste pas de manière stable d'un usage à l'autre, elle dépend de la qualité du</w:t>
+        <w:t xml:space="preserve">, l'usage relevant d'une co-construction itérative et non de l'exécution d'une commande. Ce constat rejoint Berente et al. (2021) : autonomie croissante, apprentissage, caractère insondable. Ces différences déplacent les conditions de formation des croyances fondatrices : l'utilité d'un grand modèle de langage ne se manifeste pas de façon stable d'un usage à l'autre et dépend de la qualité du</w:t>
       </w:r>
       <w:r>
         <w:t xml:space="preserve"> </w:t>
@@ -4514,7 +4498,7 @@
         <w:pStyle w:val="BodyText"/>
       </w:pPr>
       <w:r>
-        <w:t xml:space="preserve">Quatre dimensions, jusque-là périphériques dans la famille TAM/UTAUT, accèdent ainsi au statut de variables centrales : la confiance envers les systèmes d'IA, un système opaque exigeant un acte de confiance non trivial dans la fiabilité de ses recommandations, particulièrement lorsqu'elles affectent des décisions RH à fort enjeu (Budhwar et al., 2022 ; Tambe et al., 2019) ; la transparence algorithmique, dont l'absence constitue pour les professionnels RH un frein structurel dès que les décisions doivent être justifiées auprès de candidats, de collaborateurs ou d'instances réglementaires (Tambe et al., 2019) ; les risques éthiques, biais, discrimination indirecte et perte d'humanité de la décision, que Charlwood et Guenole (2022) théorisent comme des paradoxes constitutifs susceptibles d'inverser le rapport entre coûts et bénéfices anticipé par l'utilisateur ; la confidentialité des données RH, d'autant plus sensible que les traitements portent sur des informations personnelles et que leur finalité peut dériver au fil des usages (Tursunbayeva et al., 2022). Trois conséquences en découlent pour la recherche : les variables explicatives classiques doivent être considérées comme partielles et non comme exhaustives ; les dimensions propres à l'IA gagnent à être explorées explicitement, exigence qui motive la proposition P6 ; une posture exclusivement déductive risquerait d'enfermer le matériau dans une grille trop étroite, d'où l'intérêt d'un dispositif qualitatif autorisant l'émergence.</w:t>
+        <w:t xml:space="preserve">Quatre dimensions jusque-là périphériques dans la famille TAM/UTAUT deviennent ainsi centrales : la confiance envers les systèmes d'IA, dont l'opacité exige un acte de confiance non trivial dans la fiabilité de ses recommandations, surtout lorsqu'elles affectent des décisions RH à fort enjeu (Budhwar et al., 2022 ; Tambe et al., 2019) ; la transparence algorithmique, dont l'absence constitue pour les professionnels RH un frein structurel dès qu'une décision doit être justifiée auprès de candidats, de collaborateurs ou d'instances réglementaires (Tambe et al., 2019) ; les risques éthiques, biais, discrimination indirecte et perte d'humanité de la décision, que Charlwood et Guenole (2022) théorisent comme des paradoxes constitutifs susceptibles d'inverser le rapport coûts-bénéfices anticipé par l'utilisateur ; la confidentialité des données RH, d'autant plus sensible que les traitements portent sur des informations personnelles dont la finalité peut dériver au fil des usages (Tursunbayeva et al., 2022). Trois conséquences en découlent : les variables explicatives classiques sont partielles et non exhaustives ; les dimensions propres à l'IA doivent être explorées explicitement, exigence qui motive la proposition P6 ; une posture exclusivement déductive enfermerait le matériau dans une grille trop étroite, d'où l'intérêt d'un dispositif qualitatif autorisant l'émergence.</w:t>
       </w:r>
     </w:p>
     <w:bookmarkEnd w:id="75"/>
@@ -4536,7 +4520,7 @@
         <w:pStyle w:val="FirstParagraph"/>
       </w:pPr>
       <w:r>
-        <w:t xml:space="preserve">Plusieurs cadres alternatifs méritent d'être présentés, pour situer la décision de retenir TAM/UTAUT et identifier les dimensions que ces cadres saisiraient mieux. La théorie de la diffusion des innovations, dont Rogers (2003) offre la formulation la plus aboutie, analyse les caractéristiques perçues de l'innovation elle-même, cinq propriétés prédisant la vitesse de diffusion : avantage relatif, compatibilité avec les valeurs et les besoins existants, complexité, testabilité, observabilité. Appliquée à l'IA en RH, cette grille éclairerait la diffusion rapide du tri de CV et les résistances persistantes que suscite l'analyse de sentiment, en pointant la compatibilité avec les valeurs identitaires de la profession. La théorie de l'appropriation, initiée par Orlikowski (1992) dans la lignée de la théorie de la structuration et formalisée par DeSanctis et Poole (1994), analyse les usages situés, les détournements par rapport aux usages prescrits et la co-construction progressive du sens d'une technologie : elle met en lumière ce que le TAM ne capture pas, un outil pouvant être formellement adopté tout en étant détourné de sa fonction, contourné par des pratiques parallèles ou intégré dans un</w:t>
+        <w:t xml:space="preserve">Présenter plusieurs cadres alternatifs permet de situer le choix de TAM/UTAUT et d'identifier les dimensions qu'ils saisiraient mieux. La théorie de la diffusion des innovations, dont Rogers (2003) offre la formulation la plus aboutie, analyse les caractéristiques perçues de l'innovation, cinq propriétés prédisant la vitesse de diffusion : avantage relatif, compatibilité avec les valeurs et les besoins existants, complexité, testabilité, observabilité. Appliquée à l'IA en RH, cette grille éclairerait la diffusion rapide du tri de CV et les résistances que suscite l'analyse de sentiment, en pointant la compatibilité avec les valeurs identitaires de la profession. La théorie de l'appropriation, initiée par Orlikowski (1992) dans la lignée de la structuration et formalisée par DeSanctis et Poole (1994), analyse les usages situés, les détournements des usages prescrits et la co-construction du sens d'une technologie : elle éclaire ce que le TAM ne capture pas, un outil pouvant être formellement adopté mais détourné de sa fonction, contourné par des pratiques parallèles ou intégré dans un</w:t>
       </w:r>
       <w:r>
         <w:t xml:space="preserve"> </w:t>
@@ -4552,15 +4536,15 @@
         <w:t xml:space="preserve"> </w:t>
       </w:r>
       <w:r>
-        <w:t xml:space="preserve">qui en modifie la portée. La théorie décomposée du comportement planifié (Taylor &amp; Todd, 1995), enfin, conserve la logique cognitive du TAM en décomposant chaque croyance en facteurs plus fins, au prix de la parcimonie, ce qui explique sa moindre diffusion.</w:t>
-      </w:r>
-    </w:p>
-    <w:p>
-      <w:pPr>
-        <w:pStyle w:val="BodyText"/>
-      </w:pPr>
-      <w:r>
-        <w:t xml:space="preserve">Ces trois cadres n'ont pas la même relation au TAM, et la distinction commande l'usage qui en est fait. La théorie décomposée en est une variante interne, substituable mais peu susceptible d'apporter des dimensions nouvelles. La diffusion des innovations est complémentaire : elle déplace le regard de l'utilisateur vers les propriétés perçues de l'innovation, rejoignant le reproche de Benbasat et Barki (2007), et fournit avec la compatibilité un instrument utile pour penser la friction entre l'IA et les valeurs de la profession RH. La théorie de l'appropriation est en revanche incommensurable : elle ne cherche pas à prédire une adoption mais à décrire une construction sociale de l'usage, et ne peut être combinée au TAM sans incohérence épistémologique. Deux emprunts ciblés sont donc opérés et assumés comme tels : de Rogers (2003), l'idée que la compatibilité avec les valeurs professionnelles constitue un frein possible, dimension que la proposition P5 intègre sous l'angle de l'identité menacée ; de la théorie de l'appropriation, aucun concept mais une vigilance méthodologique, rester attentif dans les entretiens aux écarts entre usage prescrit et usage réel. Y. Lee et al. (2003), qui documentent la trajectoire bibliométrique du TAM, rappellent du reste que la force du modèle n'a jamais résidé dans son exhaustivité : le cadre est puissant mais incomplet, ce qui exige du chercheur qu'il explicite sa posture plutôt qu'il ne l'adopte tacitement.</w:t>
+        <w:t xml:space="preserve">qui en modifie la portée. La théorie décomposée du comportement planifié (Taylor &amp; Todd, 1995) conserve enfin la logique cognitive du TAM en décomposant chaque croyance en facteurs plus fins, au prix de la parcimonie et d'une moindre diffusion.</w:t>
+      </w:r>
+    </w:p>
+    <w:p>
+      <w:pPr>
+        <w:pStyle w:val="BodyText"/>
+      </w:pPr>
+      <w:r>
+        <w:t xml:space="preserve">Ces trois cadres n'ont pas la même relation au TAM, ce qui commande leur usage. La théorie décomposée en est une variante interne, substituable mais peu porteuse de dimensions nouvelles. La diffusion des innovations est complémentaire : elle déplace le regard de l'utilisateur vers les propriétés perçues de l'innovation, rejoignant le reproche de Benbasat et Barki (2007), et fournit avec la compatibilité un instrument pour penser la friction entre l'IA et les valeurs de la profession RH. La théorie de l'appropriation est en revanche incommensurable : elle ne prédit pas une adoption mais décrit une construction sociale de l'usage, et ne peut être combinée au TAM sans incohérence épistémologique. Deux emprunts ciblés sont donc assumés : de Rogers (2003), l'idée que la compatibilité avec les valeurs professionnelles constitue un frein possible, que la proposition P5 intègre sous l'angle de l'identité menacée ; de la théorie de l'appropriation, aucun concept mais une vigilance méthodologique, celle des écarts entre usage prescrit et usage réel dans les entretiens. Y. Lee et al. (2003), qui documentent la trajectoire bibliométrique du TAM, rappellent que la force du modèle n'a jamais résidé dans son exhaustivité : puissant mais incomplet, le cadre exige du chercheur qu'il explicite sa posture au lieu de l'adopter tacitement.</w:t>
       </w:r>
     </w:p>
     <w:bookmarkEnd w:id="76"/>
@@ -4582,15 +4566,15 @@
         <w:pStyle w:val="FirstParagraph"/>
       </w:pPr>
       <w:r>
-        <w:t xml:space="preserve">Pourquoi, au regard de ces critiques, retenir le TAM/UTAUT comme cadre principal ? Ce choix se justifie à un triple titre. La posture qualitative déductive exige d'abord un cadre structurant, suffisamment lisible pour orienter la collecte et le codage, suffisamment ouvert pour autoriser l'émergence : la parcimonie décriée par Bagozzi (2007) constitue ici un avantage opérationnel, permettant un guide d'entretien clair et une grille d'analyse traçable. La mobilisation du cadre garantit ensuite la comparabilité avec la littérature internationale dominante (Dwivedi et al., 2019 ; Pillai &amp; Sivathanu, 2020 ; Williams et al., 2015) : des résultats situés sur le terrain marocain n'ont de portée qu'à la condition d'être discutés à l'aune des cadres les plus partagés. Ses dimensions sont enfin opérationnellement testables en entretien, chacune se traduisant en questions ouvertes, en relances et en codes analytiques, ce qui n'est pas le cas des concepts plus diffus de la théorie de l'appropriation.</w:t>
-      </w:r>
-    </w:p>
-    <w:p>
-      <w:pPr>
-        <w:pStyle w:val="BodyText"/>
-      </w:pPr>
-      <w:r>
-        <w:t xml:space="preserve">Le mémoire reconnaît les limites de ce choix et les prend en charge méthodologiquement. La posture qualitative est précisément mobilisée pour détecter ce que le cadre ne capte pas, détournements d'usage, appropriations situées, dimensions imprévues telles que la confiance algorithmique, l'anxiété éthique ou l'identité professionnelle : le codage déductif sera systématiquement complété d'un codage ouvert destiné à recueillir ce qui déborde la grille initiale. Cette double posture, déductive sur les variables fondatrices et exploratoire sur les variables émergentes, concilie rigueur cumulative et ouverture à la spécificité de l'objet ; la rareté des études qualitatives dans la littérature UTAUT (Williams et al., 2015) délimite précisément l'espace de contribution que le mémoire entend occuper. Le modèle d'adéquation tâche-technologie de Goodhue et Thompson (1995) sera mobilisé de manière complémentaire dans la discussion (Partie III), pour analyser la variabilité de l'adoption selon les tâches RH considérées, sans constituer un cadre principal.</w:t>
+        <w:t xml:space="preserve">Pourquoi retenir malgré ces critiques le TAM/UTAUT comme cadre principal ? Ce choix se justifie à un triple titre. La posture qualitative déductive exige d'abord un cadre structurant, assez lisible pour orienter la collecte et le codage, assez ouvert pour autoriser l'émergence : la parcimonie décriée par Bagozzi (2007) devient ici un avantage opérationnel, permettant un guide d'entretien clair et une grille d'analyse traçable. Le cadre garantit ensuite la comparabilité avec la littérature internationale dominante (Dwivedi et al., 2019 ; Pillai &amp; Sivathanu, 2020 ; Williams et al., 2015) : des résultats situés sur le terrain marocain n'ont de portée que discutés à l'aune des cadres les plus partagés. Ses dimensions sont enfin testables en entretien, chacune se traduisant en questions ouvertes, en relances et en codes analytiques, ce qui n'est pas le cas des concepts plus diffus de la théorie de l'appropriation.</w:t>
+      </w:r>
+    </w:p>
+    <w:p>
+      <w:pPr>
+        <w:pStyle w:val="BodyText"/>
+      </w:pPr>
+      <w:r>
+        <w:t xml:space="preserve">Le mémoire reconnaît les limites de ce choix et les prend en charge méthodologiquement. La posture qualitative est mobilisée pour détecter ce que le cadre ne capte pas, détournements d'usage, appropriations situées, dimensions imprévues comme la confiance algorithmique, l'anxiété éthique ou l'identité professionnelle : le codage déductif sera systématiquement complété d'un codage ouvert recueillant ce qui déborde la grille. Cette double posture, déductive sur les variables fondatrices et exploratoire sur les émergentes, concilie rigueur cumulative et ouverture à la spécificité de l'objet ; la rareté des études qualitatives dans la littérature UTAUT (Williams et al., 2015) délimite l'espace de contribution visé. Le modèle d'adéquation tâche-technologie de Goodhue et Thompson (1995) sera mobilisé en complément dans la discussion (Partie III), pour analyser la variabilité de l'adoption selon les tâches RH, sans constituer un cadre principal.</w:t>
       </w:r>
     </w:p>
     <w:p>
@@ -4608,7 +4592,7 @@
         <w:t xml:space="preserve"> </w:t>
       </w:r>
       <w:r>
-        <w:t xml:space="preserve">Trois familles de critiques structurent le champ : les critiques internes, qui dénoncent la stagnation (Bagozzi, 2007) et la négligence des propriétés de l'artefact (Benbasat &amp; Barki, 2007) ; l'inadéquation aux technologies probabilistes contemporaines ; les cadres concurrents éclairant des dimensions complémentaires. Le mémoire retient le cadre TAM/UTAUT pour sa lisibilité, sa comparabilité internationale (Lee et al., 2003) et sa testabilité opérationnelle, tout en chargeant la posture qualitative de détecter ce que ce cadre ne capte pas spontanément. Le principal enseignement de la discussion est cependant constructif plutôt que défensif : c'est la critique la plus sévère, celle de la mise à l'écart de l'artefact, qui indique la voie de l'enrichissement. Réintroduire dans le modèle les propriétés propres à l'IA, opacité, dimension probabiliste, sensibilité éthique, revient à répondre à Benbasat et Barki (2007) dans leurs propres termes : c'est l'objet de la proposition P6, dont la section suivante construit les quatre variables ; l'attention aux frictions identitaires empruntée à Rogers (2003) nourrit pour sa part la proposition P5.</w:t>
+        <w:t xml:space="preserve">Trois familles de critiques structurent le champ : les critiques internes, qui dénoncent la stagnation (Bagozzi, 2007) et la négligence des propriétés de l'artefact (Benbasat &amp; Barki, 2007) ; l'inadéquation aux technologies probabilistes contemporaines ; les cadres concurrents éclairant des dimensions complémentaires. Le mémoire retient TAM/UTAUT pour sa lisibilité, sa comparabilité internationale (Lee et al., 2003) et sa testabilité opérationnelle, tout en chargeant la posture qualitative de détecter ce qu'il ne capte pas spontanément. L'enseignement principal est cependant constructif : c'est la critique la plus sévère, celle de la mise à l'écart de l'artefact, qui indique la voie de l'enrichissement. Réintroduire les propriétés propres à l'IA, opacité, dimension probabiliste, sensibilité éthique, répond à Benbasat et Barki (2007) dans leurs propres termes : c'est l'objet de la proposition P6, dont la section suivante construit les quatre variables ; l'attention aux frictions identitaires empruntée à Rogers (2003) nourrit la proposition P5.</w:t>
       </w:r>
     </w:p>
     <w:bookmarkEnd w:id="77"/>
@@ -4631,7 +4615,7 @@
         <w:pStyle w:val="FirstParagraph"/>
       </w:pPr>
       <w:r>
-        <w:t xml:space="preserve">La discussion critique débouche sur un choix constructif : mobiliser la famille TAM/UTAUT non comme une structure rigide, mais comme un réservoir conceptuel dans lequel sélectionner les variables pertinentes au regard de la problématique, puis enrichir cette sélection des dimensions propres à l'IA que la littérature récente a théorisées. La section expose la logique d'intégration (2.4.1), les variables classiques et leurs antécédents psychologiques (2.4.2), les variables spécifiques à l'IA, apport conceptuel central de la recherche (2.4.3), et les variables modératrices contextuelles (2.4.4).</w:t>
+        <w:t xml:space="preserve">La discussion critique débouche sur un choix constructif : mobiliser la famille TAM/UTAUT non en structure rigide, mais en réservoir où puiser les variables pertinentes au regard de la problématique, puis les enrichir des dimensions propres à l'IA théorisées par la littérature récente. La section expose la logique d'intégration (2.4.1), les variables classiques et leurs antécédents psychologiques (2.4.2), les variables spécifiques à l'IA, apport conceptuel central (2.4.3), et les modératrices contextuelles (2.4.4).</w:t>
       </w:r>
     </w:p>
     <w:bookmarkStart w:id="79" w:name="la-logique-dintégration"/>
@@ -4652,7 +4636,7 @@
         <w:pStyle w:val="FirstParagraph"/>
       </w:pPr>
       <w:r>
-        <w:t xml:space="preserve">Aucun modèle pris isolément ne couvre l'ensemble des dimensions pertinentes : le TAM originel (Davis, 1989) est trop parcimonieux pour saisir les dimensions sociales et organisationnelles ; UTAUT (Venkatesh et al., 2003) intègre les conditions facilitantes mais ignore largement les dimensions cognitives et affectives ; TAM 3 (Venkatesh &amp; Bala, 2008) introduit l'anxiété et l'auto-efficacité mais reste centré sur la facilité d'usage ; UTAUT 2 (Venkatesh et al., 2012) ajoute des variables consuméristes dont seules certaines sont transposables au contexte organisationnel. Les relectures critiques du champ (Bagozzi, 2007 ; Dwivedi et al., 2019) invitent dès lors à mobiliser ces modèles comme des réservoirs conceptuels, au service de la problématique posée. Le cadre intégrateur combine ainsi cinq apports : les deux variables fondatrices du TAM, utilité perçue et facilité d'usage perçue (Davis, 1989) ; les dimensions sociales et organisationnelles d'UTAUT, influence sociale et conditions facilitantes (Venkatesh et al., 2003) ; les dimensions cognitives et affectives de TAM 3, auto-efficacité numérique et anxiété (Compeau &amp; Higgins, 1995 ; Venkatesh &amp; Bala, 2008), la seconde étant enrichie de la crainte du remplacement professionnel (Charlwood &amp; Guenole, 2022) ; un bloc de variables IA-spécifiques détaillé en 2.4.3 ; des variables modératrices contextuelles issues d'UTAUT 2 et de la littérature internationale de GRH (Budhwar et al., 2022 ; Pillai &amp; Sivathanu, 2020 ; Venkatesh et al., 2012). Dans la perspective post-positiviste justifiée au chapitre 3, ce cadre est mobilisé comme structure heuristique, sans prétendre épuiser la complexité du réel ni interdire l'émergence de variables non anticipées.</w:t>
+        <w:t xml:space="preserve">Aucun modèle ne couvre à lui seul l'ensemble des dimensions pertinentes : le TAM originel (Davis, 1989) est trop parcimonieux pour le social et l'organisationnel ; UTAUT (Venkatesh et al., 2003) intègre les conditions facilitantes mais ignore largement le cognitif et l'affectif ; TAM 3 (Venkatesh &amp; Bala, 2008) introduit l'anxiété et l'auto-efficacité mais reste centré sur la facilité d'usage ; UTAUT 2 (Venkatesh et al., 2012) ajoute des variables consuméristes en partie seulement transposables au contexte organisationnel. Les relectures critiques du champ (Bagozzi, 2007 ; Dwivedi et al., 2019) invitent donc à les traiter en réservoirs conceptuels. Le cadre intégrateur combine cinq apports : les deux variables fondatrices du TAM, utilité perçue et facilité d'usage perçue (Davis, 1989) ; les dimensions sociales et organisationnelles d'UTAUT, influence sociale et conditions facilitantes (Venkatesh et al., 2003) ; les dimensions cognitives et affectives de TAM 3, auto-efficacité numérique et anxiété (Compeau &amp; Higgins, 1995 ; Venkatesh &amp; Bala, 2008), la seconde enrichie de la crainte du remplacement professionnel (Charlwood &amp; Guenole, 2022) ; un bloc IA-spécifique détaillé en 2.4.3 ; des modératrices contextuelles issues d'UTAUT 2 et de la littérature internationale de GRH (Budhwar et al., 2022 ; Pillai &amp; Sivathanu, 2020 ; Venkatesh et al., 2012). Dans la perspective post-positiviste justifiée au chapitre 3, il est mobilisé comme structure heuristique, sans prétendre épuiser la complexité du réel ni interdire l'émergence de variables non anticipées.</w:t>
       </w:r>
     </w:p>
     <w:bookmarkEnd w:id="79"/>
@@ -4674,7 +4658,7 @@
         <w:pStyle w:val="FirstParagraph"/>
       </w:pPr>
       <w:r>
-        <w:t xml:space="preserve">Le modèle distingue les variables indépendantes classiques, les variables antécédentes psychologiques, dont l'effet est médiatisé par la facilité d'usage perçue, et les variables IA-spécifiques présentées en 2.4.3. Trois variables classiques sont directement associées à l'intention d'adoption.</w:t>
+        <w:t xml:space="preserve">Le modèle distingue les variables indépendantes classiques, les antécédentes psychologiques, dont l'effet passe par la facilité d'usage perçue, et les variables IA-spécifiques présentées en 2.4.3. Trois variables classiques sont directement associées à l'intention d'adoption.</w:t>
       </w:r>
     </w:p>
     <w:p>
@@ -4736,7 +4720,7 @@
         <w:pStyle w:val="FirstParagraph"/>
       </w:pPr>
       <w:r>
-        <w:t xml:space="preserve">Une quatrième variable classique occupe une position distincte, qu'il importe de ne pas confondre avec les précédentes.</w:t>
+        <w:t xml:space="preserve">Une quatrième variable classique occupe une position distincte des précédentes.</w:t>
       </w:r>
     </w:p>
     <w:p>
@@ -4762,7 +4746,7 @@
         <w:pStyle w:val="FirstParagraph"/>
       </w:pPr>
       <w:r>
-        <w:t xml:space="preserve">Deux variables antécédentes agissent en amont, par l'intermédiaire de la facilité d'usage perçue.</w:t>
+        <w:t xml:space="preserve">Deux variables antécédentes agissent en amont.</w:t>
       </w:r>
     </w:p>
     <w:p>
@@ -4820,7 +4804,7 @@
         <w:pStyle w:val="FirstParagraph"/>
       </w:pPr>
       <w:r>
-        <w:t xml:space="preserve">Le modèle intègre un bloc de variables explicatives propres à l'IA, en cohérence avec la spécificité de l'objet analysée en 2.3.2 : ce bloc ne se substitue pas aux dimensions classiques, il capte ce que le cadre originel ne formalise pas. L'émergence d'une gestion des ressources humaines algorithmique, dans laquelle des décisions RH sont partiellement déléguées à des systèmes automatisés, constitue selon Meijerink et al. (2021) un champ de recherche à part entière ; les quatre variables retenues en traduisent les enjeux du point de vue du professionnel appelé à travailler avec ces systèmes.</w:t>
+        <w:t xml:space="preserve">Le modèle intègre un bloc de variables propres à l'IA, en cohérence avec la spécificité de l'objet analysée en 2.3.2 : loin de se substituer aux dimensions classiques, il capte ce que le cadre originel ne formalise pas. L'essor d'une gestion des ressources humaines algorithmique, où des décisions RH sont partiellement déléguées à des systèmes automatisés, constitue selon Meijerink et al. (2021) un champ de recherche à part entière ; les quatre variables retenues en traduisent les enjeux pour le professionnel qui travaille avec ces systèmes.</w:t>
       </w:r>
     </w:p>
     <w:p>
@@ -4838,7 +4822,7 @@
         <w:t xml:space="preserve"> </w:t>
       </w:r>
       <w:r>
-        <w:t xml:space="preserve">Depuis Mayer et al. (1995), la confiance désigne la volonté de se rendre vulnérable aux actions d'autrui sur la foi d'une attente de fiabilité, indépendamment de toute capacité de contrôle : la définition s'applique remarquablement à la relation entre un professionnel RH et un système algorithmique opaque, suivre une recommandation de présélection revenant à assumer une décision dont on ne maîtrise pas la fabrique. La revue de Glikson et Woolley (2020) confirme la centralité de cette variable, dotée d'une composante cognitive et d'une composante affective, et évolutive selon les performances observées et la criticité des tâches confiées. Deux résultats expérimentaux montrent qu'elle n'est ni stable ni symétrique de la confiance interpersonnelle : l'</w:t>
+        <w:t xml:space="preserve">Depuis Mayer et al. (1995), la confiance désigne la volonté de se rendre vulnérable aux actions d'autrui sur la foi d'une attente de fiabilité, indépendamment de tout contrôle : elle s'applique à la relation entre un professionnel RH et un système algorithmique opaque, suivre une recommandation de présélection revenant à assumer une décision dont on ne maîtrise pas la fabrique. La revue de Glikson et Woolley (2020) confirme sa centralité : elle associe une composante cognitive et une composante affective et évolue selon les performances observées et la criticité des tâches confiées. Deux résultats expérimentaux montrent qu'elle n'est ni stable ni symétrique de la confiance interpersonnelle : l'</w:t>
       </w:r>
       <w:r>
         <w:rPr>
@@ -4851,7 +4835,7 @@
         <w:t xml:space="preserve"> </w:t>
       </w:r>
       <w:r>
-        <w:t xml:space="preserve">(Dietvorst et al., 2015), les individus se détournant plus vite d'un algorithme qui se trompe que d'un humain commettant des erreurs comparables, et l'</w:t>
+        <w:t xml:space="preserve">(Dietvorst et al., 2015), les individus se détournant plus vite d'un algorithme qui se trompe que d'un humain aux erreurs comparables, et l'</w:t>
       </w:r>
       <w:r>
         <w:rPr>
@@ -4864,7 +4848,7 @@
         <w:t xml:space="preserve"> </w:t>
       </w:r>
       <w:r>
-        <w:t xml:space="preserve">(Logg et al., 2019), observée chez les profanes et qui s'atténue nettement chez les experts du domaine. Ces phénomènes dessinent une confiance conditionnelle, sensible aux erreurs observées et au niveau d'expertise, configuration directement pertinente pour des professionnels RH expérimentés, susceptibles d'osciller entre déférence et défiance (Tambe et al., 2019).</w:t>
+        <w:t xml:space="preserve">(Logg et al., 2019), observée chez les profanes et s'atténuant nettement chez les experts. Cette confiance conditionnelle, sensible aux erreurs et à l'expertise, concerne directement des professionnels RH expérimentés, susceptibles d'osciller entre déférence et défiance (Tambe et al., 2019).</w:t>
       </w:r>
     </w:p>
     <w:p>
@@ -4898,7 +4882,7 @@
         <w:t xml:space="preserve"> </w:t>
       </w:r>
       <w:r>
-        <w:t xml:space="preserve">constitue de ce point de vue un frein structurel à l'usage professionnel (Tambe et al., 2019) ; Shin (2021) précise le mécanisme, la présence d'explications intelligibles et la possibilité d'en apprécier la qualité causale renforçant la transparence perçue, laquelle nourrit la confiance puis l'acceptation du système. La transparence opère donc comme un antécédent psychologique de la confiance, ce qui justifie d'en faire une variable à part entière.</w:t>
+        <w:t xml:space="preserve">constitue un frein structurel à l'usage professionnel (Tambe et al., 2019) ; Shin (2021) en précise le mécanisme, les explications intelligibles et la possibilité d'en apprécier la qualité causale renforçant la transparence perçue, laquelle nourrit la confiance puis l'acceptation du système. Antécédent psychologique de la confiance, la transparence justifie ainsi son statut de variable à part entière.</w:t>
       </w:r>
     </w:p>
     <w:p>
@@ -4916,7 +4900,7 @@
         <w:t xml:space="preserve"> </w:t>
       </w:r>
       <w:r>
-        <w:t xml:space="preserve">Cette variable recouvre la sensibilité aux risques de biais, de discrimination indirecte et de déshumanisation des décisions. M. K. Lee (2018) montre que, pour des tâches perçues comme « humaines » telles que recruter ou évaluer, une décision algorithmique est jugée moins équitable et suscite des émotions plus négatives qu'une décision identique rendue par un humain : la résistance engage des jugements normatifs sur ce qu'une machine est légitime à décider, non un simple déficit d'information. La revue systématique de Köchling et Wehner (2020) établit par ailleurs que les systèmes peuvent reproduire, voire amplifier, les biais de leurs données d'apprentissage, dont les cas emblématiques du chapitre 1 fournissent l'illustration ; Charlwood et Guenole (2022) théorisent ces tensions comme des paradoxes constitutifs que les professionnels doivent arbitrer en situation.</w:t>
+        <w:t xml:space="preserve">Cette variable recouvre la sensibilité aux biais, à la discrimination indirecte et à la déshumanisation des décisions. M. K. Lee (2018) montre que, pour des tâches perçues comme « humaines » telles que recruter ou évaluer, une décision algorithmique est jugée moins équitable et suscite des émotions plus négatives qu'une décision humaine identique : la résistance engage des jugements normatifs sur ce qu'une machine est légitime à décider, non un simple déficit d'information. La revue systématique de Köchling et Wehner (2020) établit par ailleurs que les systèmes peuvent reproduire, voire amplifier, les biais de leurs données d'apprentissage, qu'illustrent les cas emblématiques du chapitre 1 ; Charlwood et Guenole (2022) théorisent ces tensions comme des paradoxes constitutifs que les professionnels arbitrent en situation.</w:t>
       </w:r>
     </w:p>
     <w:p>
@@ -4947,15 +4931,15 @@
         <w:t xml:space="preserve">function creep</w:t>
       </w:r>
       <w:r>
-        <w:t xml:space="preserve">), la légitimité des dispositifs reposant sur le consentement éclairé des salariés et la gouvernance des données autant que sur la loi : la confidentialité est donc traitée comme un jugement de légitimité formé par le professionnel, non comme une contrainte externe. Le cadre marocain spécifie, à titre descriptif, les conditions concrètes de ce jugement : la loi 09-08, placée sous le contrôle de la CNDP, encadre les traitements de données personnelles, aucun texte spécifique à l'IA n'ayant été adopté à ce jour. Une question empirique en résulte, qui sera posée au terrain : la loi 09-08 est-elle, pour les professionnels de la région, une référence effectivement mobilisée dans leurs arbitrages, ou une norme connue de loin dont l'application concrète reste indéterminée ?</w:t>
-      </w:r>
-    </w:p>
-    <w:p>
-      <w:pPr>
-        <w:pStyle w:val="BodyText"/>
-      </w:pPr>
-      <w:r>
-        <w:t xml:space="preserve">Ces quatre variables sont modélisées comme directement associées à l'intention d'adoption, parallèlement aux variables classiques ; elles constituent le cœur de la proposition P6. L'architecture d'ensemble du modèle s'en trouve clarifiée : AE et AX sont antécédents de FU ; UP, FU, IS et les quatre variables IA-spécifiques sont directement associées à l'intention ; CF porte sur l'usage effectif, dans le respect des positions théoriques de TAM 3 et d'UTAUT, enrichies des dimensions propres à l'IA.</w:t>
+        <w:t xml:space="preserve">), la légitimité des dispositifs reposant sur le consentement éclairé des salariés et la gouvernance des données autant que sur la loi : la confidentialité est donc un jugement de légitimité du professionnel, non une contrainte externe. Le cadre marocain en spécifie, à titre descriptif, les conditions concrètes : la loi 09-08, placée sous le contrôle de la CNDP, encadre les traitements de données personnelles, aucun texte spécifique à l'IA n'ayant été adopté à ce jour. Une question empirique en résulte, qui sera posée au terrain : la loi 09-08 est-elle, pour les professionnels de la région, une référence effectivement mobilisée dans leurs arbitrages, ou une norme connue de loin dont l'application concrète reste indéterminée ?</w:t>
+      </w:r>
+    </w:p>
+    <w:p>
+      <w:pPr>
+        <w:pStyle w:val="BodyText"/>
+      </w:pPr>
+      <w:r>
+        <w:t xml:space="preserve">Ces quatre variables constituent le cœur de la proposition P6, et l'architecture d'ensemble s'en trouve clarifiée : AE et AX sont antécédents de FU ; UP, FU, IS et les variables IA-spécifiques sont directement associées à l'intention, parallèlement aux variables classiques ; CF porte sur l'usage effectif, dans le respect des positions théoriques de TAM 3 et d'UTAUT, enrichies des dimensions propres à l'IA.</w:t>
       </w:r>
     </w:p>
     <w:bookmarkEnd w:id="81"/>
@@ -4977,7 +4961,7 @@
         <w:pStyle w:val="FirstParagraph"/>
       </w:pPr>
       <w:r>
-        <w:t xml:space="preserve">Le modèle intègre enfin plusieurs familles de variables modératrices contextuelles, enracinées dans UTAUT 2 (Venkatesh et al., 2012) et dans la littérature internationale de GRH (Budhwar et al., 2022), qui donnent un poids explicite aux facteurs organisationnels et contextuels marocains, sous-représentés dans la littérature internationale (Dwivedi et al., 2019).</w:t>
+        <w:t xml:space="preserve">Le modèle intègre enfin des variables modératrices contextuelles, issues d'UTAUT 2 (Venkatesh et al., 2012) et de la littérature internationale de GRH (Budhwar et al., 2022), qui donnent un poids explicite aux facteurs organisationnels et contextuels marocains, sous-représentés dans cette littérature (Dwivedi et al., 2019).</w:t>
       </w:r>
     </w:p>
     <w:p>
@@ -5073,7 +5057,7 @@
         <w:pStyle w:val="FirstParagraph"/>
       </w:pPr>
       <w:r>
-        <w:t xml:space="preserve">Le rôle légitimant du management, dont l'importance est soulignée tant par Tambe et al. (2019) que par Budhwar et al. (2022), aurait pu figurer parmi ces modérateurs ; il est délibérément rattaché à l'influence sociale, donc à la proposition P3, pour une raison théorique : ce qui agit sur le professionnel n'est pas l'engagement de la direction en soi, fait organisationnel objectif, mais la perception qu'il en a, ce qui relève exactement de l'influence sociale au sens du TAM 2 et d'UTAUT (Venkatesh &amp; Davis, 2000 ; Venkatesh et al., 2003). La culture organisationnelle et la maturité digitale peuvent toutefois moduler le poids de cette légitimation managériale, hypothèse que la phase empirique pourra éprouver. Conformément à la logique d'UTAUT et d'UTAUT 2, les variables modératrices n'agissent pas directement sur l'intention : elles modulent les liens entre variables explicatives et variables dépendantes, au premier chef le passage de l'intention à l'usage effectif, et constituent le cœur de la proposition P7. Le Tableau 5, qui récapitule l'ensemble des variables du cadre intégrateur, leur définition opérationnelle et leurs ancrages théoriques, figure en Annexe G.</w:t>
+        <w:t xml:space="preserve">Le rôle légitimant du management, souligné par Tambe et al. (2019) comme par Budhwar et al. (2022), aurait pu figurer parmi ces modérateurs ; il est délibérément rattaché à l'influence sociale, donc à la proposition P3 : ce qui agit sur le professionnel n'est pas l'engagement de la direction en soi, fait organisationnel objectif, mais la perception qu'il en a, qui relève exactement de l'influence sociale au sens du TAM 2 et d'UTAUT (Venkatesh &amp; Davis, 2000 ; Venkatesh et al., 2003). La culture organisationnelle et la maturité digitale peuvent toutefois moduler le poids de cette légitimation, hypothèse que la phase empirique pourra éprouver. Conformément à la logique d'UTAUT et d'UTAUT 2, les modératrices n'agissent pas directement sur l'intention : elles modulent les liens entre variables explicatives et dépendantes, au premier chef le passage de l'intention à l'usage effectif, et constituent le cœur de la proposition P7. Le Tableau 5, en Annexe G, récapitule les variables du cadre intégrateur, leur définition opérationnelle et leurs ancrages théoriques.</w:t>
       </w:r>
     </w:p>
     <w:p>
@@ -5091,7 +5075,7 @@
         <w:t xml:space="preserve"> </w:t>
       </w:r>
       <w:r>
-        <w:t xml:space="preserve">Le cadre intégrateur ne procède pas d'une addition de variables mais d'une réponse argumentée aux controverses laissées ouvertes par les deux chapitres. Aux quatre déterminants classiques, conservés parce que les acquis établis en section 1.5 leur donnent raison, s'ajoutent deux antécédents psychologiques hérités de TAM 3 et quatre variables propres à l'IA. Ces dernières répondent point par point à la controverse sur les réactions au jugement algorithmique, en traitant la confiance comme une variable conditionnelle plutôt que comme une disposition stable (Dietvorst et al., 2015 ; Glikson &amp; Woolley, 2020 ; Logg et al., 2019), et à la critique de la mise à l'écart de l'artefact, en réintroduisant l'opacité et ses effets sous les espèces de la transparence perçue (Shin, 2021), de l'équité perçue (Köchling &amp; Wehner, 2020 ; M. K. Lee, 2018) et de la légitimité du traitement des données (Tursunbayeva et al., 2022) : elles constituent le contenu de la proposition P6, apport conceptuel principal du mémoire. Les variables modératrices contextuelles tirent les conséquences de la lacune contextuelle établie au chapitre 1 : parce que le contenu même de l'influence sociale, des conditions facilitantes et du cadre légal varie selon les configurations institutionnelles (Budhwar et al., 2022 ; Dwivedi et al., 2019), elles fondent la proposition P7. Reste à assembler ces variables en une architecture de lecture explicite, objet de la section suivante.</w:t>
+        <w:t xml:space="preserve">Le cadre intégrateur ne procède pas d'une addition de variables mais d'une réponse aux controverses laissées ouvertes par les deux chapitres. Aux quatre déterminants classiques, conservés parce que les acquis de la section 1.5 leur donnent raison, s'ajoutent deux antécédents hérités de TAM 3 et quatre variables propres à l'IA. Ces dernières répondent à la controverse sur les réactions au jugement algorithmique, en traitant la confiance comme conditionnelle et non comme une disposition stable (Dietvorst et al., 2015 ; Glikson &amp; Woolley, 2020 ; Logg et al., 2019), et à la critique de la mise à l'écart de l'artefact, en réintroduisant l'opacité et ses effets à travers la transparence perçue (Shin, 2021), l'équité perçue (Köchling &amp; Wehner, 2020 ; M. K. Lee, 2018) et la légitimité du traitement des données (Tursunbayeva et al., 2022) : elles forment la proposition P6, apport conceptuel principal du mémoire. Les modératrices contextuelles tirent les conséquences de la lacune établie au chapitre 1 : parce que le contenu même de l'influence sociale, des conditions facilitantes et du cadre légal varie selon les configurations institutionnelles (Budhwar et al., 2022 ; Dwivedi et al., 2019), elles fondent la proposition P7. Reste à assembler ces variables en une architecture de lecture explicite, objet de la section suivante.</w:t>
       </w:r>
     </w:p>
     <w:bookmarkEnd w:id="82"/>
@@ -5114,7 +5098,7 @@
         <w:pStyle w:val="FirstParagraph"/>
       </w:pPr>
       <w:r>
-        <w:t xml:space="preserve">Les variables retenues peuvent désormais être assemblées en un modèle conceptuel</w:t>
+        <w:t xml:space="preserve">Les variables retenues s'assemblent en un modèle conceptuel</w:t>
       </w:r>
       <w:r>
         <w:t xml:space="preserve"> </w:t>
@@ -5127,7 +5111,7 @@
         <w:t xml:space="preserve">a priori</w:t>
       </w:r>
       <w:r>
-        <w:t xml:space="preserve">, décrit comme une architecture de lecture en cinq blocs (2.5.1) et articulé aux sept propositions de recherche (2.5.2). Le statut particulier de la proposition P7, qui érige le contexte marocain en axe de contribution, est explicité en dernier lieu (2.5.3).</w:t>
+        <w:t xml:space="preserve">, présenté comme une architecture de lecture en cinq blocs (2.5.1) et articulé aux sept propositions de recherche (2.5.2). Le statut de P7, qui érige le contexte marocain en axe de contribution, est explicité en dernier lieu (2.5.3).</w:t>
       </w:r>
     </w:p>
     <w:bookmarkStart w:id="87" w:name="X72b7b2d6e43a9e52f991059ef0f5e7213e735b7"/>
@@ -5158,7 +5142,7 @@
         <w:t xml:space="preserve"> </w:t>
       </w:r>
       <w:r>
-        <w:t xml:space="preserve">Trois variables exercent un effet direct sur l'intention d'adoption : l'utilité perçue, enrichie de la valeur ajoutée par rapport au travail humain ; la facilité d'usage perçue, dont le lien classique vers l'utilité perçue est conservé, un outil aisé à utiliser étant plus volontiers perçu comme utile ; l'influence sociale, intégrant la légitimation managériale. Toutes trois sont associées positivement à l'intention. La quatrième, les conditions facilitantes, occupe la position que lui assigne UTAUT : elle porte sur l'usage effectif et non sur l'intention, conformément à la discussion de la section 2.4.2.</w:t>
+        <w:t xml:space="preserve">Trois variables agissent directement sur l'intention d'adoption : l'utilité perçue, enrichie de la valeur ajoutée par rapport au travail humain ; la facilité d'usage perçue, dont le lien classique vers l'utilité perçue est conservé, un outil aisé étant plus volontiers jugé utile ; l'influence sociale, intégrant la légitimation managériale. Toutes trois sont positivement associées à l'intention. La quatrième, les conditions facilitantes, occupe la position que lui assigne UTAUT et porte sur l'usage effectif et non sur l'intention, conformément à la section 2.4.2.</w:t>
       </w:r>
     </w:p>
     <w:p>
@@ -5176,7 +5160,7 @@
         <w:t xml:space="preserve"> </w:t>
       </w:r>
       <w:r>
-        <w:t xml:space="preserve">Conformément à Venkatesh et Bala (2008), l'auto-efficacité numérique et l'anxiété ne sont pas directement reliées à l'intention : AE est associée positivement à la facilité d'usage perçue, AX négativement, leur relation à l'intention étant médiatisée par FU.</w:t>
+        <w:t xml:space="preserve">Suivant Venkatesh et Bala (2008), l'auto-efficacité numérique et l'anxiété ne touchent pas directement l'intention : AE est associée positivement à la facilité d'usage perçue, AX négativement, leur effet étant médiatisé par FU.</w:t>
       </w:r>
     </w:p>
     <w:p>
@@ -5194,7 +5178,7 @@
         <w:t xml:space="preserve"> </w:t>
       </w:r>
       <w:r>
-        <w:t xml:space="preserve">Quatre variables propres à l'IA sont directement associées à l'intention : la confiance envers les outils, la transparence et l'explicabilité perçues, la perception des risques éthiques et de l'équité des décisions, les préoccupations de confidentialité des données RH. Elles traduisent les spécificités de l'objet (opacité, dimension probabiliste, sensibilité éthique) et s'enracinent dans la littérature présentée en 2.4.3 (Dietvorst et al., 2015 ; Glikson &amp; Woolley, 2020 ; Köchling &amp; Wehner, 2020 ; M. K. Lee, 2018 ; Logg et al., 2019 ; Mayer et al., 1995 ; Shin, 2021 ; Tursunbayeva et al., 2022), relayée par les travaux consacrés à l'IA en RH (Budhwar et al., 2022 ; Charlwood &amp; Guenole, 2022 ; Tambe et al., 2019). Ce bloc constitue l'apport conceptuel principal du modèle.</w:t>
+        <w:t xml:space="preserve">Quatre variables propres à l'IA sont directement associées à l'intention : la confiance envers les outils, la transparence et l'explicabilité perçues, la perception des risques éthiques et de l'équité des décisions, les préoccupations de confidentialité des données RH. Elles traduisent les spécificités de l'objet (opacité, dimension probabiliste, sensibilité éthique) et s'ancrent dans la littérature de la section 2.4.3 (Dietvorst et al., 2015 ; Glikson &amp; Woolley, 2020 ; Köchling &amp; Wehner, 2020 ; M. K. Lee, 2018 ; Logg et al., 2019 ; Mayer et al., 1995 ; Shin, 2021 ; Tursunbayeva et al., 2022), relayée par les travaux sur l'IA en RH (Budhwar et al., 2022 ; Charlwood &amp; Guenole, 2022 ; Tambe et al., 2019). Ce bloc porte l'apport conceptuel principal du modèle.</w:t>
       </w:r>
     </w:p>
     <w:p>
@@ -5225,7 +5209,7 @@
         <w:t xml:space="preserve">Maroc Digital 2030</w:t>
       </w:r>
       <w:r>
-        <w:t xml:space="preserve">) sont traités comme des conditions contextuelles susceptibles de moduler les relations attendues du modèle, au premier chef celle qui relie l'intention à l'usage effectif ; dans le dispositif qualitatif retenu, ces conditions sont explorées par comparaison entre sous-groupes de répondants, et non testées statistiquement. Ces modérateurs peuvent également infléchir le poids des déterminants du bloc 1, notamment celui de la légitimation managériale.</w:t>
+        <w:t xml:space="preserve">) sont traités comme des conditions susceptibles de moduler les relations du modèle, au premier chef celle qui relie l'intention à l'usage effectif ; dans le dispositif qualitatif, elles sont explorées par comparaison entre sous-groupes de répondants, et non testées statistiquement. Ces modérateurs peuvent aussi infléchir le poids des déterminants du bloc 1, notamment celui de la légitimation managériale.</w:t>
       </w:r>
     </w:p>
     <w:p>
@@ -5243,15 +5227,15 @@
         <w:t xml:space="preserve"> </w:t>
       </w:r>
       <w:r>
-        <w:t xml:space="preserve">Le modèle distingue l'intention d'adoption, associée aux déterminants directs des blocs 1 et 3 après médiation des antécédents du bloc 2, et l'usage effectif, qui dépend de la conversion de cette intention en pratique routinière sous l'effet des conditions facilitantes et des modérateurs du bloc 4. Cette distinction, bien documentée par Parry et Tyson (2011), sépare les facteurs déclencheurs d'une intention favorable des conditions de sa traduction en pratique.</w:t>
-      </w:r>
-    </w:p>
-    <w:p>
-      <w:pPr>
-        <w:pStyle w:val="BodyText"/>
-      </w:pPr>
-      <w:r>
-        <w:t xml:space="preserve">La Figure 5 représente cette architecture selon trois conventions de lecture : l'aplat de chaque variable signale sa provenance théorique, noyau du TAM, apports d'UTAUT, antécédents de TAM 3, facteurs tirés de la littérature sur l'IA et variables contextuelles marocaines ; les regroupements en pointillés délimitent les familles de déterminants, les bandeaux P6 et P7 étant les deux ensembles que les modèles d'origine ne comportent pas ; chaque flèche pleine porte le numéro de la proposition qu'elle formalise, les flèches en pointillés figurant les effets modérateurs, qui portent sur des relations et non sur des variables. Dans le cadre qualitatif retenu, ces flèches se lisent comme des relations attendues dans le discours des répondants, appelées à être soutenues, nuancées ou non soutenues par le matériau, et non comme des liens causaux mesurés. Deux traits traduisent des choix théoriques discutés plus haut : l'auto-efficacité et l'anxiété n'atteignent l'intention que par l'intermédiaire de la facilité d'usage perçue (Venkatesh &amp; Bala, 2008) ; les conditions facilitantes rejoignent l'usage effectif plutôt que l'intention, conformément à UTAUT et à l'enseignement e-HRM (Parry &amp; Tyson, 2011).</w:t>
+        <w:t xml:space="preserve">Le modèle distingue l'intention d'adoption, associée aux déterminants directs des blocs 1 et 3 après médiation du bloc 2, et l'usage effectif, qui dépend de sa conversion en pratique routinière sous l'effet des conditions facilitantes et des modérateurs du bloc 4. Cette distinction, documentée par Parry et Tyson (2011), sépare les déclencheurs d'une intention favorable des conditions de sa traduction en pratique.</w:t>
+      </w:r>
+    </w:p>
+    <w:p>
+      <w:pPr>
+        <w:pStyle w:val="BodyText"/>
+      </w:pPr>
+      <w:r>
+        <w:t xml:space="preserve">La Figure 5 représente cette architecture selon trois conventions : l'aplat de chaque variable signale sa provenance théorique, noyau du TAM, apports d'UTAUT, antécédents de TAM 3, facteurs issus de la littérature sur l'IA et variables contextuelles marocaines ; les regroupements en pointillés délimitent les familles de déterminants, les bandeaux P6 et P7 étant absents des modèles d'origine ; chaque flèche pleine porte le numéro de la proposition qu'elle formalise, les flèches en pointillés figurant les effets modérateurs, portant sur des relations et non sur des variables. Dans ce cadre qualitatif, ces flèches se lisent comme des relations attendues dans le discours des répondants, appelées à être soutenues, nuancées ou non soutenues par le matériau, et non comme des liens causaux mesurés. Deux traits traduisent des choix discutés plus haut : l'auto-efficacité et l'anxiété n'atteignent l'intention que par la facilité d'usage perçue (Venkatesh &amp; Bala, 2008) ; les conditions facilitantes rejoignent l'usage effectif plutôt que l'intention, conformément à UTAUT et à l'enseignement e-HRM (Parry &amp; Tyson, 2011).</w:t>
       </w:r>
     </w:p>
     <w:p>
@@ -5358,7 +5342,7 @@
         <w:pStyle w:val="FirstParagraph"/>
       </w:pPr>
       <w:r>
-        <w:t xml:space="preserve">Le Tableau 6 articule les sept propositions de recherche aux variables du modèle. Sa structure traduit une exigence formulée tout au long de la revue : une proposition ne se déduit pas d'une littérature, elle se justifie par l'écart entre ce que cette littérature établit et ce qu'elle laisse indéterminé ; les deux dernières colonnes explicitent donc, pour chaque proposition, l'acquis sur lequel elle s'appuie et la zone d'ombre qu'elle met à l'épreuve. Les ancrages théoriques détaillés de chaque variable figurent au Tableau 5 (Annexe G) ; la correspondance entre propositions, thèmes du guide d'entretien et familles de codes est détaillée en section 4.2 et en Annexe A.</w:t>
+        <w:t xml:space="preserve">Le Tableau 6 articule les sept propositions aux variables du modèle. Sa structure traduit une exigence posée tout au long de la revue : une proposition ne se déduit pas d'une littérature, elle se justifie par l'écart entre ce que celle-ci établit et ce qu'elle laisse indéterminé ; les deux dernières colonnes explicitent donc, pour chaque proposition, l'acquis mobilisé et la zone d'ombre mise à l'épreuve. Les ancrages théoriques de chaque variable figurent au Tableau 5 (Annexe G) ; la correspondance entre propositions, thèmes du guide d'entretien et familles de codes est détaillée en section 4.2 et en Annexe A.</w:t>
       </w:r>
     </w:p>
     <w:p>
@@ -5934,7 +5918,7 @@
         <w:pStyle w:val="BodyText"/>
       </w:pPr>
       <w:r>
-        <w:t xml:space="preserve">Cette articulation garantit la traçabilité entre théorie, propositions et future analyse empirique. Chaque proposition sera confrontée au discours des répondants et pourra être soutenue, nuancée, non soutenue ou reformulée dans les limites du corpus, au terme de la phase empirique ; la dernière colonne du tableau énonce par avance ce que le terrain doit permettre de trancher, ce qui interdit de tenir pour un résultat la simple confirmation d'un acquis déjà établi ailleurs. La proposition P6 a par ailleurs le statut d'une proposition-cadre : ses quatre volets sont analysés séparément sous les intitulés P6a pour la confiance, P6b pour la transparence et l'explicabilité, P6c pour les risques éthiques et l'équité et P6d pour la confidentialité des données RH, la synthèse d'ensemble revenant à P6.</w:t>
+        <w:t xml:space="preserve">Cette articulation garantit la traçabilité entre théorie, propositions et analyse empirique. Chaque proposition sera confrontée au discours des répondants et pourra être soutenue, nuancée, non soutenue ou reformulée dans les limites du corpus, au terme de la phase empirique ; la dernière colonne énonce par avance ce que le terrain doit trancher, interdisant de tenir pour un résultat la simple confirmation d'un acquis établi ailleurs. P6 a par ailleurs statut de proposition-cadre : ses quatre volets sont analysés séparément, P6a pour la confiance, P6b pour la transparence et l'explicabilité, P6c pour les risques éthiques et l'équité, P6d pour la confidentialité des données RH, la synthèse d'ensemble revenant à P6.</w:t>
       </w:r>
     </w:p>
     <w:bookmarkEnd w:id="88"/>
@@ -5956,7 +5940,7 @@
         <w:pStyle w:val="FirstParagraph"/>
       </w:pPr>
       <w:r>
-        <w:t xml:space="preserve">Le statut de la proposition P7 mérite d'être souligné : les facteurs contextuels marocains n'y sont pas traités comme de simples variables de contrôle destinées à neutraliser des effets parasites, ils constituent un axe central de contribution potentielle de la recherche. Les modèles de la famille TAM/UTAUT ont été élaborés et validés, pour l'essentiel, dans des contextes occidentaux ; leur transférabilité à un terrain comme la région Souss-Massa ne va pas de soi (Budhwar et al., 2022 ; Dwivedi et al., 2019). Le terrain marocain peut faire émerger des facteurs absents des modèles : rapport spécifique à la légitimation managériale et à l'autorité hiérarchique, cultures d'entreprises familiales ou de filiales internationales, maturité digitale hétérogène, effets du cadre institutionnel (loi 09-08,</w:t>
+        <w:t xml:space="preserve">Le statut de P7 doit être souligné : les facteurs contextuels marocains n'y sont pas de simples variables de contrôle neutralisant des effets parasites, ils constituent un axe central de contribution. Les modèles TAM/UTAUT ont été élaborés et validés pour l'essentiel dans des contextes occidentaux ; leur transférabilité à la région Souss-Massa ne va pas de soi (Budhwar et al., 2022 ; Dwivedi et al., 2019). Le terrain marocain peut faire émerger des facteurs absents des modèles : rapport spécifique à la légitimation managériale et à l'autorité hiérarchique, cultures d'entreprises familiales ou de filiales internationales, maturité digitale hétérogène, effets du cadre institutionnel (loi 09-08,</w:t>
       </w:r>
       <w:r>
         <w:t xml:space="preserve"> </w:t>
@@ -5969,7 +5953,7 @@
         <w:t xml:space="preserve">Maroc Digital 2030</w:t>
       </w:r>
       <w:r>
-        <w:t xml:space="preserve">). Le dispositif qualitatif est précisément conçu pour capter ces dimensions émergentes : P7 fonctionne comme une porte ouverte du modèle, par laquelle le contexte peut enrichir la théorie, et non comme une clause de contextualisation cosmétique.</w:t>
+        <w:t xml:space="preserve">). Le dispositif qualitatif est conçu pour capter ces dimensions émergentes : P7 fonctionne comme une porte ouverte du modèle, par laquelle le contexte enrichit la théorie, et non comme une clause de contextualisation cosmétique.</w:t>
       </w:r>
     </w:p>
     <w:p>
@@ -5987,7 +5971,7 @@
         <w:t xml:space="preserve"> </w:t>
       </w:r>
       <w:r>
-        <w:t xml:space="preserve">Ce chapitre a retracé la généalogie critique du Technology Acceptance Model, de ses fondations psychosociales à son aboutissement dans UTAUT 2, puis confronté le cadre à ses critiques, stagnation paradigmatique, inadéquation aux technologies probabilistes et conversationnelles, cadres concurrents, ce qui a conduit à une mobilisation explicitée : lisible, comparable et testable, mais complétée d'une posture qualitative ouverte à l'émergence de variables non anticipées. Sur cette base, un modèle conceptuel</w:t>
+        <w:t xml:space="preserve">Ce chapitre a retracé la généalogie critique du Technology Acceptance Model, de ses fondations psychosociales à UTAUT 2, puis confronté le cadre à ses critiques, stagnation paradigmatique, inadéquation aux technologies probabilistes et conversationnelles, cadres concurrents, d'où une mobilisation explicitée : lisible, comparable et testable, mais complétée d'une posture qualitative ouverte aux variables non anticipées. Sur cette base a été construit un modèle conceptuel</w:t>
       </w:r>
       <w:r>
         <w:t xml:space="preserve"> </w:t>
@@ -6003,7 +5987,7 @@
         <w:t xml:space="preserve"> </w:t>
       </w:r>
       <w:r>
-        <w:t xml:space="preserve">en cinq blocs a été construit : trois variables classiques directement associées à l'intention (UP, FU, IS) et les conditions facilitantes portant sur l'usage effectif ; deux antécédents psychologiques médiatisés par la facilité d'usage perçue (AE et AX, cette dernière restreinte à l'anxiété de prise en main, la crainte du remplacement et la peur de la perte de valeur ajoutée humaine relevant de la proposition P5) ; quatre variables IA-spécifiques ancrées dans la littérature sur la confiance, le jugement algorithmique, l'explicabilité, l'équité perçue et l'éthique des données (proposition P6) ; des modérateurs contextuels marocains érigés en axe de contribution (proposition P7) ; une double variable dépendante distinguant l'intention d'adoption de l'usage effectif. Trois choix de modélisation résument la contribution, chacun répondant à une controverse identifiée plutôt qu'à une convention de présentation : conserver le noyau TAM/UTAUT se justifie par les acquis solides établis en section 1.5 ; y adjoindre quatre variables propres à l'IA répond dans leurs propres termes à Benbasat et Barki (2007), qui reprochaient au modèle d'avoir évacué les propriétés de l'artefact ; conférer aux facteurs contextuels marocains un statut explicatif tire les conséquences du constat de Dwivedi et al. (2019) sur les conditions particulières de validation du modèle. Le modèle fournit ainsi la grille analytique qui guidera la construction du guide d'entretien et l'analyse thématique, et son articulation explicite aux sept propositions garantit la traçabilité de l'ensemble du dispositif de recherche.</w:t>
+        <w:t xml:space="preserve">en cinq blocs : trois variables classiques associées à l'intention (UP, FU, IS) et les conditions facilitantes portant sur l'usage effectif ; deux antécédents psychologiques médiatisés par la facilité d'usage perçue (AE et AX, cette dernière restreinte à l'anxiété de prise en main, la crainte du remplacement et la peur de la perte de valeur ajoutée humaine relevant de P5) ; quatre variables IA-spécifiques ancrées dans la littérature sur la confiance, le jugement algorithmique, l'explicabilité, l'équité perçue et l'éthique des données (P6) ; des modérateurs contextuels marocains érigés en axe de contribution (P7) ; une double variable dépendante distinguant l'intention d'adoption de l'usage effectif. Trois choix de modélisation résument la contribution, chacun répondant à une controverse plutôt qu'à une convention : conserver le noyau TAM/UTAUT se justifie par les acquis établis en section 1.5 ; y adjoindre quatre variables propres à l'IA répond en leurs termes à Benbasat et Barki (2007), qui reprochaient au modèle d'évacuer les propriétés de l'artefact ; conférer aux facteurs contextuels marocains un statut explicatif tire les conséquences du constat de Dwivedi et al. (2019) sur les conditions de validation du modèle. Le modèle fournit ainsi la grille analytique du guide d'entretien et de l'analyse thématique, et son articulation aux sept propositions garantit la traçabilité du dispositif de recherche.</w:t>
       </w:r>
     </w:p>
     <w:bookmarkEnd w:id="89"/>
@@ -6027,7 +6011,7 @@
         <w:pStyle w:val="FirstParagraph"/>
       </w:pPr>
       <w:r>
-        <w:t xml:space="preserve">La Partie I a construit le socle théorique et empirique de l'étude, en réponse à une problématique resserrée sur la spécificité de l'IA : confiance, transparence algorithmique, risques éthiques, confidentialité des données et crainte du remplacement. Le chapitre 1 a défini l'objet d'étude, dégagé quatre acquis solides, cinq controverses non tranchées et trois lacunes qui se composent en un verrou unique : une population peu étudiée, à la fois prescriptrice, utilisatrice et potentiellement menacée ; un contexte dont on ignore s'il préserve les mécanismes établis ailleurs ; des instruments dominants incapables, par construction, de révéler ce qui n'a pas été anticipé. Le chapitre 2 a retracé la généalogie du TAM et de ses extensions, discuté ses critiques les plus radicales, puis construit le modèle conceptuel</w:t>
+        <w:t xml:space="preserve">La Partie I a construit le socle théorique et empirique de l'étude, en réponse à une problématique resserrée sur la spécificité de l'IA : confiance, transparence algorithmique, risques éthiques, confidentialité des données et crainte du remplacement. Le chapitre 1 a défini l'objet d'étude et dégagé quatre acquis solides, cinq controverses non tranchées et trois lacunes composant un verrou unique : une population peu étudiée, à la fois prescriptrice, utilisatrice et potentiellement menacée ; un contexte dont on ignore s'il préserve les mécanismes établis ailleurs ; des instruments dominants incapables, par construction, de révéler ce qui n'a pas été anticipé. Le chapitre 2 a retracé la généalogie du TAM et de ses extensions, discuté ses critiques radicales et construit le modèle conceptuel</w:t>
       </w:r>
       <w:r>
         <w:t xml:space="preserve"> </w:t>
@@ -6043,7 +6027,7 @@
         <w:t xml:space="preserve"> </w:t>
       </w:r>
       <w:r>
-        <w:t xml:space="preserve">articulé aux sept propositions, dont P6, dédiée aux facteurs spécifiques à l'IA, et P7, qui érige les facteurs contextuels marocains en axe de contribution. La Partie II explicite la démarche qui permettra d'opérationnaliser ce modèle : positionnement épistémologique post-positiviste, justification d'une approche qualitative à logique déductive, stratégie de collecte par entretiens semi-directifs auprès des professionnels RH de la région Souss-Massa et méthode d'analyse thématique retenue pour le traitement des données.</w:t>
+        <w:t xml:space="preserve">articulé aux sept propositions, dont P6, dédiée aux facteurs spécifiques à l'IA, et P7, qui érige le contexte marocain en axe de contribution. La Partie II explicite l'opérationnalisation de ce modèle : positionnement épistémologique post-positiviste, approche qualitative à logique déductive, collecte par entretiens semi-directifs auprès des professionnels RH de la région Souss-Massa et analyse thématique des données.</w:t>
       </w:r>
     </w:p>
     <w:bookmarkEnd w:id="92"/>
@@ -6120,7 +6104,7 @@
         <w:pStyle w:val="FirstParagraph"/>
       </w:pPr>
       <w:r>
-        <w:t xml:space="preserve">Toute recherche repose sur des présupposés épistémologiques qui orientent la définition de l'objet, le choix des méthodes et l'interprétation des résultats (Paillé &amp; Mucchielli, 2016 ; Thiétart, 2014). Le présent chapitre explicite la posture adoptée, le post-positivisme au sens de Guba et Lincoln (1994), et en démontre la cohérence avec une démarche qualitative déductive structurée par le cadre TAM/UTAUT. Cinq sections déroulent les choix qui en découlent : les grands paradigmes en sciences de gestion (3.1), la justification du post-positivisme (3.2), le choix d'une approche qualitative (3.3), la stratégie d'étude à visée explicative (3.4) et le terrain de la région Souss-Massa (3.5). Conformément aux recommandations de Miles et al. (2014), ces décisions sont pensées comme un ensemble intégré, non comme une suite de choix indépendants.</w:t>
+        <w:t xml:space="preserve">Toute recherche repose sur des présupposés épistémologiques qui orientent la définition de l'objet, le choix des méthodes et l'interprétation des résultats (Paillé &amp; Mucchielli, 2016 ; Thiétart, 2014). Ce chapitre explicite la posture retenue, le post-positivisme au sens de Guba et Lincoln (1994), et sa cohérence avec une démarche qualitative déductive structurée par le cadre TAM/UTAUT. Cinq sections en déroulent les choix : les grands paradigmes en sciences de gestion (3.1), la justification du post-positivisme (3.2), l'approche qualitative (3.3), la stratégie à visée explicative (3.4) et le terrain de la région Souss-Massa (3.5). Conformément à Miles et al. (2014), ces décisions forment un ensemble intégré et non une suite de choix indépendants.</w:t>
       </w:r>
     </w:p>
     <w:bookmarkStart w:id="96" w:name="Xba23fd5329e6f09212bca58821f6f55eae5a57c"/>
@@ -6154,7 +6138,7 @@
         <w:pStyle w:val="FirstParagraph"/>
       </w:pPr>
       <w:r>
-        <w:t xml:space="preserve">Les sciences de gestion mobilisent classiquement trois grands paradigmes, qui se distinguent par leurs présupposés ontologiques, épistémologiques et méthodologiques. Le</w:t>
+        <w:t xml:space="preserve">Les sciences de gestion mobilisent trois grands paradigmes, distingués par leurs présupposés ontologiques, épistémologiques et méthodologiques. Le</w:t>
       </w:r>
       <w:r>
         <w:t xml:space="preserve"> </w:t>
@@ -6167,7 +6151,7 @@
         <w:t xml:space="preserve">paradigme positiviste</w:t>
       </w:r>
       <w:r>
-        <w:t xml:space="preserve">, hérité de Comte et adapté aux sciences sociales par Durkheim, postule une réalité objective, indépendante du chercheur, dont il vise à identifier des régularités et des lois explicatives par une démarche hypothético-déductive fondée sur des hypothèses falsifiables (Popper, 1959) ; il structure la majorité des travaux quantitatifs de la lignée TAM/UTAUT (Davis, 1989 ; Venkatesh et al., 2003). Le</w:t>
+        <w:t xml:space="preserve">, hérité de Comte et adapté aux sciences sociales par Durkheim, postule une réalité objective, indépendante du chercheur, dont il cherche régularités et lois explicatives par une démarche hypothético-déductive à hypothèses falsifiables (Popper, 1959) ; il structure l'essentiel des travaux quantitatifs de la lignée TAM/UTAUT (Davis, 1989 ; Venkatesh et al., 2003). Le</w:t>
       </w:r>
       <w:r>
         <w:t xml:space="preserve"> </w:t>
@@ -6180,7 +6164,7 @@
         <w:t xml:space="preserve">paradigme interprétativiste</w:t>
       </w:r>
       <w:r>
-        <w:t xml:space="preserve">, inspiré de la sociologie compréhensive de Weber et de la phénoménologie de Schütz, considère la réalité sociale comme un tissu de significations subjectives : le projet de connaissance consiste à comprendre le sens que les acteurs donnent à leur action, par une méthode qualitative où le chercheur participe à la construction du sens. Le</w:t>
+        <w:t xml:space="preserve">, inspiré de la sociologie compréhensive de Weber et de la phénoménologie de Schütz, tient la réalité sociale pour un tissu de significations subjectives : il s'agit de comprendre le sens que les acteurs donnent à leur action, par une méthode qualitative où le chercheur participe à sa construction. Le</w:t>
       </w:r>
       <w:r>
         <w:t xml:space="preserve"> </w:t>
@@ -6193,7 +6177,7 @@
         <w:t xml:space="preserve">paradigme constructiviste</w:t>
       </w:r>
       <w:r>
-        <w:t xml:space="preserve">, issu de Piaget puis de Le Moigne (1995), tient la réalité pour construite dans l'interaction entre le sujet connaissant et l'objet : la connaissance produite est située, contextuelle et finalisée par un projet d'action, ce qui inspire nombre de recherches-action en gestion.</w:t>
+        <w:t xml:space="preserve">, issu de Piaget puis de Le Moigne (1995), tient la réalité pour construite dans l'interaction du sujet connaissant et de l'objet : la connaissance y est située, contextuelle et finalisée par un projet d'action, d'où nombre de recherches-action en gestion.</w:t>
       </w:r>
     </w:p>
     <w:bookmarkEnd w:id="94"/>
@@ -6228,7 +6212,7 @@
         <w:t xml:space="preserve">post-positivisme</w:t>
       </w:r>
       <w:r>
-        <w:t xml:space="preserve">, formalisé par Popper (1959) puis Guba et Lincoln (1994), constitue une posture intermédiaire qui assouplit les présupposés du positivisme strict tout en conservant ses exigences fondamentales. L'expression « positivisme tempéré », parfois rencontrée dans les travaux francophones, n'est pas retenue : faute de canonisation dans la littérature de référence, elle offre moins de précision conceptuelle que le terme de post-positivisme. Quatre principes caractérisent cette posture : un réalisme ontologique critique, qui admet une réalité indépendante de l'observateur mais connaissable de manière imparfaite et probabiliste, position qui rejoint le réalisme critique de Bhaskar (1975) ; une objectivité conçue comme idéal régulateur, le chercheur faillible mobilisant triangulation, double codage et réflexivité pour limiter les biais (Lincoln &amp; Guba, 1985) ; une démarche déductive privilégiée, partant d'un cadre éprouvé pour formuler des propositions falsifiables sans exclure l'émergence ; l'admission de méthodes qualitatives pour accéder à des phénomènes complexes et contextuels, à condition d'en garantir la rigueur (Miles et al., 2014). Largement répandue dans les recherches qualitatives en gestion (Creswell &amp; Poth, 2018), cette posture est particulièrement adaptée lorsqu'un cadre théorique solidement étayé doit être éprouvé dans un contexte nouveau, configuration qui est précisément celle de la présente recherche.</w:t>
+        <w:t xml:space="preserve">, formalisé par Popper (1959) puis Guba et Lincoln (1994), assouplit les présupposés du positivisme strict tout en conservant ses exigences fondamentales. L'expression « positivisme tempéré », parfois rencontrée dans les travaux francophones, n'est pas retenue : non canonisée dans la littérature de référence, elle est conceptuellement moins précise que le post-positivisme. Quatre principes la caractérisent : un réalisme ontologique critique, qui admet une réalité indépendante de l'observateur mais connaissable de façon imparfaite et probabiliste, proche du réalisme critique de Bhaskar (1975) ; une objectivité conçue comme idéal régulateur, le chercheur faillible mobilisant triangulation, double codage et réflexivité pour limiter les biais (Lincoln &amp; Guba, 1985) ; une démarche déductive, partant d'un cadre éprouvé pour formuler des propositions falsifiables sans exclure l'émergence ; l'admission de méthodes qualitatives pour accéder à des phénomènes complexes et contextuels, sous condition de rigueur (Miles et al., 2014). Répandue dans les recherches qualitatives en gestion (Creswell &amp; Poth, 2018), cette posture convient particulièrement lorsqu'un cadre solidement étayé doit être éprouvé dans un contexte nouveau, soit la configuration de cette recherche.</w:t>
       </w:r>
     </w:p>
     <w:bookmarkEnd w:id="95"/>
@@ -6264,7 +6248,7 @@
         <w:pStyle w:val="FirstParagraph"/>
       </w:pPr>
       <w:r>
-        <w:t xml:space="preserve">La recherche s'inscrit dans une démarche résolument déductive, structurée par le TAM (Davis, 1989), le TAM 3 (Venkatesh &amp; Bala, 2008) et l'UTAUT (Venkatesh et al., 2003), enrichis des travaux récents sur l'IA en RH (Budhwar et al., 2022 ; Charlwood &amp; Guenole, 2022 ; Tambe et al., 2019) : les sept propositions formulées en Partie I constituent autant d'énoncés falsifiables à confronter au terrain, la connaissance préexistante servant de grille structurante pour observer et interpréter le réel. La cohérence entre posture et démarche s'observe à trois niveaux. Au plan</w:t>
+        <w:t xml:space="preserve">La recherche adopte une démarche résolument déductive, structurée par le TAM (Davis, 1989), le TAM 3 (Venkatesh &amp; Bala, 2008) et l'UTAUT (Venkatesh et al., 2003), enrichis des travaux récents sur l'IA en RH (Budhwar et al., 2022 ; Charlwood &amp; Guenole, 2022 ; Tambe et al., 2019) : les sept propositions de la Partie I sont autant d'énoncés falsifiables à confronter au terrain, la connaissance préexistante servant de grille d'observation et d'interprétation du réel. La cohérence entre posture et démarche s'observe à trois niveaux. Au plan</w:t>
       </w:r>
       <w:r>
         <w:t xml:space="preserve"> </w:t>
@@ -6277,7 +6261,7 @@
         <w:t xml:space="preserve">ontologique</w:t>
       </w:r>
       <w:r>
-        <w:t xml:space="preserve">, les facteurs d'adoption identifiés par le cadre sont considérés comme des réalités opératoires que les répondants peuvent verbaliser, leur saisie demeurant imparfaite et médiée par le langage. Au plan</w:t>
+        <w:t xml:space="preserve">, les facteurs d'adoption du cadre sont tenus pour des réalités opératoires que les répondants peuvent verbaliser, leur saisie restant imparfaite et médiée par le langage. Au plan</w:t>
       </w:r>
       <w:r>
         <w:t xml:space="preserve"> </w:t>
@@ -6303,7 +6287,7 @@
         <w:t xml:space="preserve">méthodologique</w:t>
       </w:r>
       <w:r>
-        <w:t xml:space="preserve">, le codage des entretiens est principalement déductif tout en autorisant l'émergence de codes complémentaires, démarche que Miles et al. (2014) qualifient d'hybride. Le post-positivisme tolère et valorise explicitement les approches qualitatives à logique déductive (Creswell &amp; Poth, 2018 ; Guba &amp; Lincoln, 1994) : le dispositif se distingue ainsi du positivisme strict, qui exigerait une démarche quantitative, comme du constructivisme, qui prohiberait toute pré-structuration théorique.</w:t>
+        <w:t xml:space="preserve">, le codage des entretiens est principalement déductif tout en autorisant des codes complémentaires, démarche que Miles et al. (2014) qualifient d'hybride. Le post-positivisme valorise explicitement les approches qualitatives à logique déductive (Creswell &amp; Poth, 2018 ; Guba &amp; Lincoln, 1994) : le dispositif se distingue ainsi du positivisme strict, qui exigerait le quantitatif, comme du constructivisme, qui prohiberait toute pré-structuration théorique.</w:t>
       </w:r>
     </w:p>
     <w:bookmarkEnd w:id="97"/>
@@ -6325,7 +6309,7 @@
         <w:pStyle w:val="FirstParagraph"/>
       </w:pPr>
       <w:r>
-        <w:t xml:space="preserve">Le choix d'une approche qualitative, au regard de la tradition quantitative dominante du TAM/UTAUT, repose sur trois arguments. D'abord, la revue systématique de Williams et al. (2015) relève une nette sous-représentation des études qualitatives dans la littérature UTAUT, tout en soulignant que l'approche qualitative saisit des dimensions contextuelles, culturelles et émotionnelles que les questionnaires standardisés capturent mal ; Dwivedi et al. (2019) plaident dans le même sens pour des extensions contextuelles du modèle. Ensuite, la problématique ne vise pas seulement à identifier le poids relatif de chaque facteur, mais à comprendre comment ces facteurs s'articulent, se hiérarchisent et se manifestent dans le discours des praticiens, ambition compréhensive qui justifie l'entretien semi-directif. Enfin, le terrain marocain, et la région Souss-Massa en particulier, demeure très peu documenté (section 1.4) : dans un contexte sous-investigué, une démarche qualitative déductive produit des connaissances situées tout en restant ancrée dans un cadre solide, en réponse à la recommandation de Budhwar et al. (2022) en faveur d'études contextualisées dans les économies émergentes. Ces orientations emportent des implications opérationnelles directes : approche qualitative déductive plutôt que</w:t>
+        <w:t xml:space="preserve">Le choix du qualitatif, au regard de la tradition quantitative dominante du TAM/UTAUT, repose sur trois arguments. D'abord, la revue systématique de Williams et al. (2015) relève une nette sous-représentation du qualitatif dans la littérature UTAUT et souligne qu'il saisit des dimensions contextuelles, culturelles et émotionnelles mal captées par les questionnaires standardisés ; Dwivedi et al. (2019) plaident de même pour des extensions contextuelles du modèle. Ensuite, la problématique ne vise pas le seul poids relatif de chaque facteur, mais la façon dont ils s'articulent, se hiérarchisent et se manifestent dans le discours des praticiens, ambition compréhensive qui justifie l'entretien semi-directif. Enfin, le terrain marocain, et le Souss-Massa en particulier, reste très peu documenté (section 1.4) : dans un contexte sous-investigué, une démarche qualitative déductive produit des connaissances situées tout en restant ancrée dans un cadre solide, suivant la recommandation de Budhwar et al. (2022) en faveur d'études contextualisées dans les économies émergentes. Les implications opérationnelles sont directes : approche qualitative déductive plutôt que</w:t>
       </w:r>
       <w:r>
         <w:t xml:space="preserve"> </w:t>
@@ -6341,7 +6325,7 @@
         <w:t xml:space="preserve"> </w:t>
       </w:r>
       <w:r>
-        <w:t xml:space="preserve">(choix motivé en 3.4), guide d'entretien structuré par les dimensions du cadre, grille de codage préétablie ouverte aux codes émergents, scientificité appréciée au prisme des critères de la recherche qualitative (crédibilité, transférabilité, fiabilité, confirmabilité ; Lincoln &amp; Guba, 1985).</w:t>
+        <w:t xml:space="preserve">(choix motivé en 3.4), guide d'entretien structuré par les dimensions du cadre, grille de codage préétablie ouverte aux codes émergents, scientificité appréciée selon les critères de la recherche qualitative (crédibilité, transférabilité, fiabilité, confirmabilité ; Lincoln &amp; Guba, 1985).</w:t>
       </w:r>
     </w:p>
     <w:bookmarkEnd w:id="98"/>
@@ -6377,7 +6361,7 @@
         <w:pStyle w:val="FirstParagraph"/>
       </w:pPr>
       <w:r>
-        <w:t xml:space="preserve">La problématique, qui interroge les facteurs associés, dans le discours des professionnels RH de la région Souss-Massa, à l'adoption ou à la non-adoption de l'IA au regard des dimensions classiques de l'acceptation et des spécificités propres à l'IA, appelle quatre exigences qu'une approche qualitative est seule à pouvoir satisfaire de front. Il s'agit d'abord de saisir des représentations et des perceptions (utilité perçue, facilité d'usage, anxiété), par nature subjectives et difficilement réductibles à des échelles standardisées dans un contexte sous-investigué : les entretiens semi-directifs donnent un accès direct au discours des acteurs et à leur cadre interprétatif (Bardin, 2013 ; Paillé &amp; Mucchielli, 2016). Le phénomène étudié est ensuite émergent dans le contexte marocain : les usages y sont récents, hétérogènes, parfois incomplètement formalisés, et un questionnaire standardisé risquerait de présupposer des catégories d'usage qui n'existent pas encore localement. L'exploration des facteurs spécifiques à l'IA (P6) et des facteurs contextuels marocains (P7) exige en outre une investigation discursive approfondie : Tambe et al. (2019) soulignent la difficulté de capturer par questionnaire fermé les enjeux éthiques et de transparence des décisions algorithmiques, Charlwood et Guenole (2022) mettent en évidence des paradoxes (efficacité contre équité, augmentation contre remplacement) qui appellent le qualitatif, et Budhwar et al. (2022) plaident pour des recherches contextualisées sur la confiance et la confidentialité dans les économies émergentes. La sous-représentation des études qualitatives dans la littérature UTAUT (Williams et al., 2015) constitue enfin une lacune méthodologique que ce mémoire entend contribuer à combler.</w:t>
+        <w:t xml:space="preserve">La problématique, qui interroge les facteurs associés, dans le discours des professionnels RH du Souss-Massa, à l'adoption ou à la non-adoption de l'IA au regard des dimensions classiques de l'acceptation et des spécificités de l'IA, appelle quatre exigences qu'une approche qualitative est seule à satisfaire de front. Il s'agit d'abord de saisir des représentations et des perceptions (utilité perçue, facilité d'usage, anxiété), subjectives et peu réductibles à des échelles standardisées dans un contexte sous-investigué : l'entretien semi-directif donne un accès direct au discours des acteurs et à leur cadre interprétatif (Bardin, 2013 ; Paillé &amp; Mucchielli, 2016). Le phénomène est ensuite émergent au Maroc, où les usages sont récents, hétérogènes, parfois incomplètement formalisés, si bien qu'un questionnaire standardisé présupposerait des catégories d'usage qui n'existent pas encore localement. L'exploration des facteurs spécifiques à l'IA (P6) et des facteurs contextuels marocains (P7) exige en outre une investigation discursive approfondie : Tambe et al. (2019) soulignent la difficulté de saisir par questionnaire fermé les enjeux éthiques et de transparence des décisions algorithmiques, Charlwood et Guenole (2022) mettent au jour des paradoxes (efficacité contre équité, augmentation contre remplacement) qui appellent le qualitatif, et Budhwar et al. (2022) plaident pour des recherches contextualisées sur la confiance et la confidentialité dans les économies émergentes. La sous-représentation des études qualitatives dans la littérature UTAUT (Williams et al., 2015) constitue enfin une lacune méthodologique que ce mémoire entend combler en partie.</w:t>
       </w:r>
     </w:p>
     <w:bookmarkEnd w:id="100"/>
@@ -6399,7 +6383,7 @@
         <w:pStyle w:val="FirstParagraph"/>
       </w:pPr>
       <w:r>
-        <w:t xml:space="preserve">L'approche qualitative permet de contextualiser les facteurs d'adoption, un même répondant pouvant nuancer fortement son rapport à l'utilité perçue selon le type d'outil considéré ; d'identifier des dimensions émergentes absentes du cadre initial, intégrables comme codes complémentaires, tels le poids symbolique du « tampon papier » dans certaines administrations ou la souveraineté des données ; d'interpréter enfin les silences, les hésitations et les contradictions du discours, données précieuses pour repérer les freins implicites, Pillai et Sivathanu (2020) observant ainsi, en contexte indien, des écarts entre discours managérial favorable et pratiques effectives. Une approche quantitative aurait permis de tester statistiquement la validité du modèle, mais sans cette finesse interprétative : le choix qualitatif est cohérent avec la problématique, le contexte et l'état de l'art méthodologique sur UTAUT.</w:t>
+        <w:t xml:space="preserve">L'approche qualitative permet de contextualiser les facteurs d'adoption, un même répondant pouvant nuancer son rapport à l'utilité perçue selon le type d'outil ; d'identifier des dimensions émergentes absentes du cadre initial, intégrables comme codes complémentaires, tels le poids symbolique du « tampon papier » dans certaines administrations ou la souveraineté des données ; d'interpréter enfin les silences, hésitations et contradictions du discours, précieux pour repérer les freins implicites, Pillai et Sivathanu (2020) observant ainsi, en contexte indien, des écarts entre discours managérial favorable et pratiques effectives. Une approche quantitative aurait testé statistiquement le modèle, mais sans cette finesse interprétative : le choix qualitatif est cohérent avec la problématique, le contexte et l'état de l'art méthodologique sur UTAUT.</w:t>
       </w:r>
     </w:p>
     <w:bookmarkEnd w:id="101"/>
@@ -6422,7 +6406,7 @@
         <w:pStyle w:val="FirstParagraph"/>
       </w:pPr>
       <w:r>
-        <w:t xml:space="preserve">La recherche adopte une stratégie d'étude qualitative à visée explicative, à distinguer d'une étude purement exploratoire comme d'une étude de cas multiples. Trois éléments caractérisent ce choix. La visée explicative, d'abord : la recherche ne se limite pas à décrire les usages, elle cherche à identifier et à comprendre les facteurs associés à leur adoption ou à leur non-adoption, ambition rendue possible par le cadre théorique préexistant. L'unité d'analyse, ensuite, est l'individu, le professionnel RH, plutôt que l'organisation : cette focale est cohérente avec le TAM/UTAUT, qui modélise des perceptions et des intentions individuelles, et permet d'agréger des points de vue issus d'entreprises variées, là où une étude de cas multiples aurait restreint la diversité des profils et alourdi l'accès au terrain. La logique déductive, enfin, est explicitée : la grille de lecture est issue du cadre enrichi et les propositions P1 à P7 organisent l'analyse. Une logique inductive de type</w:t>
+        <w:t xml:space="preserve">La recherche adopte une stratégie d'étude qualitative à visée explicative, distincte d'une étude purement exploratoire comme d'une étude de cas multiples, que caractérisent trois éléments. La visée explicative, d'abord : au-delà de la description des usages, la recherche identifie et comprend les facteurs associés à leur adoption ou à leur non-adoption, ambition permise par le cadre théorique préexistant. L'unité d'analyse, ensuite, est l'individu, le professionnel RH, plutôt que l'organisation : cohérente avec le TAM/UTAUT, qui modélise des perceptions et intentions individuelles, cette focale permet d'agréger des points de vue d'entreprises variées, là où une étude de cas multiples aurait restreint la diversité des profils et alourdi l'accès au terrain. La logique déductive, enfin : la grille de lecture est issue du cadre enrichi et les propositions P1 à P7 organisent l'analyse. Une logique inductive de type</w:t>
       </w:r>
       <w:r>
         <w:t xml:space="preserve"> </w:t>
@@ -6438,15 +6422,15 @@
         <w:t xml:space="preserve"> </w:t>
       </w:r>
       <w:r>
-        <w:t xml:space="preserve">(Glaser &amp; Strauss, 1967) aurait convenu à un objet entièrement nouveau, ce qui n'est pas le cas : elle est écartée comme posture globale, la saturation, mobilisée au chapitre 4 sous sa forme thématique, restant le principal concept qui en est retenu.</w:t>
-      </w:r>
-    </w:p>
-    <w:p>
-      <w:pPr>
-        <w:pStyle w:val="BodyText"/>
-      </w:pPr>
-      <w:r>
-        <w:t xml:space="preserve">L'articulation déductive s'opère à trois niveaux successifs : les dimensions du cadre structurent le guide d'entretien, chaque thème correspondant à une dimension ou à une proposition ; la grille de codage découle de ces mêmes dimensions (section 4.4) ; l'interprétation procédera par confrontation des verbatims aux propositions P1 à P7, pour conclure au soutien, à la nuance ou au non-soutien de chacune dans la Partie III. Cette chaîne en trois maillons garantit la traçabilité analytique exigée par les standards de la recherche qualitative rigoureuse (Lincoln &amp; Guba, 1985 ; Miles et al., 2014). La Figure 6 synthétise la démarche, de la posture épistémologique à la discussion des propositions.</w:t>
+        <w:t xml:space="preserve">(Glaser &amp; Strauss, 1967) aurait convenu à un objet entièrement nouveau, ce qui n'est pas le cas : elle est écartée comme posture globale, seule la saturation, mobilisée au chapitre 4 sous sa forme thématique, en étant retenue.</w:t>
+      </w:r>
+    </w:p>
+    <w:p>
+      <w:pPr>
+        <w:pStyle w:val="BodyText"/>
+      </w:pPr>
+      <w:r>
+        <w:t xml:space="preserve">L'articulation déductive s'opère à trois niveaux : les dimensions du cadre structurent le guide d'entretien, chaque thème correspondant à une dimension ou à une proposition ; la grille de codage découle de ces mêmes dimensions (section 4.4) ; l'interprétation procédera par confrontation des verbatims aux propositions P1 à P7, pour conclure au soutien, à la nuance ou au non-soutien de chacune dans la Partie III. Cette chaîne garantit la traçabilité analytique exigée par les standards de la recherche qualitative (Lincoln &amp; Guba, 1985 ; Miles et al., 2014). La Figure 6 synthétise la démarche, de la posture épistémologique à la discussion des propositions.</w:t>
       </w:r>
     </w:p>
     <w:p>
@@ -6548,7 +6532,7 @@
         <w:pStyle w:val="FirstParagraph"/>
       </w:pPr>
       <w:r>
-        <w:t xml:space="preserve">La région Souss-Massa, organisée autour du pôle urbain d'Agadir, repose sur trois dominantes historiques : l'agro-industrie, dont la production maraîchère et agrumicole, la transformation et l'exportation structurent un écosystème dense ; le tourisme et l'hôtellerie, où coexistent grands groupes internationaux et PME ; la pêche et la transformation halieutique, adossées au port d'Agadir. S'y ajoutent un développement notable des services et de l'</w:t>
+        <w:t xml:space="preserve">La région Souss-Massa, organisée autour du pôle urbain d'Agadir, repose sur trois dominantes historiques : l'agro-industrie, dont la production maraîchère et agrumicole, la transformation et l'exportation structurent un écosystème dense ; le tourisme et l'hôtellerie, où coexistent grands groupes internationaux et PME ; la pêche et la transformation halieutique, adossées au port d'Agadir. S'y ajoutent les services et l'</w:t>
       </w:r>
       <w:r>
         <w:rPr>
@@ -6558,10 +6542,7 @@
         <w:t xml:space="preserve">offshoring</w:t>
       </w:r>
       <w:r>
-        <w:t xml:space="preserve"> </w:t>
-      </w:r>
-      <w:r>
-        <w:t xml:space="preserve">et un secteur tertiaire porté par l'urbanisation et la digitalisation progressive du tissu économique. Cette diversité sectorielle garantit l'accès à des profils RH variés exerçant dans des contextes organisationnels hétérogènes : elle est une condition nécessaire à la diversification de l'échantillon et à la transférabilité des résultats (Lincoln &amp; Guba, 1985).</w:t>
+        <w:t xml:space="preserve">, en net développement, et un tertiaire porté par l'urbanisation et la digitalisation progressive du tissu économique. Cette diversité donne accès à des profils RH variés exerçant dans des contextes organisationnels hétérogènes, condition de la diversification de l'échantillon et de la transférabilité des résultats (Lincoln &amp; Guba, 1985).</w:t>
       </w:r>
     </w:p>
     <w:bookmarkEnd w:id="107"/>
@@ -6596,7 +6577,7 @@
         <w:t xml:space="preserve">Maroc Digital 2030</w:t>
       </w:r>
       <w:r>
-        <w:t xml:space="preserve">, lancée en septembre 2024 et relayée localement par le Conseil régional et la CGEM Souss-Massa, tandis que le cadre juridique demeure en transition : aucun texte marocain ne régit encore spécifiquement l'IA, la protection des données restant régie par la loi 09-08 sous le contrôle de la CNDP. Cette configuration réglementaire mouvante correspond précisément aux facteurs contextuels que la proposition P7 invite à examiner. Ensuite, la coexistence de TPE, de PME, de grandes entreprises et de filiales de groupes internationaux permet d'observer un large spectre de maturités numériques au sein d'un même territoire. Enfin, la région demeure sous-représentée dans la littérature : aucune étude indexée dans les bases consultées, selon la stratégie documentée en Annexe F, n'a été identifiée sur l'adoption de l'IA en RH dans le Souss-Massa, ce qui confirme la contribution potentielle de la recherche à la production de connaissances situées.</w:t>
+        <w:t xml:space="preserve">, lancée en septembre 2024 et relayée localement par le Conseil régional et la CGEM Souss-Massa, tandis que le cadre juridique demeure en transition : aucun texte marocain ne régit encore spécifiquement l'IA, la protection des données restant régie par la loi 09-08 sous le contrôle de la CNDP. Cette configuration réglementaire mouvante correspond aux facteurs contextuels que la proposition P7 invite à examiner. Ensuite, la coexistence de TPE, PME, grandes entreprises et filiales de groupes internationaux permet d'observer un large spectre de maturités numériques sur un même territoire. Enfin, la région demeure sous-représentée dans la littérature : aucune étude indexée dans les bases consultées, selon la stratégie documentée en Annexe F, n'a été identifiée sur l'adoption de l'IA en RH dans le Souss-Massa, ce qui confirme la contribution potentielle de la recherche à des connaissances situées.</w:t>
       </w:r>
     </w:p>
     <w:p>
@@ -6614,7 +6595,7 @@
         <w:t xml:space="preserve"> </w:t>
       </w:r>
       <w:r>
-        <w:t xml:space="preserve">Le mémoire adopte une posture post-positiviste, ancrée dans Popper (1959) et Guba et Lincoln (1994), qui concilie réalisme ontologique critique, démarche déductive structurée par le cadre TAM/UTAUT et méthode qualitative compréhensive. Ce choix est cohérent avec l'objet de recherche, avec la sous-représentation des travaux qualitatifs dans la littérature UTAUT (Williams et al., 2015) et avec la nécessité de produire des connaissances contextuellement situées sur le terrain marocain. Le design articule une approche qualitative, une stratégie d'étude à visée explicative centrée sur l'individu et une logique déductive organisée par les propositions P1 à P7 ; le terrain du Souss-Massa, par la diversité de son tissu économique et la rareté des travaux qui lui sont consacrés, renforce la portée de la contribution attendue. Reste à décrire le dispositif opératoire : c'est l'objet du chapitre 4.</w:t>
+        <w:t xml:space="preserve">Le mémoire adopte une posture post-positiviste, ancrée dans Popper (1959) et Guba et Lincoln (1994), qui concilie réalisme ontologique critique, démarche déductive structurée par le cadre TAM/UTAUT et méthode qualitative compréhensive. Ce choix est cohérent avec l'objet de recherche, la sous-représentation des travaux qualitatifs dans la littérature UTAUT (Williams et al., 2015) et la nécessité de produire des connaissances situées sur le terrain marocain. Le design articule approche qualitative, stratégie à visée explicative centrée sur l'individu et logique déductive organisée par les propositions P1 à P7 ; le terrain du Souss-Massa, par la diversité de son tissu économique et la rareté des travaux qui lui sont consacrés, renforce la portée de la contribution attendue. Reste à décrire le dispositif opératoire : c'est l'objet du chapitre 4.</w:t>
       </w:r>
     </w:p>
     <w:bookmarkEnd w:id="108"/>
@@ -6638,7 +6619,7 @@
         <w:pStyle w:val="FirstParagraph"/>
       </w:pPr>
       <w:r>
-        <w:t xml:space="preserve">Le chapitre précédent a posé la posture épistémologique et le design général de la recherche ; celui-ci en déploie la traduction opératoire, de la constitution du corpus empirique à son interprétation : construction de l'échantillon (4.1), guide d'entretien semi-directif (4.2), procédure de collecte et dispositif éthique (4.3), analyse des données (4.4), critères de scientificité et réflexivité du chercheur (4.5). Une attention constante est portée à la traçabilité et à la transparence des décisions méthodologiques, garantes de la scientificité en recherche qualitative (Lincoln &amp; Guba, 1985 ; Miles et al., 2014 ; Paillé &amp; Mucchielli, 2016) : chaque choix, de la taille de l'échantillon au seuil du coefficient d'accord inter-codeurs, est justifié, documenté et auditable.</w:t>
+        <w:t xml:space="preserve">Après la posture épistémologique et le design de la recherche posés au chapitre précédent, ce chapitre en déploie la traduction opératoire : construction de l'échantillon (4.1), guide d'entretien semi-directif (4.2), procédure de collecte et dispositif éthique (4.3), analyse des données (4.4), critères de scientificité et réflexivité du chercheur (4.5). La traçabilité et la transparence des décisions méthodologiques, garantes de la scientificité en recherche qualitative (Lincoln &amp; Guba, 1985 ; Miles et al., 2014 ; Paillé &amp; Mucchielli, 2016), y sont constantes : chaque choix, de la taille de l'échantillon au seuil du coefficient d'accord inter-codeurs, est justifié, documenté et auditable.</w:t>
       </w:r>
     </w:p>
     <w:bookmarkStart w:id="114" w:name="la-construction-de-léchantillon"/>
@@ -6672,7 +6653,7 @@
         <w:pStyle w:val="FirstParagraph"/>
       </w:pPr>
       <w:r>
-        <w:t xml:space="preserve">L'échantillonnage retenu est</w:t>
+        <w:t xml:space="preserve">L'échantillonnage est</w:t>
       </w:r>
       <w:r>
         <w:t xml:space="preserve"> </w:t>
@@ -6698,7 +6679,7 @@
         <w:t xml:space="preserve">purposive sampling</w:t>
       </w:r>
       <w:r>
-        <w:t xml:space="preserve">) au sens de Patton (2002) et de Miles et al. (2014) : il sélectionne des informateurs qui maximisent la richesse informationnelle au regard de la problématique, plutôt qu'un échantillon statistiquement représentatif. Cette option est cohérente avec la visée explicative de l'étude, qui exige des répondants capables d'un discours circonstancié sur leurs pratiques ; la rigueur se déplace alors vers l'explicitation de critères de sélection opérationnels et vérifiables. Un professionnel RH est éligible s'il satisfait simultanément aux six critères d'inclusion du Tableau 7 ; à l'inverse, un seul critère d'exclusion suffit à écarter un profil, les deux colonnes se lisant comme deux listes indépendantes, la première conjonctive, la seconde disjonctive.</w:t>
+        <w:t xml:space="preserve">) au sens de Patton (2002) et de Miles et al. (2014) : il retient des informateurs maximisant la richesse informationnelle au regard de la problématique, plutôt qu'un échantillon statistiquement représentatif. Cette option sert la visée explicative de l'étude, qui exige des répondants capables d'un discours circonstancié sur leurs pratiques ; la rigueur se déplace vers des critères de sélection opérationnels et vérifiables. Un professionnel RH est éligible s'il satisfait simultanément aux six critères d'inclusion du Tableau 7 ; un seul critère d'exclusion suffit en revanche à l'écarter, les deux colonnes formant deux listes indépendantes, conjonctive puis disjonctive.</w:t>
       </w:r>
     </w:p>
     <w:p>
@@ -7006,7 +6987,7 @@
         <w:pStyle w:val="BodyText"/>
       </w:pPr>
       <w:r>
-        <w:t xml:space="preserve">Trois de ces critères appellent une justification particulière. Le seuil d'expérience de trois ans conditionne une lecture comparative des évolutions de la fonction. L'exposition à un outil d'IA au cours des douze derniers mois garantit un discours empiriquement ancré et écarte les discours purement spéculatifs, sans exiger d'expertise technique. L'exclusion des consultants externes tient à la nature du matériau recherché : l'expérience vécue de professionnels agissant dans leur propre organisation, non des observations de tiers. Les cas limites sont arbitrés au cas par cas et consignés dans le journal de bord du chercheur.</w:t>
+        <w:t xml:space="preserve">Trois critères appellent une justification. Le seuil de trois ans d'expérience conditionne une lecture comparative des évolutions de la fonction. L'exposition à un outil d'IA au cours des douze derniers mois garantit un discours empiriquement ancré et écarte les propos spéculatifs, sans exiger d'expertise technique. L'exclusion des consultants externes tient au matériau recherché : l'expérience vécue de professionnels agissant dans leur organisation, non des observations de tiers. Les cas limites sont arbitrés individuellement et consignés au journal de bord.</w:t>
       </w:r>
     </w:p>
     <w:bookmarkEnd w:id="111"/>
@@ -7028,7 +7009,7 @@
         <w:pStyle w:val="FirstParagraph"/>
       </w:pPr>
       <w:r>
-        <w:t xml:space="preserve">Au sein de la population éligible, la constitution de l'échantillon maximise la diversification interne selon cinq axes, chacun assorti d'une cible minimale fixée</w:t>
+        <w:t xml:space="preserve">Dans la population éligible, l'échantillon maximise la diversification selon cinq axes, chacun assorti d'une cible minimale fixée</w:t>
       </w:r>
       <w:r>
         <w:t xml:space="preserve"> </w:t>
@@ -7044,7 +7025,7 @@
         <w:t xml:space="preserve"> </w:t>
       </w:r>
       <w:r>
-        <w:t xml:space="preserve">(Tableau 8). Cette diversification ne vise pas la représentativité statistique mais la</w:t>
+        <w:t xml:space="preserve">(Tableau 8). L'enjeu n'est pas la représentativité statistique mais la</w:t>
       </w:r>
       <w:r>
         <w:t xml:space="preserve"> </w:t>
@@ -7060,7 +7041,7 @@
         <w:t xml:space="preserve"> </w:t>
       </w:r>
       <w:r>
-        <w:t xml:space="preserve">des profils : exposer le cadre TAM/UTAUT enrichi (P1 à P7) à une variété maximale de contextes organisationnels, sectoriels et démographiques, condition d'une interprétation nuancée des convergences et des contrastes.</w:t>
+        <w:t xml:space="preserve">des profils : exposer le cadre TAM/UTAUT enrichi (P1 à P7) à une variété maximale de contextes organisationnels, sectoriels et démographiques, condition d'une interprétation nuancée des convergences et contrastes.</w:t>
       </w:r>
     </w:p>
     <w:p>
@@ -7391,7 +7372,7 @@
         <w:pStyle w:val="BodyText"/>
       </w:pPr>
       <w:r>
-        <w:t xml:space="preserve">Le suivi de la matrice s'opère en continu durant la collecte, au moyen d'un tableau de bord tenu dans le journal de bord, les recrutements successifs étant orientés vers les modalités encore vacantes. Le statut des deux instruments est distinct : les critères d'inclusion et d'exclusion du Tableau 7 sont les seules conditions éliminatoires ; les cibles du Tableau 8 constituent des objectifs souhaitables de diversification, hiérarchisés dans l'ordre du tableau, dont la satisfaction simultanée ne peut être garantie avec douze à vingt entretiens, tout écart constaté en fin de collecte étant consigné dans le journal de bord puis discuté dans la Partie III au titre des limites. À titre indicatif, un scénario prévisionnel de quatorze entretiens a été esquissé pour préparer le recrutement : huit répondants du secteur agricole et agro-industriel, trois du tourisme et de l'hôtellerie, deux du bâtiment et des travaux publics et un exerçant dans un organisme semi-public, couvrant les fonctions de DRH, de responsable RH, de</w:t>
+        <w:t xml:space="preserve">La matrice est suivie en continu, via un tableau de bord tenu au journal de bord, les recrutements successifs étant orientés vers les modalités encore vacantes. Le statut des deux instruments diffère : les critères du Tableau 7 sont les seules conditions éliminatoires ; les cibles du Tableau 8 sont des objectifs souhaitables, hiérarchisés dans l'ordre du tableau, dont la satisfaction simultanée ne peut être garantie avec douze à vingt entretiens, tout écart constaté en fin de collecte étant consigné au journal de bord puis discuté dans la Partie III au titre des limites. À titre indicatif, un scénario prévisionnel de quatorze entretiens a été esquissé pour préparer le recrutement : huit répondants du secteur agricole et agro-industriel, trois du tourisme et de l'hôtellerie, deux du bâtiment et des travaux publics et un exerçant dans un organisme semi-public, couvrant les fonctions de DRH, de responsable RH, de</w:t>
       </w:r>
       <w:r>
         <w:t xml:space="preserve"> </w:t>
@@ -7417,15 +7398,15 @@
         <w:t xml:space="preserve"> </w:t>
       </w:r>
       <w:r>
-        <w:t xml:space="preserve">: cet écart serait corrigé si l'accès au terrain le permet et, à défaut, consigné au journal de bord puis discuté au titre des limites. Le statut de l'organisation (privée, semi-publique ou publique) est par ailleurs relevé pour chaque répondant, en complément du secteur d'activité.</w:t>
-      </w:r>
-    </w:p>
-    <w:p>
-      <w:pPr>
-        <w:pStyle w:val="BodyText"/>
-      </w:pPr>
-      <w:r>
-        <w:t xml:space="preserve">L'accès aux répondants panache cinq canaux complémentaires, retenus pour atteindre des profils contrastés et limiter le biais d'homogénéité du réseau initial : le ciblage LinkedIn par messages personnalisés ; la CGEM Souss-Massa (Confédération Générale des Entreprises du Maroc, antenne régionale) ; l'ANAPEC (Agence Nationale de Promotion de l'Emploi et des Compétences) ; les réseaux d'anciens étudiants des écoles de management et des programmes MBA ; l'effet boule de neige (</w:t>
+        <w:t xml:space="preserve">: cet écart serait corrigé si l'accès au terrain le permet et, à défaut, consigné au journal de bord puis discuté au titre des limites. Le statut de l'organisation (privée, semi-publique ou publique) est par ailleurs relevé pour chaque répondant.</w:t>
+      </w:r>
+    </w:p>
+    <w:p>
+      <w:pPr>
+        <w:pStyle w:val="BodyText"/>
+      </w:pPr>
+      <w:r>
+        <w:t xml:space="preserve">L'accès aux répondants panache cinq canaux, retenus pour atteindre des profils contrastés et limiter le biais d'homogénéité du réseau initial : le ciblage LinkedIn par messages personnalisés ; la CGEM Souss-Massa (Confédération Générale des Entreprises du Maroc, antenne régionale) ; l'ANAPEC (Agence Nationale de Promotion de l'Emploi et des Compétences) ; les réseaux d'anciens des écoles de management et des programmes MBA ; l'effet boule de neige (</w:t>
       </w:r>
       <w:r>
         <w:rPr>
@@ -7435,7 +7416,7 @@
         <w:t xml:space="preserve">snowball sampling</w:t>
       </w:r>
       <w:r>
-        <w:t xml:space="preserve">), chaque répondant étant invité en clôture d'entretien à recommander un ou deux professionnels éligibles. La boule de neige est adaptée à une communauté professionnelle restreinte et relativement endogène, mais comporte un biais reconnu de sur-représentation de profils homogènes : le panachage systématique des canaux et le suivi actif de la matrice de diversification en constituent les contrepoids.</w:t>
+        <w:t xml:space="preserve">), chaque répondant étant invité en clôture à recommander un ou deux professionnels éligibles. Ce dernier canal convient à une communauté professionnelle restreinte et endogène, mais comporte un biais reconnu de sur-représentation de profils homogènes, auquel le panachage des canaux et le suivi de la matrice font contrepoids.</w:t>
       </w:r>
     </w:p>
     <w:bookmarkEnd w:id="112"/>
@@ -7457,7 +7438,7 @@
         <w:pStyle w:val="FirstParagraph"/>
       </w:pPr>
       <w:r>
-        <w:t xml:space="preserve">La constitution de l'échantillon procède d'une</w:t>
+        <w:t xml:space="preserve">L'échantillon combine une</w:t>
       </w:r>
       <w:r>
         <w:t xml:space="preserve"> </w:t>
@@ -7473,7 +7454,7 @@
         <w:t xml:space="preserve"> </w:t>
       </w:r>
       <w:r>
-        <w:t xml:space="preserve">combinée à la logique raisonnée : les premiers répondants couvrent les modalités les plus contrastées de la matrice, les recrutements suivants comblent les vides, jusqu'au point où les nouveaux entretiens n'apportent plus de catégories ni de sous-thèmes analytiques nouveaux (Guest et al., 2006 ; Saunders et al., 2018). Une distinction conceptuelle s'impose : la saturation théorique, au sens originel de Glaser et Strauss (1967), vise la stabilisation d'une théorie émergente dans une logique inductive ; la présente recherche, déductive et structurée par le cadre TAM/UTAUT, vise une saturation</w:t>
+        <w:t xml:space="preserve">et une logique raisonnée : les premiers répondants couvrent les modalités les plus contrastées de la matrice, les suivants comblent les vides, jusqu'à ce que les nouveaux entretiens n'apportent plus de catégories ni de sous-thèmes analytiques (Guest et al., 2006 ; Saunders et al., 2018). Une distinction s'impose : la saturation théorique, au sens originel de Glaser et Strauss (1967), vise la stabilisation d'une théorie émergente dans une logique inductive ; la présente recherche, déductive et structurée par le cadre TAM/UTAUT, vise une saturation</w:t>
       </w:r>
       <w:r>
         <w:t xml:space="preserve"> </w:t>
@@ -7486,7 +7467,7 @@
         <w:t xml:space="preserve">thématique</w:t>
       </w:r>
       <w:r>
-        <w:t xml:space="preserve">, atteinte lorsque les dimensions du cadre sont suffisamment documentées par le matériau pour autoriser une interprétation robuste, soit la saturation thématique</w:t>
+        <w:t xml:space="preserve">, atteinte lorsque les dimensions du cadre sont assez documentées pour autoriser une interprétation robuste, soit la saturation thématique</w:t>
       </w:r>
       <w:r>
         <w:t xml:space="preserve"> </w:t>
@@ -7510,7 +7491,7 @@
         <w:pStyle w:val="BodyText"/>
       </w:pPr>
       <w:r>
-        <w:t xml:space="preserve">La taille cible est fixée à</w:t>
+        <w:t xml:space="preserve">La taille cible,</w:t>
       </w:r>
       <w:r>
         <w:t xml:space="preserve"> </w:t>
@@ -7523,7 +7504,7 @@
         <w:t xml:space="preserve">douze à vingt répondants</w:t>
       </w:r>
       <w:r>
-        <w:t xml:space="preserve">, fourchette appuyée sur des repères empiriques convergents : Guest et al. (2006) montrent qu'environ douze entretiens suffisent à atteindre la saturation thématique dans un échantillon relativement homogène interrogé avec une grille structurée ; Miles et al. (2014) situent au-delà de vingt le seuil où le rendement marginal de chaque entretien supplémentaire devient négligeable. L'échantillon visé étant délibérément hétérogène sur cinq axes, la borne basse de douze demeure indicative : l'arrêt reste conditionné à la saturation documentée dimension par dimension. Le critère d'arrêt s'apprécie selon trois indicateurs : absence de nouveaux sous-thèmes lors des deux ou trois derniers entretiens, confirmation des catégories déjà identifiées par les nouveaux verbatims, couverture suffisante de la matrice de diversification. Si, à vingt entretiens, la saturation n'était pas atteinte sur une dimension donnée, un recrutement complémentaire ciblé serait engagé. La saturation ne se décrète pas : elle se documente, entretien après entretien, dans le journal de bord.</w:t>
+        <w:t xml:space="preserve">, s'appuie sur des repères empiriques convergents : Guest et al. (2006) montrent qu'environ douze entretiens suffisent à la saturation thématique dans un échantillon relativement homogène interrogé avec une grille structurée ; Miles et al. (2014) situent au-delà de vingt le seuil où le rendement marginal d'un entretien devient négligeable. L'échantillon visé étant hétérogène sur cinq axes, la borne basse de douze reste indicative : l'arrêt est conditionné à la saturation documentée dimension par dimension. Il s'apprécie selon trois indicateurs : absence de nouveaux sous-thèmes lors des deux ou trois derniers entretiens, confirmation des catégories déjà identifiées par les nouveaux verbatims, couverture suffisante de la matrice. Si, à vingt entretiens, la saturation n'était pas atteinte sur une dimension, un recrutement complémentaire ciblé serait engagé. La saturation ne se décrète pas : elle se documente au journal de bord, entretien après entretien.</w:t>
       </w:r>
     </w:p>
     <w:bookmarkEnd w:id="113"/>
@@ -7572,7 +7553,7 @@
         <w:t xml:space="preserve">guide d'entretien semi-directif</w:t>
       </w:r>
       <w:r>
-        <w:t xml:space="preserve">, reproduit intégralement en Annexe A, est l'outil central de la collecte. Sa conception ne procède pas d'un inventaire de thèmes mais d'une traduction opératoire du modèle conceptuel</w:t>
+        <w:t xml:space="preserve">, reproduit intégralement en Annexe A, est l'outil central de la collecte. Il ne procède pas d'un inventaire de thèmes mais d'une traduction opératoire du modèle conceptuel</w:t>
       </w:r>
       <w:r>
         <w:t xml:space="preserve"> </w:t>
@@ -7588,7 +7569,7 @@
         <w:t xml:space="preserve"> </w:t>
       </w:r>
       <w:r>
-        <w:t xml:space="preserve">construit au chapitre 2, commandée par quatre principes.</w:t>
+        <w:t xml:space="preserve">du chapitre 2, commandée par quatre principes.</w:t>
       </w:r>
     </w:p>
     <w:p>
@@ -7612,7 +7593,7 @@
         <w:t xml:space="preserve"> </w:t>
       </w:r>
       <w:r>
-        <w:t xml:space="preserve">: chacun des six thèmes opérationnalise une ou plusieurs dimensions du modèle, les déterminants classiques du TAM et de l'UTAUT et leurs antécédents psychologiques (thèmes 3 et 4), les quatre facteurs spécifiques à l'IA de la proposition P6 (thème 5), les variables contextuelles marocaines de P7 (thème 6) ; les thèmes 1 et 2 ne testent aucune proposition, ils installent le régime narratif de l'entretien et documentent les représentations et les usages. L'ordre des thèmes suit la logique du récit du répondant, de ce dont il est le plus facile de parler, le parcours et les usages, vers ce qui engage davantage, la confiance accordée, les craintes éprouvées, l'identité professionnelle : les dimensions sensibles ne sont abordées qu'une fois la relation d'entretien établie.</w:t>
+        <w:t xml:space="preserve">: chacun des six thèmes opérationnalise une ou plusieurs dimensions du modèle, les déterminants classiques du TAM et de l'UTAUT et leurs antécédents psychologiques (thèmes 3 et 4), les quatre facteurs spécifiques à l'IA de P6 (thème 5), les variables contextuelles marocaines de P7 (thème 6) ; les thèmes 1 et 2 ne testent aucune proposition mais installent le régime narratif et documentent représentations et usages. L'ordre suit la logique du récit, du plus facile à dire, le parcours et les usages, vers ce qui engage davantage, la confiance, les craintes, l'identité professionnelle : les dimensions sensibles ne sont abordées qu'une fois la relation d'entretien établie.</w:t>
       </w:r>
     </w:p>
     <w:p>
@@ -7668,15 +7649,15 @@
         <w:t xml:space="preserve"> </w:t>
       </w:r>
       <w:r>
-        <w:t xml:space="preserve">que l'enquêteur n'active que si le répondant n'aborde pas spontanément la dimension concernée ; les termes du cadre théorique ne sont jamais soufflés, la question portant sur ce que l'outil a apporté et sur ce qu'il a coûté en effort, non sur l'« utilité perçue ».</w:t>
-      </w:r>
-    </w:p>
-    <w:p>
-      <w:pPr>
-        <w:pStyle w:val="BodyText"/>
-      </w:pPr>
-      <w:r>
-        <w:t xml:space="preserve">Le troisième principe, inflexion majeure de la présente version, consiste à</w:t>
+        <w:t xml:space="preserve">activées seulement si le répondant n'aborde pas spontanément la dimension ; les termes du cadre théorique ne sont jamais soufflés, la question portant sur ce que l'outil a apporté et coûté en effort, non sur l'« utilité perçue ».</w:t>
+      </w:r>
+    </w:p>
+    <w:p>
+      <w:pPr>
+        <w:pStyle w:val="BodyText"/>
+      </w:pPr>
+      <w:r>
+        <w:t xml:space="preserve">Le troisième principe, inflexion majeure de cette version, consiste à</w:t>
       </w:r>
       <w:r>
         <w:t xml:space="preserve"> </w:t>
@@ -7692,7 +7673,7 @@
         <w:t xml:space="preserve"> </w:t>
       </w:r>
       <w:r>
-        <w:t xml:space="preserve">: le récit d'expérience vécue (« racontez-moi une situation où… ») produit des verbatims circonstanciés, datables et discutables, atténue le biais de désirabilité sociale, un récit détaillé étant plus difficile à embellir qu'un jugement général (cf. § 4.5.3), et fournit le matériau dont l'analyse thématique a besoin pour illustrer chaque thème par des extraits situés (Miles et al., 2014).</w:t>
+        <w:t xml:space="preserve">: le récit d'expérience vécue (« racontez-moi une situation où… ») produit des verbatims circonstanciés, datables et discutables, atténue le biais de désirabilité sociale, un récit détaillé s'embellissant moins qu'un jugement général (cf. § 4.5.3), et fournit à l'analyse thématique de quoi illustrer chaque thème par des extraits situés (Miles et al., 2014).</w:t>
       </w:r>
     </w:p>
     <w:p>
@@ -7713,15 +7694,15 @@
         <w:t xml:space="preserve">trois registres transversaux</w:t>
       </w:r>
       <w:r>
-        <w:t xml:space="preserve">, mobilisables dès qu'une réponse demeure abstraite : l'illustration (« Pouvez-vous me donner un exemple ? »), le récit (« Que s'est-il passé exactement ? ») et le ressenti (« Qu'avez-vous ressenti à ce moment-là ? »), auxquels s'ajoutent la reformulation en écho et le silence maintenu quelques secondes après une réponse brève.</w:t>
-      </w:r>
-    </w:p>
-    <w:p>
-      <w:pPr>
-        <w:pStyle w:val="BodyText"/>
-      </w:pPr>
-      <w:r>
-        <w:t xml:space="preserve">L'architecture qui en résulte comprend six thèmes et une clôture réflexive : Thème 1, « Profil et parcours » (Q1) ; Thème 2, « Représentations et pratiques de l'IA » (Q2, Q3) ; Thème 3, « Ce que l'IA apporte, ce qu'elle coûte, ce qu'elle ne remplace pas » (Q4, Q5), qui couvre P1 et P2 ; Thème 4, « Entourage professionnel, management et moyens » (Q6, Q7), qui couvre P3 et P4 ; Thème 5, « Confiance, transparence, risques et devenir du métier » (Q8 à Q12), cœur du dispositif couvrant P6 et P5 ; Thème 6, « Contexte marocain et perspectives » (Q13, Q14), qui couvre P7 ; clôture par la question réflexive de hiérarchisation (Q15) et l'ouverture sur les points non abordés (Q16). La durée cible est de 75 minutes, dans une fourchette de 70 à 90 minutes, format assumé au profit des dimensions les plus sensibles et compensé par une règle de modularité arrêtée</w:t>
+        <w:t xml:space="preserve">, mobilisables dès qu'une réponse reste abstraite : l'illustration (« Pouvez-vous me donner un exemple ? »), le récit (« Que s'est-il passé exactement ? ») et le ressenti (« Qu'avez-vous ressenti à ce moment-là ? »), auxquels s'ajoutent la reformulation en écho et le silence de quelques secondes après une réponse brève.</w:t>
+      </w:r>
+    </w:p>
+    <w:p>
+      <w:pPr>
+        <w:pStyle w:val="BodyText"/>
+      </w:pPr>
+      <w:r>
+        <w:t xml:space="preserve">L'architecture comprend six thèmes et une clôture réflexive : Thème 1, « Profil et parcours » (Q1) ; Thème 2, « Représentations et pratiques de l'IA » (Q2, Q3) ; Thème 3, « Ce que l'IA apporte, ce qu'elle coûte, ce qu'elle ne remplace pas » (Q4, Q5), couvrant P1 et P2 ; Thème 4, « Entourage professionnel, management et moyens » (Q6, Q7), couvrant P3 et P4 ; Thème 5, « Confiance, transparence, risques et devenir du métier » (Q8 à Q12), cœur du dispositif couvrant P6 et P5 ; Thème 6, « Contexte marocain et perspectives » (Q13, Q14), couvrant P7 ; clôture par la question réflexive de hiérarchisation (Q15) et l'ouverture sur les points non abordés (Q16). La durée cible est de 75 minutes (fourchette de 70 à 90), format assumé au profit des dimensions sensibles et compensé par une règle de modularité arrêtée</w:t>
       </w:r>
       <w:r>
         <w:t xml:space="preserve"> </w:t>
@@ -7737,15 +7718,15 @@
         <w:t xml:space="preserve"> </w:t>
       </w:r>
       <w:r>
-        <w:t xml:space="preserve">: lorsque le répondant ne dispose que d'une heure, la priorité est donnée aux thèmes 3 et 5, qui portent P1, P2, P5 et P6 ; le thème 6 est réduit aux relances de Q13 et la question réflexive est maintenue en toute hypothèse. Le test pilote calibrera cet arbitrage.</w:t>
-      </w:r>
-    </w:p>
-    <w:p>
-      <w:pPr>
-        <w:pStyle w:val="BodyText"/>
-      </w:pPr>
-      <w:r>
-        <w:t xml:space="preserve">L'entretien est encadré par deux moments protocolaires. Un préambule oral d'environ trois minutes rappelle le cadre académique de la recherche, l'enregistrement audio par captation locale et sa destruction au plus tard trois mois après la soutenance, la pseudonymisation par identifiants (R1 à Rn), la conformité à la loi 09-08 et le droit d'interrompre l'entretien ou de refuser une question ; il précise qu'il n'existe ni bonne ni mauvaise réponse, les tentatives inabouties intéressant la recherche autant que les réussites. Le consentement éclairé écrit est recueilli à ce moment (cf. § 4.3.3). En clôture, l'enquêteur sollicite l'accord de principe pour la validation ultérieure des interprétations (</w:t>
+        <w:t xml:space="preserve">: si le répondant ne dispose que d'une heure, priorité va aux thèmes 3 et 5, qui portent P1, P2, P5 et P6 ; le thème 6 est réduit aux relances de Q13, la question réflexive étant maintenue en toute hypothèse. Le test pilote calibrera cet arbitrage.</w:t>
+      </w:r>
+    </w:p>
+    <w:p>
+      <w:pPr>
+        <w:pStyle w:val="BodyText"/>
+      </w:pPr>
+      <w:r>
+        <w:t xml:space="preserve">L'entretien est encadré par deux moments protocolaires. Un préambule oral de trois minutes rappelle le cadre académique de la recherche, l'enregistrement audio par captation locale et sa destruction au plus tard trois mois après la soutenance, la pseudonymisation par identifiants (R1 à Rn), la conformité à la loi 09-08 et le droit d'interrompre l'entretien ou de refuser une question ; il précise qu'il n'existe ni bonne ni mauvaise réponse, les tentatives inabouties intéressant la recherche autant que les réussites. Le consentement éclairé écrit y est recueilli (cf. § 4.3.3). En clôture, l'enquêteur sollicite l'accord de principe pour la validation des interprétations (</w:t>
       </w:r>
       <w:r>
         <w:rPr>
@@ -7755,7 +7736,7 @@
         <w:t xml:space="preserve">member checking</w:t>
       </w:r>
       <w:r>
-        <w:t xml:space="preserve">, cf. § 4.3.4) et propose la restitution finale. Immédiatement après l'entretien, un mémo consigne le contexte, le langage non verbal et les hypothèses émergentes.</w:t>
+        <w:t xml:space="preserve">, cf. § 4.3.4) et propose la restitution finale. Aussitôt après, un mémo consigne le contexte, le langage non verbal et les hypothèses émergentes.</w:t>
       </w:r>
     </w:p>
     <w:bookmarkEnd w:id="115"/>
@@ -7777,7 +7758,7 @@
         <w:pStyle w:val="FirstParagraph"/>
       </w:pPr>
       <w:r>
-        <w:t xml:space="preserve">Le Thème 5 concentre cinq des seize questions racines et près du tiers de la durée de l'entretien, déséquilibre délibéré que justifient deux arguments. Le premier est théorique : la proposition P6 recouvre quatre variables distinctes, construites séparément en section 2.4.3, la confiance envers les outils, la transparence et l'explicabilité perçues, la perception des risques éthiques et de l'équité, les préoccupations de confidentialité des données RH ; les traiter par une question unique reviendrait à présumer leur articulation, que la recherche entend précisément établir. Le second est méthodologique : sur la confiance, les biais ou l'éthique, les réponses de principe sont socialement attendues, nul professionnel ne déclarant se désintéresser des biais algorithmiques ; interroger frontalement ces dimensions produirait un discours normatif, homogène et peu informatif. Le guide les aborde donc par des situations vécues. La confiance est instruite par le récit de ce que le répondant a effectivement fait d'une recommandation algorithmique, avec relances sur l'observation éventuelle d'une erreur et sur l'évolution ultérieure de l'usage, ce qui éprouve la tension entre aversion et appréciation algorithmiques documentée au chapitre 2 (Dietvorst et al., 2015 ; Logg et al., 2019). La transparence est saisie par une situation de justification auprès d'un tiers et par ce que le répondant n'a pas su expliquer, opérationnalisation directe du mécanisme mis en évidence par Shin (2021). Les biais sont abordés par l'observation ou la crainte d'un résultat inéquitable, puis par les frontières normatives de la décision algorithmique, dans la ligne de M. K. Lee (2018) et de Köchling et Wehner (2020). La confidentialité est instruite par le récit d'une hésitation concrète avant de transmettre une donnée à un outil, qui donne accès à la portée réelle de la loi 09-08 dans les pratiques plutôt qu'à sa connaissance déclarative. La crainte du remplacement, enfin, est approchée par la part du travail jugée automatisable et par le récit d'une situation où ce sentiment a été éprouvé.</w:t>
+        <w:t xml:space="preserve">Le Thème 5 concentre cinq des seize questions racines et près du tiers de la durée de l'entretien, déséquilibre délibéré que justifient deux arguments. Le premier est théorique : P6 recouvre quatre variables distinctes, construites séparément en section 2.4.3, la confiance envers les outils, la transparence et l'explicabilité perçues, la perception des risques éthiques et de l'équité, la confidentialité des données RH ; les traiter par une question unique présumerait leur articulation, que la recherche entend précisément établir. Le second est méthodologique : sur la confiance, les biais ou l'éthique, les réponses de principe sont socialement attendues, nul professionnel ne se déclarant indifférent aux biais algorithmiques ; les interroger frontalement produirait un discours normatif, homogène et peu informatif. Le guide les aborde donc par des situations vécues. La confiance est instruite par le récit de ce que le répondant a fait d'une recommandation algorithmique, avec relances sur l'observation éventuelle d'une erreur et l'évolution de l'usage, éprouvant la tension entre aversion et appréciation algorithmiques documentée au chapitre 2 (Dietvorst et al., 2015 ; Logg et al., 2019). La transparence est saisie par une situation de justification auprès d'un tiers et par ce qu'il n'a pas su expliquer, opérationnalisation du mécanisme mis au jour par Shin (2021). Les biais sont abordés par l'observation ou la crainte d'un résultat inéquitable, puis par les frontières normatives de la décision algorithmique (M. K. Lee, 2018 ; Köchling et Wehner, 2020). La confidentialité passe par le récit d'une hésitation avant de transmettre une donnée à un outil, ce qui atteint la portée réelle de la loi 09-08 dans les pratiques plutôt que sa connaissance déclarative. La crainte du remplacement, enfin, est approchée par la part du travail jugée automatisable et par le récit d'une situation où elle a été éprouvée.</w:t>
       </w:r>
     </w:p>
     <w:bookmarkEnd w:id="116"/>
@@ -7799,7 +7780,7 @@
         <w:pStyle w:val="FirstParagraph"/>
       </w:pPr>
       <w:r>
-        <w:t xml:space="preserve">La question Q15 invite le répondant à désigner le facteur unique qui favoriserait le plus l'adoption de l'IA dans son organisation, le frein unique à lever en priorité et l'acteur détenant le pouvoir d'agir sur ce frein. Elle ne teste aucune proposition et alimente une famille de codes distincte (HIE) : sa fonction est de produire, non plus la description de facteurs, mais leur</w:t>
+        <w:t xml:space="preserve">La question Q15 invite le répondant à désigner le facteur unique qui favoriserait le plus l'adoption de l'IA dans son organisation, le frein unique à lever en priorité et l'acteur ayant le pouvoir d'agir sur ce frein. Elle ne teste aucune proposition et alimente une famille de codes distincte (HIE) : sa fonction est de produire non la description des facteurs, mais leur</w:t>
       </w:r>
       <w:r>
         <w:t xml:space="preserve"> </w:t>
@@ -7812,7 +7793,7 @@
         <w:t xml:space="preserve">mise en ordre par l'acteur lui-même</w:t>
       </w:r>
       <w:r>
-        <w:t xml:space="preserve">. La confrontation entre la hiérarchie énoncée par les répondants et celle qui ressortira de l'analyse thématique constitue un objet d'interprétation en soi : une convergence renforcerait la crédibilité des résultats ; une divergence serait analytiquement plus instructive encore et nourrirait directement les recommandations managériales de la Partie III. Placée en fin d'entretien, la question bénéficie d'un effet de récapitulation : le répondant a parcouru l'ensemble des dimensions et arbitre en connaissance de cause.</w:t>
+        <w:t xml:space="preserve">. Confronter la hiérarchie énoncée par les répondants à celle qui ressortira de l'analyse thématique forme un objet d'interprétation en soi : une convergence renforcerait la crédibilité des résultats ; une divergence serait plus instructive encore et nourrirait les recommandations managériales de la Partie III. Placée en fin d'entretien, elle bénéficie d'un effet de récapitulation : le répondant a parcouru toutes les dimensions et arbitre en connaissance de cause.</w:t>
       </w:r>
     </w:p>
     <w:bookmarkEnd w:id="117"/>
@@ -7834,7 +7815,7 @@
         <w:pStyle w:val="FirstParagraph"/>
       </w:pPr>
       <w:r>
-        <w:t xml:space="preserve">La cohérence interne du dispositif exige que chaque proposition soit adossée à au moins une question du guide et à une famille de codes analytiques, de sorte que la chaîne proposition, thème, question, verbatim, code puis discussion soit auditable de bout en bout (Miles et al., 2014). Le Tableau 9 établit cette correspondance pour les sept propositions.</w:t>
+        <w:t xml:space="preserve">La cohérence du dispositif exige que chaque proposition soit adossée à au moins une question du guide et à une famille de codes, de sorte que la chaîne proposition, thème, question, verbatim, code puis discussion soit auditable (Miles et al., 2014). Le Tableau 9 établit cette correspondance pour les sept propositions.</w:t>
       </w:r>
     </w:p>
     <w:p>
@@ -8410,7 +8391,7 @@
         <w:pStyle w:val="BodyText"/>
       </w:pPr>
       <w:r>
-        <w:t xml:space="preserve">La lecture du tableau appelle quatre commentaires. P1 et P2 mobilisent le noyau du TAM (Davis, 1989), enrichi pour P2 de l'auto-efficacité au sens de Compeau et Higgins (1995) et de l'anxiété d'usage intégrée par le TAM 3 (Venkatesh &amp; Bala, 2008) ; P3 et P4 renvoient aux dimensions sociales et organisationnelles de l'UTAUT (Venkatesh et al., 2003), la légitimation managériale prolongeant l'influence sociale. La famille VAH apparaît deux fois : la valeur ajoutée humaine est interrogée positivement en Q4, à travers les situations de non-recours délibéré, et négativement en Q12, comme valeur menacée, ce qui permettra de confronter les deux versants d'un même construit. Le poids du Thème 5 traduit la centralité des facteurs IA-spécifiques dans la contribution attendue du mémoire. P7, enfin, opérationnalise les facteurs contextuels marocains dans la filiation des extensions contextuelles du cadre (Dwivedi et al., 2019 ; Venkatesh et al., 2012). Les questions hors tableau remplissent des fonctions complémentaires : Q1 (codes PRO), Q2 et Q3 (REP, USG) assurent l'échauffement et le cadrage empirique ; Q14 (PRO-FUT) nourrit la mise en perspective managériale ; Q15 (HIE) produit le matériau du § 4.2.3 ; Q16 (EM) constitue l'espace dédié à l'émergence. La matrice détaillée question par question figure en Annexe D, le rappel synthétique en section 2.5 ; les trois présentations sont strictement cohérentes entre elles.</w:t>
+        <w:t xml:space="preserve">La lecture du tableau appelle quatre commentaires. P1 et P2 mobilisent le noyau du TAM (Davis, 1989), enrichi pour P2 de l'auto-efficacité au sens de Compeau et Higgins (1995) et de l'anxiété d'usage intégrée par le TAM 3 (Venkatesh &amp; Bala, 2008) ; P3 et P4 renvoient aux dimensions sociales et organisationnelles de l'UTAUT (Venkatesh et al., 2003), la légitimation managériale prolongeant l'influence sociale. La famille VAH apparaît deux fois : la valeur ajoutée humaine est interrogée positivement en Q4, à travers les situations de non-recours délibéré, et négativement en Q12, comme valeur menacée, ce qui permettra d'en confronter les deux versants. Le poids du Thème 5 traduit la centralité des facteurs IA-spécifiques dans la contribution attendue du mémoire. P7, enfin, opérationnalise les facteurs contextuels marocains dans la filiation des extensions du cadre (Dwivedi et al., 2019 ; Venkatesh et al., 2012). Les questions hors tableau ont des fonctions complémentaires : Q1 (PRO), Q2 et Q3 (REP, USG) assurent l'échauffement et le cadrage empirique ; Q14 (PRO-FUT) nourrit la mise en perspective managériale ; Q15 (HIE) produit le matériau du § 4.2.3 ; Q16 (EM) ouvre l'espace dédié à l'émergence. La matrice détaillée figure en Annexe D, le rappel synthétique en section 2.5 ; les trois présentations sont strictement cohérentes.</w:t>
       </w:r>
     </w:p>
     <w:bookmarkEnd w:id="118"/>
@@ -8432,7 +8413,7 @@
         <w:pStyle w:val="FirstParagraph"/>
       </w:pPr>
       <w:r>
-        <w:t xml:space="preserve">Préalablement au déploiement intégral, le guide fait l'objet d'un</w:t>
+        <w:t xml:space="preserve">Avant le déploiement intégral, le guide fait l'objet d'un</w:t>
       </w:r>
       <w:r>
         <w:t xml:space="preserve"> </w:t>
@@ -8448,7 +8429,7 @@
         <w:t xml:space="preserve"> </w:t>
       </w:r>
       <w:r>
-        <w:t xml:space="preserve">auprès de deux professionnels RH répondant aux critères d'inclusion, évalué selon six critères standardisés : la durée effective comparée à la cible de 75 minutes ; la clarté des questions, mesurée par le décompte des demandes de reformulation ; la couverture des sept propositions, vérifiée par l'existence de verbatims exploitables pour chacune ; le</w:t>
+        <w:t xml:space="preserve">auprès de deux professionnels RH répondant aux critères d'inclusion, évalué selon six critères standardisés : la durée effective comparée à la cible de 75 minutes ; la clarté des questions, mesurée par le décompte des demandes de reformulation ; la couverture des sept propositions, vérifiée par des verbatims exploitables pour chacune ; le</w:t>
       </w:r>
       <w:r>
         <w:t xml:space="preserve"> </w:t>
@@ -8461,7 +8442,7 @@
         <w:t xml:space="preserve">rendement des relances de récit et de ressenti</w:t>
       </w:r>
       <w:r>
-        <w:t xml:space="preserve">, apprécié par la proportion de réponses comportant une situation datée et circonstanciée plutôt qu'un jugement général ; le déclenchement effectif des relances propres à chaque question ; la détection de redondances entre questions. Le quatrième critère est le plus important : si les questions narratives continuaient d'appeler des réponses de principe, c'est la formulation elle-même qui devrait être révisée, non la seule liste des relances. À l'issue du test, le guide est ajusté (reformulations, suppressions, relances, durées) et une version consolidée est utilisée pour la collecte principale. Le statut des entretiens pilotes est arrêté</w:t>
+        <w:t xml:space="preserve">, apprécié par la proportion de réponses comportant une situation datée et circonstanciée plutôt qu'un jugement général ; le déclenchement effectif des relances propres à chaque question ; la détection de redondances. Le quatrième critère prime : si les questions narratives continuaient d'appeler des réponses de principe, c'est la formulation elle-même qui devrait être révisée, non la seule liste des relances. À l'issue du test, le guide est ajusté (reformulations, suppressions, relances, durées) et une version consolidée sert à la collecte principale. Le statut des entretiens pilotes est arrêté</w:t>
       </w:r>
       <w:r>
         <w:t xml:space="preserve"> </w:t>
@@ -8474,7 +8455,7 @@
         <w:t xml:space="preserve">a priori</w:t>
       </w:r>
       <w:r>
-        <w:t xml:space="preserve">, afin d'éviter toute décision opportuniste en cours d'analyse : inclus dans le corpus principal si le guide n'a subi que des modifications cosmétiques, conservés à titre exploratoire et exclus du corpus principal en cas d'ajustements significatifs ; la décision et ses justifications sont consignées dans le journal de bord.</w:t>
+        <w:t xml:space="preserve">, pour éviter toute décision opportuniste en cours d'analyse : inclusion dans le corpus principal si le guide n'a subi que des modifications cosmétiques, conservation à titre exploratoire et exclusion en cas d'ajustements significatifs ; la décision et ses justifications sont consignées au journal de bord.</w:t>
       </w:r>
     </w:p>
     <w:bookmarkEnd w:id="119"/>
@@ -8532,7 +8513,10 @@
         <w:pStyle w:val="FirstParagraph"/>
       </w:pPr>
       <w:r>
-        <w:t xml:space="preserve">Le terrain marocain implique une diversité linguistique que le dispositif accueille plutôt qu'il ne la neutralise : français, arabe standard, arabe dialectal marocain (</w:t>
+        <w:t xml:space="preserve">Le terrain marocain implique une diversité linguistique que le dispositif accueille plutôt qu'il ne la neutralise : français, arabe standard,</w:t>
+      </w:r>
+      <w:r>
+        <w:t xml:space="preserve"> </w:t>
       </w:r>
       <w:r>
         <w:rPr>
@@ -8542,7 +8526,10 @@
         <w:t xml:space="preserve">darija</w:t>
       </w:r>
       <w:r>
-        <w:t xml:space="preserve">) et, plus marginalement, amazigh. Le guide est rédigé en français, la liberté linguistique étant laissée au répondant, selon quatre niveaux : information dès la prise de contact ; adaptation du chercheur pendant l'entretien, une question pouvant être reformulée en</w:t>
+        <w:t xml:space="preserve"> </w:t>
+      </w:r>
+      <w:r>
+        <w:t xml:space="preserve">et, plus marginalement, amazigh. Le guide est rédigé en français, la liberté linguistique étant laissée au répondant selon quatre niveaux : information dès la prise de contact ; adaptation du chercheur pendant l'entretien, une question pouvant être reformulée en</w:t>
       </w:r>
       <w:r>
         <w:t xml:space="preserve"> </w:t>
@@ -8558,7 +8545,7 @@
         <w:t xml:space="preserve"> </w:t>
       </w:r>
       <w:r>
-        <w:t xml:space="preserve">à la demande ; retranscription des passages en</w:t>
+        <w:t xml:space="preserve">; retranscription des passages en</w:t>
       </w:r>
       <w:r>
         <w:t xml:space="preserve"> </w:t>
@@ -8574,23 +8561,23 @@
         <w:t xml:space="preserve"> </w:t>
       </w:r>
       <w:r>
-        <w:t xml:space="preserve">ou en arabe dans la langue d'origine, suivie d'une traduction française entre crochets ; codage appliqué à la version française, un lien étant conservé vers la formulation originale pour discuter les tournures difficilement traduisibles. Cette procédure s'inspire des recommandations de Temple et Young (2004) pour la recherche qualitative multilingue et préserve la confirmabilité au sens de Lincoln et Guba (1985) : la trace de la langue d'origine reste auditable à chaque étape.</w:t>
-      </w:r>
-    </w:p>
-    <w:p>
-      <w:pPr>
-        <w:pStyle w:val="BodyText"/>
-      </w:pPr>
-      <w:r>
-        <w:t xml:space="preserve">Sous réserve du consentement explicite du répondant, l'entretien est enregistré au format audio par enregistreur dédié, en présentiel comme en visioconférence : la captation est réalisée localement sur l'équipement du chercheur, sans recours à la fonction d'enregistrement de la plateforme de visioconférence, de sorte qu'aucun enregistrement ne transite par un service tiers ni ne soit conservé sur ses serveurs ; l'enregistrement vidéo est exclu, sauf demande spécifique. À l'issue de l'entretien, le chercheur rédige immédiatement un mémo (impressions, passages saillants, éléments non verbaux, pistes analytiques), qui alimente le journal de bord et soutient la réflexivité (Miles et al., 2014).</w:t>
-      </w:r>
-    </w:p>
-    <w:p>
-      <w:pPr>
-        <w:pStyle w:val="BodyText"/>
-      </w:pPr>
-      <w:r>
-        <w:t xml:space="preserve">La retranscription est intégrale et pseudonymisée. Les noms de personnes, d'entreprises et d'outils susceptibles d'identifier le répondant sont remplacés par des codes (R1 à Rn pour les répondants, E1 et suivants pour les entreprises) ; la table de correspondance est conservée à part, chiffrée, accessible au seul chercheur, et détruite au plus tard un mois après la soutenance, moment au-delà duquel le retrait individuel des données ne peut techniquement plus être exécuté, ce dont les répondants sont informés. Le terme de pseudonymisation est retenu à dessein : tant que cette table existe, le rapprochement avec l'identité du répondant demeure possible pour le seul chercheur, ce qui ne constitue pas une anonymisation irréversible. La retranscription est effectuée manuellement ou à l'aide d'un outil de transcription automatique exécuté localement (par exemple Whisper), de manière à ce qu'aucun enregistrement ne transite par un service tiers, puis systématiquement relue ; les combinaisons rares de caractéristiques susceptibles de permettre une réidentification indirecte sont masquées ou agrégées dans le mémoire. Les destinataires des données se limitent au chercheur, à l'encadrante du mémoire pour la supervision, au second codeur pour le sous-corpus pseudonymisé du double codage, sous engagement écrit de confidentialité, et au jury pour les extraits cités dans le volume. Les fichiers audio, stockés sur un support chiffré, sont détruits au plus tard trois mois après la soutenance ; les retranscriptions pseudonymisées et les exports d'analyse sont conservés cinq ans à des fins de vérification académique, sauf exigence contraire de l'établissement, puis supprimés ; les formulaires de consentement sont archivés séparément pendant cinq ans, durée de preuve retenue par défaut et ajustable selon les exigences de l'établissement. Ces durées, définies par catégorie de données, sont rappelées dans la lettre de présentation et le formulaire de consentement.</w:t>
+        <w:t xml:space="preserve">ou en arabe dans la langue d'origine, suivie d'une traduction française entre crochets ; codage sur la version française, un lien étant conservé vers la formulation originale pour discuter les tournures difficilement traduisibles. Cette procédure s'inspire des recommandations de Temple et Young (2004) pour la recherche qualitative multilingue et préserve la confirmabilité au sens de Lincoln et Guba (1985) : la trace de la langue d'origine reste auditable à chaque étape.</w:t>
+      </w:r>
+    </w:p>
+    <w:p>
+      <w:pPr>
+        <w:pStyle w:val="BodyText"/>
+      </w:pPr>
+      <w:r>
+        <w:t xml:space="preserve">Sous réserve du consentement explicite du répondant, l'entretien est enregistré au format audio par enregistreur dédié, en présentiel comme en visioconférence : la captation est réalisée localement sur l'équipement du chercheur, sans recours à la fonction d'enregistrement de la plateforme, de sorte qu'aucun enregistrement ne transite par un service tiers ; l'enregistrement vidéo est exclu, sauf demande spécifique. Le chercheur rédige immédiatement après l'entretien un mémo (impressions, passages saillants, éléments non verbaux, pistes analytiques), qui alimente le journal de bord et soutient la réflexivité (Miles et al., 2014).</w:t>
+      </w:r>
+    </w:p>
+    <w:p>
+      <w:pPr>
+        <w:pStyle w:val="BodyText"/>
+      </w:pPr>
+      <w:r>
+        <w:t xml:space="preserve">La retranscription est intégrale et pseudonymisée. Les noms de personnes, d'entreprises et d'outils susceptibles d'identifier le répondant sont remplacés par des codes (R1 à Rn pour les répondants, E1 et suivants pour les entreprises) ; la table de correspondance est conservée à part, chiffrée, accessible au seul chercheur, et détruite au plus tard un mois après la soutenance, moment au-delà duquel le retrait individuel des données ne peut techniquement plus être exécuté, ce dont les répondants sont informés. Le terme de pseudonymisation est retenu à dessein : tant que cette table existe, le rapprochement avec l'identité du répondant demeure possible pour le seul chercheur, ce qui ne constitue pas une anonymisation irréversible. Elle est effectuée manuellement ou par un outil de transcription automatique exécuté localement (par exemple Whisper), puis systématiquement relue ; les combinaisons rares de caractéristiques susceptibles de permettre une réidentification indirecte sont masquées ou agrégées dans le mémoire. Les destinataires des données se limitent au chercheur, à l'encadrante du mémoire pour la supervision, au second codeur pour le sous-corpus pseudonymisé du double codage, sous engagement écrit de confidentialité, et au jury pour les extraits cités dans le volume. Les fichiers audio, stockés sur un support chiffré, sont détruits au plus tard trois mois après la soutenance ; les retranscriptions pseudonymisées et les exports d'analyse sont conservés cinq ans à des fins de vérification académique, sauf exigence contraire de l'établissement, puis supprimés ; les formulaires de consentement sont archivés séparément pendant cinq ans, durée de preuve retenue par défaut et ajustable selon les exigences de l'établissement. Ces durées, définies par catégorie de données, sont rappelées dans la lettre de présentation et le formulaire de consentement.</w:t>
       </w:r>
     </w:p>
     <w:bookmarkEnd w:id="122"/>
@@ -8612,7 +8599,7 @@
         <w:pStyle w:val="FirstParagraph"/>
       </w:pPr>
       <w:r>
-        <w:t xml:space="preserve">Chaque répondant signe un formulaire de consentement éclairé (Annexe C), établi en deux exemplaires. À titre d'exception, lorsque la signature est matériellement impossible, le consentement est recueilli oralement en début d'enregistrement, clause par clause, l'exception étant consignée au journal de bord et le formulaire signé régularisé dès que possible. Le formulaire précise l'objet académique et non commercial de la recherche, les modalités de l'entretien, le droit de retrait à tout moment et sans justification, dans la limite temporelle liée à la destruction de la table de correspondance (cf. § 4.3.2), avec destruction des données déjà collectées, la pseudonymisation systématique dans le mémoire final, la confidentialité de l'enregistrement, les destinataires possibles des résultats et les coordonnées du chercheur.</w:t>
+        <w:t xml:space="preserve">Chaque répondant signe un formulaire de consentement éclairé (Annexe C), établi en deux exemplaires. À titre d'exception, lorsque la signature est matériellement impossible, le consentement est recueilli oralement en début d'enregistrement, clause par clause, l'exception étant consignée au journal de bord et le formulaire signé régularisé dès que possible. Il précise l'objet académique et non commercial de la recherche, les modalités de l'entretien, le droit de retrait sans justification et la destruction des données déjà collectées, dans la limite temporelle liée à la destruction de la table de correspondance (cf. § 4.3.2), la pseudonymisation systématique, la confidentialité de l'enregistrement, les destinataires des résultats et les coordonnées du chercheur.</w:t>
       </w:r>
     </w:p>
     <w:p>
@@ -8636,7 +8623,7 @@
         <w:t xml:space="preserve"> </w:t>
       </w:r>
       <w:r>
-        <w:t xml:space="preserve">relative à la protection des personnes physiques à l'égard du traitement des données à caractère personnel, promulguée par le Dahir n° 1-09-15 du 18 février 2009, ainsi qu'à son décret d'application et aux délibérations de la CNDP. Six principes structurent cette conformité : la finalité explicite ; la minimisation, seuls les verbatims pseudonymisés et des métadonnées de profil agrégées étant conservés ; la loyauté et la transparence ; le consentement libre, spécifique et éclairé ; la sécurité et la confidentialité, par stockage chiffré, accès restreint et destruction programmée par catégorie de données ; les droits d'accès, de rectification et d'opposition, chaque répondant pouvant, dans la même limite temporelle, consulter sa retranscription, la faire modifier ou la retirer du corpus. Pour les répondants ressortissants de l'Union européenne ou exerçant dans une filiale de groupe européen, la conformité au RGPD (Règlement (UE) 2016/679) est également assurée, les principes des deux régimes convergeant largement. Le traitement projeté fait l'objet, avant toute collecte, de la formalité préalable requise auprès de la CNDP, déclaration ou autorisation selon le régime applicable, déposée par le responsable du traitement identifié dans le dossier ; aucun entretien n'est conduit avant l'obtention du récépissé ou de l'autorisation, dont les références sont reportées dans la lettre de présentation et le formulaire de consentement, le protocole de recherche, la note d'information et le formulaire faisant partie des pièces du dossier. Ce cadre n'est pas qu'une contrainte externe : la sensibilité des données RH et la conformité à la loi 09-08 figurent parmi les objets mêmes de l'enquête (P6 et P7), et le sérieux du dispositif éthique participe de la crédibilité du chercheur auprès de répondants professionnellement avertis de ces questions.</w:t>
+        <w:t xml:space="preserve">relative à la protection des personnes physiques à l'égard du traitement des données à caractère personnel, promulguée par le Dahir n° 1-09-15 du 18 février 2009, ainsi qu'à son décret d'application et aux délibérations de la CNDP. Six principes structurent cette conformité : la finalité explicite ; la minimisation, seuls les verbatims pseudonymisés et des métadonnées de profil agrégées étant conservés ; la loyauté et la transparence ; le consentement libre, spécifique et éclairé ; la sécurité et la confidentialité, par stockage chiffré, accès restreint et destruction programmée par catégorie de données ; les droits d'accès, de rectification et d'opposition, chaque répondant pouvant, dans la même limite temporelle, consulter sa retranscription, la faire modifier ou la retirer du corpus. Pour les répondants ressortissants de l'Union européenne ou exerçant dans une filiale de groupe européen, la conformité au RGPD (Règlement (UE) 2016/679) est également assurée, les principes des deux régimes convergeant largement. Le traitement projeté fait l'objet, avant toute collecte, de la formalité préalable requise auprès de la CNDP, déclaration ou autorisation selon le régime applicable, déposée par le responsable du traitement ; aucun entretien n'est conduit avant l'obtention du récépissé ou de l'autorisation, dont les références sont reportées dans la lettre et le formulaire, le protocole, la note d'information et le formulaire figurant parmi les pièces du dossier. Ce cadre n'est pas qu'une contrainte externe : la sensibilité des données RH et la conformité à la loi 09-08 figurent parmi les objets mêmes de l'enquête (P6 et P7), et le sérieux du dispositif participe de la crédibilité du chercheur auprès de répondants avertis de ces questions.</w:t>
       </w:r>
     </w:p>
     <w:bookmarkEnd w:id="123"/>
@@ -8674,7 +8661,7 @@
         <w:t xml:space="preserve"> </w:t>
       </w:r>
       <w:r>
-        <w:t xml:space="preserve">recommandée par Lincoln et Guba (1985), une synthèse intermédiaire des thèmes émergents (5 à 8 pages, pseudonymisée) est soumise, une fois le codage substantiellement avancé mais avant la clôture de la rédaction des résultats, à 3 à 5 répondants volontaires choisis pour la diversité de leurs profils, invités à se prononcer sur la justesse des interprétations au regard de leur expérience et sur l'identification d'éventuelles dimensions absentes. Les retours sont intégrés selon une procédure documentée dans le journal de bord : reformulation des thèmes contestés, intégration des dimensions omises, mention explicite des points de désaccord persistants ; un désaccord entre le répondant et l'analyse ne vaut pas réfutation automatique, mais il est tracé et discuté. À l'issue de la soutenance, une synthèse finale (10 à 15 pages, pseudonymisée) est proposée à l'ensemble des répondants : cette restitution remplit une fonction éthique, témoigner du respect du temps accordé, et une fonction managériale, diffuser une connaissance utile à la communauté RH régionale ; elle est distincte du</w:t>
+        <w:t xml:space="preserve">recommandée par Lincoln et Guba (1985), une synthèse intermédiaire des thèmes émergents (5 à 8 pages, pseudonymisée) est soumise, une fois le codage substantiellement avancé mais avant la clôture des résultats, à trois à cinq répondants volontaires choisis pour la diversité de leurs profils, invités à se prononcer sur la justesse des interprétations et sur d'éventuelles dimensions absentes. Les retours sont intégrés selon une procédure documentée dans le journal de bord : reformulation des thèmes contestés, intégration des dimensions omises, mention explicite des points de désaccord persistants ; un désaccord entre le répondant et l'analyse ne vaut pas réfutation automatique, mais il est tracé et discuté. À l'issue de la soutenance, une synthèse finale (10 à 15 pages, pseudonymisée) est proposée à l'ensemble des répondants : cette restitution remplit une fonction éthique, témoigner du respect du temps accordé, et une fonction managériale, diffuser une connaissance utile à la communauté RH régionale ; elle est distincte du</w:t>
       </w:r>
       <w:r>
         <w:t xml:space="preserve"> </w:t>
@@ -8742,7 +8729,7 @@
         <w:t xml:space="preserve"> </w:t>
       </w:r>
       <w:r>
-        <w:t xml:space="preserve">croise les entretiens avec des documents organisationnels partagés volontairement par les répondants : politiques RH formalisées, chartes d'usage de l'IA, communication interne, procédures de protection des données, plans de formation. La demande est formulée en fin d'entretien, sous engagement de confidentialité spécifique ; chaque document reçu est enregistré dans une fiche de traçabilité puis analysé selon une grille allégée alignée sur les conditions facilitantes, l'influence sociale et les facteurs contextuels, le croisement avec les verbatims permettant de confronter les usages déclarés aux dispositifs formalisés. La</w:t>
+        <w:t xml:space="preserve">croise les entretiens avec des documents organisationnels partagés volontairement par les répondants : politiques RH, chartes d'usage de l'IA, communication interne, procédures de protection des données, plans de formation. Demandés en fin d'entretien sous engagement de confidentialité, ils sont enregistrés dans une fiche de traçabilité puis analysés selon une grille allégée alignée sur les conditions facilitantes, l'influence sociale et les facteurs contextuels, le croisement avec les verbatims confrontant les usages déclarés aux dispositifs formalisés. La</w:t>
       </w:r>
       <w:r>
         <w:t xml:space="preserve"> </w:t>
@@ -8793,7 +8780,7 @@
         <w:t xml:space="preserve"> </w:t>
       </w:r>
       <w:r>
-        <w:t xml:space="preserve">est retenue pour trois raisons. Elle est cohérente avec la posture post-positiviste : elle mobilise des catégories analytiques issues du cadre théorique tout en autorisant l'émergence, souplesse que Braun et Clarke (2006) identifient comme sa force distinctive. Elle dispose de fondements méthodologiques solides et complémentaires : Bardin (2013) codifie l'analyse catégorielle thématique en trois temps, Paillé et Mucchielli (2016) formalisent la méthode des thèmes, Braun et Clarke (2006) balisent la démarche en six phases. Elle est enfin transparente et reproductible lorsqu'elle est documentée, la traçabilité du codage autorisant l'audit et le double codage. D'autres options ont été considérées puis écartées : une analyse lexicale automatisée, de type IRaMuTeQ, offrirait une exploration statistique du corpus au prix de la finesse interprétative recherchée sur un matériau de taille modérée ; une analyse de discours déplacerait l'objet vers la déconstruction des rapports de pouvoir, hors du cadre TAM/UTAUT.</w:t>
+        <w:t xml:space="preserve">est retenue pour trois raisons. Elle est cohérente avec la posture post-positiviste : elle mobilise des catégories analytiques issues du cadre théorique tout en autorisant l'émergence, souplesse que Braun et Clarke (2006) identifient comme sa force distinctive. Elle dispose de fondements méthodologiques solides et complémentaires : Bardin (2013) codifie l'analyse catégorielle thématique en trois temps, Paillé et Mucchielli (2016) formalisent la méthode des thèmes, Braun et Clarke (2006) balisent la démarche en six phases. Elle est enfin transparente et reproductible lorsqu'elle est documentée, la traçabilité du codage autorisant l'audit et le double codage. Deux options ont été écartées : l'analyse lexicale automatisée, de type IRaMuTeQ, qui offrirait une exploration statistique au prix de la finesse interprétative recherchée sur un corpus de taille modérée ; l'analyse de discours, qui déplacerait l'objet vers la déconstruction des rapports de pouvoir, hors du cadre TAM/UTAUT.</w:t>
       </w:r>
     </w:p>
     <w:p>
@@ -9468,7 +9455,7 @@
         <w:pStyle w:val="BodyText"/>
       </w:pPr>
       <w:r>
-        <w:t xml:space="preserve">La fiabilité interne de l'analyse repose sur un</w:t>
+        <w:t xml:space="preserve">La fiabilité interne repose sur un</w:t>
       </w:r>
       <w:r>
         <w:t xml:space="preserve"> </w:t>
@@ -9481,7 +9468,10 @@
         <w:t xml:space="preserve">double codage indépendant</w:t>
       </w:r>
       <w:r>
-        <w:t xml:space="preserve">, appliqué à 25 % du corpus, soit trois à cinq entretiens selon la taille finale de l'échantillon. Le sous-corpus est stratifié de manière à couvrir les langues d'entretien, les grands secteurs et les types de profils, un tirage aléatoire étant opéré à l'intérieur de ces strates. L'unité de codage est le segment de sens, portion de verbatim porteuse d'une idée identifiable ; la segmentation du sous-corpus est arrêtée en amont et imposée aux deux codeurs, seul l'étiquetage étant indépendant ; un même segment peut recevoir plusieurs codes, et les segments qui ne relèvent d'aucun code reçoivent la mention explicite « hors grille », qui entre dans le calcul de l'accord. Le second codeur est un pair chercheur extérieur à l'encadrement du mémoire, désigné avant le début de la collecte ; il signe un engagement écrit de confidentialité, figure à ce titre parmi les destinataires des données pseudonymisées (cf. § 4.3.2), et sa formation préalable à la grille fait l'objet d'une séance dédiée.</w:t>
+        <w:t xml:space="preserve"> </w:t>
+      </w:r>
+      <w:r>
+        <w:t xml:space="preserve">appliqué à 25 % du corpus, soit trois à cinq entretiens. Le sous-corpus est stratifié pour couvrir les langues d'entretien, les grands secteurs et les types de profils, un tirage aléatoire étant opéré à l'intérieur de ces strates. L'unité de codage est le segment de sens, portion de verbatim porteuse d'une idée identifiable ; la segmentation du sous-corpus est arrêtée en amont et imposée aux deux codeurs, seul l'étiquetage étant indépendant ; un même segment peut recevoir plusieurs codes, et les segments qui ne relèvent d'aucun code reçoivent la mention explicite « hors grille », qui entre dans le calcul de l'accord. Le second codeur est un pair chercheur extérieur à l'encadrement du mémoire, désigné avant le début de la collecte ; il signe un engagement écrit de confidentialité, figure à ce titre parmi les destinataires des données pseudonymisées (cf. § 4.3.2), et sa formation préalable à la grille fait l'objet d'une séance dédiée.</w:t>
       </w:r>
     </w:p>
     <w:p>
@@ -9505,7 +9495,7 @@
         <w:t xml:space="preserve"> </w:t>
       </w:r>
       <w:r>
-        <w:t xml:space="preserve">(Cohen, 1960) est calculé sur ce sous-corpus, avec un seuil d'acceptabilité fixé à κ ≥ 0,70, appuyé sur l'échelle de Landis et Koch (1977), où un accord compris entre 0,61 et 0,80 est qualifié de « substantiel ». Le calcul est conduit dimension par dimension (P1 à P7, familles CT, RES, RIS, CFD, MNG et RMP incluses), afin de localiser les éventuelles fragilités du codage plutôt que de les diluer dans un score global. En cas de kappa inférieur au seuil sur une dimension, une procédure de résolution est engagée : discussion entre les codeurs sur les sources de divergence, reformulation des définitions opérationnelles concernées, re-codage du sous-corpus avec la grille révisée, recalcul du kappa. Le kappa initial et le kappa obtenu après révision sont l'un et l'autre rapportés dans la Partie III, avec les divergences persistantes et les éventuels effets de prévalence : l'itération ne vise pas à franchir mécaniquement le seuil, mais à stabiliser des définitions dont l'instabilité éventuelle constitue en elle-même un enseignement. Chaque cycle est tracé dans le journal de bord ; si le seuil demeurait hors d'atteinte sur une dimension après deux itérations, la discussion des résultats le signalerait explicitement et entourerait l'interprétation de cette dimension des précautions requises. Ce dispositif complète les deux triangulations du § 4.4.1 : ensemble, ils soutiennent la crédibilité, la fiabilité et la confirmabilité de l'analyse.</w:t>
+        <w:t xml:space="preserve">(Cohen, 1960) est calculé sur ce sous-corpus, avec un seuil d'acceptabilité fixé à κ ≥ 0,70, appuyé sur l'échelle de Landis et Koch (1977), où un accord compris entre 0,61 et 0,80 est qualifié de « substantiel ». Le calcul est conduit dimension par dimension (P1 à P7, familles CT, RES, RIS, CFD, MNG et RMP incluses), afin de localiser les éventuelles fragilités du codage plutôt que de les diluer dans un score global. En deçà du seuil sur une dimension, une procédure de résolution est engagée : discussion sur les sources de divergence, reformulation des définitions concernées, re-codage du sous-corpus avec la grille révisée, recalcul du kappa. Le kappa initial et le kappa obtenu après révision sont l'un et l'autre rapportés dans la Partie III, avec les divergences persistantes et les éventuels effets de prévalence : l'itération ne vise pas à franchir mécaniquement le seuil, mais à stabiliser des définitions dont l'instabilité éventuelle constitue en elle-même un enseignement. Chaque cycle est tracé dans le journal de bord ; si le seuil demeurait hors d'atteinte sur une dimension après deux itérations, la discussion des résultats le signalerait explicitement et entourerait l'interprétation de cette dimension des précautions requises. Ce dispositif complète les deux triangulations du § 4.4.1 : ensemble, ils soutiennent la crédibilité, la fiabilité et la confirmabilité de l'analyse.</w:t>
       </w:r>
     </w:p>
     <w:bookmarkEnd w:id="132"/>
@@ -9657,7 +9647,7 @@
         <w:t xml:space="preserve"> </w:t>
       </w:r>
       <w:r>
-        <w:t xml:space="preserve">: la connaissance de la communauté RH marocaine et des contacts professionnels dans la région Souss-Massa facilitent l'accès au terrain et la compréhension fine des codes culturels et organisationnels, mais exposent à un effet de connivence pouvant inhiber l'expression de positions dissonantes et à la sous-problématisation d'éléments tenus pour évidents. Une posture</w:t>
+        <w:t xml:space="preserve">: la connaissance de la communauté RH marocaine facilite l'accès au terrain et la compréhension des codes culturels et organisationnels, mais expose à un effet de connivence pouvant inhiber l'expression de positions dissonantes et à la sous-problématisation d'éléments tenus pour évidents. Une posture</w:t>
       </w:r>
       <w:r>
         <w:t xml:space="preserve"> </w:t>

</xml_diff>

<commit_message>
Applique les 100 corrections de la relecture adversariale post-condensation
Relecture en quatre lots visant les dégradations introduites par la
condensation : 13 graves, 52 moyennes, 35 mineures, toutes appliquées par
appariement exact sans échec. Corrections de fond notables : lien
unidirectionnel du TAM rétabli en 2.1.2 (la facilité d'usage nourrit
l'utilité perçue), portée de la loi 09-08 rétablie en 1.4.4, quatre défis de
Tambe et al. reformulés en contraintes éthiques et juridiques, définition
de CONF-DATA et contenu de l'appréciation algorithmique restitués,
attribution DeSanctis et Poole / Orlikowski remise dans le bon ordre,
cohérence de l'anxiété rétablie en 2.4.1, réserve « non des lois générales »
et « droit de retrait à tout moment » restaurés. Corps : 80 pages hors
annexes, 132 au total.

Co-Authored-By: Claude Fable 5 <noreply@anthropic.com>
Claude-Session: https://claude.ai/code/session_019cQWueQyn1tismMV8DQS9i
</commit_message>
<xml_diff>
--- a/revision-memoire/manuscrit/Memoire_GEMBA_EL-HASSOUNY_corrige_v1.docx
+++ b/revision-memoire/manuscrit/Memoire_GEMBA_EL-HASSOUNY_corrige_v1.docx
@@ -1658,7 +1658,7 @@
         <w:pStyle w:val="BodyText"/>
       </w:pPr>
       <w:r>
-        <w:t xml:space="preserve">Un constat structure tout le mémoire : l'IA ne peut être étudiée comme un simple module du SIRH. Elle s'en distingue par au moins cinq traits : l'opacité des mécanismes de recommandation, qui déplace la question de l'acceptation vers l'explicabilité ; la confiance, devenue condition centrale de la relation du professionnel à l'outil (Glikson &amp; Woolley, 2020) ; des risques éthiques avérés de biais et de discrimination algorithmique, aigus en recrutement (Köchling &amp; Wehner, 2020) ; la confidentialité de données RH touchant directement à la vie des personnes (Tursunbayeva et al., 2022) ; enfin la crainte du remplacement du professionnel par la machine qu'il est précisément invité à adopter (Charlwood &amp; Guenole, 2022 ; Meijerink et al., 2021). Une telle technologie appelle un cadre d'analyse enrichi, non l'application mécanique de modèles conçus pour la bureautique des années 1990.</w:t>
+        <w:t xml:space="preserve">Un constat structure tout le mémoire : l'IA ne peut être étudiée comme un simple module du SIRH. Elle s'en distingue par au moins cinq traits : l'opacité des mécanismes de recommandation, qui déplace la question de l'acceptation vers l'explicabilité ; la confiance, devenue condition centrale de la relation du professionnel à l'outil (Glikson &amp; Woolley, 2020) ; des risques éthiques avérés de biais et de discrimination algorithmique, aigus en recrutement (Köchling &amp; Wehner, 2020) ; la confidentialité des données RH, qui touchent directement à la vie des personnes (Tursunbayeva et al., 2022) ; enfin la crainte du remplacement du professionnel par la machine qu'il est précisément invité à adopter (Charlwood &amp; Guenole, 2022 ; Meijerink et al., 2021). Une telle technologie appelle un cadre d'analyse enrichi, non l'application mécanique de modèles conçus pour la bureautique des années 1990.</w:t>
       </w:r>
     </w:p>
     <w:p>
@@ -1690,7 +1690,7 @@
         <w:pStyle w:val="BodyText"/>
       </w:pPr>
       <w:r>
-        <w:t xml:space="preserve">Dans ce paysage s'inscrit le terrain retenu : la région Souss-Massa, structurée autour du pôle économique d'Agadir. Son tissu productif mêle dominantes agro-alimentaire, touristique et halieutique, développement notable des services et de l'</w:t>
+        <w:t xml:space="preserve">Dans ce paysage s'inscrit le terrain retenu : la région Souss-Massa, structurée autour du pôle économique d'Agadir. Son tissu productif associe des dominantes agro-alimentaire, touristique et halieutique à un développement notable des services et de l'</w:t>
       </w:r>
       <w:r>
         <w:rPr>
@@ -1700,7 +1700,7 @@
         <w:t xml:space="preserve">offshoring</w:t>
       </w:r>
       <w:r>
-        <w:t xml:space="preserve">, et juxtapose TPE familiales, PME exportatrices et filiales de groupes internationaux. Cette double diversité en fait un observatoire pertinent des écarts de maturité digitale. Or l'adoption effective de l'IA par les professionnels RH y demeure inégale et très peu documentée ; ce que l'on y observera ne vaudra pas pour l'ensemble du Maroc, mais fournira un point de comparaison utile pour d'autres régions au profil économique voisin. C'est cette zone d'ombre que la présente recherche entend éclairer.</w:t>
+        <w:t xml:space="preserve">, et il juxtapose TPE familiales, PME exportatrices et filiales de groupes internationaux. Cette double diversité en fait un observatoire pertinent des écarts de maturité digitale. Or l'adoption effective de l'IA par les professionnels RH y demeure inégale et très peu documentée ; ce que l'on y observera ne vaudra pas pour l'ensemble du Maroc, mais fournira un point de comparaison utile pour d'autres régions au profil économique voisin. C'est cette zone d'ombre que la présente recherche entend éclairer.</w:t>
       </w:r>
     </w:p>
     <w:bookmarkEnd w:id="28"/>
@@ -1730,7 +1730,7 @@
         <w:pStyle w:val="BodyText"/>
       </w:pPr>
       <w:r>
-        <w:t xml:space="preserve">Le versant managérial est tout aussi direct : DRH et directions générales doivent décider d'investissements dont ils mesurent mal les conditions d'appropriation, les éditeurs de solutions sondent les attentes de marchés encore jeunes et les acteurs publics, engagés dans la mise en œuvre de</w:t>
+        <w:t xml:space="preserve">L’intérêt managérial est tout aussi direct : DRH et directions générales doivent décider d'investissements dont ils mesurent mal les conditions d'appropriation, les éditeurs de solutions sondent les attentes de marchés encore jeunes et les acteurs publics, engagés dans la mise en œuvre de</w:t>
       </w:r>
       <w:r>
         <w:t xml:space="preserve"> </w:t>
@@ -2438,7 +2438,7 @@
         <w:t xml:space="preserve">Maroc Digital 2030</w:t>
       </w:r>
       <w:r>
-        <w:t xml:space="preserve">) décrivent le contexte d'exercice des professionnels sans fonder aucune proposition ; les cas d'entreprise documentés par la presse économique (Amazon, HireVue, Workday) illustrent des controverses publiques, leur portée probatoire est faible et l'argument sur le caractère structurel des biais algorithmiques est porté par la revue systématique de Köchling et Wehner (2020). Le chapitre 1 circonscrit l'objet d'étude, des définitions de l'IA à la revue empirique incluant les contextes africain, arabe et marocain ; le chapitre 2 retrace la généalogie critique du Technology Acceptance Model (Davis, 1989) et de ses extensions (TAM 2, TAM 3, UTAUT, UTAUT 2), discute ses limites à l'aune de cadres concurrents, puis construit le modèle conceptuel intégrateur articulé aux sept propositions (P1 à P7), P6 et P7 se situant à l'intersection des modèles classiques d'acceptation, des travaux récents sur les spécificités de l'IA en RH (Budhwar et al., 2022 ; Charlwood &amp; Guenole, 2022 ; Tambe et al., 2019) et des recherches sur l'adoption des technologies dans les contextes émergents (Dwivedi et al., 2019).</w:t>
+        <w:t xml:space="preserve">) décrivent le contexte d'exercice des professionnels sans fonder aucune proposition ; les cas d'entreprise documentés par la presse économique (Amazon, HireVue, Workday) illustrent des controverses publiques mais leur portée probatoire reste faible, l'argument sur le caractère structurel des biais algorithmiques étant porté par la revue systématique de Köchling et Wehner (2020). Le chapitre 1 circonscrit l'objet d'étude, des définitions de l'IA à la revue empirique incluant les contextes africain, arabe et marocain ; le chapitre 2 retrace la généalogie critique du Technology Acceptance Model (Davis, 1989) et de ses extensions (TAM 2, TAM 3, UTAUT, UTAUT 2), discute ses limites à l'aune de cadres concurrents, puis construit le modèle conceptuel intégrateur articulé aux sept propositions (P1 à P7), P6 et P7 se situant à l'intersection des modèles classiques d'acceptation, des travaux récents sur les spécificités de l'IA en RH (Budhwar et al., 2022 ; Charlwood &amp; Guenole, 2022 ; Tambe et al., 2019) et des recherches sur l'adoption des technologies dans les contextes émergents (Dwivedi et al., 2019).</w:t>
       </w:r>
     </w:p>
     <w:bookmarkStart w:id="58" w:name="Xa82dce9560ed5c14ed0d0374dd115a61b056405"/>
@@ -2488,7 +2488,7 @@
         <w:pStyle w:val="FirstParagraph"/>
       </w:pPr>
       <w:r>
-        <w:t xml:space="preserve">Définir l'IA n'est pas un préalable d'érudition : le périmètre retenu commande ce que la recherche observera et ce que le modèle conceptuel devra expliquer. Or aucune définition unique ne fait consensus. L'ingénierie et les systèmes d'information entrent par les techniques et leurs performances (Janiesch et al., 2021) ; le management des SI par les propriétés de l'artefact, Berente et al. (2021) caractérisant la gestion de l'IA par trois facettes en tension, autonomie croissante des systèmes, capacité d'apprentissage et « inscrutabilité » (</w:t>
+        <w:t xml:space="preserve">Définir l'IA n'est pas un préalable d'érudition : le périmètre retenu commande ce que la recherche observera et ce que le modèle conceptuel devra expliquer. Or aucune définition unique ne fait consensus. L'ingénierie et les systèmes d'information (SI) entrent par les techniques et leurs performances (Janiesch et al., 2021) ; le management des SI par les propriétés de l'artefact, Berente et al. (2021) caractérisant la gestion de l'IA par trois facettes en tension, autonomie croissante des systèmes, capacité d'apprentissage et « inscrutabilité » (</w:t>
       </w:r>
       <w:r>
         <w:rPr>
@@ -2519,7 +2519,7 @@
         <w:pStyle w:val="FirstParagraph"/>
       </w:pPr>
       <w:r>
-        <w:t xml:space="preserve">Née à la conférence de Dartmouth en 1956 dans une visée symbolique fondée sur des règles logiques explicitement codées, l'IA connaît une première vague de systèmes experts avant l'« hiver » né de l'impossibilité de formaliser exhaustivement la connaissance humaine. L'inflexion contemporaine tient au déplacement vers une IA fondée sur les données, permis par l'abondance des données numériques, la puissance de calcul accrue et le perfectionnement des algorithmes d'apprentissage statistique (Janiesch et al., 2021), et aboutit dès les années 2010 à l'essor du</w:t>
+        <w:t xml:space="preserve">Née à la conférence de Dartmouth en 1956 dans une visée symbolique fondée sur des règles logiques explicitement codées, l'IA connaît une première vague de systèmes experts avant l'« hiver de l'IA », provoqué par l'impossibilité de formaliser exhaustivement la connaissance humaine. L'inflexion contemporaine tient au déplacement vers une IA fondée sur les données, permis par l'abondance des données numériques, la puissance de calcul accrue et le perfectionnement des algorithmes d'apprentissage statistique (Janiesch et al., 2021), et aboutit dès les années 2010 à l'essor du</w:t>
       </w:r>
       <w:r>
         <w:t xml:space="preserve"> </w:t>
@@ -2724,7 +2724,7 @@
         <w:pStyle w:val="FirstParagraph"/>
       </w:pPr>
       <w:r>
-        <w:t xml:space="preserve">En quarante ans, la fonction RH est passée de l'administration du personnel (paie, contrats, dossiers) à une gestion élargie du recrutement, de la formation et de la mobilité, puis à un rôle de partenaire stratégique de la direction, porté par la reconnaissance du capital humain comme avantage concurrentiel (Stone et al., 2015). Elle s'accompagne d'une exigence de valeur démontrable, terrain favorable aux outils de mesure et d'optimisation : l'IA, technologie d'analyse et de prédiction, s'inscrit dans cette légitimation par la donnée.</w:t>
+        <w:t xml:space="preserve">En quarante ans, la fonction RH est passée de l'administration du personnel (paie, contrats, dossiers) à une gestion élargie du recrutement, de la formation et de la mobilité, puis à un rôle de partenaire stratégique de la direction, porté par la reconnaissance du capital humain comme avantage concurrentiel (Stone et al., 2015). Cette évolution s'accompagne d'une exigence de valeur démontrable, terrain favorable aux outils de mesure et d'optimisation : l'IA, technologie d'analyse et de prédiction, s'inscrit dans cette légitimation par la donnée.</w:t>
       </w:r>
     </w:p>
     <w:bookmarkEnd w:id="41"/>
@@ -2746,7 +2746,7 @@
         <w:pStyle w:val="FirstParagraph"/>
       </w:pPr>
       <w:r>
-        <w:t xml:space="preserve">Parallèlement, les systèmes d'information de ressources humaines (SIRH) ont centralisé les données, automatisé les tâches transactionnelles et externalisé certaines fonctions, dynamique étudiée de longue date par la littérature e-HRM (Bondarouk &amp; Ruël, 2009 ; Bondarouk et al., 2017 ; Marler &amp; Fisher, 2013 ; Strohmeier, 2007). Le passage du SIRH à l'IA relève donc moins de la rupture que du continuum : là où les SIRH ont rendu les données disponibles, l'IA leur confère un pouvoir prédictif et prescriptif, les organisations au socle mature paraissant mieux préparées (Bondarouk et al., 2017). La</w:t>
+        <w:t xml:space="preserve">Parallèlement, les systèmes d'information de ressources humaines (SIRH) ont centralisé les données, automatisé les tâches transactionnelles et externalisé certaines fonctions, dynamique étudiée de longue date par la littérature e-HRM (Bondarouk &amp; Ruël, 2009 ; Bondarouk et al., 2017 ; Marler &amp; Fisher, 2013 ; Strohmeier, 2007). Le passage du SIRH à l'IA peut ainsi se lire, au moins sur le plan des conditions organisationnelles, dans une logique de continuité plutôt que de rupture : là où les SIRH ont rendu les données disponibles, l'IA leur confère un pouvoir prédictif et prescriptif, les organisations dotées d’un socle SIRH mature paraissant mieux préparées (Bondarouk et al., 2017). La</w:t>
       </w:r>
       <w:r>
         <w:t xml:space="preserve"> </w:t>
@@ -2762,7 +2762,7 @@
         <w:t xml:space="preserve"> </w:t>
       </w:r>
       <w:r>
-        <w:t xml:space="preserve">désigne une configuration où l'IA ne remplace pas le professionnel mais étend ses capacités d'analyse et de décision (Budhwar et al., 2022 ; Tambe et al., 2019) ; Tambe et al. (2019) y identifient quatre défis, la complexité des phénomènes humains, la rareté des données, la sensibilité aux biais éthiques et juridiques et les réactions des salariés à une gestion algorithmique de leur trajectoire.</w:t>
+        <w:t xml:space="preserve">désigne une configuration où l'IA ne remplace pas le professionnel mais étend ses capacités d'analyse et de décision (Budhwar et al., 2022 ; Tambe et al., 2019) ; Tambe et al. (2019) y identifient quatre défis : la complexité des phénomènes humains, la rareté des données, les contraintes éthiques et juridiques qui pèsent sur l’expérimentation, et les réactions des salariés à une gestion algorithmique de leur trajectoire.</w:t>
       </w:r>
     </w:p>
     <w:p>
@@ -2802,7 +2802,7 @@
         <w:pStyle w:val="BodyText"/>
       </w:pPr>
       <w:r>
-        <w:t xml:space="preserve">Dans le Souss-Massa, la trajectoire de la fonction RH paraît enfin plus compressée qu'en Europe occidentale ou en Amérique du Nord, certaines organisations ayant pu passer en moins d'une décennie d'une administration du personnel rudimentaire à l'exposition aux outils d'IA. Cette hypothèse de « compression historique », non étayée par une littérature empirique systématique, compte parmi les questions exploratoires que la recherche instruira en confrontant les trajectoires marocaines aux étapes décrites par la littérature internationale (Bondarouk et al., 2017 ; Stone et al., 2015) ; la rareté de la littérature marocaine sur l'adoption de l'IA en RH justifie d'ailleurs scientifiquement la recherche.</w:t>
+        <w:t xml:space="preserve">Dans le Souss-Massa, enfin, la trajectoire de la fonction RH paraît plus compressée qu'en Europe occidentale ou en Amérique du Nord, certaines organisations ayant pu passer en moins d'une décennie d'une administration du personnel rudimentaire à l'exposition aux outils d'IA. Cette hypothèse de « compression historique », non étayée par une littérature empirique systématique, compte parmi les questions exploratoires que la recherche instruira en confrontant les trajectoires marocaines aux étapes décrites par la littérature internationale (Bondarouk et al., 2017 ; Stone et al., 2015) ; la rareté des travaux marocains sur l'adoption de l'IA en RH, au périmètre des bases consultées (Annexe F), renforce d'ailleurs l'intérêt scientifique de cette investigation.</w:t>
       </w:r>
     </w:p>
     <w:bookmarkEnd w:id="42"/>
@@ -2824,15 +2824,7 @@
         <w:pStyle w:val="FirstParagraph"/>
       </w:pPr>
       <w:r>
-        <w:t xml:space="preserve">Quatre domaines structurent l'offre d'outils d'IA en ressources humaines : le recrutement, la gestion des talents, la formation et l'écoute des collaborateurs. Plutôt que d'en dresser le catalogue, la même question leur est posée : que la littérature établit-elle, sur quelle base probante, et que laisse-t-elle ouvert ? La réponse varie fortement d'un domaine à l'autre, variation qui est elle-même un résultat de la revue.</w:t>
-      </w:r>
-    </w:p>
-    <w:p>
-      <w:pPr>
-        <w:pStyle w:val="BodyText"/>
-      </w:pPr>
-      <w:r>
-        <w:t xml:space="preserve">Le recrutement est le domaine le plus avancé et le plus publié (Black &amp; van Esch, 2020 ; Pillai &amp; Sivathanu, 2020 ; Suen et al., 2019) :</w:t>
+        <w:t xml:space="preserve">Quatre domaines structurent l'offre d'outils d'IA en ressources humaines : le recrutement, la gestion des talents outillée par le</w:t>
       </w:r>
       <w:r>
         <w:t xml:space="preserve"> </w:t>
@@ -2842,13 +2834,18 @@
           <w:iCs/>
           <w:i/>
         </w:rPr>
-        <w:t xml:space="preserve">parsing</w:t>
-      </w:r>
-      <w:r>
-        <w:t xml:space="preserve"> </w:t>
-      </w:r>
-      <w:r>
-        <w:t xml:space="preserve">automatique de CV,</w:t>
+        <w:t xml:space="preserve">people analytics</w:t>
+      </w:r>
+      <w:r>
+        <w:t xml:space="preserve">, la formation et l'écoute des collaborateurs. Plutôt que d'en dresser le catalogue, on leur adresse à chacun la même question : que la littérature établit-elle, sur quelle base probante, et que laisse-t-elle ouvert ? La réponse varie fortement d'un domaine à l'autre, variation qui est elle-même un résultat de la revue.</w:t>
+      </w:r>
+    </w:p>
+    <w:p>
+      <w:pPr>
+        <w:pStyle w:val="BodyText"/>
+      </w:pPr>
+      <w:r>
+        <w:t xml:space="preserve">Le recrutement est le domaine le plus avancé et le plus publié (Black &amp; van Esch, 2020 ; Pillai &amp; Sivathanu, 2020 ; Suen et al., 2019) :</w:t>
       </w:r>
       <w:r>
         <w:t xml:space="preserve"> </w:t>
@@ -2858,21 +2855,13 @@
           <w:iCs/>
           <w:i/>
         </w:rPr>
-        <w:t xml:space="preserve">matching</w:t>
-      </w:r>
-      <w:r>
-        <w:t xml:space="preserve"> </w:t>
-      </w:r>
-      <w:r>
-        <w:t xml:space="preserve">candidat-poste, chatbots pour les premières étapes de la relation candidat, analyses vidéo automatisées d'entretiens. L'efficacité opérationnelle des étapes amont est établie ; ce qui divise tient au point de vue adopté. Black et van Esch (2020) raisonnent en managers et situent l'intérêt de ces outils dans la prise en charge de tâches répétitives à faible valeur ajoutée, sans préciser à quelles conditions les recruteurs consentent à cette délégation ; Suen et al. (2019) montrent expérimentalement, côté candidat, que l'algorithme n'altère pas les évaluations finales mais dégrade l'expérience perçue lorsqu'elle paraît déshumanisée ; Pillai et Sivathanu (2020) se placent au niveau de l'organisation. Ces travaux ne se contredisent pas : ils ne traitent pas du même objet, et aucun ne porte sur le professionnel RH lui-même, premier indice de la lacune sectorielle discutée en section 1.5.</w:t>
-      </w:r>
-    </w:p>
-    <w:p>
-      <w:pPr>
-        <w:pStyle w:val="BodyText"/>
-      </w:pPr>
-      <w:r>
-        <w:t xml:space="preserve">Le</w:t>
+        <w:t xml:space="preserve">parsing</w:t>
+      </w:r>
+      <w:r>
+        <w:t xml:space="preserve"> </w:t>
+      </w:r>
+      <w:r>
+        <w:t xml:space="preserve">automatique de CV,</w:t>
       </w:r>
       <w:r>
         <w:t xml:space="preserve"> </w:t>
@@ -2882,13 +2871,21 @@
           <w:iCs/>
           <w:i/>
         </w:rPr>
-        <w:t xml:space="preserve">people analytics</w:t>
-      </w:r>
-      <w:r>
-        <w:t xml:space="preserve"> </w:t>
-      </w:r>
-      <w:r>
-        <w:t xml:space="preserve">applique aux données RH des techniques statistiques et algorithmiques à visée descriptive, prédictive ou prescriptive (Marler &amp; Boudreau, 2017) : prédiction des risques de départ, identification des hauts potentiels, analyse des écarts de rémunération, modélisation des parcours. La filiation avec la</w:t>
+        <w:t xml:space="preserve">matching</w:t>
+      </w:r>
+      <w:r>
+        <w:t xml:space="preserve"> </w:t>
+      </w:r>
+      <w:r>
+        <w:t xml:space="preserve">candidat-poste, chatbots pour les premières étapes de la relation candidat, analyses vidéo automatisées d'entretiens. L'efficacité opérationnelle des étapes amont est établie ; ce qui divise tient au point de vue adopté. Black et van Esch (2020) raisonnent en managers et situent l'intérêt de ces outils dans la prise en charge de tâches répétitives à faible valeur ajoutée, sans préciser à quelles conditions les recruteurs consentent à cette délégation ; Suen et al. (2019) montrent expérimentalement, côté candidat, que l'algorithme n'altère pas les évaluations finales mais dégrade l'expérience vécue par les candidats lorsque l'entretien leur paraît déshumanisé ; Pillai et Sivathanu (2020) se placent, quant à eux, au niveau de l'organisation et de ses conditions d'adoption, sans descendre au niveau des professionnels qui manipulent ces outils. Ces travaux ne se contredisent pas : ils ne traitent pas du même objet, et aucun ne porte sur le professionnel RH lui-même, premier indice de la lacune sectorielle discutée en section 1.5.</w:t>
+      </w:r>
+    </w:p>
+    <w:p>
+      <w:pPr>
+        <w:pStyle w:val="BodyText"/>
+      </w:pPr>
+      <w:r>
+        <w:t xml:space="preserve">Le</w:t>
       </w:r>
       <w:r>
         <w:t xml:space="preserve"> </w:t>
@@ -2898,21 +2895,13 @@
           <w:iCs/>
           <w:i/>
         </w:rPr>
-        <w:t xml:space="preserve">business intelligence</w:t>
-      </w:r>
-      <w:r>
-        <w:t xml:space="preserve"> </w:t>
-      </w:r>
-      <w:r>
-        <w:t xml:space="preserve">fondée sur les données massives est explicite (Chen et al., 2012). Le verdict de la revue la plus systématique est sévère : la preuve d'un impact stratégique reste largement à construire et la maturité analytique des fonctions RH demeure très inégale (Marler &amp; Boudreau, 2017). D'où une prudence méthodologique : l'utilité perçue déclarée ne saurait valoir utilité démontrée, et la proposition P1 sera instruite en interrogeant les bénéfices constatés autant qu'attendus.</w:t>
-      </w:r>
-    </w:p>
-    <w:p>
-      <w:pPr>
-        <w:pStyle w:val="BodyText"/>
-      </w:pPr>
-      <w:r>
-        <w:t xml:space="preserve">La formation et le développement des compétences sont transformés par les systèmes de recommandation, les parcours adaptatifs et la production de contenus pédagogiques par IA générative. Le contraste est frappant : aucune étude empirique de référence sur l'adoption de ces outils par les professionnels RH eux-mêmes n'a été identifiée dans les bases consultées, selon la stratégie de recherche décrite en Annexe F. Les arguments disponibles procèdent par extrapolation : Marler et Boudreau (2017) défendent une approche</w:t>
+        <w:t xml:space="preserve">people analytics</w:t>
+      </w:r>
+      <w:r>
+        <w:t xml:space="preserve"> </w:t>
+      </w:r>
+      <w:r>
+        <w:t xml:space="preserve">applique aux données RH des techniques statistiques et algorithmiques à visée descriptive, prédictive ou prescriptive (Marler &amp; Boudreau, 2017) : prédiction des risques de départ, identification des hauts potentiels, analyse des écarts de rémunération, modélisation des parcours. La filiation avec la</w:t>
       </w:r>
       <w:r>
         <w:t xml:space="preserve"> </w:t>
@@ -2922,13 +2911,21 @@
           <w:iCs/>
           <w:i/>
         </w:rPr>
-        <w:t xml:space="preserve">evidence-based</w:t>
-      </w:r>
-      <w:r>
-        <w:t xml:space="preserve"> </w:t>
-      </w:r>
-      <w:r>
-        <w:t xml:space="preserve">du développement des compétences sans traiter les dispositifs adaptatifs ; Tambe et al. (2019) rappellent que les jeux de données RH sont souvent trop restreints pour entraîner des modèles robustes. L'individualisation promise suppose une masse critique de traces d'apprentissage et une infrastructure de</w:t>
+        <w:t xml:space="preserve">business intelligence</w:t>
+      </w:r>
+      <w:r>
+        <w:t xml:space="preserve"> </w:t>
+      </w:r>
+      <w:r>
+        <w:t xml:space="preserve">fondée sur les données massives est explicite (Chen et al., 2012). Le verdict de la revue la plus systématique est sévère : la preuve d'un impact stratégique reste largement à construire et la maturité analytique des fonctions RH demeure très inégale (Marler &amp; Boudreau, 2017). D'où une prudence méthodologique : l'utilité perçue déclarée ne saurait tenir lieu d'utilité démontrée, et la proposition P1 sera instruite en interrogeant les bénéfices constatés autant qu'attendus.</w:t>
+      </w:r>
+    </w:p>
+    <w:p>
+      <w:pPr>
+        <w:pStyle w:val="BodyText"/>
+      </w:pPr>
+      <w:r>
+        <w:t xml:space="preserve">La formation et le développement des compétences sont transformés par les systèmes de recommandation, les parcours adaptatifs et la production de contenus pédagogiques par IA générative. Le contraste est frappant : aucune étude empirique de référence sur l'adoption de ces outils par les professionnels RH eux-mêmes n'a été identifiée dans les bases consultées, selon la stratégie de recherche décrite en Annexe F. Les arguments disponibles procèdent par extrapolation : Marler et Boudreau (2017) défendent une approche</w:t>
       </w:r>
       <w:r>
         <w:t xml:space="preserve"> </w:t>
@@ -2938,6 +2935,22 @@
           <w:iCs/>
           <w:i/>
         </w:rPr>
+        <w:t xml:space="preserve">evidence-based</w:t>
+      </w:r>
+      <w:r>
+        <w:t xml:space="preserve"> </w:t>
+      </w:r>
+      <w:r>
+        <w:t xml:space="preserve">du développement des compétences sans traiter les dispositifs adaptatifs ; Tambe et al. (2019) rappellent que les jeux de données RH sont souvent trop restreints pour entraîner des modèles robustes. L'individualisation promise suppose une masse critique de traces d'apprentissage et une infrastructure de</w:t>
+      </w:r>
+      <w:r>
+        <w:t xml:space="preserve"> </w:t>
+      </w:r>
+      <w:r>
+        <w:rPr>
+          <w:iCs/>
+          <w:i/>
+        </w:rPr>
         <w:t xml:space="preserve">learning analytics</w:t>
       </w:r>
       <w:r>
@@ -2952,7 +2965,7 @@
         <w:pStyle w:val="BodyText"/>
       </w:pPr>
       <w:r>
-        <w:t xml:space="preserve">Un quatrième domaine, plus récent et plus contesté, analyse l'engagement et le climat social par des outils d'écoute collaborateur algorithmique, appliquant l'analyse de sentiment à des enquêtes ouvertes, des messages internes ou des réseaux sociaux d'entreprise. Ces solutions promettent une visibilité accrue mais soulèvent de vives questions éthiques de surveillance et de confidentialité (Charlwood &amp; Guenole, 2022 ; Tursunbayeva et al., 2022). C'est le seul domaine où la controverse éthique précède la diffusion des usages : il révèle les arbitrages normatifs que les professionnels RH opèrent en amont de toute considération d'efficacité.</w:t>
+        <w:t xml:space="preserve">Un quatrième domaine, plus récent et plus contesté, porte sur l'analyse de l'engagement et du climat social par des outils algorithmiques d'écoute des collaborateurs, appliquant l'analyse de sentiment à des enquêtes ouvertes, des messages internes ou des réseaux sociaux d'entreprise. Ces solutions promettent une visibilité accrue mais soulèvent de vives questions éthiques de surveillance et de confidentialité (Charlwood &amp; Guenole, 2022 ; Tursunbayeva et al., 2022). C'est le seul domaine où la controverse éthique précède la diffusion des usages : il révèle les arbitrages normatifs que les professionnels RH opèrent en amont de toute considération d'efficacité.</w:t>
       </w:r>
     </w:p>
     <w:p>
@@ -3053,7 +3066,7 @@
         <w:t xml:space="preserve"> </w:t>
       </w:r>
       <w:r>
-        <w:t xml:space="preserve">L'adoption de l'IA en RH s'inscrit dans une dynamique jalonnée par la stratégisation de la fonction et la digitalisation des SIRH. La controverse entre continuité et rupture se résout par une dissociation : continuité des conditions organisationnelles, rupture des ressorts subjectifs. La cartographie ajoute un enseignement moins attendu : l'état de la preuve empirique varie radicalement d'un domaine à l'autre, du recrutement abondamment documenté à la formation adaptative, presque absente de la littérature ; là où la preuve existe, elle porte rarement sur le professionnel RH lui-même. Trois propositions en découlent. Le verdict réservé de Marler et Boudreau (2017) conduit à instruire la proposition P1 en distinguant utilité attendue et utilité constatée ; la continuité des conditions organisationnelles, établie par Bondarouk et al. (2017), fonde la proposition P4 ; l'hypothèse d'une trajectoire de digitalisation compressée dans le tissu marocain, formulée à titre exploratoire, appelle la proposition P7 et son examen sur le terrain.</w:t>
+        <w:t xml:space="preserve">L'adoption de l'IA en RH s'inscrit dans une dynamique jalonnée par la stratégisation de la fonction et la digitalisation des SIRH. La controverse entre continuité et rupture se résout par une dissociation : continuité des conditions organisationnelles, rupture des ressorts subjectifs. La cartographie ajoute un enseignement moins attendu : l'état de la preuve empirique varie radicalement d'un domaine à l'autre, du recrutement abondamment documenté à la formation adaptative, presque absente des travaux recensés (Annexe F) ; là où la preuve existe, elle porte rarement sur le professionnel RH lui-même. Trois propositions en découlent. Le verdict réservé de Marler et Boudreau (2017) conduit à instruire la proposition P1 en distinguant utilité attendue et utilité constatée ; la continuité des conditions organisationnelles, établie par Bondarouk et al. (2017), fonde la proposition P4 ; l'hypothèse d'une trajectoire de digitalisation compressée dans le tissu marocain, formulée à titre exploratoire, appelle la proposition P7 et son examen sur le terrain.</w:t>
       </w:r>
     </w:p>
     <w:bookmarkEnd w:id="46"/>
@@ -3084,7 +3097,7 @@
         <w:pStyle w:val="BodyText"/>
       </w:pPr>
       <w:r>
-        <w:t xml:space="preserve">Le champ s'est structuré dès les années 2000. Strohmeier (2007), dans une première revue systématique, distingue objectifs opérationnels, relationnels et transformationnels, typologie largement reprise ; Bondarouk et Ruël (2009) posent les défis structurels du champ, mesure des bénéfices, écart entre intentions et usage, tension entre standardisation et personnalisation ; Parry et Tyson (2011) démontrent empiriquement l'écart systématique entre objectifs déclarés et résultats observés, les organisations promettant des transformations stratégiques pour surtout constater des gains transactionnels, d'où la nécessité de distinguer l'intention d'adopter de l'intégration effective ; Marler et Fisher (2013) concluent, en revue</w:t>
+        <w:t xml:space="preserve">Le champ s'est structuré dès les années 2000. Strohmeier (2007), dans une première revue systématique, distingue objectifs opérationnels, relationnels et transformationnels, typologie largement reprise ; Bondarouk et Ruël (2009) posent les défis structurels du champ : mesure des bénéfices, écart entre intentions et usage, tension entre standardisation et personnalisation ; Parry et Tyson (2011) démontrent empiriquement l'écart systématique entre objectifs déclarés et résultats observés, les organisations annonçant des transformations stratégiques alors qu’elles ne constatent, pour l’essentiel, que des gains transactionnels, d'où la nécessité de distinguer l'intention d'adopter de l'intégration effective ; Marler et Fisher (2013) concluent, en revue</w:t>
       </w:r>
       <w:r>
         <w:t xml:space="preserve"> </w:t>
@@ -3097,7 +3110,7 @@
         <w:t xml:space="preserve">evidence-based</w:t>
       </w:r>
       <w:r>
-        <w:t xml:space="preserve">, que la contribution stratégique de l'e-HRM n'est jamais automatique mais dépend de la maturité organisationnelle, du pilotage et de l'engagement de la direction, conclusion très actuelle pour l'IA (Tambe et al., 2019) ; Bondarouk et al. (2017) périodisent enfin quatre décennies du champ et signalent la sous-représentation persistante des contextes non occidentaux.</w:t>
+        <w:t xml:space="preserve">, que la contribution stratégique de l'e-HRM n'est pas automatique mais dépend de la maturité organisationnelle, du pilotage et de l'engagement de la direction, conclusion que les travaux sur l'IA reprennent à leur compte (Tambe et al., 2019) ; Bondarouk et al. (2017) périodisent enfin les quatre décennies de recherche sur l’e-HRM et signalent la sous-représentation persistante des contextes non occidentaux.</w:t>
       </w:r>
     </w:p>
     <w:p>
@@ -3121,7 +3134,7 @@
         <w:t xml:space="preserve"> </w:t>
       </w:r>
       <w:r>
-        <w:t xml:space="preserve">par Marler et Boudreau (2017) : établi sur des objets techniques différents et à des périodes distinctes, il est l'un des rares acquis solides du champ. Une question reste en suspens : cet écart traduit-il un déficit réel de mise en œuvre ou une asymétrie de mesure, objectifs énoncés en termes stratégiques et résultats en termes transactionnels ? Aucun travail recensé ne tranche ; un dispositif qualitatif peut éclairer l'alternative par le récit que les praticiens font de la distance entre l'attendu et l'obtenu. La transposition comporte cependant une limite : les systèmes e-HRM sont transactionnels, ils exécutent et enregistrent ; l'IA introduit des systèmes qui recommandent, classent et prédisent, intervenant dans le jugement professionnel plutôt qu'en aval. Les enseignements e-HRM restent valides pour les conditions d'usage, mais muets sur la relation d'un professionnel à un outil qui empiète sur son expertise.</w:t>
+        <w:t xml:space="preserve">par Marler et Boudreau (2017) : établi sur des objets techniques différents et à des périodes distinctes, il est l'un des rares acquis solides du champ. Une question reste en suspens : cet écart traduit-il un déficit réel de mise en œuvre ou une asymétrie de mesure, les objectifs étant énoncés en termes stratégiques et les résultats en termes transactionnels ? Aucun travail recensé ne tranche ; un dispositif qualitatif peut éclairer l'alternative par le récit que les praticiens font de la distance entre l'attendu et l'obtenu. La transposition comporte cependant une limite : les systèmes e-HRM sont transactionnels : ils exécutent et enregistrent ; l'IA introduit des systèmes qui recommandent, classent et prédisent, et qui interviennent dans le jugement professionnel lui-même plutôt qu'en aval de celui-ci. Les enseignements e-HRM restent valides pour les conditions d'usage, mais muets sur la relation d'un professionnel à un outil qui empiète sur son expertise.</w:t>
       </w:r>
     </w:p>
     <w:p>
@@ -3139,7 +3152,7 @@
         <w:t xml:space="preserve"> </w:t>
       </w:r>
       <w:r>
-        <w:t xml:space="preserve">Deux décennies de recherche e-HRM livrent trois enseignements transposables : distinguer l'intention déclarée de l'usage effectif (Parry &amp; Tyson, 2011) ; tenir la contribution stratégique pour conditionnelle, suspendue à la maturité organisationnelle et au pilotage (Marler &amp; Fisher, 2013) ; compter avec la sous-représentation persistante des contextes non occidentaux (Bondarouk et al., 2017). Le premier justifie deux variables dépendantes distinctes, l'intention d'adoption et l'usage effectif ; le deuxième fonde la proposition P4 ; le troisième nourrit la lacune contextuelle et la proposition P7. Cet héritage ne permet pas d'anticiper les effets propres d'un système qui intervient dans le jugement professionnel : c'est l'objet de la section suivante.</w:t>
+        <w:t xml:space="preserve">Deux décennies de recherche e-HRM livrent trois enseignements transposables : distinguer l'intention déclarée de l'usage effectif (Parry &amp; Tyson, 2011) ; tenir la contribution stratégique pour conditionnelle, suspendue à la maturité organisationnelle et au pilotage (Marler &amp; Fisher, 2013) ; compter avec la sous-représentation persistante des contextes non occidentaux (Bondarouk et al., 2017). Le premier justifie deux variables dépendantes distinctes, l'intention d'adoption et l'usage effectif ; le deuxième fonde la proposition P4 ; le troisième conforte le constat de la lacune contextuelle et fonde la proposition P7. Cet héritage ne permet pas d'anticiper les effets propres d'un système qui intervient dans le jugement professionnel : c'est l'objet de la section suivante.</w:t>
       </w:r>
     </w:p>
     <w:bookmarkEnd w:id="48"/>
@@ -3211,15 +3224,15 @@
         <w:t xml:space="preserve">matching</w:t>
       </w:r>
       <w:r>
-        <w:t xml:space="preserve">) mais montre ses limites aux étapes aval, plus relationnelles ; leur perspective reste managériale et prescriptive. Suen et al. (2019), par une étude expérimentale sur les entretiens vidéo automatisés, abordent, en complément, les réactions des candidats : l'algorithme n'affecte pas significativement les évaluations finales mais dégrade l'expérience candidat perçue comme déshumanisée, rappel que ces bénéficiaires indirects sont aussi des parties prenantes dont les réactions affectent l'usage en retour. Pillai et Sivathanu (2020) livrent l'une des rares études empiriques à cadre intégré, combinant UTAUT et modèle Technology-Organization-Environment (T-O-E), sur le secteur des technologies de l'information en Inde : ils confirment le rôle central de l'utilité et de la facilité d'usage perçues tout en révélant le poids des facteurs organisationnels et environnementaux ; la similarité contextuelle en fait le point de comparaison le plus pertinent pour ce mémoire. Les enjeux éthiques forment le second pan critique : Charlwood et Guenole (2022) théorisent les paradoxes de la fonction RH face à l'IA, efficacité contre équité, objectivation contre reproduction des biais, augmentation contre remplacement, transparence contre opacité, dilemmes structurels qui pèsent sur les attitudes des professionnels et où s'enracine en partie la proposition P5.</w:t>
-      </w:r>
-    </w:p>
-    <w:p>
-      <w:pPr>
-        <w:pStyle w:val="BodyText"/>
-      </w:pPr>
-      <w:r>
-        <w:t xml:space="preserve">Le bilan de ce premier ensemble se dresse ainsi : accord net sur les bénéfices opérationnels des étapes amont, corroboré par des méthodes différentes ; désaccord sur ce que ces bénéfices coûtent, et à qui, trois réponses coexistant sans se rencontrer, la dégradation de l'expérience candidat (Suen et al., 2019), des conditions organisationnelles et environnementales exigeantes (Pillai &amp; Sivathanu, 2020), des dilemmes normatifs pour la fonction (Charlwood &amp; Guenole, 2022). Reste ouverte la question de l'arbitrage : comment un professionnel RH, en situation, tranche-t-il entre un gain d'efficacité tangible et un coût éthique diffus ? Aucun travail recensé ne l'observe directement, ce qui délimite l'apport de la présente recherche.</w:t>
+        <w:t xml:space="preserve">) mais montre ses limites aux étapes aval, plus relationnelles ; leur perspective reste managériale et prescriptive. Suen et al. (2019), par une étude expérimentale sur les entretiens vidéo automatisés, abordent, en complément, les réactions des candidats : l'algorithme n'affecte pas significativement les évaluations finales mais dégrade l'expérience candidat perçue comme déshumanisée, rappel que les candidats, destinataires indirects de l'outil, sont aussi des parties prenantes dont les réactions affectent l'usage en retour. Pillai et Sivathanu (2020) livrent l'une des rares études empiriques à cadre intégré, combinant UTAUT et le modèle Technology-Organization-Environment (T-O-E), sur le secteur des technologies de l'information en Inde : ils confirment le rôle central de l'utilité et de la facilité d'usage perçues tout en révélant le poids des facteurs organisationnels et environnementaux ; la similarité contextuelle en fait le point de comparaison le plus pertinent pour ce mémoire. Les enjeux éthiques forment le second pan critique : Charlwood et Guenole (2022) théorisent les paradoxes de la fonction RH face à l'IA, efficacité contre équité, objectivation contre reproduction des biais, augmentation contre remplacement, transparence contre opacité, dilemmes structurels qui pèsent sur les attitudes des professionnels et où s'enracine en partie la proposition P5.</w:t>
+      </w:r>
+    </w:p>
+    <w:p>
+      <w:pPr>
+        <w:pStyle w:val="BodyText"/>
+      </w:pPr>
+      <w:r>
+        <w:t xml:space="preserve">Le bilan de ce premier ensemble s’établit ainsi : accord net sur les bénéfices opérationnels des étapes amont, corroboré par des méthodes différentes ; désaccord sur ce que ces bénéfices coûtent, et à qui, trois réponses coexistant sans se rencontrer, la dégradation de l'expérience candidat (Suen et al., 2019), des conditions organisationnelles et environnementales exigeantes (Pillai &amp; Sivathanu, 2020), des dilemmes normatifs pour la fonction (Charlwood &amp; Guenole, 2022). Reste ouverte la question de l'arbitrage : comment un professionnel RH, en situation, tranche-t-il entre un gain d'efficacité tangible et un coût éthique diffus ? Aucun travail recensé ne l'observe directement, ce qui délimite l'apport de la présente recherche.</w:t>
       </w:r>
     </w:p>
     <w:bookmarkEnd w:id="49"/>
@@ -3270,15 +3283,15 @@
         <w:t xml:space="preserve">evidence-based</w:t>
       </w:r>
       <w:r>
-        <w:t xml:space="preserve">, l'écart entre discours promotionnels et réalité des pratiques : les usages réellement transformés restent rares et la preuve d'un impact organisationnel demeure à construire, ce que rejoint Parry et Tyson (2011) sur l'e-HRM, confirmant un écart structurel entre attentes et résultats. Tambe et al. (2019), dans un article de référence, identifient quatre défis propres à l'IA en RH : la complexité des phénomènes humains, difficiles à modéliser algorithmiquement ; la rareté relative des données RH ; les biais éthiques et juridiques, majeurs dès lors que les décisions affectent des trajectoires individuelles ; la fragilité de la légitimité sociale d'une gestion algorithmique. Ces défis complètent la grille TAM/UTAUT et justifient une analyse qualitative attentive aux ressorts subjectifs des professionnels ; Vrontis et al. (2022) confirment ces tensions en revue systématique et pointent l'hétérogénéité des situations selon les secteurs, les pays et les sous-domaines RH.</w:t>
-      </w:r>
-    </w:p>
-    <w:p>
-      <w:pPr>
-        <w:pStyle w:val="BodyText"/>
-      </w:pPr>
-      <w:r>
-        <w:t xml:space="preserve">Le statut épistémique de ces contributions conditionne leur usage. Tambe et al. (2019) proposent une analyse conceptuelle adossée à l'expérience du champ, non une étude empirique : leurs quatre défis forment une grille féconde, mais leur poids respectif dans les décisions d'adoption n'a pas été mesuré. Vrontis et al. (2022) et Budhwar et al. (2022) sont des revues systématiques concluant toutes deux à l'hétérogénéité des situations et appelant à des recherches contextualisées. La littérature sur l'IA en gestion des talents est ainsi riche en cadrages et en revues, pauvre en études primaires sur les praticiens : ce déséquilibre plaide pour une contribution empirique de première main.</w:t>
+        <w:t xml:space="preserve">, l'écart entre discours promotionnels et réalité des pratiques : les usages réellement transformés restent rares et la preuve d'un impact organisationnel demeure à construire, constat que rejoignent Parry et Tyson (2011) pour l'e-HRM et qui confirme un écart structurel entre attentes et résultats. Tambe et al. (2019), dans un article de référence, identifient quatre défis propres à l'IA en RH : la complexité des phénomènes humains, difficiles à modéliser algorithmiquement ; la rareté relative des données RH ; les enjeux éthiques et juridiques, majeurs dès lors que les décisions affectent des trajectoires individuelles ; la fragilité de la légitimité sociale d'une gestion algorithmique. Ces défis complètent la grille TAM/UTAUT et justifient une analyse qualitative attentive aux ressorts subjectifs des professionnels ; Vrontis et al. (2022) confirment ces tensions en revue systématique et pointent l'hétérogénéité des situations selon les secteurs, les pays et les sous-domaines RH.</w:t>
+      </w:r>
+    </w:p>
+    <w:p>
+      <w:pPr>
+        <w:pStyle w:val="BodyText"/>
+      </w:pPr>
+      <w:r>
+        <w:t xml:space="preserve">Le statut épistémique de ces contributions conditionne leur usage. Tambe et al. (2019) proposent une analyse conceptuelle adossée à l'expérience du champ, non une étude empirique : leurs quatre défis forment une grille féconde, mais leur poids respectif dans les décisions d'adoption n'a pas été mesuré. Vrontis et al. (2022) et Budhwar et al. (2022) signent des revues systématiques concluant toutes deux à l'hétérogénéité des situations et appelant à des recherches contextualisées. La littérature sur l'IA en gestion des talents est ainsi riche en cadrages et en revues, pauvre en études primaires sur les praticiens : ce déséquilibre plaide pour une contribution empirique de première main.</w:t>
       </w:r>
     </w:p>
     <w:bookmarkEnd w:id="50"/>
@@ -3300,15 +3313,15 @@
         <w:pStyle w:val="FirstParagraph"/>
       </w:pPr>
       <w:r>
-        <w:t xml:space="preserve">Les implémentations les plus avancées, concentrées en Amérique du Nord, en Europe occidentale et en Asie de l'Est, combinent plusieurs outils intégrés à un écosystème SIRH cohérent et un appui fort de la direction générale (Vrontis et al., 2022), selon des trajectoires anticipées par Stone et al. (2015) et amplifiées par l'accélération numérique post-pandémique (Dwivedi et al., 2020). Trois épisodes controversés jalonnent cette diffusion, dont le statut doit être posé d'emblée : documentés par la presse économique internationale, par des décisions d'entreprise rendues publiques et, pour l'un, par des procédures judiciaires en cours, ils ne sont pas des données scientifiques et leur valeur probante est faible ; on les mobilise parce qu'ils circulent largement et façonnent les représentations des praticiens. Amazon a abandonné en 2018 un algorithme expérimental de tri qui pénalisait systématiquement les CV de candidates, biais hérité de données d'entraînement majoritairement masculines (Charlwood &amp; Guenole, 2022 ; Tambe et al., 2019). HireVue a retiré en 2021 la composante d'analyse faciale de sa solution d'entretien vidéo, mise en cause pour sa validité scientifique et ses risques de discrimination indirecte ; Suen et al. (2019) documentent la dégradation de l'expérience perçue quand l'entretien paraît déshumanisé, et Langer et Landers (2021) montrent que les effets atteignent les observateurs tiers, dont les jugements pèsent sur la légitimité des outils. Workday, enfin, fait l'objet d'actions en justice aux États-Unis (2023-2024) pour des effets discriminatoires allégués de ses algorithmes de présélection.</w:t>
-      </w:r>
-    </w:p>
-    <w:p>
-      <w:pPr>
-        <w:pStyle w:val="BodyText"/>
-      </w:pPr>
-      <w:r>
-        <w:t xml:space="preserve">De trois cas on ne peut inférer une propriété générale : le risque de sélection des épisodes médiatisés interdit la généralisation. La revue systématique de Köchling et Wehner (2020) porte l'argument : la reproduction, voire l'amplification, des biais des données d'apprentissage constitue un risque transversal et structurel, indépendamment des cas médiatisés ; Charlwood et Guenole (2022) le formulent comme paradoxe, l'IA mobilisée pour objectiver les décisions pouvant amplifier les biais qu'elle prétendait neutraliser. Ces controverses pèsent sur les perceptions des professionnels RH : elles alimentent la vigilance éthique dont rendra compte la proposition P6 et l'anxiété portée par la proposition P5, et soulèvent une question que le guide d'entretien instruira avec précaution : ces cas sont-ils connus des professionnels de la région Souss-Massa, et avec quel effet sur leur rapport aux outils ?</w:t>
+        <w:t xml:space="preserve">Les implémentations les plus avancées, concentrées en Amérique du Nord, en Europe occidentale et en Asie de l'Est, combinent plusieurs outils, intégrés à un écosystème SIRH cohérent, et bénéficient d’un appui fort de la direction générale (Vrontis et al., 2022), selon des trajectoires anticipées par Stone et al. (2015) et amplifiées par l'accélération numérique post-pandémique (Dwivedi et al., 2020). Trois épisodes controversés jalonnent cette diffusion, dont le statut doit être posé d'emblée : documentés par la presse économique internationale, par des décisions d'entreprise rendues publiques et, pour l'un, par des procédures judiciaires en cours, ils ne sont pas des données scientifiques et leur valeur probante est faible ; on les mobilise parce qu'ils circulent largement et façonnent les représentations des praticiens. Amazon a abandonné en 2018 un algorithme expérimental de tri qui pénalisait systématiquement les CV de candidates, biais hérité de données d'entraînement majoritairement masculines (Charlwood &amp; Guenole, 2022 ; Tambe et al., 2019). HireVue a retiré en 2021 la composante d'analyse faciale de sa solution d'entretien vidéo, mise en cause pour sa validité scientifique et ses risques de discrimination indirecte ; Suen et al. (2019) documentent la dégradation de l'expérience perçue quand l'entretien paraît déshumanisé, et Langer et Landers (2021) montrent que les effets atteignent les observateurs tiers, dont les jugements pèsent sur la légitimité des outils. Workday, enfin, fait l'objet d'actions en justice aux États-Unis (2023-2024) pour des effets discriminatoires allégués de ses algorithmes de présélection.</w:t>
+      </w:r>
+    </w:p>
+    <w:p>
+      <w:pPr>
+        <w:pStyle w:val="BodyText"/>
+      </w:pPr>
+      <w:r>
+        <w:t xml:space="preserve">De trois cas on ne peut inférer une propriété générale : le biais de sélection des épisodes médiatisés interdit la généralisation. La revue systématique de Köchling et Wehner (2020) porte l'argument : la reproduction, voire l'amplification, des biais des données d'apprentissage constitue un risque transversal et structurel, indépendamment des cas médiatisés ; Charlwood et Guenole (2022) le formulent comme paradoxe, l'IA mobilisée pour objectiver les décisions pouvant amplifier les biais qu'elle prétendait neutraliser. Ces controverses pèsent sur les perceptions des professionnels RH : elles alimentent la vigilance éthique dont rendra compte la proposition P6 et l'anxiété portée par la proposition P5, et soulèvent une question que le guide d'entretien instruira avec précaution : ces cas sont-ils connus des professionnels de la région Souss-Massa, et avec quel effet sur leur rapport aux outils ?</w:t>
       </w:r>
     </w:p>
     <w:bookmarkEnd w:id="51"/>
@@ -3367,7 +3380,7 @@
         <w:t xml:space="preserve">Maroc Digital 2030</w:t>
       </w:r>
       <w:r>
-        <w:t xml:space="preserve">, lancée officiellement en septembre 2024, qui place la transformation numérique au cœur de l'agenda national ; la loi 09-08, placée sous le contrôle de la CNDP, qui encadre tout traitement algorithmique de données RH sensibles, aucune loi marocaine spécifique à l'IA n'ayant été adoptée à ce jour ; un tissu économique régional aux secteurs et aux tailles d'organisation très contrastés. Ces éléments ne démontrent rien par eux-mêmes : ils définissent les conditions concrètes de déploiement des mécanismes théoriques, et le guide d'entretien les mobilise en relances plutôt qu'en questions frontales. Le Tableau 2, qui récapitule les principaux travaux de cette revue en explicitant la nature et la portée de chacun, condition d'une évaluation lucide de leur degré de preuve, figure en Annexe G.</w:t>
+        <w:t xml:space="preserve">, lancée officiellement en septembre 2024, qui place la transformation numérique au cœur de l'agenda national ; la loi 09-08 relative à la protection des personnes physiques à l’égard du traitement des données à caractère personnel, placée sous le contrôle de la CNDP, qui s’applique aux traitements de données RH, y compris automatisés, aucune loi marocaine spécifique à l'IA n'ayant été adoptée à ce jour ; un tissu économique régional aux secteurs et aux tailles d'organisation très contrastés. Ces éléments ne démontrent rien par eux-mêmes : ils définissent les conditions concrètes de déploiement des mécanismes théoriques, et le guide d'entretien les mobilise en relances plutôt qu'en questions frontales. Le Tableau 2, qui récapitule les principaux travaux de cette revue en explicitant la nature et la portée de chacun, condition d'une évaluation lucide de leur degré de preuve, figure en Annexe G.</w:t>
       </w:r>
     </w:p>
     <w:p>
@@ -3429,7 +3442,7 @@
         <w:pStyle w:val="FirstParagraph"/>
       </w:pPr>
       <w:r>
-        <w:t xml:space="preserve">Quatre résultats peuvent être tenus pour établis, obtenus par des équipes distinctes, sur des objets différents et par des méthodes non convergentes : l'utilité perçue et la facilité d'usage perçue restent des déterminants centraux de l'adoption, y compris pour l'IA appliquée au recrutement (Davis, 1989 ; Pillai &amp; Sivathanu, 2020 ; Venkatesh et al., 2003), aucun travail recensé ne les infirmant ; l'écart entre intention déclarée et usage effectif est robuste, observé pour l'e-HRM (Parry &amp; Tyson, 2011), pour le</w:t>
+        <w:t xml:space="preserve">Quatre résultats peuvent être tenus pour établis, obtenus par des équipes distinctes, sur des objets différents et par des méthodes indépendantes : l'utilité perçue et la facilité d'usage perçue restent des déterminants centraux de l'adoption, y compris pour l'IA appliquée au recrutement (Davis, 1989 ; Pillai &amp; Sivathanu, 2020 ; Venkatesh et al., 2003), aucun travail recensé ne les infirmant ; l'écart entre intention déclarée et usage effectif est robuste, observé pour l'e-HRM (Parry &amp; Tyson, 2011), pour le</w:t>
       </w:r>
       <w:r>
         <w:t xml:space="preserve"> </w:t>
@@ -3499,7 +3512,7 @@
         <w:t xml:space="preserve"> </w:t>
       </w:r>
       <w:r>
-        <w:t xml:space="preserve">Le professionnel RH occupe, face à l'IA, une position qu'aucune recherche recensée ne prend pour objet, et l'insuffisance conjointe des travaux les plus proches fait la lacune : Suen et al. (2019) étudient les réactions des candidats, soumis à l'outil ; Marler et Boudreau (2017) raisonnent au niveau de l'organisation et de sa maturité analytique ; Pillai et Sivathanu (2020) saisissent l'adoption organisationnelle dans un cadre quantitatif ; Langer et Landers (2021) élargissent l'analyse aux observateurs tiers, où le professionnel RH figure en spectateur de l'automatisation et non en décideur ; Black et van Esch (2020) conseillent les managers sans documenter les conditions de leur adhésion. Sa position est pourtant théoriquement singulière : prescripteur, utilisateur et cible potentielle à la fois, l'automatisation d'une partie de ses tâches étant annoncée par la littérature qu'il lit (Charlwood &amp; Guenole, 2022 ; Meijerink et al., 2021). Les modèles d'acceptation reposent sur une hypothèse implicite que cette configuration met en défaut, celle d'un utilisateur dont l'emploi n'est pas menacé par la technologie qu'on lui demande d'adopter : la lacune n'est pas seulement empirique mais théorique, ce qui fonde l'introduction de la crainte du remplacement dans la proposition P5.</w:t>
+        <w:t xml:space="preserve">Le professionnel RH occupe, face à l'IA, une position qu'aucune recherche recensée ne prend pour objet, et l'insuffisance conjointe des travaux les plus proches établit cette lacune : Suen et al. (2019) étudient les réactions des candidats, soumis à l'outil ; Marler et Boudreau (2017) raisonnent au niveau de l'organisation et de sa maturité analytique ; Pillai et Sivathanu (2020) saisissent l'adoption organisationnelle dans un cadre quantitatif ; Langer et Landers (2021) élargissent l'analyse aux observateurs tiers, perspective dans laquelle le professionnel RH figure en spectateur de l'automatisation et non en décideur ; Black et van Esch (2020) conseillent les managers sans documenter les conditions de leur adhésion. La position du professionnel RH est pourtant théoriquement singulière : il est à la fois prescripteur, utilisateur et cible potentielle, l'automatisation d'une partie de ses tâches étant annoncée par la littérature qu'il lit (Charlwood &amp; Guenole, 2022 ; Meijerink et al., 2021). Les modèles d'acceptation reposent sur une hypothèse implicite que cette configuration met en défaut, celle d'un utilisateur dont l'emploi n'est pas menacé par la technologie qu'on lui demande d'adopter : la lacune n'est pas seulement empirique mais théorique, ce qui fonde l'introduction de la crainte du remplacement dans la proposition P5.</w:t>
       </w:r>
     </w:p>
     <w:p>
@@ -3517,7 +3530,7 @@
         <w:t xml:space="preserve"> </w:t>
       </w:r>
       <w:r>
-        <w:t xml:space="preserve">La sous-représentation de l'Afrique du Nord et du Maroc dans la production internationale, constatée par Bondarouk et al. (2017) pour tout le champ e-HRM, ne serait à elle seule qu'un argument de complétude documentaire. L'argument scientifique tient à la structure même des modèles mobilisés : plusieurs de leurs variables ont un contenu que la littérature reconnaît variable selon les configurations institutionnelles et culturelles. L'influence sociale, définie par Venkatesh et al. (2003) comme la perception des attentes d'autrui, opère ici comme pression normative entre pairs, là comme prescription hiérarchique difficilement discutable ; les conditions facilitantes recouvrent des réalités hétérogènes selon l'équipement des organisations ; le cadre légal, absent du modèle originel, structure ici le périmètre des usages licites. Dwivedi et al. (2019) montrent que le modèle a été validé sur des populations et environnements particuliers, et Budhwar et al. (2022) en tirent un appel à la contextualisation. On ignore donc si les mécanismes établis conservent le même contenu hors de leurs terrains d'origine, et le Maroc n'offre à ce jour, dans les bases consultées (Annexe F), aucun matériau indexé permettant d'en juger.</w:t>
+        <w:t xml:space="preserve">La sous-représentation de l'Afrique du Nord et du Maroc dans la production internationale, constatée par Bondarouk et al. (2017) pour tout le champ e-HRM, ne serait à elle seule qu'un argument de complétude documentaire. L'argument scientifique tient à la structure même des modèles mobilisés : plusieurs de leurs variables ont un contenu que la littérature reconnaît fluctuant selon les configurations institutionnelles et culturelles. L'influence sociale, définie par Venkatesh et al. (2003) comme la perception des attentes d'autrui, opère ici comme pression normative entre pairs, là comme prescription hiérarchique difficilement discutable ; les conditions facilitantes recouvrent des réalités hétérogènes selon l'équipement des organisations ; le cadre légal, absent du modèle originel, structure ici le périmètre des usages licites. Or, comme le rappelle la section 1.4.4, l’UTAUT n’a été validé que sur des populations et des environnements particuliers (Dwivedi et al., 2019), ce dont Budhwar et al. (2022) tirent un appel à la contextualisation. On ignore donc si les mécanismes établis conservent le même contenu hors de leurs terrains d'origine, et le Maroc n'offre à ce jour, dans les bases consultées (Annexe F), aucun matériau indexé permettant d'en juger.</w:t>
       </w:r>
     </w:p>
     <w:p>
@@ -3535,7 +3548,7 @@
         <w:t xml:space="preserve"> </w:t>
       </w:r>
       <w:r>
-        <w:t xml:space="preserve">Williams et al. (2015) documentent la prédominance écrasante des devis quantitatifs par questionnaire et équations structurelles dans la littérature UTAUT, que confirme le réexamen de Dwivedi et al. (2019). Or un instrument standardisé mesure l'intensité de construits déjà identifiés ; il ne peut, par construction, révéler un construit non anticipé. Les deux lacunes précédentes désignent des zones où de tels construits sont probables, et les questions restées ouvertes au terme du Tableau 3 portent sur des arbitrages, raisonnements que seule la parole des acteurs rend accessibles. Cette lacune n'est donc pas indépendante des deux autres : elle en est la conséquence et explique qu'elles n'aient pas été comblées. Les trois composent ainsi un verrou unique, une population peu étudiée, dans un contexte peu documenté, avec des instruments incapables de faire émerger ce qui n'a pas été prévu : y répondre suppose de changer simultanément les trois termes, ce que le dispositif exposé en Partie II entreprend.</w:t>
+        <w:t xml:space="preserve">Williams et al. (2015) documentent la prédominance écrasante des devis quantitatifs par questionnaire et équations structurelles dans la littérature UTAUT, que confirme le réexamen de Dwivedi et al. (2019). Or un instrument standardisé mesure l'intensité de construits déjà identifiés ; il ne peut, par construction, révéler un construit non anticipé. Les deux lacunes précédentes désignent des zones où de tels construits sont probables, et les questions restées ouvertes au terme du Tableau 3 portent sur des arbitrages, raisonnements que seule la parole des acteurs rend accessibles. Cette lacune n'est donc pas indépendante des deux autres : elle en est la conséquence et explique qu'elles n'aient pas été comblées. Les trois lacunes composent ainsi un verrou unique : une population peu étudiée, dans un contexte peu documenté, avec des instruments incapables de faire émerger ce qui n'a pas été prévu : y répondre suppose de changer simultanément les trois termes, ce que le dispositif exposé en Partie II entreprend.</w:t>
       </w:r>
     </w:p>
     <w:p>
@@ -3734,7 +3747,7 @@
         <w:t xml:space="preserve">perceived ease of use</w:t>
       </w:r>
       <w:r>
-        <w:t xml:space="preserve">), qui s'influencent mutuellement et subissent l'effet de variables externes contextuelles. Davis (1989) définit l'utilité perçue comme « le degré auquel une personne croit que l'utilisation d'un système améliorerait sa performance au travail », et la facilité d'usage perçue comme « le degré auquel une personne croit qu'utiliser un système serait exempt d'effort ».</w:t>
+        <w:t xml:space="preserve">), la facilité d'usage perçue nourrissant l'utilité perçue, l'une et l'autre subissant l'effet de variables externes contextuelles. Davis (1989) définit l'utilité perçue comme « le degré auquel une personne croit que l'utilisation d'un système améliorerait sa performance au travail », et la facilité d'usage perçue comme « le degré auquel une personne croit qu'utiliser un système serait exempt d'effort ».</w:t>
       </w:r>
     </w:p>
     <w:p>
@@ -3862,7 +3875,7 @@
         <w:pStyle w:val="FirstParagraph"/>
       </w:pPr>
       <w:r>
-        <w:t xml:space="preserve">L'articulation des deux croyances mérite examen. Davis (1989) postule qu'un outil aisé à prendre en main a plus de chances d'apporter une valeur effective, la facilité d'usage nourrissant l'utilité perçue : ce lien compte parmi les résultats les plus reproduits. Les synthèses ultérieures en relativisent la constance : Y. Lee et al. (2003), Williams et al. (2015) et Dwivedi et al. (2019) documentent une forte variabilité du poids relatif des deux croyances selon les contextes, le déterminant lié à l'effort perdant son pouvoir explicatif à mesure que l'expérience s'accroît. Le poids respectif de l'utilité et de la facilité ne se postule donc pas : il s'établit sur le terrain.</w:t>
+        <w:t xml:space="preserve">L'articulation des deux croyances mérite examen. Davis (1989) postule qu'un outil aisé à prendre en main a plus de chances d'apporter une valeur effective, la facilité d'usage nourrissant l'utilité perçue : ce lien compte parmi les résultats les plus reproduits. Les synthèses ultérieures en relativisent la constance : Y. Lee et al. (2003), Williams et al. (2015) et Dwivedi et al. (2019) documentent une forte variabilité du poids relatif des deux croyances selon les contextes, la facilité d'usage perçue perdant son pouvoir explicatif à mesure que l'expérience s'accroît. Le poids respectif de l'utilité et de la facilité ne se postule donc pas : il s'établit sur le terrain.</w:t>
       </w:r>
     </w:p>
     <w:p>
@@ -3946,55 +3959,39 @@
         <w:pStyle w:val="FirstParagraph"/>
       </w:pPr>
       <w:r>
-        <w:t xml:space="preserve">Le TAM 3 ajoute les antécédents de la facilité d'usage perçue : auto-efficacité informatique, héritée de Compeau et Higgins (1995), anxiété informatique, caractère ludique perçu et perception de contrôle externe (Venkatesh &amp; Bala, 2008). Ce positionnement de l'auto-efficacité et de l'anxiété en antécédents de la facilité d'usage, et non en déterminants directs de l'intention, sera repris</w:t>
-      </w:r>
-      <w:r>
-        <w:t xml:space="preserve"> </w:t>
+        <w:t xml:space="preserve">Le TAM 3 ajoute les antécédents de la facilité d'usage perçue : auto-efficacité informatique (héritée de Compeau &amp; Higgins, 1995), anxiété informatique, caractère ludique perçu et perception de contrôle externe (Venkatesh &amp; Bala, 2008). Ce positionnement de l'auto-efficacité et de l'anxiété en antécédents de la facilité d'usage, et non en déterminants directs de l'intention, sera repris tel quel dans le modèle de la section 2.5. Ces apports ouvrent surtout un espace conceptuel pour les freins psychologiques qu'ignoraient les modèles antérieurs : la proposition P5 s'y inscrit en interrogeant les craintes des professionnels RH face au remplacement, à la perte de valeur ajoutée humaine et aux transformations identitaires associées à l'IA.</w:t>
+      </w:r>
+    </w:p>
+    <w:bookmarkEnd w:id="67"/>
+    <w:bookmarkStart w:id="71" w:name="X89b906766a0f6c43e0d3729a1edab2d9f0b03d6"/>
+    <w:p>
+      <w:pPr>
+        <w:pStyle w:val="Heading4"/>
+      </w:pPr>
+      <w:r>
+        <w:rPr>
+          <w:bCs/>
+          <w:b/>
+        </w:rPr>
+        <w:t xml:space="preserve">2.2.3 UTAUT (Venkatesh et al., 2003) : l'unification du champ</w:t>
+      </w:r>
+    </w:p>
+    <w:p>
+      <w:pPr>
+        <w:pStyle w:val="FirstParagraph"/>
+      </w:pPr>
+      <w:r>
+        <w:t xml:space="preserve">Le modèle UTAUT (</w:t>
       </w:r>
       <w:r>
         <w:rPr>
           <w:iCs/>
           <w:i/>
         </w:rPr>
-        <w:t xml:space="preserve">stricto sensu</w:t>
-      </w:r>
-      <w:r>
-        <w:t xml:space="preserve"> </w:t>
-      </w:r>
-      <w:r>
-        <w:t xml:space="preserve">dans le modèle de la section 2.5. Ces apports ouvrent surtout un espace conceptuel pour les freins psychologiques qu'ignoraient les modèles antérieurs : la proposition P5 s'y inscrit en interrogeant les craintes des professionnels RH face au remplacement, aux biais et aux transformations identitaires associées à l'IA.</w:t>
-      </w:r>
-    </w:p>
-    <w:bookmarkEnd w:id="67"/>
-    <w:bookmarkStart w:id="71" w:name="X89b906766a0f6c43e0d3729a1edab2d9f0b03d6"/>
-    <w:p>
-      <w:pPr>
-        <w:pStyle w:val="Heading4"/>
-      </w:pPr>
-      <w:r>
-        <w:rPr>
-          <w:bCs/>
-          <w:b/>
-        </w:rPr>
-        <w:t xml:space="preserve">2.2.3 UTAUT (Venkatesh et al., 2003) : l'unification du champ</w:t>
-      </w:r>
-    </w:p>
-    <w:p>
-      <w:pPr>
-        <w:pStyle w:val="FirstParagraph"/>
-      </w:pPr>
-      <w:r>
-        <w:t xml:space="preserve">Le modèle UTAUT (</w:t>
-      </w:r>
-      <w:r>
-        <w:rPr>
-          <w:iCs/>
-          <w:i/>
-        </w:rPr>
         <w:t xml:space="preserve">Unified Theory of Acceptance and Use of Technology</w:t>
       </w:r>
       <w:r>
-        <w:t xml:space="preserve">) marque une étape théorique majeure : Venkatesh et al. (2003) y synthétisent huit modèles concurrents (TRA, TAM et TAM 2, théorie du comportement planifié, modèle motivationnel, modèle de l'utilisation des PC, théorie de la diffusion de l'innovation, théorie sociale cognitive) en un cadre intégré reposant sur quatre déterminants et quatre modérateurs.</w:t>
+        <w:t xml:space="preserve">) marque une étape théorique majeure : Venkatesh et al. (2003) y synthétisent huit modèles concurrents (TRA, TAM et TAM 2, théorie du comportement planifié, modèle combiné TAM-TPB, modèle motivationnel, modèle de l'utilisation des PC, théorie de la diffusion de l'innovation, théorie sociale cognitive) en un cadre intégré reposant sur quatre déterminants et quatre modérateurs.</w:t>
       </w:r>
     </w:p>
     <w:p>
@@ -4203,7 +4200,7 @@
         <w:pStyle w:val="BodyText"/>
       </w:pPr>
       <w:r>
-        <w:t xml:space="preserve">L'apport décisif d'UTAUT, les conditions facilitantes, intègre la dimension organisationnelle de l'adoption : la proposition P4 interroge la façon dont infrastructures, budgets, formation et accompagnement pèsent dans le passage de l'intention à l'usage effectif, articulation particulièrement adaptée à l'IA en RH.</w:t>
+        <w:t xml:space="preserve">L'apport décisif d'UTAUT, les conditions facilitantes, intègre la dimension organisationnelle de l'adoption : la proposition P4 interroge la façon dont les infrastructures, les budgets, la formation et l'accompagnement pèsent dans le passage de l'intention à l'usage effectif, articulation particulièrement pertinente pour l'IA en RH.</w:t>
       </w:r>
     </w:p>
     <w:bookmarkEnd w:id="71"/>
@@ -4249,7 +4246,7 @@
         <w:pStyle w:val="BodyText"/>
       </w:pPr>
       <w:r>
-        <w:t xml:space="preserve">Ces pourcentages appellent la prudence : obtenus sur les échantillons de validation des auteurs, ils ne se reproduisent pas mécaniquement ailleurs. Williams et al. (2015) montrent que les études appliquant UTAUT en mobilisent rarement l'intégralité, souvent réduite à quelques déterminants et privée des modérateurs ; Dwivedi et al. (2019) proposent un modèle révisé qui réintroduit l'attitude et relativise la nécessité systématique des modérateurs. Une part de la puissance affichée tient donc moins à la justesse du modèle qu'à l'accumulation de variables, ce que Bagozzi (2007) formulera comme un problème de fond. Y voir un cadre validé serait excessif ; le lire comme un répertoire de variables dont la pertinence s'apprécie cas par cas est plus fidèle à l'état des connaissances : c'est la lecture adoptée ici.</w:t>
+        <w:t xml:space="preserve">Ces pourcentages appellent la prudence : obtenus sur les échantillons de validation des auteurs, ils ne se reproduisent pas mécaniquement ailleurs. Williams et al. (2015) montrent que les études appliquant UTAUT en mobilisent rarement l'intégralité, souvent réduite à quelques déterminants et privée des modérateurs ; Dwivedi et al. (2019) proposent un modèle révisé qui réintroduit l'attitude et relativise la nécessité systématique des modérateurs. Une part de la puissance affichée tient donc moins à la justesse du modèle qu'à l'accumulation de variables, ce que Bagozzi (2007) formule comme un problème de fond, discuté en section 2.3. Y voir un cadre validé serait excessif ; le lire comme un répertoire de variables dont la pertinence s'apprécie cas par cas est plus fidèle à l'état des connaissances : c'est la lecture adoptée ici.</w:t>
       </w:r>
     </w:p>
     <w:p>
@@ -4324,7 +4321,7 @@
         <w:t xml:space="preserve">stagnation paradigmatique</w:t>
       </w:r>
       <w:r>
-        <w:t xml:space="preserve">. Elle ne tient pas à une obsolescence empirique du modèle, qui prédit toujours correctement l'intention d'usage, mais à un effet pervers de sa réussite académique : sa parcimonie initiale en a fait un instrument de publication massivement reproductible, d'où une production cumulative homogène mais théoriquement appauvrie, des études confirmant les mêmes liens dans des contextes variés sans rénover sa structure ni questionner ses fondements psychologiques. Le diagnostic recense quatre limites structurelles : la réduction de l'adoption à une intention rationnelle médiatisée par deux croyances, qui sous-théorise émotions, affect et états motivationnels complexes ; la réduction du passage de l'intention au comportement à un simple lien, alors qu'il mobilise des processus cognitifs distincts ; l'absorption des facteurs collectifs dans une « influence sociale » à la structure interne inexplorée ; le caractère statique d'un modèle qui prédit l'adoption à un instant donné sans modéliser l'évolution des croyances.</w:t>
+        <w:t xml:space="preserve">. Elle ne tient pas à une obsolescence empirique du modèle, qui prédit toujours correctement l'intention d'usage, mais à un effet pervers de sa réussite académique : sa parcimonie initiale en a fait un instrument de publication massivement reproductible, d'où une production cumulative homogène mais théoriquement appauvrie, des études confirmant les mêmes liens dans des contextes variés sans rénover sa structure ni questionner ses fondements psychologiques. Le diagnostic recense quatre limites structurelles : la réduction de l'adoption à une intention rationnelle médiatisée par deux croyances, qui sous-théorise les émotions, l'affect et les états motivationnels complexes ; la réduction du passage de l'intention au comportement à un simple lien, alors qu'il mobilise des processus cognitifs distincts ; l'absorption des facteurs collectifs dans une « influence sociale » à la structure interne inexplorée ; le caractère statique d'un modèle qui prédit l'adoption à un instant donné sans modéliser l'évolution des croyances.</w:t>
       </w:r>
     </w:p>
     <w:p>
@@ -4464,7 +4461,7 @@
         <w:t xml:space="preserve">conversationnelle</w:t>
       </w:r>
       <w:r>
-        <w:t xml:space="preserve">, l'usage relevant d'une co-construction itérative et non de l'exécution d'une commande. Ce constat rejoint Berente et al. (2021) : autonomie croissante, apprentissage, caractère insondable. Ces différences déplacent les conditions de formation des croyances fondatrices : l'utilité d'un grand modèle de langage ne se manifeste pas de façon stable d'un usage à l'autre et dépend de la qualité du</w:t>
+        <w:t xml:space="preserve">, l'usage relevant d'une co-construction itérative et non de l'exécution d'une commande. Ce constat rejoint Berente et al. (2021), pour qui la gestion de l’IA se distingue des vagues technologiques antérieures par trois facettes évolutives : l’autonomie croissante des systèmes, leur capacité d’apprentissage et leur caractère insondable. Ces différences déplacent les conditions de formation des croyances fondatrices : l'utilité d'un grand modèle de langage ne se manifeste pas de façon stable d'un usage à l'autre et dépend de la qualité du</w:t>
       </w:r>
       <w:r>
         <w:t xml:space="preserve"> </w:t>
@@ -4498,7 +4495,7 @@
         <w:pStyle w:val="BodyText"/>
       </w:pPr>
       <w:r>
-        <w:t xml:space="preserve">Quatre dimensions jusque-là périphériques dans la famille TAM/UTAUT deviennent ainsi centrales : la confiance envers les systèmes d'IA, dont l'opacité exige un acte de confiance non trivial dans la fiabilité de ses recommandations, surtout lorsqu'elles affectent des décisions RH à fort enjeu (Budhwar et al., 2022 ; Tambe et al., 2019) ; la transparence algorithmique, dont l'absence constitue pour les professionnels RH un frein structurel dès qu'une décision doit être justifiée auprès de candidats, de collaborateurs ou d'instances réglementaires (Tambe et al., 2019) ; les risques éthiques, biais, discrimination indirecte et perte d'humanité de la décision, que Charlwood et Guenole (2022) théorisent comme des paradoxes constitutifs susceptibles d'inverser le rapport coûts-bénéfices anticipé par l'utilisateur ; la confidentialité des données RH, d'autant plus sensible que les traitements portent sur des informations personnelles dont la finalité peut dériver au fil des usages (Tursunbayeva et al., 2022). Trois conséquences en découlent : les variables explicatives classiques sont partielles et non exhaustives ; les dimensions propres à l'IA doivent être explorées explicitement, exigence qui motive la proposition P6 ; une posture exclusivement déductive enfermerait le matériau dans une grille trop étroite, d'où l'intérêt d'un dispositif qualitatif autorisant l'émergence.</w:t>
+        <w:t xml:space="preserve">Quatre dimensions jusque-là périphériques dans la famille TAM/UTAUT deviennent ainsi centrales : la confiance envers les systèmes d'IA, dont l'opacité exige de l'utilisateur un engagement non trivial dans la fiabilité de leurs recommandations, surtout lorsqu'elles affectent des décisions RH à fort enjeu (Budhwar et al., 2022 ; Tambe et al., 2019) ; la transparence algorithmique, dont l'absence constitue pour les professionnels RH un frein structurel dès qu'une décision doit être justifiée auprès de candidats, de collaborateurs ou d'instances réglementaires (Tambe et al., 2019) ; les risques éthiques, biais, discrimination indirecte et perte d'humanité de la décision, que Charlwood et Guenole (2022) théorisent comme des paradoxes constitutifs susceptibles d'inverser le rapport coûts-bénéfices anticipé par l'utilisateur ; la confidentialité des données RH, d'autant plus sensible que les traitements portent sur des informations personnelles dont la finalité peut dériver au fil des usages (Tursunbayeva et al., 2022). Trois conséquences en découlent : les variables explicatives classiques sont partielles et non exhaustives ; les dimensions propres à l'IA doivent être explorées explicitement, exigence qui motive la proposition P6 ; une posture exclusivement déductive enfermerait le matériau dans une grille trop étroite, d'où l'intérêt d'un dispositif qualitatif autorisant l'émergence.</w:t>
       </w:r>
     </w:p>
     <w:bookmarkEnd w:id="75"/>
@@ -4520,7 +4517,7 @@
         <w:pStyle w:val="FirstParagraph"/>
       </w:pPr>
       <w:r>
-        <w:t xml:space="preserve">Présenter plusieurs cadres alternatifs permet de situer le choix de TAM/UTAUT et d'identifier les dimensions qu'ils saisiraient mieux. La théorie de la diffusion des innovations, dont Rogers (2003) offre la formulation la plus aboutie, analyse les caractéristiques perçues de l'innovation, cinq propriétés prédisant la vitesse de diffusion : avantage relatif, compatibilité avec les valeurs et les besoins existants, complexité, testabilité, observabilité. Appliquée à l'IA en RH, cette grille éclairerait la diffusion rapide du tri de CV et les résistances que suscite l'analyse de sentiment, en pointant la compatibilité avec les valeurs identitaires de la profession. La théorie de l'appropriation, initiée par Orlikowski (1992) dans la lignée de la structuration et formalisée par DeSanctis et Poole (1994), analyse les usages situés, les détournements des usages prescrits et la co-construction du sens d'une technologie : elle éclaire ce que le TAM ne capture pas, un outil pouvant être formellement adopté mais détourné de sa fonction, contourné par des pratiques parallèles ou intégré dans un</w:t>
+        <w:t xml:space="preserve">Présenter plusieurs cadres alternatifs permet de situer le choix de TAM/UTAUT et d'identifier les dimensions qu'ils saisiraient mieux. La théorie de la diffusion des innovations, dont Rogers (2003) offre la formulation la plus aboutie, analyse les caractéristiques perçues de l'innovation, cinq propriétés prédisant la vitesse de diffusion : avantage relatif, compatibilité avec les valeurs et les besoins existants, complexité, testabilité, observabilité. Appliquée à l'IA en RH, cette grille éclairerait la diffusion rapide du tri de CV et les résistances que suscite l'analyse de sentiment, en pointant la compatibilité avec les valeurs identitaires de la profession. La théorie de l'appropriation, formalisée par DeSanctis et Poole (1994) dans la lignée de la théorie de la structuration et prolongée par Orlikowski (1992), analyse les usages situés, les détournements des usages prescrits et la co-construction du sens d'une technologie : elle éclaire ce que le TAM ne capture pas, un outil pouvant être formellement adopté mais détourné de sa fonction, contourné par des pratiques parallèles ou intégré dans un</w:t>
       </w:r>
       <w:r>
         <w:t xml:space="preserve"> </w:t>
@@ -4592,7 +4589,7 @@
         <w:t xml:space="preserve"> </w:t>
       </w:r>
       <w:r>
-        <w:t xml:space="preserve">Trois familles de critiques structurent le champ : les critiques internes, qui dénoncent la stagnation (Bagozzi, 2007) et la négligence des propriétés de l'artefact (Benbasat &amp; Barki, 2007) ; l'inadéquation aux technologies probabilistes contemporaines ; les cadres concurrents éclairant des dimensions complémentaires. Le mémoire retient TAM/UTAUT pour sa lisibilité, sa comparabilité internationale (Lee et al., 2003) et sa testabilité opérationnelle, tout en chargeant la posture qualitative de détecter ce qu'il ne capte pas spontanément. L'enseignement principal est cependant constructif : c'est la critique la plus sévère, celle de la mise à l'écart de l'artefact, qui indique la voie de l'enrichissement. Réintroduire les propriétés propres à l'IA, opacité, dimension probabiliste, sensibilité éthique, répond à Benbasat et Barki (2007) dans leurs propres termes : c'est l'objet de la proposition P6, dont la section suivante construit les quatre variables ; l'attention aux frictions identitaires empruntée à Rogers (2003) nourrit la proposition P5.</w:t>
+        <w:t xml:space="preserve">Trois familles de critiques structurent le champ : les critiques internes, qui dénoncent la stagnation (Bagozzi, 2007) et la négligence des propriétés de l'artefact (Benbasat &amp; Barki, 2007) ; l'inadéquation aux technologies probabilistes contemporaines ; les cadres concurrents éclairant des dimensions complémentaires. Le mémoire retient TAM/UTAUT pour sa lisibilité, sa comparabilité internationale (Y. Lee et al., 2003) et sa testabilité opérationnelle, tout en chargeant la posture qualitative de détecter ce qu'il ne capte pas spontanément. L'enseignement principal est cependant constructif : c'est la critique la plus sévère, celle de la mise à l'écart de l'artefact, qui indique la voie de l'enrichissement. Réintroduire les propriétés propres à l'IA, opacité, dimension probabiliste, sensibilité éthique, répond à Benbasat et Barki (2007) dans leurs propres termes : c'est l'objet de la proposition P6, dont la section suivante construit les quatre variables ; l'attention aux frictions identitaires empruntée à Rogers (2003) nourrit la proposition P5.</w:t>
       </w:r>
     </w:p>
     <w:bookmarkEnd w:id="77"/>
@@ -4636,7 +4633,7 @@
         <w:pStyle w:val="FirstParagraph"/>
       </w:pPr>
       <w:r>
-        <w:t xml:space="preserve">Aucun modèle ne couvre à lui seul l'ensemble des dimensions pertinentes : le TAM originel (Davis, 1989) est trop parcimonieux pour le social et l'organisationnel ; UTAUT (Venkatesh et al., 2003) intègre les conditions facilitantes mais ignore largement le cognitif et l'affectif ; TAM 3 (Venkatesh &amp; Bala, 2008) introduit l'anxiété et l'auto-efficacité mais reste centré sur la facilité d'usage ; UTAUT 2 (Venkatesh et al., 2012) ajoute des variables consuméristes en partie seulement transposables au contexte organisationnel. Les relectures critiques du champ (Bagozzi, 2007 ; Dwivedi et al., 2019) invitent donc à les traiter en réservoirs conceptuels. Le cadre intégrateur combine cinq apports : les deux variables fondatrices du TAM, utilité perçue et facilité d'usage perçue (Davis, 1989) ; les dimensions sociales et organisationnelles d'UTAUT, influence sociale et conditions facilitantes (Venkatesh et al., 2003) ; les dimensions cognitives et affectives de TAM 3, auto-efficacité numérique et anxiété (Compeau &amp; Higgins, 1995 ; Venkatesh &amp; Bala, 2008), la seconde enrichie de la crainte du remplacement professionnel (Charlwood &amp; Guenole, 2022) ; un bloc IA-spécifique détaillé en 2.4.3 ; des modératrices contextuelles issues d'UTAUT 2 et de la littérature internationale de GRH (Budhwar et al., 2022 ; Pillai &amp; Sivathanu, 2020 ; Venkatesh et al., 2012). Dans la perspective post-positiviste justifiée au chapitre 3, il est mobilisé comme structure heuristique, sans prétendre épuiser la complexité du réel ni interdire l'émergence de variables non anticipées.</w:t>
+        <w:t xml:space="preserve">Aucun modèle ne couvre à lui seul l'ensemble des dimensions pertinentes : le TAM originel (Davis, 1989) est trop parcimonieux pour le social et l'organisationnel ; UTAUT (Venkatesh et al., 2003) intègre les conditions facilitantes mais ignore largement le cognitif et l'affectif ; TAM 3 (Venkatesh &amp; Bala, 2008) introduit l'anxiété et l'auto-efficacité mais reste centré sur la facilité d'usage ; UTAUT 2 (Venkatesh et al., 2012) ajoute des variables consuméristes en partie seulement transposables au contexte organisationnel. Les relectures critiques du champ (Bagozzi, 2007 ; Dwivedi et al., 2019) invitent donc à les traiter en réservoirs conceptuels. Le cadre intégrateur combine cinq apports : les deux variables fondatrices du TAM, utilité perçue et facilité d'usage perçue (Davis, 1989) ; les dimensions sociales et organisationnelles d'UTAUT, influence sociale et conditions facilitantes (Venkatesh et al., 2003) ; les dimensions cognitives et affectives de TAM 3, auto-efficacité numérique et anxiété (Compeau &amp; Higgins, 1995 ; Venkatesh &amp; Bala, 2008), la seconde restreinte à l’anxiété de prise en main, la crainte du remplacement professionnel étant traitée comme un frein direct distinct rattaché à P5 (Charlwood &amp; Guenole, 2022) ; un bloc IA-spécifique détaillé en 2.4.3 ; des modératrices contextuelles issues d'UTAUT 2 et de la littérature internationale de GRH (Budhwar et al., 2022 ; Pillai &amp; Sivathanu, 2020 ; Venkatesh et al., 2012). Dans la perspective post-positiviste justifiée au chapitre 3, il est mobilisé comme structure heuristique, sans prétendre épuiser la complexité du réel ni interdire l'émergence de variables non anticipées.</w:t>
       </w:r>
     </w:p>
     <w:bookmarkEnd w:id="79"/>
@@ -4658,7 +4655,7 @@
         <w:pStyle w:val="FirstParagraph"/>
       </w:pPr>
       <w:r>
-        <w:t xml:space="preserve">Le modèle distingue les variables indépendantes classiques, les antécédentes psychologiques, dont l'effet passe par la facilité d'usage perçue, et les variables IA-spécifiques présentées en 2.4.3. Trois variables classiques sont directement associées à l'intention d'adoption.</w:t>
+        <w:t xml:space="preserve">Le modèle distingue les variables indépendantes classiques, les variables antécédentes psychologiques, dont l'effet passe par la facilité d'usage perçue, et les variables IA-spécifiques présentées en 2.4.3. Trois variables classiques sont directement associées à l'intention d'adoption.</w:t>
       </w:r>
     </w:p>
     <w:p>
@@ -4694,7 +4691,7 @@
         <w:t xml:space="preserve"> </w:t>
       </w:r>
       <w:r>
-        <w:t xml:space="preserve">: degré auquel l'usage de l'IA est estimé exempt d'effort. Variable fondatrice du TAM (Davis, 1989), reformulée en attente d'effort dans UTAUT.</w:t>
+        <w:t xml:space="preserve">: degré auquel le professionnel RH estime que l'usage de l'IA serait exempt d'effort. Variable fondatrice du TAM (Davis, 1989), reformulée en attente d'effort dans UTAUT.</w:t>
       </w:r>
     </w:p>
     <w:p>
@@ -4822,7 +4819,7 @@
         <w:t xml:space="preserve"> </w:t>
       </w:r>
       <w:r>
-        <w:t xml:space="preserve">Depuis Mayer et al. (1995), la confiance désigne la volonté de se rendre vulnérable aux actions d'autrui sur la foi d'une attente de fiabilité, indépendamment de tout contrôle : elle s'applique à la relation entre un professionnel RH et un système algorithmique opaque, suivre une recommandation de présélection revenant à assumer une décision dont on ne maîtrise pas la fabrique. La revue de Glikson et Woolley (2020) confirme sa centralité : elle associe une composante cognitive et une composante affective et évolue selon les performances observées et la criticité des tâches confiées. Deux résultats expérimentaux montrent qu'elle n'est ni stable ni symétrique de la confiance interpersonnelle : l'</w:t>
+        <w:t xml:space="preserve">Depuis Mayer et al. (1995), la confiance désigne la volonté de se rendre vulnérable aux actions d'autrui sur la foi d'une attente de fiabilité, indépendamment de tout contrôle : elle s'applique à la relation entre un professionnel RH et un système algorithmique opaque, suivre une recommandation de présélection revenant à assumer une décision dont on ne maîtrise pas la fabrique. La revue de Glikson et Woolley (2020) confirme sa centralité : la confiance associe une composante cognitive et une composante affective, et son niveau évolue selon les performances observées et la criticité des tâches confiées. Deux résultats expérimentaux montrent qu'elle n'est ni stable ni symétrique de la confiance interpersonnelle : l'</w:t>
       </w:r>
       <w:r>
         <w:rPr>
@@ -4848,7 +4845,7 @@
         <w:t xml:space="preserve"> </w:t>
       </w:r>
       <w:r>
-        <w:t xml:space="preserve">(Logg et al., 2019), observée chez les profanes et s'atténuant nettement chez les experts. Cette confiance conditionnelle, sensible aux erreurs et à l'expertise, concerne directement des professionnels RH expérimentés, susceptibles d'osciller entre déférence et défiance (Tambe et al., 2019).</w:t>
+        <w:t xml:space="preserve">(Logg et al., 2019), les profanes accordant, à contenu identique, plus de poids à un conseil algorithmique qu'à un conseil humain, préférence qui s'atténue nettement chez les experts. Cette confiance conditionnelle, sensible aux erreurs et à l'expertise, concerne directement des professionnels RH expérimentés, susceptibles d'osciller entre déférence et défiance (Tambe et al., 2019).</w:t>
       </w:r>
     </w:p>
     <w:p>
@@ -4882,7 +4879,7 @@
         <w:t xml:space="preserve"> </w:t>
       </w:r>
       <w:r>
-        <w:t xml:space="preserve">constitue un frein structurel à l'usage professionnel (Tambe et al., 2019) ; Shin (2021) en précise le mécanisme, les explications intelligibles et la possibilité d'en apprécier la qualité causale renforçant la transparence perçue, laquelle nourrit la confiance puis l'acceptation du système. Antécédent psychologique de la confiance, la transparence justifie ainsi son statut de variable à part entière.</w:t>
+        <w:t xml:space="preserve">constitue un frein structurel à l'usage professionnel (Tambe et al., 2019) ; Shin (2021) en précise le mécanisme, les explications intelligibles et la possibilité d'en apprécier la qualité causale renforçant la transparence perçue, laquelle nourrit la confiance puis l'acceptation du système. Antécédent psychologique de la confiance, la transparence est ainsi traitée comme une variable à part entière, et non comme une sous-dimension de celle-ci.</w:t>
       </w:r>
     </w:p>
     <w:p>
@@ -4918,7 +4915,7 @@
         <w:t xml:space="preserve"> </w:t>
       </w:r>
       <w:r>
-        <w:t xml:space="preserve">Tursunbayeva et al. (2022) montrent que ces préoccupations débordent la seule conformité juridique (risques d'atteinte à la vie privée, opacité des finalités, dérive des usages,</w:t>
+        <w:t xml:space="preserve">Cette variable désigne l’attention portée à la protection des données personnelles traitées par les outils d’IA. Tursunbayeva et al. (2022) montrent que ces préoccupations débordent la seule conformité juridique (risques d'atteinte à la vie privée, opacité des finalités, dérive des usages,</w:t>
       </w:r>
       <w:r>
         <w:t xml:space="preserve"> </w:t>
@@ -4939,7 +4936,7 @@
         <w:pStyle w:val="BodyText"/>
       </w:pPr>
       <w:r>
-        <w:t xml:space="preserve">Ces quatre variables constituent le cœur de la proposition P6, et l'architecture d'ensemble s'en trouve clarifiée : AE et AX sont antécédents de FU ; UP, FU, IS et les variables IA-spécifiques sont directement associées à l'intention, parallèlement aux variables classiques ; CF porte sur l'usage effectif, dans le respect des positions théoriques de TAM 3 et d'UTAUT, enrichies des dimensions propres à l'IA.</w:t>
+        <w:t xml:space="preserve">Ces quatre variables constituent le cœur de la proposition P6, et l'architecture d'ensemble s'en trouve clarifiée : AE et AX sont antécédents de FU ; UP, FU et IS sont directement associées à l'intention, parallèlement aux quatre variables IA-spécifiques ; CF porte sur l'usage effectif, dans le respect des positions théoriques de TAM 3 et d'UTAUT, enrichies des dimensions propres à l'IA.</w:t>
       </w:r>
     </w:p>
     <w:bookmarkEnd w:id="81"/>
@@ -4979,7 +4976,7 @@
         <w:t xml:space="preserve"> </w:t>
       </w:r>
       <w:r>
-        <w:t xml:space="preserve">: valeurs partagées, rapport à l'innovation, ouverture au changement, modes de coordination internes. Sous-théorisée dans le TAM originel, elle joue un rôle structurant dans l'acceptation d'une technologie aussi disruptive que l'IA, particulièrement dans un tissu marocain marqué par une grande diversité de cultures d'entreprise (Budhwar et al., 2022).</w:t>
+        <w:t xml:space="preserve">: valeurs partagées, rapport à l'innovation, ouverture au changement, modes de coordination internes. Sous-théorisée dans le TAM originel, elle joue un rôle structurant dans l'acceptation d'une technologie aussi disruptive que l'IA, particulièrement dans un tissu économique marocain marqué par une grande diversité de cultures d'entreprise (Budhwar et al., 2022).</w:t>
       </w:r>
     </w:p>
     <w:p>
@@ -5031,7 +5028,7 @@
         <w:t xml:space="preserve"> </w:t>
       </w:r>
       <w:r>
-        <w:t xml:space="preserve">lancée en septembre 2024, contraintes réglementaires sectorielles, qui délimitent les marges de manœuvre des professionnels RH lorsque les outils manipulent des données sensibles.</w:t>
+        <w:t xml:space="preserve">lancée en septembre 2024, contraintes réglementaires sectorielles ; ce cadre délimite les marges de manœuvre des professionnels RH, notamment lorsque les outils manipulent des données sensibles.</w:t>
       </w:r>
     </w:p>
     <w:p>
@@ -5142,7 +5139,7 @@
         <w:t xml:space="preserve"> </w:t>
       </w:r>
       <w:r>
-        <w:t xml:space="preserve">Trois variables agissent directement sur l'intention d'adoption : l'utilité perçue, enrichie de la valeur ajoutée par rapport au travail humain ; la facilité d'usage perçue, dont le lien classique vers l'utilité perçue est conservé, un outil aisé étant plus volontiers jugé utile ; l'influence sociale, intégrant la légitimation managériale. Toutes trois sont positivement associées à l'intention. La quatrième, les conditions facilitantes, occupe la position que lui assigne UTAUT et porte sur l'usage effectif et non sur l'intention, conformément à la section 2.4.2.</w:t>
+        <w:t xml:space="preserve">Quatre variables composent ce bloc ; trois agissent directement sur l'intention d'adoption : l'utilité perçue, enrichie de la valeur ajoutée par rapport au travail humain ; la facilité d'usage perçue, dont le lien classique vers l'utilité perçue est conservé, un outil aisé étant plus volontiers jugé utile ; l'influence sociale, intégrant la légitimation managériale. Toutes trois sont positivement associées à l'intention. La quatrième, les conditions facilitantes, occupe la position que lui assigne UTAUT et porte sur l'usage effectif et non sur l'intention, conformément à la section 2.4.2.</w:t>
       </w:r>
     </w:p>
     <w:p>
@@ -5227,7 +5224,7 @@
         <w:t xml:space="preserve"> </w:t>
       </w:r>
       <w:r>
-        <w:t xml:space="preserve">Le modèle distingue l'intention d'adoption, associée aux déterminants directs des blocs 1 et 3 après médiation du bloc 2, et l'usage effectif, qui dépend de sa conversion en pratique routinière sous l'effet des conditions facilitantes et des modérateurs du bloc 4. Cette distinction, documentée par Parry et Tyson (2011), sépare les déclencheurs d'une intention favorable des conditions de sa traduction en pratique.</w:t>
+        <w:t xml:space="preserve">Le modèle distingue l'intention d'adoption, associée aux déterminants directs des blocs 1 et 3 après médiation du bloc 2, et l'usage effectif, qui dépend de la conversion de cette intention en pratique routinière sous l'effet des conditions facilitantes et des modérateurs du bloc 4. Cette distinction, documentée par Parry et Tyson (2011), sépare les déclencheurs d'une intention favorable des conditions de sa traduction en pratique.</w:t>
       </w:r>
     </w:p>
     <w:p>
@@ -6011,7 +6008,7 @@
         <w:pStyle w:val="FirstParagraph"/>
       </w:pPr>
       <w:r>
-        <w:t xml:space="preserve">La Partie I a construit le socle théorique et empirique de l'étude, en réponse à une problématique resserrée sur la spécificité de l'IA : confiance, transparence algorithmique, risques éthiques, confidentialité des données et crainte du remplacement. Le chapitre 1 a défini l'objet d'étude et dégagé quatre acquis solides, cinq controverses non tranchées et trois lacunes composant un verrou unique : une population peu étudiée, à la fois prescriptrice, utilisatrice et potentiellement menacée ; un contexte dont on ignore s'il préserve les mécanismes établis ailleurs ; des instruments dominants incapables, par construction, de révéler ce qui n'a pas été anticipé. Le chapitre 2 a retracé la généalogie du TAM et de ses extensions, discuté ses critiques radicales et construit le modèle conceptuel</w:t>
+        <w:t xml:space="preserve">La Partie I a construit le socle théorique et empirique de l'étude, en réponse à une problématique resserrée sur la spécificité de l'IA : confiance, transparence algorithmique, risques éthiques, confidentialité des données et crainte du remplacement. Le chapitre 1 a défini l'objet d'étude et dégagé quatre acquis solides, cinq controverses non tranchées et trois lacunes composant un verrou unique : une population peu étudiée, à la fois prescriptrice, utilisatrice et potentiellement menacée ; un contexte dont on ignore s'il préserve le contenu des mécanismes établis ailleurs ; des instruments dominants incapables, par construction, de révéler ce qui n'a pas été anticipé. Le chapitre 2 a retracé la généalogie du TAM et de ses extensions, discuté ses critiques radicales et construit le modèle conceptuel</w:t>
       </w:r>
       <w:r>
         <w:t xml:space="preserve"> </w:t>
@@ -6151,7 +6148,7 @@
         <w:t xml:space="preserve">paradigme positiviste</w:t>
       </w:r>
       <w:r>
-        <w:t xml:space="preserve">, hérité de Comte et adapté aux sciences sociales par Durkheim, postule une réalité objective, indépendante du chercheur, dont il cherche régularités et lois explicatives par une démarche hypothético-déductive à hypothèses falsifiables (Popper, 1959) ; il structure l'essentiel des travaux quantitatifs de la lignée TAM/UTAUT (Davis, 1989 ; Venkatesh et al., 2003). Le</w:t>
+        <w:t xml:space="preserve">, hérité de Comte et adapté aux sciences sociales par Durkheim, postule une réalité objective, indépendante du chercheur, dont celui-ci cherche à établir les régularités et les lois explicatives par une démarche hypothético-déductive fondée sur des hypothèses falsifiables (Popper, 1959) ; il structure l'essentiel des travaux quantitatifs de la lignée TAM/UTAUT (Davis, 1989 ; Venkatesh et al., 2003). Le</w:t>
       </w:r>
       <w:r>
         <w:t xml:space="preserve"> </w:t>
@@ -6212,7 +6209,7 @@
         <w:t xml:space="preserve">post-positivisme</w:t>
       </w:r>
       <w:r>
-        <w:t xml:space="preserve">, formalisé par Popper (1959) puis Guba et Lincoln (1994), assouplit les présupposés du positivisme strict tout en conservant ses exigences fondamentales. L'expression « positivisme tempéré », parfois rencontrée dans les travaux francophones, n'est pas retenue : non canonisée dans la littérature de référence, elle est conceptuellement moins précise que le post-positivisme. Quatre principes la caractérisent : un réalisme ontologique critique, qui admet une réalité indépendante de l'observateur mais connaissable de façon imparfaite et probabiliste, proche du réalisme critique de Bhaskar (1975) ; une objectivité conçue comme idéal régulateur, le chercheur faillible mobilisant triangulation, double codage et réflexivité pour limiter les biais (Lincoln &amp; Guba, 1985) ; une démarche déductive, partant d'un cadre éprouvé pour formuler des propositions falsifiables sans exclure l'émergence ; l'admission de méthodes qualitatives pour accéder à des phénomènes complexes et contextuels, sous condition de rigueur (Miles et al., 2014). Répandue dans les recherches qualitatives en gestion (Creswell &amp; Poth, 2018), cette posture convient particulièrement lorsqu'un cadre solidement étayé doit être éprouvé dans un contexte nouveau, soit la configuration de cette recherche.</w:t>
+        <w:t xml:space="preserve">, formalisé par Popper (1959) puis Guba et Lincoln (1994), assouplit les présupposés du positivisme strict tout en conservant ses exigences fondamentales. L'expression « positivisme tempéré », parfois rencontrée dans les travaux francophones, n'est pas retenue : non canonisée dans la littérature de référence, elle est conceptuellement moins précise que le post-positivisme. Quatre principes caractérisent cette posture : un réalisme ontologique critique, qui admet une réalité indépendante de l'observateur mais connaissable de façon imparfaite et probabiliste, proche du réalisme critique de Bhaskar (1975) ; une objectivité conçue comme idéal régulateur, le chercheur faillible mobilisant triangulation, double codage et réflexivité pour limiter les biais (Lincoln &amp; Guba, 1985) ; une démarche déductive, partant d'un cadre éprouvé pour formuler des propositions falsifiables sans exclure l'émergence ; l'admission de méthodes qualitatives pour accéder à des phénomènes complexes et contextuels, sous condition de rigueur (Miles et al., 2014). Répandue dans les recherches qualitatives en gestion (Creswell &amp; Poth, 2018), cette posture convient particulièrement lorsqu'un cadre solidement étayé doit être éprouvé dans un contexte nouveau, soit la configuration de cette recherche.</w:t>
       </w:r>
     </w:p>
     <w:bookmarkEnd w:id="95"/>
@@ -6309,7 +6306,7 @@
         <w:pStyle w:val="FirstParagraph"/>
       </w:pPr>
       <w:r>
-        <w:t xml:space="preserve">Le choix du qualitatif, au regard de la tradition quantitative dominante du TAM/UTAUT, repose sur trois arguments. D'abord, la revue systématique de Williams et al. (2015) relève une nette sous-représentation du qualitatif dans la littérature UTAUT et souligne qu'il saisit des dimensions contextuelles, culturelles et émotionnelles mal captées par les questionnaires standardisés ; Dwivedi et al. (2019) plaident de même pour des extensions contextuelles du modèle. Ensuite, la problématique ne vise pas le seul poids relatif de chaque facteur, mais la façon dont ils s'articulent, se hiérarchisent et se manifestent dans le discours des praticiens, ambition compréhensive qui justifie l'entretien semi-directif. Enfin, le terrain marocain, et le Souss-Massa en particulier, reste très peu documenté (section 1.4) : dans un contexte sous-investigué, une démarche qualitative déductive produit des connaissances situées tout en restant ancrée dans un cadre solide, suivant la recommandation de Budhwar et al. (2022) en faveur d'études contextualisées dans les économies émergentes. Les implications opérationnelles sont directes : approche qualitative déductive plutôt que</w:t>
+        <w:t xml:space="preserve">Le choix du qualitatif, au regard de la tradition quantitative dominante du TAM/UTAUT, repose sur trois arguments. D'abord, la revue systématique de Williams et al. (2015) relève une nette sous-représentation du qualitatif dans la littérature UTAUT et souligne qu'il saisit des dimensions contextuelles, culturelles et émotionnelles mal captées par les questionnaires standardisés ; Dwivedi et al. (2019) plaident de même pour des extensions contextuelles du modèle. Ensuite, la problématique ne vise pas le seul poids relatif de chaque facteur, mais la façon dont ils s'articulent, se hiérarchisent et se manifestent dans le discours des praticiens, ambition compréhensive qui justifie l'entretien semi-directif. Enfin, le terrain marocain, et le Souss-Massa en particulier, reste très peu documenté (section 1.4) : dans un contexte sous-investigué, une démarche qualitative déductive produit des connaissances situées tout en restant ancrée dans un cadre solide, suivant la recommandation de Budhwar et al. (2022) en faveur d'études contextualisées dans les économies émergentes. Les implications opérationnelles sont directes : privilégier une approche qualitative déductive plutôt qu'une</w:t>
       </w:r>
       <w:r>
         <w:t xml:space="preserve"> </w:t>
@@ -6325,7 +6322,7 @@
         <w:t xml:space="preserve"> </w:t>
       </w:r>
       <w:r>
-        <w:t xml:space="preserve">(choix motivé en 3.4), guide d'entretien structuré par les dimensions du cadre, grille de codage préétablie ouverte aux codes émergents, scientificité appréciée selon les critères de la recherche qualitative (crédibilité, transférabilité, fiabilité, confirmabilité ; Lincoln &amp; Guba, 1985).</w:t>
+        <w:t xml:space="preserve">(choix motivé en 3.4), structurer le guide d'entretien par les dimensions du cadre, mobiliser une grille de codage préétablie ouverte aux codes émergents et apprécier la scientificité selon les critères de la recherche qualitative, et non selon la validité interne et externe des études quantitatives (crédibilité, transférabilité, fiabilité, confirmabilité ; Lincoln &amp; Guba, 1985).</w:t>
       </w:r>
     </w:p>
     <w:bookmarkEnd w:id="98"/>
@@ -6406,7 +6403,7 @@
         <w:pStyle w:val="FirstParagraph"/>
       </w:pPr>
       <w:r>
-        <w:t xml:space="preserve">La recherche adopte une stratégie d'étude qualitative à visée explicative, distincte d'une étude purement exploratoire comme d'une étude de cas multiples, que caractérisent trois éléments. La visée explicative, d'abord : au-delà de la description des usages, la recherche identifie et comprend les facteurs associés à leur adoption ou à leur non-adoption, ambition permise par le cadre théorique préexistant. L'unité d'analyse, ensuite, est l'individu, le professionnel RH, plutôt que l'organisation : cohérente avec le TAM/UTAUT, qui modélise des perceptions et intentions individuelles, cette focale permet d'agréger des points de vue d'entreprises variées, là où une étude de cas multiples aurait restreint la diversité des profils et alourdi l'accès au terrain. La logique déductive, enfin : la grille de lecture est issue du cadre enrichi et les propositions P1 à P7 organisent l'analyse. Une logique inductive de type</w:t>
+        <w:t xml:space="preserve">La recherche adopte une stratégie d'étude qualitative à visée explicative, distincte d'une étude purement exploratoire comme d'une étude de cas multiples. Trois éléments la caractérisent. La visée explicative vient d'abord : au-delà de la description des usages, la recherche vise à identifier et à comprendre les facteurs associés à leur adoption ou à leur non-adoption, ambition permise par le cadre théorique préexistant. L'unité d'analyse, ensuite, est l'individu, le professionnel RH, plutôt que l'organisation : cohérente avec le TAM/UTAUT, qui modélise des perceptions et intentions individuelles, cette focale permet d'agréger des points de vue d'entreprises variées, là où une étude de cas multiples aurait restreint la diversité des profils et alourdi l'accès au terrain. La logique déductive, enfin : la grille de lecture est issue du cadre enrichi et les propositions P1 à P7 organisent l'analyse. Une logique inductive de type</w:t>
       </w:r>
       <w:r>
         <w:t xml:space="preserve"> </w:t>
@@ -6577,7 +6574,7 @@
         <w:t xml:space="preserve">Maroc Digital 2030</w:t>
       </w:r>
       <w:r>
-        <w:t xml:space="preserve">, lancée en septembre 2024 et relayée localement par le Conseil régional et la CGEM Souss-Massa, tandis que le cadre juridique demeure en transition : aucun texte marocain ne régit encore spécifiquement l'IA, la protection des données restant régie par la loi 09-08 sous le contrôle de la CNDP. Cette configuration réglementaire mouvante correspond aux facteurs contextuels que la proposition P7 invite à examiner. Ensuite, la coexistence de TPE, PME, grandes entreprises et filiales de groupes internationaux permet d'observer un large spectre de maturités numériques sur un même territoire. Enfin, la région demeure sous-représentée dans la littérature : aucune étude indexée dans les bases consultées, selon la stratégie documentée en Annexe F, n'a été identifiée sur l'adoption de l'IA en RH dans le Souss-Massa, ce qui confirme la contribution potentielle de la recherche à des connaissances situées.</w:t>
+        <w:t xml:space="preserve">, lancée en septembre 2024 et relayée localement par le Conseil régional et la CGEM Souss-Massa, tandis que le cadre juridique demeure en transition : aucun texte marocain ne vise encore spécifiquement l'IA, un travail réglementaire étant en cours, la protection des données demeurant assurée par la loi 09-08 sous le contrôle de la CNDP. Cette configuration réglementaire mouvante correspond aux facteurs contextuels que la proposition P7 invite à examiner. Ensuite, la coexistence de TPE, PME, grandes entreprises et filiales de groupes internationaux permet d'observer un large spectre de maturités numériques sur un même territoire. Enfin, la région demeure sous-représentée dans la littérature : aucune étude indexée dans les bases consultées, selon la stratégie documentée en Annexe F, n'a été identifiée sur l'adoption de l'IA en RH dans le Souss-Massa, ce qui confirme la contribution potentielle de la recherche à des connaissances situées.</w:t>
       </w:r>
     </w:p>
     <w:p>
@@ -7454,7 +7451,7 @@
         <w:t xml:space="preserve"> </w:t>
       </w:r>
       <w:r>
-        <w:t xml:space="preserve">et une logique raisonnée : les premiers répondants couvrent les modalités les plus contrastées de la matrice, les suivants comblent les vides, jusqu'à ce que les nouveaux entretiens n'apportent plus de catégories ni de sous-thèmes analytiques (Guest et al., 2006 ; Saunders et al., 2018). Une distinction s'impose : la saturation théorique, au sens originel de Glaser et Strauss (1967), vise la stabilisation d'une théorie émergente dans une logique inductive ; la présente recherche, déductive et structurée par le cadre TAM/UTAUT, vise une saturation</w:t>
+        <w:t xml:space="preserve">et une logique raisonnée : les premiers répondants couvrent les modalités les plus contrastées de la matrice, les suivants comblent les vides, jusqu'à ce que les nouveaux entretiens n'apportent plus de catégories ni de sous-thèmes analytiques nouveaux (Guest et al., 2006 ; Saunders et al., 2018). Une distinction s'impose : la saturation théorique, au sens originel de Glaser et Strauss (1967), vise la stabilisation d'une théorie émergente dans une logique inductive ; la présente recherche, déductive et structurée par le cadre TAM/UTAUT, vise une saturation</w:t>
       </w:r>
       <w:r>
         <w:t xml:space="preserve"> </w:t>
@@ -7504,7 +7501,7 @@
         <w:t xml:space="preserve">douze à vingt répondants</w:t>
       </w:r>
       <w:r>
-        <w:t xml:space="preserve">, s'appuie sur des repères empiriques convergents : Guest et al. (2006) montrent qu'environ douze entretiens suffisent à la saturation thématique dans un échantillon relativement homogène interrogé avec une grille structurée ; Miles et al. (2014) situent au-delà de vingt le seuil où le rendement marginal d'un entretien devient négligeable. L'échantillon visé étant hétérogène sur cinq axes, la borne basse de douze reste indicative : l'arrêt est conditionné à la saturation documentée dimension par dimension. Il s'apprécie selon trois indicateurs : absence de nouveaux sous-thèmes lors des deux ou trois derniers entretiens, confirmation des catégories déjà identifiées par les nouveaux verbatims, couverture suffisante de la matrice. Si, à vingt entretiens, la saturation n'était pas atteinte sur une dimension, un recrutement complémentaire ciblé serait engagé. La saturation ne se décrète pas : elle se documente au journal de bord, entretien après entretien.</w:t>
+        <w:t xml:space="preserve">, s'appuie sur des repères empiriques convergents : Guest et al. (2006) montrent qu'environ douze entretiens suffisent à la saturation thématique dans un échantillon relativement homogène interrogé avec une grille structurée ; Miles et al. (2014) situent au-delà de vingt le seuil où le rendement marginal d'un entretien devient négligeable. L'échantillon visé étant hétérogène sur cinq axes, la borne basse de douze reste indicative : l'arrêt est conditionné à la saturation documentée dimension par dimension. Le critère d'arrêt s'apprécie selon trois indicateurs : absence de nouveaux sous-thèmes lors des deux ou trois derniers entretiens, confirmation des catégories déjà identifiées par les nouveaux verbatims, couverture suffisante de la matrice. Si, à vingt entretiens, la saturation n'était pas atteinte sur une dimension, un recrutement complémentaire ciblé serait engagé. La saturation ne se décrète pas : elle se documente au journal de bord, entretien après entretien.</w:t>
       </w:r>
     </w:p>
     <w:bookmarkEnd w:id="113"/>
@@ -7593,7 +7590,7 @@
         <w:t xml:space="preserve"> </w:t>
       </w:r>
       <w:r>
-        <w:t xml:space="preserve">: chacun des six thèmes opérationnalise une ou plusieurs dimensions du modèle, les déterminants classiques du TAM et de l'UTAUT et leurs antécédents psychologiques (thèmes 3 et 4), les quatre facteurs spécifiques à l'IA de P6 (thème 5), les variables contextuelles marocaines de P7 (thème 6) ; les thèmes 1 et 2 ne testent aucune proposition mais installent le régime narratif et documentent représentations et usages. L'ordre suit la logique du récit, du plus facile à dire, le parcours et les usages, vers ce qui engage davantage, la confiance, les craintes, l'identité professionnelle : les dimensions sensibles ne sont abordées qu'une fois la relation d'entretien établie.</w:t>
+        <w:t xml:space="preserve">: chacun des six thèmes opérationnalise une ou plusieurs dimensions du modèle, les déterminants classiques du TAM et de l'UTAUT et leurs antécédents psychologiques (thèmes 3 et 4), les quatre facteurs spécifiques à l'IA de P6 (thème 5), les variables contextuelles marocaines de P7 (thème 6) ; les thèmes 1 et 2 ne testent aucune proposition mais installent le régime narratif et documentent les représentations et les usages. L'ordre suit la logique du récit, du plus facile à dire, le parcours et les usages, vers ce qui engage davantage, la confiance, les craintes, l'identité professionnelle : les dimensions sensibles ne sont abordées qu'une fois la relation d'entretien établie.</w:t>
       </w:r>
     </w:p>
     <w:p>
@@ -7649,7 +7646,7 @@
         <w:t xml:space="preserve"> </w:t>
       </w:r>
       <w:r>
-        <w:t xml:space="preserve">activées seulement si le répondant n'aborde pas spontanément la dimension ; les termes du cadre théorique ne sont jamais soufflés, la question portant sur ce que l'outil a apporté et coûté en effort, non sur l'« utilité perçue ».</w:t>
+        <w:t xml:space="preserve">activées seulement si le répondant n'aborde pas spontanément la dimension ; les termes du cadre théorique ne sont jamais soufflés, la question portant sur ce que l'outil a apporté et sur ce qu'il a coûté en effort, non sur l'« utilité perçue ».</w:t>
       </w:r>
     </w:p>
     <w:p>
@@ -7673,7 +7670,7 @@
         <w:t xml:space="preserve"> </w:t>
       </w:r>
       <w:r>
-        <w:t xml:space="preserve">: le récit d'expérience vécue (« racontez-moi une situation où… ») produit des verbatims circonstanciés, datables et discutables, atténue le biais de désirabilité sociale, un récit détaillé s'embellissant moins qu'un jugement général (cf. § 4.5.3), et fournit à l'analyse thématique de quoi illustrer chaque thème par des extraits situés (Miles et al., 2014).</w:t>
+        <w:t xml:space="preserve">: le récit d'expérience vécue (« racontez-moi une situation où… ») produit des verbatims circonstanciés, datables et discutables, atténue le biais de désirabilité sociale, un récit détaillé étant plus difficile à embellir qu'un jugement général (cf. § 4.5.3), et fournit à l'analyse thématique de quoi illustrer chaque thème par des extraits situés (Miles et al., 2014).</w:t>
       </w:r>
     </w:p>
     <w:p>
@@ -7718,7 +7715,7 @@
         <w:t xml:space="preserve"> </w:t>
       </w:r>
       <w:r>
-        <w:t xml:space="preserve">: si le répondant ne dispose que d'une heure, priorité va aux thèmes 3 et 5, qui portent P1, P2, P5 et P6 ; le thème 6 est réduit aux relances de Q13, la question réflexive étant maintenue en toute hypothèse. Le test pilote calibrera cet arbitrage.</w:t>
+        <w:t xml:space="preserve">: si le répondant ne dispose que d'une heure, la priorité est donnée aux thèmes 3 et 5, qui portent P1, P2, P5 et P6 ; le thème 6 est réduit aux relances de Q13, la question réflexive étant maintenue en toute hypothèse. Le test pilote calibrera cet arbitrage.</w:t>
       </w:r>
     </w:p>
     <w:p>
@@ -7758,7 +7755,7 @@
         <w:pStyle w:val="FirstParagraph"/>
       </w:pPr>
       <w:r>
-        <w:t xml:space="preserve">Le Thème 5 concentre cinq des seize questions racines et près du tiers de la durée de l'entretien, déséquilibre délibéré que justifient deux arguments. Le premier est théorique : P6 recouvre quatre variables distinctes, construites séparément en section 2.4.3, la confiance envers les outils, la transparence et l'explicabilité perçues, la perception des risques éthiques et de l'équité, la confidentialité des données RH ; les traiter par une question unique présumerait leur articulation, que la recherche entend précisément établir. Le second est méthodologique : sur la confiance, les biais ou l'éthique, les réponses de principe sont socialement attendues, nul professionnel ne se déclarant indifférent aux biais algorithmiques ; les interroger frontalement produirait un discours normatif, homogène et peu informatif. Le guide les aborde donc par des situations vécues. La confiance est instruite par le récit de ce que le répondant a fait d'une recommandation algorithmique, avec relances sur l'observation éventuelle d'une erreur et l'évolution de l'usage, éprouvant la tension entre aversion et appréciation algorithmiques documentée au chapitre 2 (Dietvorst et al., 2015 ; Logg et al., 2019). La transparence est saisie par une situation de justification auprès d'un tiers et par ce qu'il n'a pas su expliquer, opérationnalisation du mécanisme mis au jour par Shin (2021). Les biais sont abordés par l'observation ou la crainte d'un résultat inéquitable, puis par les frontières normatives de la décision algorithmique (M. K. Lee, 2018 ; Köchling et Wehner, 2020). La confidentialité passe par le récit d'une hésitation avant de transmettre une donnée à un outil, ce qui atteint la portée réelle de la loi 09-08 dans les pratiques plutôt que sa connaissance déclarative. La crainte du remplacement, enfin, est approchée par la part du travail jugée automatisable et par le récit d'une situation où elle a été éprouvée.</w:t>
+        <w:t xml:space="preserve">Le Thème 5 concentre cinq des seize questions racines et près du tiers de la durée de l'entretien, déséquilibre délibéré que justifient deux arguments. Le premier est théorique : P6 recouvre quatre variables distinctes, construites séparément en section 2.4.3, la confiance envers les outils, la transparence et l'explicabilité perçues, la perception des risques éthiques et de l'équité, la confidentialité des données RH ; les traiter par une question unique présumerait leur articulation, que la recherche entend précisément établir. Le second est méthodologique : sur la confiance, les biais ou l'éthique, les réponses de principe sont socialement attendues, nul professionnel ne se déclarant indifférent aux biais algorithmiques ; interroger frontalement ces dimensions produirait un discours normatif, homogène et peu informatif. Le guide les aborde donc par des situations vécues. La confiance est instruite par le récit de ce que le répondant a fait d'une recommandation algorithmique, avec relances sur l'observation éventuelle d'une erreur et sur l'évolution de l'usage, ce qui éprouve la tension entre aversion et appréciation algorithmiques documentée au chapitre 2 (Dietvorst et al., 2015 ; Logg et al., 2019). La transparence est saisie par une situation de justification auprès d'un tiers et par ce que le répondant n'a pas su expliquer, opérationnalisation du mécanisme mis au jour par Shin (2021). Les biais sont abordés par l'observation ou la crainte d'un résultat inéquitable, puis par les frontières normatives de la décision algorithmique (Köchling &amp; Wehner, 2020 ; M. K. Lee, 2018). La confidentialité passe par le récit d'une hésitation avant de transmettre une donnée à un outil, ce qui donne accès à la portée réelle de la loi 09-08 dans les pratiques plutôt qu’à sa connaissance déclarative. La crainte du remplacement, enfin, est approchée par la part du travail jugée automatisable et par le récit d'une situation où elle a été éprouvée.</w:t>
       </w:r>
     </w:p>
     <w:bookmarkEnd w:id="116"/>
@@ -8491,7 +8488,7 @@
         <w:pStyle w:val="FirstParagraph"/>
       </w:pPr>
       <w:r>
-        <w:t xml:space="preserve">La prise de contact s'opère par message écrit accompagné de la lettre de présentation de la recherche (Annexe B), qui précise l'identité du chercheur et son institution de rattachement, l'objet et le cadre académique de la recherche, les critères de participation, la durée et les modalités de l'entretien, les garanties éthiques et les coordonnées permettant un échange préalable ; un rendez-vous est ensuite fixé selon la disponibilité du répondant, avec un rappel 48 heures avant l'échéance. La collecte est planifiée sur trois à quatre mois, entre l'été et l'automne 2026 : cet étalement permet l'analyse itérative en parallèle de la collecte (cf. § 4.4.2) et absorbe la saisonnalité du terrain, la période estivale mobilisant fortement les fonctions RH du tourisme et de l'hôtellerie régionale. Les entretiens sont conduits, au choix du répondant, en présentiel, privilégié parce qu'il facilite l'observation des dimensions non verbales qui constituent des données qualitatives à part entière, ou par visioconférence sécurisée lorsque l'éloignement, l'agenda ou les préférences du répondant l'exigent. Dans les deux cas, la durée cible est de 75 minutes, dans une fourchette de 70 à 90 minutes ; l'entretien débute par le préambule oral décrit plus haut, suivi du recueil du consentement écrit, l'enregistrement ne démarrant qu'après ce recueil ou, dans le cas d'exception prévu au § 4.3.3, qu'après le recueil oral du consentement clause par clause.</w:t>
+        <w:t xml:space="preserve">La prise de contact s'opère par message écrit accompagné de la lettre de présentation de la recherche (Annexe B), qui précise l'identité du chercheur et son institution de rattachement, l'objet et le cadre académique de la recherche, les critères de participation, la durée et les modalités de l'entretien, les garanties éthiques et les coordonnées permettant un échange préalable ; un rendez-vous est ensuite fixé selon la disponibilité du répondant, avec un rappel 48 heures avant l'échéance. La collecte est planifiée sur trois à quatre mois, entre l'été et l'automne 2026 : cet étalement permet l'analyse itérative en parallèle de la collecte (cf. § 4.4.2) et absorbe la saisonnalité du terrain, la période estivale mobilisant fortement les fonctions RH du tourisme et de l'hôtellerie régionale. Les entretiens sont conduits, au choix du répondant, en présentiel, privilégié parce qu'il facilite l'observation des dimensions non verbales qui constituent des données qualitatives à part entière, ou par visioconférence sécurisée lorsque l'éloignement, l'agenda ou les préférences du répondant l'exigent. Dans les deux cas, la durée cible est de 75 minutes, dans une fourchette de 70 à 90 minutes ; l'entretien débute par le préambule oral décrit plus haut, suivi du recueil du consentement écrit, l'enregistrement ne démarrant qu'après ce recueil ou, dans le cas d'exception prévu au § 4.3.3, ne s'ouvrant que par le recueil oral du consentement clause par clause.</w:t>
       </w:r>
     </w:p>
     <w:bookmarkEnd w:id="121"/>
@@ -8577,7 +8574,7 @@
         <w:pStyle w:val="BodyText"/>
       </w:pPr>
       <w:r>
-        <w:t xml:space="preserve">La retranscription est intégrale et pseudonymisée. Les noms de personnes, d'entreprises et d'outils susceptibles d'identifier le répondant sont remplacés par des codes (R1 à Rn pour les répondants, E1 et suivants pour les entreprises) ; la table de correspondance est conservée à part, chiffrée, accessible au seul chercheur, et détruite au plus tard un mois après la soutenance, moment au-delà duquel le retrait individuel des données ne peut techniquement plus être exécuté, ce dont les répondants sont informés. Le terme de pseudonymisation est retenu à dessein : tant que cette table existe, le rapprochement avec l'identité du répondant demeure possible pour le seul chercheur, ce qui ne constitue pas une anonymisation irréversible. Elle est effectuée manuellement ou par un outil de transcription automatique exécuté localement (par exemple Whisper), puis systématiquement relue ; les combinaisons rares de caractéristiques susceptibles de permettre une réidentification indirecte sont masquées ou agrégées dans le mémoire. Les destinataires des données se limitent au chercheur, à l'encadrante du mémoire pour la supervision, au second codeur pour le sous-corpus pseudonymisé du double codage, sous engagement écrit de confidentialité, et au jury pour les extraits cités dans le volume. Les fichiers audio, stockés sur un support chiffré, sont détruits au plus tard trois mois après la soutenance ; les retranscriptions pseudonymisées et les exports d'analyse sont conservés cinq ans à des fins de vérification académique, sauf exigence contraire de l'établissement, puis supprimés ; les formulaires de consentement sont archivés séparément pendant cinq ans, durée de preuve retenue par défaut et ajustable selon les exigences de l'établissement. Ces durées, définies par catégorie de données, sont rappelées dans la lettre de présentation et le formulaire de consentement.</w:t>
+        <w:t xml:space="preserve">La retranscription est intégrale et pseudonymisée. Les noms de personnes, d'entreprises et d'outils susceptibles d'identifier le répondant sont remplacés par des codes (R1 à Rn pour les répondants, E1 et suivants pour les entreprises) ; la table de correspondance est conservée à part, chiffrée, accessible au seul chercheur, et détruite au plus tard un mois après la soutenance, moment au-delà duquel le retrait individuel des données ne peut techniquement plus être exécuté, ce dont les répondants sont informés. Le terme de pseudonymisation est retenu à dessein : tant que cette table existe, le rapprochement avec l'identité du répondant demeure possible pour le seul chercheur, ce qui ne constitue pas une anonymisation irréversible. La retranscription est effectuée manuellement ou par un outil de transcription automatique exécuté localement (par exemple Whisper), puis systématiquement relue ; les combinaisons rares de caractéristiques susceptibles de permettre une réidentification indirecte sont masquées ou agrégées dans le mémoire. Les destinataires des données se limitent au chercheur, à l'encadrante du mémoire pour la supervision, au second codeur pour le sous-corpus pseudonymisé du double codage, sous engagement écrit de confidentialité, et au jury pour les extraits cités dans le volume. Les fichiers audio, stockés sur un support chiffré, sont détruits au plus tard trois mois après la soutenance ; les retranscriptions pseudonymisées et les exports d'analyse sont conservés cinq ans à des fins de vérification académique, sauf exigence contraire de l'établissement, puis supprimés ; les formulaires de consentement sont archivés séparément pendant cinq ans, durée de preuve retenue par défaut et ajustable selon les exigences de l'établissement. Ces durées, définies par catégorie de données, sont rappelées dans la lettre de présentation et le formulaire de consentement.</w:t>
       </w:r>
     </w:p>
     <w:bookmarkEnd w:id="122"/>
@@ -8599,7 +8596,7 @@
         <w:pStyle w:val="FirstParagraph"/>
       </w:pPr>
       <w:r>
-        <w:t xml:space="preserve">Chaque répondant signe un formulaire de consentement éclairé (Annexe C), établi en deux exemplaires. À titre d'exception, lorsque la signature est matériellement impossible, le consentement est recueilli oralement en début d'enregistrement, clause par clause, l'exception étant consignée au journal de bord et le formulaire signé régularisé dès que possible. Il précise l'objet académique et non commercial de la recherche, les modalités de l'entretien, le droit de retrait sans justification et la destruction des données déjà collectées, dans la limite temporelle liée à la destruction de la table de correspondance (cf. § 4.3.2), la pseudonymisation systématique, la confidentialité de l'enregistrement, les destinataires des résultats et les coordonnées du chercheur.</w:t>
+        <w:t xml:space="preserve">Chaque répondant signe un formulaire de consentement éclairé (Annexe C), établi en deux exemplaires. À titre d'exception, lorsque la signature est matériellement impossible, le consentement est recueilli oralement en début d'enregistrement, clause par clause, l'exception étant consignée au journal de bord et le formulaire signé régularisé dès que possible. Le formulaire précise l'objet académique et non commercial de la recherche, les modalités de l'entretien, le droit de retrait à tout moment et sans justification, avec destruction des données déjà collectées, dans la limite temporelle liée à la destruction de la table de correspondance (cf. § 4.3.2), la pseudonymisation systématique, la confidentialité de l'enregistrement, les destinataires des résultats et les coordonnées du chercheur.</w:t>
       </w:r>
     </w:p>
     <w:p>
@@ -8623,7 +8620,7 @@
         <w:t xml:space="preserve"> </w:t>
       </w:r>
       <w:r>
-        <w:t xml:space="preserve">relative à la protection des personnes physiques à l'égard du traitement des données à caractère personnel, promulguée par le Dahir n° 1-09-15 du 18 février 2009, ainsi qu'à son décret d'application et aux délibérations de la CNDP. Six principes structurent cette conformité : la finalité explicite ; la minimisation, seuls les verbatims pseudonymisés et des métadonnées de profil agrégées étant conservés ; la loyauté et la transparence ; le consentement libre, spécifique et éclairé ; la sécurité et la confidentialité, par stockage chiffré, accès restreint et destruction programmée par catégorie de données ; les droits d'accès, de rectification et d'opposition, chaque répondant pouvant, dans la même limite temporelle, consulter sa retranscription, la faire modifier ou la retirer du corpus. Pour les répondants ressortissants de l'Union européenne ou exerçant dans une filiale de groupe européen, la conformité au RGPD (Règlement (UE) 2016/679) est également assurée, les principes des deux régimes convergeant largement. Le traitement projeté fait l'objet, avant toute collecte, de la formalité préalable requise auprès de la CNDP, déclaration ou autorisation selon le régime applicable, déposée par le responsable du traitement ; aucun entretien n'est conduit avant l'obtention du récépissé ou de l'autorisation, dont les références sont reportées dans la lettre et le formulaire, le protocole, la note d'information et le formulaire figurant parmi les pièces du dossier. Ce cadre n'est pas qu'une contrainte externe : la sensibilité des données RH et la conformité à la loi 09-08 figurent parmi les objets mêmes de l'enquête (P6 et P7), et le sérieux du dispositif participe de la crédibilité du chercheur auprès de répondants avertis de ces questions.</w:t>
+        <w:t xml:space="preserve">relative à la protection des personnes physiques à l'égard du traitement des données à caractère personnel, promulguée par le Dahir n° 1-09-15 du 18 février 2009, ainsi qu'à son décret d'application et aux délibérations de la CNDP. Six principes structurent cette conformité : la finalité explicite ; la minimisation, seuls les verbatims pseudonymisés et des métadonnées de profil agrégées étant conservés ; la loyauté et la transparence ; le consentement libre, spécifique et éclairé ; la sécurité et la confidentialité, par stockage chiffré, accès restreint et destruction programmée par catégorie de données ; les droits d'accès, de rectification et d'opposition, chaque répondant pouvant, dans la même limite temporelle, consulter sa retranscription, la faire modifier ou la retirer du corpus. Pour les répondants ressortissants de l'Union européenne ou exerçant dans une filiale de groupe européen, la conformité au RGPD (Règlement (UE) 2016/679) est également assurée, les principes des deux régimes convergeant largement. Le traitement projeté fait l'objet, avant toute collecte, de la formalité préalable requise auprès de la CNDP, déclaration ou autorisation selon le régime applicable, déposée par le responsable du traitement ; aucun entretien n'est conduit avant l'obtention du récépissé ou de l'autorisation, dont les références sont reportées dans la lettre de présentation et le formulaire de consentement, le protocole de recherche et la note d'information figurant parmi les pièces du dossier. Ce cadre n'est pas qu'une contrainte externe : la sensibilité des données RH et la conformité à la loi 09-08 figurent parmi les objets mêmes de l'enquête (P6 et P7), et le sérieux du dispositif participe de la crédibilité du chercheur auprès de répondants avertis de ces questions.</w:t>
       </w:r>
     </w:p>
     <w:bookmarkEnd w:id="123"/>
@@ -8949,7 +8946,7 @@
         <w:t xml:space="preserve"> </w:t>
       </w:r>
       <w:r>
-        <w:t xml:space="preserve">à partir des dimensions du cadre TAM/UTAUT enrichi et des sept propositions. Elle se décline en treize familles de codes analytiques subdivisées en sous-codes opérationnels, complétées par les codes descriptifs de contexte (PRO, REP, USG, PRO-FUT), la famille réflexive HIE issue de la question de clôture et les codes émergents EM. Aux familles issues du noyau TAM/UTAUT (UP, FU, AE, AX, IS, CF) s'ajoutent celles qui opérationnalisent les enrichissements du modèle conceptuel : VAH (valeur ajoutée humaine) pour P1, MNG (légitimation managériale) pour P3, RMP (remplacement) pour P5, CT (confiance et transparence), RIS (risques éthiques) et CFD (confidentialité des données) pour les facteurs IA-spécifiques de P6, et CTX pour les facteurs contextuels marocains de P7. Le Tableau 10 en présente un extrait centré sur ces familles distinctives ; la grille complète, avec les définitions opérationnelles de chaque sous-code et leurs ancrages théoriques, figure en Annexe E, où la famille USG est en outre déclinée en six sous-codes (USG-1 à USG-6) reprenant l'échelle d'états d'usage définie par l'objectif OS1, du non-usage sans intention à l'abandon.</w:t>
+        <w:t xml:space="preserve">à partir des dimensions du cadre TAM/UTAUT enrichi et des sept propositions. Elle se décline en treize familles de codes analytiques subdivisées en sous-codes opérationnels, complétées par les codes descriptifs de contexte (PRO, REP, USG, PRO-FUT), la famille réflexive HIE issue de la question de clôture et les codes émergents EM. Aux familles issues du noyau TAM/UTAUT (UP pour l'utilité perçue, FU pour la facilité d'usage, AE et AX pour l'auto-efficacité et l'anxiété, IS pour l'influence sociale, CF pour les conditions facilitantes) s'ajoutent celles qui opérationnalisent les enrichissements du modèle conceptuel : VAH (valeur ajoutée humaine) pour P1, MNG (légitimation managériale) pour P3, RES (anxiété générale et résistances) et RMP (remplacement) pour P5, CT (confiance et transparence), RIS (risques éthiques) et CFD (confidentialité des données) pour les facteurs IA-spécifiques de P6, et CTX pour les facteurs contextuels marocains de P7. Le Tableau 10 en présente un extrait centré sur ces familles distinctives ; la grille complète, avec les définitions opérationnelles de chaque sous-code et leurs ancrages théoriques, figure en Annexe E, où la famille USG est en outre déclinée en six sous-codes (USG-1 à USG-6) reprenant l'échelle d'états d'usage définie par l'objectif OS1, du non-usage sans intention à l'abandon.</w:t>
       </w:r>
     </w:p>
     <w:p>
@@ -9717,7 +9714,7 @@
         <w:pStyle w:val="FirstParagraph"/>
       </w:pPr>
       <w:r>
-        <w:t xml:space="preserve">Six limites principales sont anticipées, chacune assortie de ses atténuations : la limite d'échantillon, douze à vingt répondants ne constituant pas un échantillon statistiquement représentatif des professionnels RH du Souss-Massa, la transférabilité restant à éprouver par des recherches complémentaires ; le biais de désirabilité sociale, les répondants pouvant valoriser leur usage de l'IA ou au contraire le minimiser, atténué par la garantie de pseudonymisation, la formulation ouverte des questions et l'attention aux contradictions discursives ; le biais d'auto-déclaration, le discours sur les usages ne se confondant pas avec les usages effectifs, atténué par la demande systématique d'illustrations concrètes et le croisement avec les documents organisationnels (cf. § 4.4.1) ; le biais de l'enquêteur, atténué par la réflexivité documentée, le guide structuré, le double codage et la supervision de l'encadrante ; le biais de sélection par boule de neige, atténué par le panachage des cinq canaux d'accès et le suivi actif de la matrice de diversification ; les limites du cadre TAM/UTAUT enrichi, la grille déductive pouvant sous-estimer des dimensions hors cadre telles que les dynamiques identitaires profondes, les processus organisationnels longitudinaux ou les effets de génération, atténuées par l'ouverture aux codes émergents (cf. § 4.4.3) et la confrontation aux apports récents de la littérature (Budhwar et al., 2022 ; Charlwood &amp; Guenole, 2022 ; Tambe et al., 2019). Ces limites ne disqualifient pas la recherche : elles en délimitent la portée, et elles sont reprises dans la conclusion générale du mémoire.</w:t>
+        <w:t xml:space="preserve">Six limites principales sont anticipées, chacune assortie de ses atténuations : la limite d'échantillon, douze à vingt répondants ne constituant pas un échantillon statistiquement représentatif des professionnels RH du Souss-Massa, la transférabilité restant à éprouver par des recherches complémentaires ; le biais de désirabilité sociale, les répondants pouvant valoriser leur usage de l'IA ou au contraire le minimiser, atténué par la garantie de pseudonymisation, la formulation ouverte des questions et l'attention aux contradictions discursives ; le biais d'auto-déclaration, le discours sur les usages ne se confondant pas avec les usages effectifs, atténué par la demande systématique d'illustrations concrètes et le croisement avec les documents organisationnels (cf. § 4.4.1) ; le biais de l'enquêteur, atténué par la réflexivité documentée, le guide structuré, le double codage et la supervision de l'encadrante ; le biais de sélection par boule de neige, atténué par le panachage des cinq canaux d'accès et le suivi actif de la matrice de diversification ; les limites du cadre TAM/UTAUT enrichi, la grille déductive pouvant sous-estimer des dimensions hors cadre telles que les dynamiques identitaires profondes, les processus organisationnels longitudinaux ou les effets de génération, atténuées par l'ouverture aux codes émergents (cf. § 4.4.3) et la confrontation aux apports récents de la littérature (Budhwar et al., 2022 ; Charlwood &amp; Guenole, 2022 ; Tambe et al., 2019). Ces limites ne disqualifient pas la recherche : elles en délimitent la portée, et elles seront reprises dans la conclusion générale du mémoire.</w:t>
       </w:r>
     </w:p>
     <w:p>
@@ -9764,7 +9761,7 @@
         <w:t xml:space="preserve"> </w:t>
       </w:r>
       <w:r>
-        <w:t xml:space="preserve">auprès de 3 à 5 répondants volontaires. L'analyse combine triangulation documentaire et théorique, analyse thématique en six étapes articulant Bardin (2013), Paillé et Mucchielli (2016) et Braun et Clarke (2006) (Figure 7), grille de codage déductive à treize familles analytiques ouverte aux codes émergents (Tableau 10 et Annexe E), outillage CAQDAS et double codage indépendant sur 25 % du corpus avec un seuil de kappa de Cohen fixé à 0,70 (Landis &amp; Koch, 1977). La scientificité s'apprécie selon les quatre critères de Lincoln et Guba (1985), adossée à une réflexivité explicitée et à la reconnaissance de six limites anticipées. Le dispositif est ainsi complet, documenté et auditable ; il peut être déployé sur le terrain.</w:t>
+        <w:t xml:space="preserve">auprès de trois à cinq répondants volontaires. L'analyse combine triangulation documentaire et théorique, analyse thématique en six étapes articulant Bardin (2013), Paillé et Mucchielli (2016) et Braun et Clarke (2006) (Figure 7), grille de codage déductive à treize familles analytiques ouverte aux codes émergents (Tableau 10 et Annexe E), outillage CAQDAS et double codage indépendant sur 25 % du corpus avec un seuil de kappa de Cohen fixé à 0,70 (Landis &amp; Koch, 1977). La scientificité s'apprécie selon les quatre critères de Lincoln et Guba (1985), adossée à une réflexivité explicitée et à la reconnaissance de six limites anticipées. Le dispositif est ainsi complet, documenté et auditable ; il peut être déployé sur le terrain.</w:t>
       </w:r>
     </w:p>
     <w:bookmarkEnd w:id="136"/>
@@ -9788,7 +9785,7 @@
         <w:pStyle w:val="FirstParagraph"/>
       </w:pPr>
       <w:r>
-        <w:t xml:space="preserve">La Partie II a établi la cohérence interne du dispositif méthodologique. Le chapitre 3 a fondé le positionnement post-positiviste et ses conséquences de design ; le chapitre 4 l'a opérationnalisé : échantillonnage raisonné de douze à vingt répondants, guide semi-directif tracé vers les propositions, dispositif éthique aligné sur la loi 09-08, analyse thématique à grille mixte, double codage avec coefficient kappa et critères de scientificité de Lincoln et Guba (1985). Cette architecture satisfait trois exigences cardinales : la rigueur, chaque décision étant tracée, du recrutement des répondants au seuil d'accord inter-codeurs ; la cohérence, l'épistémologie, l'approche, la stratégie et l'outillage s'alignant sans rupture ; la transparence, les biais et les limites étant anticipés et documentés, non tus. Le dispositif est désormais prêt à être déployé : la Partie III mettra ce socle à l'épreuve du terrain, les verbatims y étant analysés dimension par dimension, confrontés aux sept propositions et discutés à la lumière de la littérature, avec une attention particulière aux facteurs spécifiques à l'IA (P6) et aux facteurs contextuels marocains (P7), qui portent la contribution distinctive de ce mémoire.</w:t>
+        <w:t xml:space="preserve">La Partie II a établi la cohérence interne du dispositif méthodologique. Le chapitre 3 a fondé le positionnement post-positiviste et ses conséquences de design ; le chapitre 4 l'a opérationnalisé : échantillonnage raisonné de douze à vingt répondants, guide semi-directif dont la traçabilité vers les propositions est établie, dispositif éthique aligné sur la loi 09-08, analyse thématique à grille mixte, double codage avec coefficient kappa et critères de scientificité de Lincoln et Guba (1985). Cette architecture satisfait trois exigences cardinales. La rigueur, d'abord : chaque décision est tracée, du recrutement des répondants au seuil d'accord inter-codeurs. La cohérence, ensuite : l'épistémologie, l'approche, la stratégie et l'outillage s'alignent sans rupture. La transparence, enfin : les biais et les limites sont anticipés et documentés, non tus. Le dispositif est désormais prêt à être déployé : la Partie III mettra ce socle à l'épreuve du terrain, les verbatims y étant analysés dimension par dimension, confrontés aux sept propositions et discutés à la lumière de la littérature, avec une attention particulière aux facteurs spécifiques à l'IA (P6) et aux facteurs contextuels marocains (P7), qui portent la contribution distinctive de ce mémoire.</w:t>
       </w:r>
     </w:p>
     <w:bookmarkEnd w:id="139"/>
@@ -9825,7 +9822,7 @@
         <w:pStyle w:val="FirstParagraph"/>
       </w:pPr>
       <w:r>
-        <w:t xml:space="preserve">Ce volume s'était fixé un objectif borné : construire, avant tout contact avec le terrain, un appareil théorique et méthodologique capable de soutenir une étude qualitative déductive de l'adoption de l'IA par les professionnels RH de la région Souss-Massa. Trois acquis peuvent être revendiqués à ce stade, avec la prudence qui s'impose puisque rien n'a encore été confronté aux données. Le premier est un cadre intégrateur argumenté. La revue a établi le double constat qui fonde la problématique, une fonction RH entrée dans une phase d'outillage algorithmique sans précédent (Budhwar et al., 2022 ; Tambe et al., 2019) et trois lacunes béantes, sectorielle, contextuelle et méthodologique ; le chapitre 2 a retracé la généalogie des modèles d'acceptation, du TAM (Davis, 1989) à l'UTAUT 2 (Venkatesh et al., 2012), pris au sérieux leurs critiques, puis construit un cadre qui conserve l'ossature classique en l'enrichissant de deux registres : les facteurs spécifiques à l'IA, confiance (Glikson &amp; Woolley, 2020 ; Mayer et al., 1995), explicabilité (Shin, 2021), aversion et appréciation algorithmiques (Dietvorst et al., 2015 ; Logg et al., 2019), équité perçue et risques de discrimination (Köchling &amp; Wehner, 2020 ; M. K. Lee, 2018), et les facteurs contextuels marocains, de la culture organisationnelle au cadre de la loi 09-08 et à la dynamique ouverte par</w:t>
+        <w:t xml:space="preserve">Ce volume s'était fixé un objectif borné : construire, avant tout contact avec le terrain, un appareil théorique et méthodologique capable de soutenir une étude qualitative déductive de l'adoption de l'IA par les professionnels RH de la région Souss-Massa. Trois acquis peuvent être revendiqués à ce stade, avec la prudence qui s'impose puisque rien n'a encore été confronté aux données. Le premier est un cadre intégrateur argumenté. La revue a établi le double constat qui fonde la problématique : une fonction RH entrée dans une phase d'outillage algorithmique sans précédent (Budhwar et al., 2022 ; Tambe et al., 2019) et trois lacunes, sectorielle, contextuelle et méthodologique, établies au chapitre 1 par confrontation à la littérature consultée ; le chapitre 2 a retracé la généalogie des modèles d'acceptation, du TAM (Davis, 1989) à l'UTAUT 2 (Venkatesh et al., 2012), pris au sérieux leurs critiques, puis construit un cadre qui conserve l'ossature classique en l'enrichissant de deux registres. D'un côté, les facteurs spécifiques à l'IA : la confiance (Glikson &amp; Woolley, 2020 ; Mayer et al., 1995), l'explicabilité (Shin, 2021), l'aversion et l'appréciation algorithmiques (Dietvorst et al., 2015 ; Logg et al., 2019), l'équité perçue et les risques de discrimination (Köchling &amp; Wehner, 2020 ; M. K. Lee, 2018). De l'autre, les facteurs contextuels marocains, de la culture organisationnelle au cadre de la loi 09-08 et à la dynamique ouverte par</w:t>
       </w:r>
       <w:r>
         <w:t xml:space="preserve"> </w:t>
@@ -9838,7 +9835,7 @@
         <w:t xml:space="preserve">Maroc Digital 2030</w:t>
       </w:r>
       <w:r>
-        <w:t xml:space="preserve">. Le deuxième acquis est un jeu de sept propositions articulées à ce cadre : P1 à P5 opérationnalisent les dimensions classiques de l'acceptation, P6 isole ce qui relève en propre de l'IA, P7 érige le contexte marocain en facteur explicatif de plein droit ; chaque proposition est reliée à une sous-question, à un thème du guide et à une famille de codes, la chaîne de traçabilité courant de la théorie à la future grille d'analyse ; cette architecture constitue un pari raisonné, que le terrain viendra éprouver. Le troisième acquis est un dispositif méthodologique complet et auditable : posture post-positiviste assumée, échantillonnage raisonné avec matrice de diversification, cible de douze à vingt entretiens arbitrée par la saturation thématique (Guest et al., 2006 ; Saunders et al., 2018), guide semi-directif soumis à un pré-test avant la collecte principale, dispositif éthique aligné sur la loi 09-08 (consentement éclairé, pseudonymisation, conservation sécurisée), analyse thématique à codage mixte (Bardin, 2013 ; Braun &amp; Clarke, 2006), double codage partiel avec seuil d'accord explicite (Cohen, 1960 ; Landis &amp; Koch, 1977) et critères de scientificité de Lincoln et Guba (1985), complétés par un exercice de réflexivité sur la position du chercheur.</w:t>
+        <w:t xml:space="preserve">. Le deuxième acquis est un jeu de sept propositions articulées à ce cadre : P1 à P5 opérationnalisent les dimensions classiques de l'acceptation, P6 isole ce qui relève en propre de l'IA, P7 érige le contexte marocain en facteur explicatif de plein droit ; chaque proposition est reliée à une sous-question, à un thème du guide et à une famille de codes, la chaîne de traçabilité courant de la théorie à la future grille d'analyse ; cette architecture constitue un pari raisonné, que le terrain viendra éprouver. Le troisième acquis est un dispositif méthodologique complet et auditable : posture post-positiviste assumée, échantillonnage raisonné avec matrice de diversification, cible de douze à vingt entretiens arbitrée par la saturation thématique (Guest et al., 2006 ; Saunders et al., 2018), guide semi-directif qui sera soumis à un pré-test avant la collecte principale, dispositif éthique aligné sur la loi 09-08 (consentement éclairé, pseudonymisation, conservation sécurisée), analyse thématique à codage mixte (Bardin, 2013 ; Braun &amp; Clarke, 2006), double codage partiel avec seuil d'accord explicite (Cohen, 1960 ; Landis &amp; Koch, 1977) et critères de scientificité de Lincoln et Guba (1985), complétés par un exercice de réflexivité sur la position du chercheur.</w:t>
       </w:r>
     </w:p>
     <w:bookmarkEnd w:id="141"/>
@@ -9898,7 +9895,7 @@
         <w:pStyle w:val="FirstParagraph"/>
       </w:pPr>
       <w:r>
-        <w:t xml:space="preserve">Sur le plan théorique, la recherche vise un enrichissement contextualisé des modèles TAM/UTAUT appliqués à l'IA : préciser, à partir de discours situés, comment les facteurs IA-spécifiques s'articulent aux dimensions classiques, et ce que le contexte marocain fait aux mécanismes décrits par une littérature essentiellement nord-américaine, européenne et asiatique. La portée revendiquée restera celle d'une étude qualitative régionale : des propositions consolidées, transférables avec précaution à des contextes comparables, susceptibles d'alimenter en retour de futures études quantitatives confirmatoires à plus large échelle. Sur le plan managérial, quatre destinataires sont visés : les directions RH, qui pourraient y trouver des repères pour séquencer l'introduction des outils et traiter frontalement la crainte du remplacement plutôt que de la laisser prospérer en silence ; les directions générales, des indications sur les conditions facilitantes réellement discriminantes et sur leur propre rôle de légitimation ; les éditeurs de solutions, des attentes précises en matière d'explicabilité, de localisation linguistique et d'adaptation culturelle ; les pouvoirs publics enfin, engagés dans la mise en œuvre de</w:t>
+        <w:t xml:space="preserve">Sur le plan théorique, la recherche vise un enrichissement contextualisé des modèles TAM/UTAUT appliqués à l'IA : préciser, à partir de discours situés, comment les facteurs IA-spécifiques s'articulent aux dimensions classiques, et ce que le contexte marocain fait aux mécanismes décrits par une littérature essentiellement nord-américaine, européenne et asiatique. La portée revendiquée restera celle d'une étude qualitative régionale : des propositions consolidées, transférables avec précaution à des contextes comparables et non des lois générales, susceptibles d'alimenter en retour de futures études quantitatives confirmatoires à plus large échelle. Sur le plan managérial, quatre destinataires sont visés : les directions RH, des repères pour séquencer l'introduction des outils et traiter frontalement la crainte du remplacement plutôt que de la laisser prospérer en silence ; les directions générales, des indications sur les conditions facilitantes réellement discriminantes et sur leur propre rôle de légitimation ; les éditeurs de solutions, des attentes précises en matière d'explicabilité, de localisation linguistique et d'adaptation culturelle ; les pouvoirs publics enfin, engagés dans la mise en œuvre de</w:t>
       </w:r>
       <w:r>
         <w:t xml:space="preserve"> </w:t>

</xml_diff>